<commit_message>
docs: keep only canonical defense presentation
</commit_message>
<xml_diff>
--- a/doc/presentations/defensa-placa-permanent-dsi-ports-sortida-hexagonal/output/materials-orals-canonics-20-minuts.docx
+++ b/doc/presentations/defensa-placa-permanent-dsi-ports-sortida-hexagonal/output/materials-orals-canonics-20-minuts.docx
@@ -185,7 +185,115 @@
         <w:pStyle w:val="BodyText"/>
       </w:pPr>
       <w:r>
-        <w:t xml:space="preserve">També hi ha detalls formals que convindria corregir abans de la defensa:</w:t>
+        <w:t xml:space="preserve">També hi ha detalls formals que convindria revisar abans de la defensa:</w:t>
+      </w:r>
+      <w:r>
+        <w:t xml:space="preserve"> </w:t>
+      </w:r>
+      <w:r>
+        <w:rPr>
+          <w:rStyle w:val="VerbatimChar"/>
+        </w:rPr>
+        <w:t xml:space="preserve">Generarlitat</w:t>
+      </w:r>
+      <w:r>
+        <w:t xml:space="preserve"> </w:t>
+      </w:r>
+      <w:r>
+        <w:t xml:space="preserve">hauria de ser</w:t>
+      </w:r>
+      <w:r>
+        <w:t xml:space="preserve"> </w:t>
+      </w:r>
+      <w:r>
+        <w:rPr>
+          <w:rStyle w:val="VerbatimChar"/>
+        </w:rPr>
+        <w:t xml:space="preserve">Generalitat</w:t>
+      </w:r>
+      <w:r>
+        <w:t xml:space="preserve">;</w:t>
+      </w:r>
+      <w:r>
+        <w:t xml:space="preserve"> </w:t>
+      </w:r>
+      <w:r>
+        <w:rPr>
+          <w:rStyle w:val="VerbatimChar"/>
+        </w:rPr>
+        <w:t xml:space="preserve">tecnología</w:t>
+      </w:r>
+      <w:r>
+        <w:t xml:space="preserve"> </w:t>
+      </w:r>
+      <w:r>
+        <w:t xml:space="preserve">hauria de ser</w:t>
+      </w:r>
+      <w:r>
+        <w:t xml:space="preserve"> </w:t>
+      </w:r>
+      <w:r>
+        <w:rPr>
+          <w:rStyle w:val="VerbatimChar"/>
+        </w:rPr>
+        <w:t xml:space="preserve">tecnologia</w:t>
+      </w:r>
+      <w:r>
+        <w:t xml:space="preserve">;</w:t>
+      </w:r>
+      <w:r>
+        <w:t xml:space="preserve"> </w:t>
+      </w:r>
+      <w:r>
+        <w:rPr>
+          <w:rStyle w:val="VerbatimChar"/>
+        </w:rPr>
+        <w:t xml:space="preserve">necesita</w:t>
+      </w:r>
+      <w:r>
+        <w:t xml:space="preserve"> </w:t>
+      </w:r>
+      <w:r>
+        <w:t xml:space="preserve">hauria de ser</w:t>
+      </w:r>
+      <w:r>
+        <w:t xml:space="preserve"> </w:t>
+      </w:r>
+      <w:r>
+        <w:rPr>
+          <w:rStyle w:val="VerbatimChar"/>
+        </w:rPr>
+        <w:t xml:space="preserve">necessita</w:t>
+      </w:r>
+      <w:r>
+        <w:t xml:space="preserve">;</w:t>
+      </w:r>
+      <w:r>
+        <w:t xml:space="preserve"> </w:t>
+      </w:r>
+      <w:r>
+        <w:rPr>
+          <w:rStyle w:val="VerbatimChar"/>
+        </w:rPr>
+        <w:t xml:space="preserve">d´ús</w:t>
+      </w:r>
+      <w:r>
+        <w:t xml:space="preserve"> </w:t>
+      </w:r>
+      <w:r>
+        <w:t xml:space="preserve">hauria de ser</w:t>
+      </w:r>
+      <w:r>
+        <w:t xml:space="preserve"> </w:t>
+      </w:r>
+      <w:r>
+        <w:rPr>
+          <w:rStyle w:val="VerbatimChar"/>
+        </w:rPr>
+        <w:t xml:space="preserve">d'ús</w:t>
+      </w:r>
+      <w:r>
+        <w:t xml:space="preserve">; la numeració de diapositives 3 i 4 apareix duplicada; i les notes del presentador de les diapositives 1 i 2 contenen informació sobre PICA que correspon millor a les diapositives 5 o 6. La correcció</w:t>
       </w:r>
       <w:r>
         <w:t xml:space="preserve"> </w:t>
@@ -200,7 +308,7 @@
         <w:t xml:space="preserve"> </w:t>
       </w:r>
       <w:r>
-        <w:t xml:space="preserve">hauria de ser</w:t>
+        <w:t xml:space="preserve">-&gt;</w:t>
       </w:r>
       <w:r>
         <w:t xml:space="preserve"> </w:t>
@@ -212,115 +320,10 @@
         <w:t xml:space="preserve">desacoblada</w:t>
       </w:r>
       <w:r>
-        <w:t xml:space="preserve">;</w:t>
-      </w:r>
-      <w:r>
-        <w:t xml:space="preserve"> </w:t>
-      </w:r>
-      <w:r>
-        <w:rPr>
-          <w:rStyle w:val="VerbatimChar"/>
-        </w:rPr>
-        <w:t xml:space="preserve">Generarlitat</w:t>
-      </w:r>
-      <w:r>
-        <w:t xml:space="preserve"> </w:t>
-      </w:r>
-      <w:r>
-        <w:t xml:space="preserve">hauria de ser</w:t>
-      </w:r>
-      <w:r>
-        <w:t xml:space="preserve"> </w:t>
-      </w:r>
-      <w:r>
-        <w:rPr>
-          <w:rStyle w:val="VerbatimChar"/>
-        </w:rPr>
-        <w:t xml:space="preserve">Generalitat</w:t>
-      </w:r>
-      <w:r>
-        <w:t xml:space="preserve">;</w:t>
-      </w:r>
-      <w:r>
-        <w:t xml:space="preserve"> </w:t>
-      </w:r>
-      <w:r>
-        <w:rPr>
-          <w:rStyle w:val="VerbatimChar"/>
-        </w:rPr>
-        <w:t xml:space="preserve">tecnología</w:t>
-      </w:r>
-      <w:r>
-        <w:t xml:space="preserve"> </w:t>
-      </w:r>
-      <w:r>
-        <w:t xml:space="preserve">hauria de ser</w:t>
-      </w:r>
-      <w:r>
-        <w:t xml:space="preserve"> </w:t>
-      </w:r>
-      <w:r>
-        <w:rPr>
-          <w:rStyle w:val="VerbatimChar"/>
-        </w:rPr>
-        <w:t xml:space="preserve">tecnologia</w:t>
-      </w:r>
-      <w:r>
-        <w:t xml:space="preserve">;</w:t>
-      </w:r>
-      <w:r>
-        <w:t xml:space="preserve"> </w:t>
-      </w:r>
-      <w:r>
-        <w:rPr>
-          <w:rStyle w:val="VerbatimChar"/>
-        </w:rPr>
-        <w:t xml:space="preserve">necesita</w:t>
-      </w:r>
-      <w:r>
-        <w:t xml:space="preserve"> </w:t>
-      </w:r>
-      <w:r>
-        <w:t xml:space="preserve">hauria de ser</w:t>
-      </w:r>
-      <w:r>
-        <w:t xml:space="preserve"> </w:t>
-      </w:r>
-      <w:r>
-        <w:rPr>
-          <w:rStyle w:val="VerbatimChar"/>
-        </w:rPr>
-        <w:t xml:space="preserve">necessita</w:t>
-      </w:r>
-      <w:r>
-        <w:t xml:space="preserve">;</w:t>
-      </w:r>
-      <w:r>
-        <w:t xml:space="preserve"> </w:t>
-      </w:r>
-      <w:r>
-        <w:rPr>
-          <w:rStyle w:val="VerbatimChar"/>
-        </w:rPr>
-        <w:t xml:space="preserve">d´ús</w:t>
-      </w:r>
-      <w:r>
-        <w:t xml:space="preserve"> </w:t>
-      </w:r>
-      <w:r>
-        <w:t xml:space="preserve">hauria de ser</w:t>
-      </w:r>
-      <w:r>
-        <w:t xml:space="preserve"> </w:t>
-      </w:r>
-      <w:r>
-        <w:rPr>
-          <w:rStyle w:val="VerbatimChar"/>
-        </w:rPr>
-        <w:t xml:space="preserve">d'ús</w:t>
-      </w:r>
-      <w:r>
-        <w:t xml:space="preserve">; la numeració de diapositives 3 i 4 apareix duplicada; i les notes del presentador de les diapositives 1 i 2 contenen informació sobre PICA que correspon millor a les diapositives 5 o 6.</w:t>
+        <w:t xml:space="preserve"> </w:t>
+      </w:r>
+      <w:r>
+        <w:t xml:space="preserve">ja s’ha aplicat a la diapositiva 2.</w:t>
       </w:r>
     </w:p>
     <w:bookmarkEnd w:id="9"/>
@@ -370,7 +373,7 @@
         <w:pStyle w:val="BodyText"/>
       </w:pPr>
       <w:r>
-        <w:t xml:space="preserve">La diapositiva funciona. Corregiria</w:t>
+        <w:t xml:space="preserve">La diapositiva funciona. Correcció aplicada:</w:t>
       </w:r>
       <w:r>
         <w:t xml:space="preserve"> </w:t>
@@ -385,7 +388,7 @@
         <w:t xml:space="preserve"> </w:t>
       </w:r>
       <w:r>
-        <w:t xml:space="preserve">per</w:t>
+        <w:t xml:space="preserve">s’ha substituït per</w:t>
       </w:r>
       <w:r>
         <w:t xml:space="preserve"> </w:t>
@@ -397,7 +400,7 @@
         <w:t xml:space="preserve">desacoblada</w:t>
       </w:r>
       <w:r>
-        <w:t xml:space="preserve">. Si es vol reforçar el vincle amb el pla docent, es pot afegir en text petit:</w:t>
+        <w:t xml:space="preserve">. També s’ha reforçat el vincle amb el pla docent amb una referència discreta:</w:t>
       </w:r>
       <w:r>
         <w:t xml:space="preserve"> </w:t>
@@ -409,7 +412,7 @@
         <w:t xml:space="preserve">Pla docent 103322: clean/hexagonal architecture, ports i adaptadors, mapping, mòduls i DDD</w:t>
       </w:r>
       <w:r>
-        <w:t xml:space="preserve">. No cal citar tot el pla docent; amb una referència discreta n’hi ha prou.</w:t>
+        <w:t xml:space="preserve">. No cal citar tot el pla docent; amb aquesta referència n’hi ha prou.</w:t>
       </w:r>
     </w:p>
     <w:p>

</xml_diff>

<commit_message>
docs: clarify learning objective slides
</commit_message>
<xml_diff>
--- a/doc/presentations/defensa-placa-permanent-dsi-ports-sortida-hexagonal/output/materials-orals-canonics-20-minuts.docx
+++ b/doc/presentations/defensa-placa-permanent-dsi-ports-sortida-hexagonal/output/materials-orals-canonics-20-minuts.docx
@@ -424,15 +424,39 @@
           <w:b/>
           <w:bCs/>
         </w:rPr>
-        <w:t xml:space="preserve">Diapositives 3 i 4. Objectiu d’aprenentatge</w:t>
-      </w:r>
-    </w:p>
-    <w:p>
-      <w:pPr>
-        <w:pStyle w:val="BodyText"/>
-      </w:pPr>
-      <w:r>
-        <w:t xml:space="preserve">Hi ha una duplicació útil però visualment confusa. La 3 dona el principi; la 4 dona les operacions que l’estudiant ha de poder fer. Es poden mantenir totes dues si es corregeix la numeració i es presenta la 3 com a idea nuclear i la 4 com a resultat observable. Alternativa: fusionar-les si cal retallar temps.</w:t>
+        <w:t xml:space="preserve">Diapositives 3 i 4. Principi de disseny i objectiu d’aprenentatge</w:t>
+      </w:r>
+    </w:p>
+    <w:p>
+      <w:pPr>
+        <w:pStyle w:val="BodyText"/>
+      </w:pPr>
+      <w:r>
+        <w:t xml:space="preserve">Correcció aplicada. La diapositiva 3 es presenta ara com a</w:t>
+      </w:r>
+      <w:r>
+        <w:t xml:space="preserve"> </w:t>
+      </w:r>
+      <w:r>
+        <w:rPr>
+          <w:rStyle w:val="VerbatimChar"/>
+        </w:rPr>
+        <w:t xml:space="preserve">Principi de disseny</w:t>
+      </w:r>
+      <w:r>
+        <w:t xml:space="preserve">: el servei d’aplicació necessita una capacitat, no una tecnologia. La diapositiva 4 es presenta com a</w:t>
+      </w:r>
+      <w:r>
+        <w:t xml:space="preserve"> </w:t>
+      </w:r>
+      <w:r>
+        <w:rPr>
+          <w:rStyle w:val="VerbatimChar"/>
+        </w:rPr>
+        <w:t xml:space="preserve">Objectiu d'aprenentatge</w:t>
+      </w:r>
+      <w:r>
+        <w:t xml:space="preserve">: aplicar aquest principi en tres operacions observables. També s’ha corregit la numeració del peu de la diapositiva 4.</w:t>
       </w:r>
     </w:p>
     <w:p>
@@ -1047,13 +1071,13 @@
       </w:r>
     </w:p>
     <w:bookmarkEnd w:id="12"/>
-    <w:bookmarkStart w:id="13" w:name="Xcd10137b994bbd0c2141d94e0703e6e7cebfe27"/>
+    <w:bookmarkStart w:id="13" w:name="diapositiva-3.-principi-de-disseny---110"/>
     <w:p>
       <w:pPr>
         <w:pStyle w:val="Heading3"/>
       </w:pPr>
       <w:r>
-        <w:t xml:space="preserve">Diapositiva 3. Objectiu d’aprenentatge - 1:10</w:t>
+        <w:t xml:space="preserve">Diapositiva 3. Principi de disseny - 1:10</w:t>
       </w:r>
     </w:p>
     <w:p>
@@ -1122,13 +1146,13 @@
       </w:r>
     </w:p>
     <w:bookmarkEnd w:id="13"/>
-    <w:bookmarkStart w:id="14" w:name="Xa12105f40897091b4e43e058aa4b9bf768fb89e"/>
+    <w:bookmarkStart w:id="14" w:name="X044b902d0f2dfff7121a66a33ea1162812135fe"/>
     <w:p>
       <w:pPr>
         <w:pStyle w:val="Heading3"/>
       </w:pPr>
       <w:r>
-        <w:t xml:space="preserve">Diapositiva 4. Objectiu d’aprenentatge II - 0:50</w:t>
+        <w:t xml:space="preserve">Diapositiva 4. Objectiu d’aprenentatge - 0:50</w:t>
       </w:r>
     </w:p>
     <w:p>
@@ -1959,13 +1983,13 @@
       </w:r>
     </w:p>
     <w:bookmarkEnd w:id="26"/>
-    <w:bookmarkStart w:id="27" w:name="objectiu-daprenentatge---110"/>
+    <w:bookmarkStart w:id="27" w:name="principi-de-disseny---110"/>
     <w:p>
       <w:pPr>
         <w:pStyle w:val="Heading3"/>
       </w:pPr>
       <w:r>
-        <w:t xml:space="preserve">3. Objectiu d’aprenentatge - 1:10</w:t>
+        <w:t xml:space="preserve">3. Principi de disseny - 1:10</w:t>
       </w:r>
     </w:p>
     <w:p>
@@ -2053,13 +2077,13 @@
       </w:r>
     </w:p>
     <w:bookmarkEnd w:id="27"/>
-    <w:bookmarkStart w:id="28" w:name="objectiu-ii---050"/>
+    <w:bookmarkStart w:id="28" w:name="objectiu-daprenentatge---050"/>
     <w:p>
       <w:pPr>
         <w:pStyle w:val="Heading3"/>
       </w:pPr>
       <w:r>
-        <w:t xml:space="preserve">4. Objectiu II - 0:50</w:t>
+        <w:t xml:space="preserve">4. Objectiu d’aprenentatge - 0:50</w:t>
       </w:r>
     </w:p>
     <w:p>

</xml_diff>

<commit_message>
docs: refine scholarship wording
</commit_message>
<xml_diff>
--- a/doc/presentations/defensa-placa-permanent-dsi-ports-sortida-hexagonal/output/materials-orals-canonics-20-minuts.docx
+++ b/doc/presentations/defensa-placa-permanent-dsi-ports-sortida-hexagonal/output/materials-orals-canonics-20-minuts.docx
@@ -476,7 +476,7 @@
         <w:pStyle w:val="BodyText"/>
       </w:pPr>
       <w:r>
-        <w:t xml:space="preserve">La diapositiva situa bé el cas funcional abans de la tecnologia. La frase</w:t>
+        <w:t xml:space="preserve">La diapositiva situa bé el cas funcional abans de la tecnologia. Correcció aplicada: la frase</w:t>
       </w:r>
       <w:r>
         <w:t xml:space="preserve"> </w:t>
@@ -491,7 +491,22 @@
         <w:t xml:space="preserve"> </w:t>
       </w:r>
       <w:r>
-        <w:t xml:space="preserve">és entenedora; oralment convé formular-la amb prudència: si no es compleixen els requisits econòmics, l’expedient no avança favorablement en aquest tram del procediment. El diagrama petit pot ser difícil de llegir; si no es retoca, cal assenyalar només el bloc d’avaluació econòmica.</w:t>
+        <w:t xml:space="preserve">s’ha substituït per una formulació més institucional i prudent:</w:t>
+      </w:r>
+      <w:r>
+        <w:t xml:space="preserve"> </w:t>
+      </w:r>
+      <w:r>
+        <w:rPr>
+          <w:rStyle w:val="VerbatimChar"/>
+        </w:rPr>
+        <w:t xml:space="preserve">Quan no s'acredita el compliment dels requisits econòmics, l'expedient no obté una valoració favorable en aquesta fase.</w:t>
+      </w:r>
+      <w:r>
+        <w:t xml:space="preserve"> </w:t>
+      </w:r>
+      <w:r>
+        <w:t xml:space="preserve">El diagrama petit pot ser difícil de llegir; si no es retoca, cal assenyalar només el bloc d’avaluació econòmica.</w:t>
       </w:r>
     </w:p>
     <w:p>
@@ -1218,7 +1233,7 @@
         <w:pStyle w:val="BodyText"/>
       </w:pPr>
       <w:r>
-        <w:t xml:space="preserve">La part que ens interessa és l’avaluació econòmica. En aquest punt es comproven aspectes com la renda familiar i el patrimoni. Si els requisits econòmics no es compleixen, l’expedient no avança favorablement en aquest tram del procediment. [pausa breu]</w:t>
+        <w:t xml:space="preserve">La part que ens interessa és l’avaluació econòmica. En aquest punt es comproven aspectes com la renda familiar i el patrimoni. Quan no s’acredita el compliment dels requisits econòmics, l’expedient no obté una valoració favorable en aquesta fase. [pausa breu]</w:t>
       </w:r>
     </w:p>
     <w:p>

</xml_diff>

<commit_message>
docs: refresh oral materials
</commit_message>
<xml_diff>
--- a/doc/presentations/defensa-placa-permanent-dsi-ports-sortida-hexagonal/output/materials-orals-canonics-20-minuts.docx
+++ b/doc/presentations/defensa-placa-permanent-dsi-ports-sortida-hexagonal/output/materials-orals-canonics-20-minuts.docx
@@ -185,7 +185,7 @@
         <w:pStyle w:val="BodyText"/>
       </w:pPr>
       <w:r>
-        <w:t xml:space="preserve">També hi ha detalls formals que convindria revisar abans de la defensa:</w:t>
+        <w:t xml:space="preserve">S’han revisat també els detalls formals del text visible de la presentació:</w:t>
       </w:r>
       <w:r>
         <w:t xml:space="preserve"> </w:t>
@@ -200,7 +200,7 @@
         <w:t xml:space="preserve"> </w:t>
       </w:r>
       <w:r>
-        <w:t xml:space="preserve">hauria de ser</w:t>
+        <w:t xml:space="preserve">s’ha corregit per</w:t>
       </w:r>
       <w:r>
         <w:t xml:space="preserve"> </w:t>
@@ -227,7 +227,7 @@
         <w:t xml:space="preserve"> </w:t>
       </w:r>
       <w:r>
-        <w:t xml:space="preserve">hauria de ser</w:t>
+        <w:t xml:space="preserve">per</w:t>
       </w:r>
       <w:r>
         <w:t xml:space="preserve"> </w:t>
@@ -254,7 +254,7 @@
         <w:t xml:space="preserve"> </w:t>
       </w:r>
       <w:r>
-        <w:t xml:space="preserve">hauria de ser</w:t>
+        <w:t xml:space="preserve">per</w:t>
       </w:r>
       <w:r>
         <w:t xml:space="preserve"> </w:t>
@@ -281,7 +281,7 @@
         <w:t xml:space="preserve"> </w:t>
       </w:r>
       <w:r>
-        <w:t xml:space="preserve">hauria de ser</w:t>
+        <w:t xml:space="preserve">per</w:t>
       </w:r>
       <w:r>
         <w:t xml:space="preserve"> </w:t>
@@ -293,7 +293,7 @@
         <w:t xml:space="preserve">d'ús</w:t>
       </w:r>
       <w:r>
-        <w:t xml:space="preserve">; la numeració de diapositives 3 i 4 apareix duplicada; i les notes del presentador de les diapositives 1 i 2 contenen informació sobre PICA que correspon millor a les diapositives 5 o 6. La correcció</w:t>
+        <w:t xml:space="preserve">; i s’ha regularitzat la numeració visible de les diapositives. La correcció</w:t>
       </w:r>
       <w:r>
         <w:t xml:space="preserve"> </w:t>
@@ -323,7 +323,7 @@
         <w:t xml:space="preserve"> </w:t>
       </w:r>
       <w:r>
-        <w:t xml:space="preserve">ja s’ha aplicat a la diapositiva 2.</w:t>
+        <w:t xml:space="preserve">ja s’havia aplicat a la diapositiva 2.</w:t>
       </w:r>
     </w:p>
     <w:bookmarkEnd w:id="9"/>
@@ -526,7 +526,7 @@
         <w:pStyle w:val="BodyText"/>
       </w:pPr>
       <w:r>
-        <w:t xml:space="preserve">La idea és molt bona: necessitat funcional abans que API concreta. Corregir</w:t>
+        <w:t xml:space="preserve">La idea és molt bona: necessitat funcional abans que API concreta. Correcció aplicada:</w:t>
       </w:r>
       <w:r>
         <w:t xml:space="preserve"> </w:t>
@@ -538,19 +538,25 @@
         <w:t xml:space="preserve">Generarlitat</w:t>
       </w:r>
       <w:r>
-        <w:t xml:space="preserve">. La definició de PICA a peu de pàgina és llarga i petita; es podria reduir a:</w:t>
-      </w:r>
-      <w:r>
-        <w:t xml:space="preserve"> </w:t>
-      </w:r>
-      <w:r>
-        <w:rPr>
-          <w:rStyle w:val="VerbatimChar"/>
-        </w:rPr>
-        <w:t xml:space="preserve">PICA: plataforma corporativa d'interoperabilitat administrativa de la Generalitat</w:t>
-      </w:r>
-      <w:r>
-        <w:t xml:space="preserve">. La resta s’explica oralment.</w:t>
+        <w:t xml:space="preserve"> </w:t>
+      </w:r>
+      <w:r>
+        <w:t xml:space="preserve">s’ha substituït per</w:t>
+      </w:r>
+      <w:r>
+        <w:t xml:space="preserve"> </w:t>
+      </w:r>
+      <w:r>
+        <w:rPr>
+          <w:rStyle w:val="VerbatimChar"/>
+        </w:rPr>
+        <w:t xml:space="preserve">Generalitat</w:t>
+      </w:r>
+      <w:r>
+        <w:t xml:space="preserve"> </w:t>
+      </w:r>
+      <w:r>
+        <w:t xml:space="preserve">i la definició de PICA s’ha simplificat per evitar una nota massa llarga. La resta s’explica oralment.</w:t>
       </w:r>
     </w:p>
     <w:p>
@@ -842,7 +848,7 @@
         <w:t xml:space="preserve"> </w:t>
       </w:r>
       <w:r>
-        <w:t xml:space="preserve">apareguin com a implementacions que apunten cap al port. El missatge inferior és correcte i s’ha de mantenir.</w:t>
+        <w:t xml:space="preserve">apareguin com a implementacions que apunten cap al port. El missatge central és correcte i s’ha de mantenir: el cas d’ús necessita el preu actual, no un proveïdor concret.</w:t>
       </w:r>
     </w:p>
     <w:p>
@@ -941,7 +947,7 @@
         <w:pStyle w:val="BodyText"/>
       </w:pPr>
       <w:r>
-        <w:t xml:space="preserve">Correcta i institucional. El pla docent identifica el professor com a Josep Roure Alcobé; per coherència documental, faria servir</w:t>
+        <w:t xml:space="preserve">Correcta i institucional. El tancament s’ha reformulat per evitar un to de comiat o de petició explícita: agraeix l’entorn que encoratja el creixement docent i acadèmic, en present, i manté el vincle amb l’equip docent. El pla docent identifica el professor com a Josep Roure Alcobé; per coherència documental, es pot fer servir</w:t>
       </w:r>
       <w:r>
         <w:t xml:space="preserve"> </w:t>
@@ -953,7 +959,7 @@
         <w:t xml:space="preserve">Dr. Josep Roure Alcobé</w:t>
       </w:r>
       <w:r>
-        <w:t xml:space="preserve">. El text es pot llegir només parcialment; millor tancar mirant el tribunal.</w:t>
+        <w:t xml:space="preserve">. Millor tancar mirant el tribunal, no llegint la diapositiva.</w:t>
       </w:r>
     </w:p>
     <w:bookmarkEnd w:id="10"/>
@@ -1217,7 +1223,7 @@
         <w:pStyle w:val="FirstParagraph"/>
       </w:pPr>
       <w:r>
-        <w:t xml:space="preserve">Abans de parlar d’arquitectura de programari, cal entendre mínimament el procediment administratiu. [to més lent]</w:t>
+        <w:t xml:space="preserve">Abans de parlar d’arquitectura de software, cal entendre mínimament el procediment administratiu. [to més lent]</w:t>
       </w:r>
     </w:p>
     <w:p>
@@ -1299,7 +1305,7 @@
         <w:pStyle w:val="BodyText"/>
       </w:pPr>
       <w:r>
-        <w:t xml:space="preserve">Això no vol dir que la API concreta no sigui important. Ho és, i molt. Però pertany a un altre nivell de decisió. El cas d’ús ha de poder dir:</w:t>
+        <w:t xml:space="preserve">Això no vol dir que l’API concreta no sigui important. Ho és, i molt. Però pertany a un altre nivell de decisió. El cas d’ús ha de poder dir:</w:t>
       </w:r>
       <w:r>
         <w:t xml:space="preserve"> </w:t>
@@ -1361,7 +1367,7 @@
         <w:pStyle w:val="BodyText"/>
       </w:pPr>
       <w:r>
-        <w:t xml:space="preserve">Des del punt de vista de l’enginyeria del programari, això incrementa tres riscos. Primer, acoblament tecnològic: el cas d’ús coneix massa detalls externs. Segon, fragilitat del manteniment: canvis d’infraestructura obliguen a revisar lògica d’aplicació. I tercer, risc de continuïtat operativa: una evolució tècnica pot afectar un procediment que hauria de romandre estable. [assenyalar les tres caixes]</w:t>
+        <w:t xml:space="preserve">Des del punt de vista de l’enginyeria de software, això incrementa tres riscos. Primer, acoblament tecnològic: el cas d’ús coneix massa detalls externs. Segon, fragilitat del manteniment: canvis d’infraestructura obliguen a revisar lògica d’aplicació. I tercer, risc de continuïtat operativa: una evolució tècnica pot afectar un procediment que hauria de romandre estable. [assenyalar les tres caixes]</w:t>
       </w:r>
     </w:p>
     <w:p>
@@ -1836,7 +1842,15 @@
         <w:pStyle w:val="BodyText"/>
       </w:pPr>
       <w:r>
-        <w:t xml:space="preserve">Vull acabar expressant el meu agraïment al TecnoCampus per l’oportunitat d’aprendre, créixer com a docent i transferir coneixement entre la universitat i l’entorn professional. I també el meu agraïment especial al Dr. Josep Roure, amb qui comparteixo aquesta assignatura i de qui he après molt sobre arquitectura de programari i metodologies actives d’aprenentatge. [mirada al tribunal]</w:t>
+        <w:t xml:space="preserve">Vull expressar el meu agraïment al TecnoCampus per un entorn que m’encoratja a créixer, tant en la docència com en l’àmbit acadèmic, al costat d’un equip del qual aprenc i amb qui comparteixo coneixement, responsabilitat i compromís amb la formació universitària. [pausa breu; mirar el tribunal]</w:t>
+      </w:r>
+    </w:p>
+    <w:p>
+      <w:pPr>
+        <w:pStyle w:val="BodyText"/>
+      </w:pPr>
+      <w:r>
+        <w:t xml:space="preserve">També vull fer un agraïment especial al Dr. Josep Roure, company professor del TecnoCampus, amb qui he tingut l’oportunitat d’aprendre sobre arquitectura de software, metodologies actives d’aprenentatge i treball en equip. [mirada al tribunal]</w:t>
       </w:r>
     </w:p>
     <w:p>
@@ -2320,7 +2334,7 @@
         </w:numPr>
       </w:pPr>
       <w:r>
-        <w:t xml:space="preserve">El problema no és PICA; es l’acoblament directe.</w:t>
+        <w:t xml:space="preserve">El problema no és PICA; és l’acoblament directe.</w:t>
       </w:r>
     </w:p>
     <w:p>
@@ -2344,7 +2358,7 @@
         </w:numPr>
       </w:pPr>
       <w:r>
-        <w:t xml:space="preserve">Evolucio tecnològica travessa frontera.</w:t>
+        <w:t xml:space="preserve">Evolució tecnològica travessa frontera.</w:t>
       </w:r>
     </w:p>
     <w:p>

</xml_diff>

<commit_message>
docs: clean oral materials wording
</commit_message>
<xml_diff>
--- a/doc/presentations/defensa-placa-permanent-dsi-ports-sortida-hexagonal/output/materials-orals-canonics-20-minuts.docx
+++ b/doc/presentations/defensa-placa-permanent-dsi-ports-sortida-hexagonal/output/materials-orals-canonics-20-minuts.docx
@@ -185,145 +185,7 @@
         <w:pStyle w:val="BodyText"/>
       </w:pPr>
       <w:r>
-        <w:t xml:space="preserve">S’han revisat també els detalls formals del text visible de la presentació:</w:t>
-      </w:r>
-      <w:r>
-        <w:t xml:space="preserve"> </w:t>
-      </w:r>
-      <w:r>
-        <w:rPr>
-          <w:rStyle w:val="VerbatimChar"/>
-        </w:rPr>
-        <w:t xml:space="preserve">Generarlitat</w:t>
-      </w:r>
-      <w:r>
-        <w:t xml:space="preserve"> </w:t>
-      </w:r>
-      <w:r>
-        <w:t xml:space="preserve">s’ha corregit per</w:t>
-      </w:r>
-      <w:r>
-        <w:t xml:space="preserve"> </w:t>
-      </w:r>
-      <w:r>
-        <w:rPr>
-          <w:rStyle w:val="VerbatimChar"/>
-        </w:rPr>
-        <w:t xml:space="preserve">Generalitat</w:t>
-      </w:r>
-      <w:r>
-        <w:t xml:space="preserve">;</w:t>
-      </w:r>
-      <w:r>
-        <w:t xml:space="preserve"> </w:t>
-      </w:r>
-      <w:r>
-        <w:rPr>
-          <w:rStyle w:val="VerbatimChar"/>
-        </w:rPr>
-        <w:t xml:space="preserve">tecnología</w:t>
-      </w:r>
-      <w:r>
-        <w:t xml:space="preserve"> </w:t>
-      </w:r>
-      <w:r>
-        <w:t xml:space="preserve">per</w:t>
-      </w:r>
-      <w:r>
-        <w:t xml:space="preserve"> </w:t>
-      </w:r>
-      <w:r>
-        <w:rPr>
-          <w:rStyle w:val="VerbatimChar"/>
-        </w:rPr>
-        <w:t xml:space="preserve">tecnologia</w:t>
-      </w:r>
-      <w:r>
-        <w:t xml:space="preserve">;</w:t>
-      </w:r>
-      <w:r>
-        <w:t xml:space="preserve"> </w:t>
-      </w:r>
-      <w:r>
-        <w:rPr>
-          <w:rStyle w:val="VerbatimChar"/>
-        </w:rPr>
-        <w:t xml:space="preserve">necesita</w:t>
-      </w:r>
-      <w:r>
-        <w:t xml:space="preserve"> </w:t>
-      </w:r>
-      <w:r>
-        <w:t xml:space="preserve">per</w:t>
-      </w:r>
-      <w:r>
-        <w:t xml:space="preserve"> </w:t>
-      </w:r>
-      <w:r>
-        <w:rPr>
-          <w:rStyle w:val="VerbatimChar"/>
-        </w:rPr>
-        <w:t xml:space="preserve">necessita</w:t>
-      </w:r>
-      <w:r>
-        <w:t xml:space="preserve">;</w:t>
-      </w:r>
-      <w:r>
-        <w:t xml:space="preserve"> </w:t>
-      </w:r>
-      <w:r>
-        <w:rPr>
-          <w:rStyle w:val="VerbatimChar"/>
-        </w:rPr>
-        <w:t xml:space="preserve">d´ús</w:t>
-      </w:r>
-      <w:r>
-        <w:t xml:space="preserve"> </w:t>
-      </w:r>
-      <w:r>
-        <w:t xml:space="preserve">per</w:t>
-      </w:r>
-      <w:r>
-        <w:t xml:space="preserve"> </w:t>
-      </w:r>
-      <w:r>
-        <w:rPr>
-          <w:rStyle w:val="VerbatimChar"/>
-        </w:rPr>
-        <w:t xml:space="preserve">d'ús</w:t>
-      </w:r>
-      <w:r>
-        <w:t xml:space="preserve">; i s’ha regularitzat la numeració visible de les diapositives. La correcció</w:t>
-      </w:r>
-      <w:r>
-        <w:t xml:space="preserve"> </w:t>
-      </w:r>
-      <w:r>
-        <w:rPr>
-          <w:rStyle w:val="VerbatimChar"/>
-        </w:rPr>
-        <w:t xml:space="preserve">desacoplada</w:t>
-      </w:r>
-      <w:r>
-        <w:t xml:space="preserve"> </w:t>
-      </w:r>
-      <w:r>
-        <w:t xml:space="preserve">-&gt;</w:t>
-      </w:r>
-      <w:r>
-        <w:t xml:space="preserve"> </w:t>
-      </w:r>
-      <w:r>
-        <w:rPr>
-          <w:rStyle w:val="VerbatimChar"/>
-        </w:rPr>
-        <w:t xml:space="preserve">desacoblada</w:t>
-      </w:r>
-      <w:r>
-        <w:t xml:space="preserve"> </w:t>
-      </w:r>
-      <w:r>
-        <w:t xml:space="preserve">ja s’havia aplicat a la diapositiva 2.</w:t>
+        <w:t xml:space="preserve">S’han revisat també els detalls formals del text visible de la presentació: ortografia, accents, apòstrofs, cometes, noms propis i numeració visible de les diapositives. La terminologia de desacoblament ja queda formulada de manera correcta i coherent.</w:t>
       </w:r>
     </w:p>
     <w:bookmarkEnd w:id="9"/>
@@ -373,34 +235,7 @@
         <w:pStyle w:val="BodyText"/>
       </w:pPr>
       <w:r>
-        <w:t xml:space="preserve">La diapositiva funciona. Correcció aplicada:</w:t>
-      </w:r>
-      <w:r>
-        <w:t xml:space="preserve"> </w:t>
-      </w:r>
-      <w:r>
-        <w:rPr>
-          <w:rStyle w:val="VerbatimChar"/>
-        </w:rPr>
-        <w:t xml:space="preserve">desacoplada</w:t>
-      </w:r>
-      <w:r>
-        <w:t xml:space="preserve"> </w:t>
-      </w:r>
-      <w:r>
-        <w:t xml:space="preserve">s’ha substituït per</w:t>
-      </w:r>
-      <w:r>
-        <w:t xml:space="preserve"> </w:t>
-      </w:r>
-      <w:r>
-        <w:rPr>
-          <w:rStyle w:val="VerbatimChar"/>
-        </w:rPr>
-        <w:t xml:space="preserve">desacoblada</w:t>
-      </w:r>
-      <w:r>
-        <w:t xml:space="preserve">. També s’ha reforçat el vincle amb el pla docent amb una referència discreta:</w:t>
+        <w:t xml:space="preserve">La diapositiva funciona. S’ha reforçat el vincle amb el pla docent amb una referència discreta:</w:t>
       </w:r>
       <w:r>
         <w:t xml:space="preserve"> </w:t>
@@ -476,22 +311,7 @@
         <w:pStyle w:val="BodyText"/>
       </w:pPr>
       <w:r>
-        <w:t xml:space="preserve">La diapositiva situa bé el cas funcional abans de la tecnologia. Correcció aplicada: la frase</w:t>
-      </w:r>
-      <w:r>
-        <w:t xml:space="preserve"> </w:t>
-      </w:r>
-      <w:r>
-        <w:rPr>
-          <w:rStyle w:val="VerbatimChar"/>
-        </w:rPr>
-        <w:t xml:space="preserve">no es pot concedir la beca</w:t>
-      </w:r>
-      <w:r>
-        <w:t xml:space="preserve"> </w:t>
-      </w:r>
-      <w:r>
-        <w:t xml:space="preserve">s’ha substituït per una formulació més institucional i prudent:</w:t>
+        <w:t xml:space="preserve">La diapositiva situa bé el cas funcional abans de la tecnologia. S’hi ha incorporat una formulació més institucional i prudent:</w:t>
       </w:r>
       <w:r>
         <w:t xml:space="preserve"> </w:t>
@@ -526,37 +346,7 @@
         <w:pStyle w:val="BodyText"/>
       </w:pPr>
       <w:r>
-        <w:t xml:space="preserve">La idea és molt bona: necessitat funcional abans que API concreta. Correcció aplicada:</w:t>
-      </w:r>
-      <w:r>
-        <w:t xml:space="preserve"> </w:t>
-      </w:r>
-      <w:r>
-        <w:rPr>
-          <w:rStyle w:val="VerbatimChar"/>
-        </w:rPr>
-        <w:t xml:space="preserve">Generarlitat</w:t>
-      </w:r>
-      <w:r>
-        <w:t xml:space="preserve"> </w:t>
-      </w:r>
-      <w:r>
-        <w:t xml:space="preserve">s’ha substituït per</w:t>
-      </w:r>
-      <w:r>
-        <w:t xml:space="preserve"> </w:t>
-      </w:r>
-      <w:r>
-        <w:rPr>
-          <w:rStyle w:val="VerbatimChar"/>
-        </w:rPr>
-        <w:t xml:space="preserve">Generalitat</w:t>
-      </w:r>
-      <w:r>
-        <w:t xml:space="preserve"> </w:t>
-      </w:r>
-      <w:r>
-        <w:t xml:space="preserve">i la definició de PICA s’ha simplificat per evitar una nota massa llarga. La resta s’explica oralment.</w:t>
+        <w:t xml:space="preserve">La idea és molt bona: necessitat funcional abans que API concreta. La definició de PICA s’ha simplificat per evitar una nota massa llarga. La resta s’explica oralment.</w:t>
       </w:r>
     </w:p>
     <w:p>

</xml_diff>

<commit_message>
docs: merge learning objective slides
</commit_message>
<xml_diff>
--- a/doc/presentations/defensa-placa-permanent-dsi-ports-sortida-hexagonal/output/materials-orals-canonics-20-minuts.docx
+++ b/doc/presentations/defensa-placa-permanent-dsi-ports-sortida-hexagonal/output/materials-orals-canonics-20-minuts.docx
@@ -2,7 +2,7 @@
 <file path=word/document.xml><?xml version="1.0" encoding="utf-8"?>
 <w:document xmlns:w="http://schemas.openxmlformats.org/wordprocessingml/2006/main" xmlns:m="http://schemas.openxmlformats.org/officeDocument/2006/math" xmlns:r="http://schemas.openxmlformats.org/officeDocument/2006/relationships" xmlns:o="urn:schemas-microsoft-com:office:office" xmlns:v="urn:schemas-microsoft-com:vml" xmlns:w10="urn:schemas-microsoft-com:office:word" xmlns:a="http://schemas.openxmlformats.org/drawingml/2006/main" xmlns:pic="http://schemas.openxmlformats.org/drawingml/2006/picture" xmlns:wp="http://schemas.openxmlformats.org/drawingml/2006/wordprocessingDrawing">
   <w:body>
-    <w:bookmarkStart w:id="42" w:name="X79cee1dd7752e91aad864bc270c2d5ac95f00d7"/>
+    <w:bookmarkStart w:id="40" w:name="X79cee1dd7752e91aad864bc270c2d5ac95f00d7"/>
     <w:p>
       <w:pPr>
         <w:pStyle w:val="Heading1"/>
@@ -259,39 +259,15 @@
           <w:b/>
           <w:bCs/>
         </w:rPr>
-        <w:t xml:space="preserve">Diapositives 3 i 4. Principi de disseny i objectiu d’aprenentatge</w:t>
-      </w:r>
-    </w:p>
-    <w:p>
-      <w:pPr>
-        <w:pStyle w:val="BodyText"/>
-      </w:pPr>
-      <w:r>
-        <w:t xml:space="preserve">Correcció aplicada. La diapositiva 3 es presenta ara com a</w:t>
-      </w:r>
-      <w:r>
-        <w:t xml:space="preserve"> </w:t>
-      </w:r>
-      <w:r>
-        <w:rPr>
-          <w:rStyle w:val="VerbatimChar"/>
-        </w:rPr>
-        <w:t xml:space="preserve">Principi de disseny</w:t>
-      </w:r>
-      <w:r>
-        <w:t xml:space="preserve">: el servei d’aplicació necessita una capacitat, no una tecnologia. La diapositiva 4 es presenta com a</w:t>
-      </w:r>
-      <w:r>
-        <w:t xml:space="preserve"> </w:t>
-      </w:r>
-      <w:r>
-        <w:rPr>
-          <w:rStyle w:val="VerbatimChar"/>
-        </w:rPr>
-        <w:t xml:space="preserve">Objectiu d'aprenentatge</w:t>
-      </w:r>
-      <w:r>
-        <w:t xml:space="preserve">: aplicar aquest principi en tres operacions observables. També s’ha corregit la numeració del peu de la diapositiva 4.</w:t>
+        <w:t xml:space="preserve">Diapositiva 3. Objectiu de la sessió</w:t>
+      </w:r>
+    </w:p>
+    <w:p>
+      <w:pPr>
+        <w:pStyle w:val="BodyText"/>
+      </w:pPr>
+      <w:r>
+        <w:t xml:space="preserve">Correcció aplicada. Les antigues diapositives 3 i 4 s’han fusionat en una sola diapositiva pont, més lleugera i sense diagrama. La diapositiva presenta només el principi de treball —el cas d’ús necessita una capacitat, no una tecnologia— i les tres accions observables: identificar una necessitat, definir un port de sortida i implementar adaptadors. La funció d’aquesta diapositiva és situar l’objectiu sense frenar l’entrada al cas real.</w:t>
       </w:r>
     </w:p>
     <w:p>
@@ -303,7 +279,7 @@
           <w:b/>
           <w:bCs/>
         </w:rPr>
-        <w:t xml:space="preserve">Diapositiva 5. Avaluació econòmica d’una beca</w:t>
+        <w:t xml:space="preserve">Diapositiva 4. Avaluació econòmica d’una beca</w:t>
       </w:r>
     </w:p>
     <w:p>
@@ -338,7 +314,7 @@
           <w:b/>
           <w:bCs/>
         </w:rPr>
-        <w:t xml:space="preserve">Diapositiva 6. Informació externa</w:t>
+        <w:t xml:space="preserve">Diapositiva 5. Informació externa</w:t>
       </w:r>
     </w:p>
     <w:p>
@@ -358,7 +334,7 @@
           <w:b/>
           <w:bCs/>
         </w:rPr>
-        <w:t xml:space="preserve">Diapositiva 7. Dependència directa</w:t>
+        <w:t xml:space="preserve">Diapositiva 6. Dependència directa</w:t>
       </w:r>
     </w:p>
     <w:p>
@@ -414,7 +390,7 @@
           <w:b/>
           <w:bCs/>
         </w:rPr>
-        <w:t xml:space="preserve">Diapositiva 8. Port de sortida i adaptador</w:t>
+        <w:t xml:space="preserve">Diapositiva 7. Port de sortida i adaptador</w:t>
       </w:r>
     </w:p>
     <w:p>
@@ -514,7 +490,7 @@
           <w:b/>
           <w:bCs/>
         </w:rPr>
-        <w:t xml:space="preserve">Diapositiva 9. Port de sortida per a informació patrimonial</w:t>
+        <w:t xml:space="preserve">Diapositiva 8. Port de sortida per a informació patrimonial</w:t>
       </w:r>
     </w:p>
     <w:p>
@@ -576,7 +552,7 @@
           <w:b/>
           <w:bCs/>
         </w:rPr>
-        <w:t xml:space="preserve">Diapositiva 10. Transferència a domini financer</w:t>
+        <w:t xml:space="preserve">Diapositiva 9. Transferència a domini financer</w:t>
       </w:r>
     </w:p>
     <w:p>
@@ -650,7 +626,7 @@
           <w:b/>
           <w:bCs/>
         </w:rPr>
-        <w:t xml:space="preserve">Diapositiva 11. Flux i codi essencial</w:t>
+        <w:t xml:space="preserve">Diapositiva 10. Flux i codi essencial</w:t>
       </w:r>
     </w:p>
     <w:p>
@@ -670,7 +646,7 @@
         <w:t xml:space="preserve">Aquest diagrama de seqüència representa ordre d'execució, no direcció de dependències de codi</w:t>
       </w:r>
       <w:r>
-        <w:t xml:space="preserve">. Això evita contradiccions amb les diapositives 8-10.</w:t>
+        <w:t xml:space="preserve">. Això evita contradiccions amb les diapositives 7-9.</w:t>
       </w:r>
     </w:p>
     <w:p>
@@ -682,7 +658,7 @@
           <w:b/>
           <w:bCs/>
         </w:rPr>
-        <w:t xml:space="preserve">Diapositiva 12. Demo</w:t>
+        <w:t xml:space="preserve">Diapositiva 11. Demo</w:t>
       </w:r>
     </w:p>
     <w:p>
@@ -729,7 +705,7 @@
           <w:b/>
           <w:bCs/>
         </w:rPr>
-        <w:t xml:space="preserve">Diapositiva 13. Agraïment</w:t>
+        <w:t xml:space="preserve">Diapositiva 12. Agraïment</w:t>
       </w:r>
     </w:p>
     <w:p>
@@ -753,7 +729,7 @@
       </w:r>
     </w:p>
     <w:bookmarkEnd w:id="10"/>
-    <w:bookmarkStart w:id="24" w:name="guió-oral-complet-imprimible"/>
+    <w:bookmarkStart w:id="23" w:name="guió-oral-complet-imprimible"/>
     <w:p>
       <w:pPr>
         <w:pStyle w:val="Heading2"/>
@@ -840,13 +816,13 @@
       </w:r>
     </w:p>
     <w:bookmarkEnd w:id="11"/>
-    <w:bookmarkStart w:id="12" w:name="X794484db9c2056c88eef6400cfc1ece43aa7669"/>
+    <w:bookmarkStart w:id="12" w:name="Xbd8d813bdf1f660b3e63d6e4e001ea5920e5fb0"/>
     <w:p>
       <w:pPr>
         <w:pStyle w:val="Heading3"/>
       </w:pPr>
       <w:r>
-        <w:t xml:space="preserve">Diapositiva 2. On som dins l’assignatura - 1:15</w:t>
+        <w:t xml:space="preserve">Diapositiva 2. On som dins l’assignatura - 1:10</w:t>
       </w:r>
     </w:p>
     <w:p>
@@ -882,13 +858,13 @@
       </w:r>
     </w:p>
     <w:bookmarkEnd w:id="12"/>
-    <w:bookmarkStart w:id="13" w:name="diapositiva-3.-principi-de-disseny---110"/>
+    <w:bookmarkStart w:id="13" w:name="X3696606fd6d9b6d83d02a9073392ba28f4d25a2"/>
     <w:p>
       <w:pPr>
         <w:pStyle w:val="Heading3"/>
       </w:pPr>
       <w:r>
-        <w:t xml:space="preserve">Diapositiva 3. Principi de disseny - 1:10</w:t>
+        <w:t xml:space="preserve">Diapositiva 3. Objectiu de la sessió - 0:55</w:t>
       </w:r>
     </w:p>
     <w:p>
@@ -896,74 +872,41 @@
         <w:pStyle w:val="FirstParagraph"/>
       </w:pPr>
       <w:r>
-        <w:t xml:space="preserve">La idea central de la sessió és aquesta: el servei d’aplicació necessita una capacitat, no una tecnologia. [pausa breu; mirar el tribunal]</w:t>
-      </w:r>
-    </w:p>
-    <w:p>
-      <w:pPr>
-        <w:pStyle w:val="BodyText"/>
-      </w:pPr>
-      <w:r>
-        <w:t xml:space="preserve">Aquesta frase és important perquè ens obliga a canviar la pregunta. La pregunta no hauria de ser, d’entrada,</w:t>
-      </w:r>
-      <w:r>
-        <w:t xml:space="preserve"> </w:t>
-      </w:r>
-      <w:r>
-        <w:rPr>
-          <w:rStyle w:val="VerbatimChar"/>
-        </w:rPr>
-        <w:t xml:space="preserve">quina API crido?</w:t>
-      </w:r>
-      <w:r>
-        <w:t xml:space="preserve">, o</w:t>
-      </w:r>
-      <w:r>
-        <w:t xml:space="preserve"> </w:t>
-      </w:r>
-      <w:r>
-        <w:rPr>
-          <w:rStyle w:val="VerbatimChar"/>
-        </w:rPr>
-        <w:t xml:space="preserve">quin client SOAP o REST faig servir?</w:t>
-      </w:r>
-      <w:r>
-        <w:t xml:space="preserve">. La pregunta inicial hauria de ser:</w:t>
-      </w:r>
-      <w:r>
-        <w:t xml:space="preserve"> </w:t>
-      </w:r>
-      <w:r>
-        <w:rPr>
-          <w:rStyle w:val="VerbatimChar"/>
-        </w:rPr>
-        <w:t xml:space="preserve">quina capacitat necessita el cas d'ús per poder completar la seva responsabilitat?</w:t>
-      </w:r>
-    </w:p>
-    <w:p>
-      <w:pPr>
-        <w:pStyle w:val="BodyText"/>
-      </w:pPr>
-      <w:r>
-        <w:t xml:space="preserve">En arquitectura hexagonal, aquest canvi de pregunta és fonamental. El nucli de l’aplicació ha de parlar en el llenguatge del problema, no en el llenguatge accidental de la infraestructura. [assenyalar el centre del diagrama]</w:t>
-      </w:r>
-    </w:p>
-    <w:p>
-      <w:pPr>
-        <w:pStyle w:val="BodyText"/>
-      </w:pPr>
-      <w:r>
-        <w:t xml:space="preserve">El llibre de Tom Hombergs sobre Clean Architecture ho formula en la mateixa direcció conceptual: les dependències han d’apuntar cap al nucli, i el domini no ha de quedar condicionat per frameworks, bases de dades, interfícies d’usuari o sistemes externs. No es tracta d’ignorar que aquests sistemes existeixen. Es tracta de posar-los al lloc arquitectònic que els correspon.</w:t>
+        <w:t xml:space="preserve">Abans d’entrar en el cas, deixo formulat l’objectiu de la sessió. [pausa breu]</w:t>
+      </w:r>
+    </w:p>
+    <w:p>
+      <w:pPr>
+        <w:pStyle w:val="BodyText"/>
+      </w:pPr>
+      <w:r>
+        <w:t xml:space="preserve">El principi de treball és aquest: el cas d’ús necessita una capacitat, no una tecnologia. [mirar el tribunal]</w:t>
+      </w:r>
+    </w:p>
+    <w:p>
+      <w:pPr>
+        <w:pStyle w:val="BodyText"/>
+      </w:pPr>
+      <w:r>
+        <w:t xml:space="preserve">Per tant, el que aprendrem és a fer tres operacions: identificar una necessitat externa del cas d’ús, expressar-la com a port de sortida i implementar-la mitjançant adaptadors substituïbles. [assenyalar les tres caixes]</w:t>
+      </w:r>
+    </w:p>
+    <w:p>
+      <w:pPr>
+        <w:pStyle w:val="BodyText"/>
+      </w:pPr>
+      <w:r>
+        <w:t xml:space="preserve">No desenvoluparé encara tota l’abstracció. Primer veurem el problema en un cas real d’administració pública, i a partir d’aquí formularem la decisió arquitectònica. [pausa breu]</w:t>
       </w:r>
     </w:p>
     <w:bookmarkEnd w:id="13"/>
-    <w:bookmarkStart w:id="14" w:name="X044b902d0f2dfff7121a66a33ea1162812135fe"/>
+    <w:bookmarkStart w:id="14" w:name="Xe44e148b7ebe898f3299718f45351b6467fee24"/>
     <w:p>
       <w:pPr>
         <w:pStyle w:val="Heading3"/>
       </w:pPr>
       <w:r>
-        <w:t xml:space="preserve">Diapositiva 4. Objectiu d’aprenentatge - 0:50</w:t>
+        <w:t xml:space="preserve">Diapositiva 4. Avaluació econòmica d’una beca - 1:50</w:t>
       </w:r>
     </w:p>
     <w:p>
@@ -971,41 +914,49 @@
         <w:pStyle w:val="FirstParagraph"/>
       </w:pPr>
       <w:r>
-        <w:t xml:space="preserve">Per convertir aquesta idea en aprenentatge observable, podem formular tres accions. [assenyalar les tres caixes]</w:t>
-      </w:r>
-    </w:p>
-    <w:p>
-      <w:pPr>
-        <w:pStyle w:val="BodyText"/>
-      </w:pPr>
-      <w:r>
-        <w:t xml:space="preserve">Primer, identificar la necessitat o capacitat. Segon, definir un port que expressi aquesta necessitat en el llenguatge de l’aplicació. I tercer, implementar adaptadors que resolguin aquesta necessitat amb tecnologies concretes.</w:t>
-      </w:r>
-    </w:p>
-    <w:p>
-      <w:pPr>
-        <w:pStyle w:val="BodyText"/>
-      </w:pPr>
-      <w:r>
-        <w:t xml:space="preserve">Dit d’una altra manera: l’estudiant no només hauria de memoritzar que existeixen ports i adaptadors. Hauria de poder mirar un cas d’ús, detectar on apareix l’acoblament tecnològic, i proposar una frontera arquitectònica que permeti substituir la infraestructura sense modificar el cas d’ús ni el domini. [pausa breu]</w:t>
-      </w:r>
-    </w:p>
-    <w:p>
-      <w:pPr>
-        <w:pStyle w:val="BodyText"/>
-      </w:pPr>
-      <w:r>
-        <w:t xml:space="preserve">Ara ho veurem amb un cas funcional.</w:t>
+        <w:t xml:space="preserve">Abans de parlar d’arquitectura de software, cal entendre mínimament el procediment administratiu. [to més lent]</w:t>
+      </w:r>
+    </w:p>
+    <w:p>
+      <w:pPr>
+        <w:pStyle w:val="BodyText"/>
+      </w:pPr>
+      <w:r>
+        <w:t xml:space="preserve">En un procediment de beca, una sol·licitud dona lloc a un expedient. Aquest expedient passa per diferents fases: requisits generals, requisits econòmics, revisió acadèmica i resolució. [assenyalar la seqüència de la dreta]</w:t>
+      </w:r>
+    </w:p>
+    <w:p>
+      <w:pPr>
+        <w:pStyle w:val="BodyText"/>
+      </w:pPr>
+      <w:r>
+        <w:t xml:space="preserve">La part que ens interessa és l’avaluació econòmica. En aquest punt es comproven aspectes com la renda familiar i el patrimoni. Quan no s’acredita el compliment dels requisits econòmics, l’expedient no obté una valoració favorable en aquesta fase. [pausa breu]</w:t>
+      </w:r>
+    </w:p>
+    <w:p>
+      <w:pPr>
+        <w:pStyle w:val="BodyText"/>
+      </w:pPr>
+      <w:r>
+        <w:t xml:space="preserve">La idea docent important és que aquí encara no hem parlat de SOAP, ni de REST, ni de PICA, ni de cap base de dades. Estem parlant de la necessitat funcional del procediment: per poder aplicar uns criteris econòmics, el sistema necessita dades fiables sobre renda i patrimoni.</w:t>
+      </w:r>
+    </w:p>
+    <w:p>
+      <w:pPr>
+        <w:pStyle w:val="BodyText"/>
+      </w:pPr>
+      <w:r>
+        <w:t xml:space="preserve">Aquest pas és essencial. Si comencem directament per la tecnologia, correm el risc de construir el cas d’ús al voltant de la integració. En canvi, si comencem pel procediment, podem distingir entre la decisió administrativa que volem modelar i el mecanisme tècnic que ens proporciona la informació.</w:t>
       </w:r>
     </w:p>
     <w:bookmarkEnd w:id="14"/>
-    <w:bookmarkStart w:id="15" w:name="Xb1c176126e25cc487f84f2d677658c9e0434ef5"/>
+    <w:bookmarkStart w:id="15" w:name="X49d8499aef8096cf0d8707c0a2b10b4e00df2f8"/>
     <w:p>
       <w:pPr>
         <w:pStyle w:val="Heading3"/>
       </w:pPr>
       <w:r>
-        <w:t xml:space="preserve">Diapositiva 5. Avaluació econòmica d’una beca - 1:45</w:t>
+        <w:t xml:space="preserve">Diapositiva 5. Quina informació externa necessita el procediment? - 2:00</w:t>
       </w:r>
     </w:p>
     <w:p>
@@ -1013,49 +964,69 @@
         <w:pStyle w:val="FirstParagraph"/>
       </w:pPr>
       <w:r>
-        <w:t xml:space="preserve">Abans de parlar d’arquitectura de software, cal entendre mínimament el procediment administratiu. [to més lent]</w:t>
-      </w:r>
-    </w:p>
-    <w:p>
-      <w:pPr>
-        <w:pStyle w:val="BodyText"/>
-      </w:pPr>
-      <w:r>
-        <w:t xml:space="preserve">En un procediment de beca, una sol·licitud dona lloc a un expedient. Aquest expedient passa per diferents fases: requisits generals, requisits econòmics, revisió acadèmica i resolució. [assenyalar la seqüència de la dreta]</w:t>
-      </w:r>
-    </w:p>
-    <w:p>
-      <w:pPr>
-        <w:pStyle w:val="BodyText"/>
-      </w:pPr>
-      <w:r>
-        <w:t xml:space="preserve">La part que ens interessa és l’avaluació econòmica. En aquest punt es comproven aspectes com la renda familiar i el patrimoni. Quan no s’acredita el compliment dels requisits econòmics, l’expedient no obté una valoració favorable en aquesta fase. [pausa breu]</w:t>
-      </w:r>
-    </w:p>
-    <w:p>
-      <w:pPr>
-        <w:pStyle w:val="BodyText"/>
-      </w:pPr>
-      <w:r>
-        <w:t xml:space="preserve">La idea docent important és que aquí encara no hem parlat de SOAP, ni de REST, ni de PICA, ni de cap base de dades. Estem parlant de la necessitat funcional del procediment: per poder aplicar uns criteris econòmics, el sistema necessita dades fiables sobre renda i patrimoni.</w:t>
-      </w:r>
-    </w:p>
-    <w:p>
-      <w:pPr>
-        <w:pStyle w:val="BodyText"/>
-      </w:pPr>
-      <w:r>
-        <w:t xml:space="preserve">Aquest pas és essencial. Si comencem directament per la tecnologia, correm el risc de construir el cas d’ús al voltant de la integració. En canvi, si comencem pel procediment, podem distingir entre la decisió administrativa que volem modelar i el mecanisme tècnic que ens proporciona la informació.</w:t>
+        <w:t xml:space="preserve">Per avaluar renda i patrimoni, el procediment pot necessitar informació que no neix dins l’aplicació. [assenyalar la columna de necessitats]</w:t>
+      </w:r>
+    </w:p>
+    <w:p>
+      <w:pPr>
+        <w:pStyle w:val="BodyText"/>
+      </w:pPr>
+      <w:r>
+        <w:t xml:space="preserve">En termes funcionals, podem parlar de renda familiar, patrimoni i béns immobles. En termes de fonts administratives, apareixen organismes i plataformes com l’AEAT, el Cadastre i PICA. [assenyalar la columna de fonts]</w:t>
+      </w:r>
+    </w:p>
+    <w:p>
+      <w:pPr>
+        <w:pStyle w:val="BodyText"/>
+      </w:pPr>
+      <w:r>
+        <w:t xml:space="preserve">PICA és la Plataforma d’Integració i Col·laboració Administrativa de la Generalitat de Catalunya. Per a aquesta microlliçó, no cal entrar en tots els detalls tècnics de PICA. El que ens interessa és que actua com a mecanisme corporatiu d’interoperabilitat administrativa.</w:t>
+      </w:r>
+    </w:p>
+    <w:p>
+      <w:pPr>
+        <w:pStyle w:val="BodyText"/>
+      </w:pPr>
+      <w:r>
+        <w:t xml:space="preserve">La distinció clau és aquesta: el procediment necessita informació administrativa; no necessita, en el seu llenguatge propi, una API concreta. [pausa llarga; mirar el tribunal]</w:t>
+      </w:r>
+    </w:p>
+    <w:p>
+      <w:pPr>
+        <w:pStyle w:val="BodyText"/>
+      </w:pPr>
+      <w:r>
+        <w:t xml:space="preserve">Això no vol dir que l’API concreta no sigui important. Ho és, i molt. Però pertany a un altre nivell de decisió. El cas d’ús ha de poder dir:</w:t>
+      </w:r>
+      <w:r>
+        <w:t xml:space="preserve"> </w:t>
+      </w:r>
+      <w:r>
+        <w:rPr>
+          <w:rStyle w:val="VerbatimChar"/>
+        </w:rPr>
+        <w:t xml:space="preserve">necessito informació patrimonial avaluable</w:t>
+      </w:r>
+      <w:r>
+        <w:t xml:space="preserve">. L’adaptador ja resoldrà si aquesta informació arriba per SOAP, REST, PICA, un certificat, una base de dades corporativa o un mecanisme futur.</w:t>
+      </w:r>
+    </w:p>
+    <w:p>
+      <w:pPr>
+        <w:pStyle w:val="BodyText"/>
+      </w:pPr>
+      <w:r>
+        <w:t xml:space="preserve">Quan aquesta separació no es respecta, apareix el problema arquitectònic que veurem ara.</w:t>
       </w:r>
     </w:p>
     <w:bookmarkEnd w:id="15"/>
-    <w:bookmarkStart w:id="16" w:name="X33394f776bbe76b73a7cb438bc3a259e6d1ad92"/>
+    <w:bookmarkStart w:id="16" w:name="X84147f10029592ec3bd146ffb3a5109a19eca0d"/>
     <w:p>
       <w:pPr>
         <w:pStyle w:val="Heading3"/>
       </w:pPr>
       <w:r>
-        <w:t xml:space="preserve">Diapositiva 6. Quina informació externa necessita el procediment? - 1:55</w:t>
+        <w:t xml:space="preserve">Diapositiva 6. Dependència directa entre procediment i integració - 2:10</w:t>
       </w:r>
     </w:p>
     <w:p>
@@ -1063,69 +1034,57 @@
         <w:pStyle w:val="FirstParagraph"/>
       </w:pPr>
       <w:r>
-        <w:t xml:space="preserve">Per avaluar renda i patrimoni, el procediment pot necessitar informació que no neix dins l’aplicació. [assenyalar la columna de necessitats]</w:t>
-      </w:r>
-    </w:p>
-    <w:p>
-      <w:pPr>
-        <w:pStyle w:val="BodyText"/>
-      </w:pPr>
-      <w:r>
-        <w:t xml:space="preserve">En termes funcionals, podem parlar de renda familiar, patrimoni i béns immobles. En termes de fonts administratives, apareixen organismes i plataformes com l’AEAT, el Cadastre i PICA. [assenyalar la columna de fonts]</w:t>
-      </w:r>
-    </w:p>
-    <w:p>
-      <w:pPr>
-        <w:pStyle w:val="BodyText"/>
-      </w:pPr>
-      <w:r>
-        <w:t xml:space="preserve">PICA és la Plataforma d’Integració i Col·laboració Administrativa de la Generalitat de Catalunya. Per a aquesta microlliçó, no cal entrar en tots els detalls tècnics de PICA. El que ens interessa és que actua com a mecanisme corporatiu d’interoperabilitat administrativa.</w:t>
-      </w:r>
-    </w:p>
-    <w:p>
-      <w:pPr>
-        <w:pStyle w:val="BodyText"/>
-      </w:pPr>
-      <w:r>
-        <w:t xml:space="preserve">La distinció clau és aquesta: el procediment necessita informació administrativa; no necessita, en el seu llenguatge propi, una API concreta. [pausa llarga; mirar el tribunal]</w:t>
-      </w:r>
-    </w:p>
-    <w:p>
-      <w:pPr>
-        <w:pStyle w:val="BodyText"/>
-      </w:pPr>
-      <w:r>
-        <w:t xml:space="preserve">Això no vol dir que l’API concreta no sigui important. Ho és, i molt. Però pertany a un altre nivell de decisió. El cas d’ús ha de poder dir:</w:t>
-      </w:r>
-      <w:r>
-        <w:t xml:space="preserve"> </w:t>
-      </w:r>
-      <w:r>
-        <w:rPr>
-          <w:rStyle w:val="VerbatimChar"/>
-        </w:rPr>
-        <w:t xml:space="preserve">necessito informació patrimonial avaluable</w:t>
-      </w:r>
-      <w:r>
-        <w:t xml:space="preserve">. L’adaptador ja resoldrà si aquesta informació arriba per SOAP, REST, PICA, un certificat, una base de dades corporativa o un mecanisme futur.</w:t>
-      </w:r>
-    </w:p>
-    <w:p>
-      <w:pPr>
-        <w:pStyle w:val="BodyText"/>
-      </w:pPr>
-      <w:r>
-        <w:t xml:space="preserve">Quan aquesta separació no es respecta, apareix el problema arquitectònic que veurem ara.</w:t>
+        <w:t xml:space="preserve">Imaginem una situació en què el cas d’ús queda vinculat directament a la cadena tècnica: SOAP/XML, PICA, AEAT o Cadastre. [assenyalar la cadena central]</w:t>
+      </w:r>
+    </w:p>
+    <w:p>
+      <w:pPr>
+        <w:pStyle w:val="BodyText"/>
+      </w:pPr>
+      <w:r>
+        <w:t xml:space="preserve">El problema no és consumir PICA. Ho remarco perquè és important. PICA, en aquest context, és una plataforma corporativa d’interoperabilitat. El problema arquitectònic apareix quan la lògica del procediment administratiu depèn directament dels detalls de la integració: DTOs externs, estructures XML, clients SOAP, codis d’error tècnics o convencions d’una API concreta. [pausa breu]</w:t>
+      </w:r>
+    </w:p>
+    <w:p>
+      <w:pPr>
+        <w:pStyle w:val="BodyText"/>
+      </w:pPr>
+      <w:r>
+        <w:t xml:space="preserve">Quan això passa, l’evolució tecnològica travessa la frontera del cas d’ús. Si un servei evoluciona, si canvia el contracte tècnic, si cal passar de SOAP a REST, o si apareix un altre mecanisme corporatiu, el canvi pot impactar codi que hauria d’estar expressant criteris del procediment.</w:t>
+      </w:r>
+    </w:p>
+    <w:p>
+      <w:pPr>
+        <w:pStyle w:val="BodyText"/>
+      </w:pPr>
+      <w:r>
+        <w:t xml:space="preserve">Des del punt de vista de l’enginyeria de software, això incrementa tres riscos. Primer, acoblament tecnològic: el cas d’ús coneix massa detalls externs. Segon, fragilitat del manteniment: canvis d’infraestructura obliguen a revisar lògica d’aplicació. I tercer, risc de continuïtat operativa: una evolució tècnica pot afectar un procediment que hauria de romandre estable. [assenyalar les tres caixes]</w:t>
+      </w:r>
+    </w:p>
+    <w:p>
+      <w:pPr>
+        <w:pStyle w:val="BodyText"/>
+      </w:pPr>
+      <w:r>
+        <w:t xml:space="preserve">La pregunta docent, per tant, és: com podem permetre que el cas d’ús necessiti dades externes, però sense dependre directament de la tecnologia que les proporciona?</w:t>
+      </w:r>
+    </w:p>
+    <w:p>
+      <w:pPr>
+        <w:pStyle w:val="BodyText"/>
+      </w:pPr>
+      <w:r>
+        <w:t xml:space="preserve">La resposta és introduir un port de sortida.</w:t>
       </w:r>
     </w:p>
     <w:bookmarkEnd w:id="16"/>
-    <w:bookmarkStart w:id="17" w:name="X96cb14feb9aa6cee6140ca06f960605cefc01dc"/>
+    <w:bookmarkStart w:id="17" w:name="X43a98a6def8e1803c902d37f4cf49908c0aca50"/>
     <w:p>
       <w:pPr>
         <w:pStyle w:val="Heading3"/>
       </w:pPr>
       <w:r>
-        <w:t xml:space="preserve">Diapositiva 7. Dependència directa entre procediment i integració - 2:00</w:t>
+        <w:t xml:space="preserve">Diapositiva 7. Port de sortida i adaptador - 1:30</w:t>
       </w:r>
     </w:p>
     <w:p>
@@ -1133,57 +1092,85 @@
         <w:pStyle w:val="FirstParagraph"/>
       </w:pPr>
       <w:r>
-        <w:t xml:space="preserve">Imaginem una situació en què el cas d’ús queda vinculat directament a la cadena tècnica: SOAP/XML, PICA, AEAT o Cadastre. [assenyalar la cadena central]</w:t>
-      </w:r>
-    </w:p>
-    <w:p>
-      <w:pPr>
-        <w:pStyle w:val="BodyText"/>
-      </w:pPr>
-      <w:r>
-        <w:t xml:space="preserve">El problema no és consumir PICA. Ho remarco perquè és important. PICA, en aquest context, és una plataforma corporativa d’interoperabilitat. El problema arquitectònic apareix quan la lògica del procediment administratiu depèn directament dels detalls de la integració: DTOs externs, estructures XML, clients SOAP, codis d’error tècnics o convencions d’una API concreta. [pausa breu]</w:t>
-      </w:r>
-    </w:p>
-    <w:p>
-      <w:pPr>
-        <w:pStyle w:val="BodyText"/>
-      </w:pPr>
-      <w:r>
-        <w:t xml:space="preserve">Quan això passa, l’evolució tecnològica travessa la frontera del cas d’ús. Si un servei evoluciona, si canvia el contracte tècnic, si cal passar de SOAP a REST, o si apareix un altre mecanisme corporatiu, el canvi pot impactar codi que hauria d’estar expressant criteris del procediment.</w:t>
-      </w:r>
-    </w:p>
-    <w:p>
-      <w:pPr>
-        <w:pStyle w:val="BodyText"/>
-      </w:pPr>
-      <w:r>
-        <w:t xml:space="preserve">Des del punt de vista de l’enginyeria de software, això incrementa tres riscos. Primer, acoblament tecnològic: el cas d’ús coneix massa detalls externs. Segon, fragilitat del manteniment: canvis d’infraestructura obliguen a revisar lògica d’aplicació. I tercer, risc de continuïtat operativa: una evolució tècnica pot afectar un procediment que hauria de romandre estable. [assenyalar les tres caixes]</w:t>
-      </w:r>
-    </w:p>
-    <w:p>
-      <w:pPr>
-        <w:pStyle w:val="BodyText"/>
-      </w:pPr>
-      <w:r>
-        <w:t xml:space="preserve">La pregunta docent, per tant, és: com podem permetre que el cas d’ús necessiti dades externes, però sense dependre directament de la tecnologia que les proporciona?</w:t>
-      </w:r>
-    </w:p>
-    <w:p>
-      <w:pPr>
-        <w:pStyle w:val="BodyText"/>
-      </w:pPr>
-      <w:r>
-        <w:t xml:space="preserve">La resposta és introduir un port de sortida.</w:t>
+        <w:t xml:space="preserve">Un port de sortida és un contracte definit des de l’aplicació. [pausa breu]</w:t>
+      </w:r>
+    </w:p>
+    <w:p>
+      <w:pPr>
+        <w:pStyle w:val="BodyText"/>
+      </w:pPr>
+      <w:r>
+        <w:t xml:space="preserve">El cas d’ús o el servei d’aplicació diu:</w:t>
+      </w:r>
+      <w:r>
+        <w:t xml:space="preserve"> </w:t>
+      </w:r>
+      <w:r>
+        <w:rPr>
+          <w:rStyle w:val="VerbatimChar"/>
+        </w:rPr>
+        <w:t xml:space="preserve">necessito aquesta capacitat</w:t>
+      </w:r>
+      <w:r>
+        <w:t xml:space="preserve">. Per exemple: obtenir informació patrimonial, recuperar un expedient, desar una transacció o consultar el preu actual d’una acció. El port expressa aquest</w:t>
+      </w:r>
+      <w:r>
+        <w:t xml:space="preserve"> </w:t>
+      </w:r>
+      <w:r>
+        <w:rPr>
+          <w:rStyle w:val="VerbatimChar"/>
+        </w:rPr>
+        <w:t xml:space="preserve">què</w:t>
+      </w:r>
+      <w:r>
+        <w:t xml:space="preserve">. [assenyalar el port]</w:t>
+      </w:r>
+    </w:p>
+    <w:p>
+      <w:pPr>
+        <w:pStyle w:val="BodyText"/>
+      </w:pPr>
+      <w:r>
+        <w:t xml:space="preserve">L’adaptador, en canvi, resol el</w:t>
+      </w:r>
+      <w:r>
+        <w:t xml:space="preserve"> </w:t>
+      </w:r>
+      <w:r>
+        <w:rPr>
+          <w:rStyle w:val="VerbatimChar"/>
+        </w:rPr>
+        <w:t xml:space="preserve">com</w:t>
+      </w:r>
+      <w:r>
+        <w:t xml:space="preserve">. És la peça que coneix la tecnologia concreta: SOAP, REST, JDBC, JPA, un client HTTP, una estructura XML, JSON o el mecanisme que sigui necessari. [assenyalar adaptador i sistema extern]</w:t>
+      </w:r>
+    </w:p>
+    <w:p>
+      <w:pPr>
+        <w:pStyle w:val="BodyText"/>
+      </w:pPr>
+      <w:r>
+        <w:t xml:space="preserve">Aquí convé distingir dues fletxes. Si parlem de flux d’execució, el servei pot cridar el port i arribar finalment a l’adaptador. Però si parlem de dependència de codi, l’adaptador depèn del port, perquè l’adaptador implementa la interfície definida per l’aplicació. [mirada al tribunal]</w:t>
+      </w:r>
+    </w:p>
+    <w:p>
+      <w:pPr>
+        <w:pStyle w:val="BodyText"/>
+      </w:pPr>
+      <w:r>
+        <w:t xml:space="preserve">Aquesta és la inversió de dependències: el nucli no depèn de la implementació concreta; la implementació concreta depèn del contracte que defineix el nucli.</w:t>
       </w:r>
     </w:p>
     <w:bookmarkEnd w:id="17"/>
-    <w:bookmarkStart w:id="18" w:name="X38be71501c3b4b4c6f3d9d02d0cb22f98a9980c"/>
+    <w:bookmarkStart w:id="18" w:name="X25282647dc1f1bc8d2bf508fc797cb7f01a992d"/>
     <w:p>
       <w:pPr>
         <w:pStyle w:val="Heading3"/>
       </w:pPr>
       <w:r>
-        <w:t xml:space="preserve">Diapositiva 8. Port de sortida i adaptador - 1:25</w:t>
+        <w:t xml:space="preserve">Diapositiva 8. Port de sortida per a informació patrimonial - 2:05</w:t>
       </w:r>
     </w:p>
     <w:p>
@@ -1191,85 +1178,69 @@
         <w:pStyle w:val="FirstParagraph"/>
       </w:pPr>
       <w:r>
-        <w:t xml:space="preserve">Un port de sortida és un contracte definit des de l’aplicació. [pausa breu]</w:t>
-      </w:r>
-    </w:p>
-    <w:p>
-      <w:pPr>
-        <w:pStyle w:val="BodyText"/>
-      </w:pPr>
-      <w:r>
-        <w:t xml:space="preserve">El cas d’ús o el servei d’aplicació diu:</w:t>
-      </w:r>
-      <w:r>
-        <w:t xml:space="preserve"> </w:t>
-      </w:r>
-      <w:r>
-        <w:rPr>
-          <w:rStyle w:val="VerbatimChar"/>
-        </w:rPr>
-        <w:t xml:space="preserve">necessito aquesta capacitat</w:t>
-      </w:r>
-      <w:r>
-        <w:t xml:space="preserve">. Per exemple: obtenir informació patrimonial, recuperar un expedient, desar una transacció o consultar el preu actual d’una acció. El port expressa aquest</w:t>
-      </w:r>
-      <w:r>
-        <w:t xml:space="preserve"> </w:t>
-      </w:r>
-      <w:r>
-        <w:rPr>
-          <w:rStyle w:val="VerbatimChar"/>
-        </w:rPr>
-        <w:t xml:space="preserve">què</w:t>
-      </w:r>
-      <w:r>
-        <w:t xml:space="preserve">. [assenyalar el port]</w:t>
-      </w:r>
-    </w:p>
-    <w:p>
-      <w:pPr>
-        <w:pStyle w:val="BodyText"/>
-      </w:pPr>
-      <w:r>
-        <w:t xml:space="preserve">L’adaptador, en canvi, resol el</w:t>
-      </w:r>
-      <w:r>
-        <w:t xml:space="preserve"> </w:t>
-      </w:r>
-      <w:r>
-        <w:rPr>
-          <w:rStyle w:val="VerbatimChar"/>
-        </w:rPr>
-        <w:t xml:space="preserve">com</w:t>
-      </w:r>
-      <w:r>
-        <w:t xml:space="preserve">. És la peça que coneix la tecnologia concreta: SOAP, REST, JDBC, JPA, un client HTTP, una estructura XML, JSON o el mecanisme que sigui necessari. [assenyalar adaptador i sistema extern]</w:t>
-      </w:r>
-    </w:p>
-    <w:p>
-      <w:pPr>
-        <w:pStyle w:val="BodyText"/>
-      </w:pPr>
-      <w:r>
-        <w:t xml:space="preserve">Aquí convé distingir dues fletxes. Si parlem de flux d’execució, el servei pot cridar el port i arribar finalment a l’adaptador. Però si parlem de dependència de codi, l’adaptador depèn del port, perquè l’adaptador implementa la interfície definida per l’aplicació. [mirada al tribunal]</w:t>
-      </w:r>
-    </w:p>
-    <w:p>
-      <w:pPr>
-        <w:pStyle w:val="BodyText"/>
-      </w:pPr>
-      <w:r>
-        <w:t xml:space="preserve">Aquesta és la inversió de dependències: el nucli no depèn de la implementació concreta; la implementació concreta depèn del contracte que defineix el nucli.</w:t>
+        <w:t xml:space="preserve">Portem aquesta idea al cas administratiu. [assenyalar el diagrama]</w:t>
+      </w:r>
+    </w:p>
+    <w:p>
+      <w:pPr>
+        <w:pStyle w:val="BodyText"/>
+      </w:pPr>
+      <w:r>
+        <w:t xml:space="preserve">El servei d’aplicació que avalua econòmicament una beca no hauria de conèixer directament els detalls de PICA, SOAP/XML, REST o JDBC. Hauria de dependre d’un contracte expressat en el llenguatge de l’aplicació. Per exemple: obtenir informació patrimonial, recuperar dades de renda o carregar l’expedient administratiu.</w:t>
+      </w:r>
+    </w:p>
+    <w:p>
+      <w:pPr>
+        <w:pStyle w:val="BodyText"/>
+      </w:pPr>
+      <w:r>
+        <w:t xml:space="preserve">En el diagrama, el nucli de l’aplicació conté el servei d’aplicació i el model de domini. Al voltant hi ha ports: un port d’entrada per invocar el cas d’ús i ports de sortida per obtenir o persistir informació. Fora del nucli hi ha els adaptadors: el controlador REST, l’adaptador JDBC, l’adaptador d’interoperabilitat amb PICA o qualsevol altre mecanisme concret.</w:t>
+      </w:r>
+    </w:p>
+    <w:p>
+      <w:pPr>
+        <w:pStyle w:val="BodyText"/>
+      </w:pPr>
+      <w:r>
+        <w:t xml:space="preserve">El punt tècnic més important és que l’adaptador de PICA o l’adaptador JDBC no són el centre de l’arquitectura. Són substituïbles. El que és estable és el contracte que el cas d’ús necessita. [pausa breu]</w:t>
+      </w:r>
+    </w:p>
+    <w:p>
+      <w:pPr>
+        <w:pStyle w:val="BodyText"/>
+      </w:pPr>
+      <w:r>
+        <w:t xml:space="preserve">Per això la proposta de revisar les fletxes és encertada. Si la fletxa indica</w:t>
+      </w:r>
+      <w:r>
+        <w:t xml:space="preserve"> </w:t>
+      </w:r>
+      <w:r>
+        <w:rPr>
+          <w:rStyle w:val="VerbatimChar"/>
+        </w:rPr>
+        <w:t xml:space="preserve">implementa</w:t>
+      </w:r>
+      <w:r>
+        <w:t xml:space="preserve">, hauria d’anar de l’adaptador cap al port. El servei usa el port. L’adaptador implementa el port. I el domini no coneix ni l’adaptador, ni PICA, ni SOAP, ni REST.</w:t>
+      </w:r>
+    </w:p>
+    <w:p>
+      <w:pPr>
+        <w:pStyle w:val="BodyText"/>
+      </w:pPr>
+      <w:r>
+        <w:t xml:space="preserve">Aquesta mateixa estructura la podem transferir ara a un domini financer docent: HexaStock.</w:t>
       </w:r>
     </w:p>
     <w:bookmarkEnd w:id="18"/>
-    <w:bookmarkStart w:id="19" w:name="X59cad6adc5598639d21057045a6f93470b43f2d"/>
+    <w:bookmarkStart w:id="19" w:name="X619a10340c1a251e91abc9532d1ef3ec34eca8e"/>
     <w:p>
       <w:pPr>
         <w:pStyle w:val="Heading3"/>
       </w:pPr>
       <w:r>
-        <w:t xml:space="preserve">Diapositiva 9. Port de sortida per a informació patrimonial - 1:55</w:t>
+        <w:t xml:space="preserve">Diapositiva 9. Transferència a domini financer - 1:45</w:t>
       </w:r>
     </w:p>
     <w:p>
@@ -1277,69 +1248,88 @@
         <w:pStyle w:val="FirstParagraph"/>
       </w:pPr>
       <w:r>
-        <w:t xml:space="preserve">Portem aquesta idea al cas administratiu. [assenyalar el diagrama]</w:t>
-      </w:r>
-    </w:p>
-    <w:p>
-      <w:pPr>
-        <w:pStyle w:val="BodyText"/>
-      </w:pPr>
-      <w:r>
-        <w:t xml:space="preserve">El servei d’aplicació que avalua econòmicament una beca no hauria de conèixer directament els detalls de PICA, SOAP/XML, REST o JDBC. Hauria de dependre d’un contracte expressat en el llenguatge de l’aplicació. Per exemple: obtenir informació patrimonial, recuperar dades de renda o carregar l’expedient administratiu.</w:t>
-      </w:r>
-    </w:p>
-    <w:p>
-      <w:pPr>
-        <w:pStyle w:val="BodyText"/>
-      </w:pPr>
-      <w:r>
-        <w:t xml:space="preserve">En el diagrama, el nucli de l’aplicació conté el servei d’aplicació i el model de domini. Al voltant hi ha ports: un port d’entrada per invocar el cas d’ús i ports de sortida per obtenir o persistir informació. Fora del nucli hi ha els adaptadors: el controlador REST, l’adaptador JDBC, l’adaptador d’interoperabilitat amb PICA o qualsevol altre mecanisme concret.</w:t>
-      </w:r>
-    </w:p>
-    <w:p>
-      <w:pPr>
-        <w:pStyle w:val="BodyText"/>
-      </w:pPr>
-      <w:r>
-        <w:t xml:space="preserve">El punt tècnic més important és que l’adaptador de PICA o l’adaptador JDBC no són el centre de l’arquitectura. Són substituïbles. El que és estable és el contracte que el cas d’ús necessita. [pausa breu]</w:t>
-      </w:r>
-    </w:p>
-    <w:p>
-      <w:pPr>
-        <w:pStyle w:val="BodyText"/>
-      </w:pPr>
-      <w:r>
-        <w:t xml:space="preserve">Per això la proposta de revisar les fletxes és encertada. Si la fletxa indica</w:t>
-      </w:r>
-      <w:r>
-        <w:t xml:space="preserve"> </w:t>
-      </w:r>
-      <w:r>
-        <w:rPr>
-          <w:rStyle w:val="VerbatimChar"/>
-        </w:rPr>
-        <w:t xml:space="preserve">implementa</w:t>
-      </w:r>
-      <w:r>
-        <w:t xml:space="preserve">, hauria d’anar de l’adaptador cap al port. El servei usa el port. L’adaptador implementa el port. I el domini no coneix ni l’adaptador, ni PICA, ni SOAP, ni REST.</w:t>
-      </w:r>
-    </w:p>
-    <w:p>
-      <w:pPr>
-        <w:pStyle w:val="BodyText"/>
-      </w:pPr>
-      <w:r>
-        <w:t xml:space="preserve">Aquesta mateixa estructura la podem transferir ara a un domini financer docent: HexaStock.</w:t>
+        <w:t xml:space="preserve">HexaStock ens permet treballar el mateix patró en un domini diferent: la venda d’accions. [assenyalar el títol]</w:t>
+      </w:r>
+    </w:p>
+    <w:p>
+      <w:pPr>
+        <w:pStyle w:val="BodyText"/>
+      </w:pPr>
+      <w:r>
+        <w:t xml:space="preserve">Aquí el cas d’ús és vendre accions d’una cartera. Per fer-ho correctament, el servei d’aplicació necessita el preu actual del ticker. Però el cas d’ús no hauria de dependre de Finnhub, Alpha Vantage, tokens, endpoints, JSON, clients HTTP o disponibilitat d’internet. [pausa breu]</w:t>
+      </w:r>
+    </w:p>
+    <w:p>
+      <w:pPr>
+        <w:pStyle w:val="BodyText"/>
+      </w:pPr>
+      <w:r>
+        <w:t xml:space="preserve">El port de sortida és</w:t>
+      </w:r>
+      <w:r>
+        <w:t xml:space="preserve"> </w:t>
+      </w:r>
+      <w:r>
+        <w:rPr>
+          <w:rStyle w:val="VerbatimChar"/>
+        </w:rPr>
+        <w:t xml:space="preserve">StockPriceProviderPort</w:t>
+      </w:r>
+      <w:r>
+        <w:t xml:space="preserve">. Aquest port expressa la capacitat que l’aplicació necessita: obtenir el preu d’una acció. Després podem tenir diferents adaptadors que implementen aquest port:</w:t>
+      </w:r>
+      <w:r>
+        <w:t xml:space="preserve"> </w:t>
+      </w:r>
+      <w:r>
+        <w:rPr>
+          <w:rStyle w:val="VerbatimChar"/>
+        </w:rPr>
+        <w:t xml:space="preserve">FinhubStockPriceAdapter</w:t>
+      </w:r>
+      <w:r>
+        <w:t xml:space="preserve">,</w:t>
+      </w:r>
+      <w:r>
+        <w:t xml:space="preserve"> </w:t>
+      </w:r>
+      <w:r>
+        <w:rPr>
+          <w:rStyle w:val="VerbatimChar"/>
+        </w:rPr>
+        <w:t xml:space="preserve">AlphaVantageStockPriceAdapter</w:t>
+      </w:r>
+      <w:r>
+        <w:t xml:space="preserve"> </w:t>
+      </w:r>
+      <w:r>
+        <w:t xml:space="preserve">o un adaptador mock per a proves i demos controlades.</w:t>
+      </w:r>
+    </w:p>
+    <w:p>
+      <w:pPr>
+        <w:pStyle w:val="BodyText"/>
+      </w:pPr>
+      <w:r>
+        <w:t xml:space="preserve">El patró és idèntic al cas AGAUR. En el cas administratiu, el procediment necessita informació patrimonial, no una tecnologia concreta. En HexaStock, el cas d’ús necessita un preu actual, no un proveïdor concret. [mirada al tribunal]</w:t>
+      </w:r>
+    </w:p>
+    <w:p>
+      <w:pPr>
+        <w:pStyle w:val="BodyText"/>
+      </w:pPr>
+      <w:r>
+        <w:t xml:space="preserve">Per tant, el missatge docent és transferible: primer identifiquem la necessitat funcional; després definim el port; finalment implementem adaptadors.</w:t>
       </w:r>
     </w:p>
     <w:bookmarkEnd w:id="19"/>
-    <w:bookmarkStart w:id="20" w:name="Xfc787a4a7dfb56f5f09a9752b423df7b5ae64e8"/>
+    <w:bookmarkStart w:id="20" w:name="Xf23ce5279610c607185e420fa6986d11a2001c6"/>
     <w:p>
       <w:pPr>
         <w:pStyle w:val="Heading3"/>
       </w:pPr>
       <w:r>
-        <w:t xml:space="preserve">Diapositiva 10. Transferència a domini financer - 1:40</w:t>
+        <w:t xml:space="preserve">Diapositiva 10. Flux i codi essencial - 1:45</w:t>
       </w:r>
     </w:p>
     <w:p>
@@ -1347,23 +1337,47 @@
         <w:pStyle w:val="FirstParagraph"/>
       </w:pPr>
       <w:r>
-        <w:t xml:space="preserve">HexaStock ens permet treballar el mateix patró en un domini diferent: la venda d’accions. [assenyalar el títol]</w:t>
-      </w:r>
-    </w:p>
-    <w:p>
-      <w:pPr>
-        <w:pStyle w:val="BodyText"/>
-      </w:pPr>
-      <w:r>
-        <w:t xml:space="preserve">Aquí el cas d’ús és vendre accions d’una cartera. Per fer-ho correctament, el servei d’aplicació necessita el preu actual del ticker. Però el cas d’ús no hauria de dependre de Finnhub, Alpha Vantage, tokens, endpoints, JSON, clients HTTP o disponibilitat d’internet. [pausa breu]</w:t>
-      </w:r>
-    </w:p>
-    <w:p>
-      <w:pPr>
-        <w:pStyle w:val="BodyText"/>
-      </w:pPr>
-      <w:r>
-        <w:t xml:space="preserve">El port de sortida és</w:t>
+        <w:t xml:space="preserve">Aquesta diapositiva mostra el flux temporal del cas d’ús de venda. [assenyalar el diagrama de seqüència]</w:t>
+      </w:r>
+    </w:p>
+    <w:p>
+      <w:pPr>
+        <w:pStyle w:val="BodyText"/>
+      </w:pPr>
+      <w:r>
+        <w:t xml:space="preserve">Convé aclarir que, en un diagrama de seqüència, les fletxes representen ordre d’execució, no dependències de codi. Això és perfectament compatible amb la inversió de dependències que acabem d’explicar.</w:t>
+      </w:r>
+    </w:p>
+    <w:p>
+      <w:pPr>
+        <w:pStyle w:val="BodyText"/>
+      </w:pPr>
+      <w:r>
+        <w:t xml:space="preserve">El client o controlador invoca el port d’entrada,</w:t>
+      </w:r>
+      <w:r>
+        <w:t xml:space="preserve"> </w:t>
+      </w:r>
+      <w:r>
+        <w:rPr>
+          <w:rStyle w:val="VerbatimChar"/>
+        </w:rPr>
+        <w:t xml:space="preserve">PortfolioStockOperationsUseCase</w:t>
+      </w:r>
+      <w:r>
+        <w:t xml:space="preserve">. La implementació és el servei d’aplicació,</w:t>
+      </w:r>
+      <w:r>
+        <w:t xml:space="preserve"> </w:t>
+      </w:r>
+      <w:r>
+        <w:rPr>
+          <w:rStyle w:val="VerbatimChar"/>
+        </w:rPr>
+        <w:t xml:space="preserve">PortfolioStockOperationsService</w:t>
+      </w:r>
+      <w:r>
+        <w:t xml:space="preserve">. Aquest servei recupera el portfolio mitjançant un port de persistència, consulta el preu mitjançant</w:t>
       </w:r>
       <w:r>
         <w:t xml:space="preserve"> </w:t>
@@ -1375,60 +1389,57 @@
         <w:t xml:space="preserve">StockPriceProviderPort</w:t>
       </w:r>
       <w:r>
-        <w:t xml:space="preserve">. Aquest port expressa la capacitat que l’aplicació necessita: obtenir el preu d’una acció. Després podem tenir diferents adaptadors que implementen aquest port:</w:t>
-      </w:r>
-      <w:r>
-        <w:t xml:space="preserve"> </w:t>
-      </w:r>
-      <w:r>
-        <w:rPr>
-          <w:rStyle w:val="VerbatimChar"/>
-        </w:rPr>
-        <w:t xml:space="preserve">FinhubStockPriceAdapter</w:t>
-      </w:r>
-      <w:r>
-        <w:t xml:space="preserve">,</w:t>
-      </w:r>
-      <w:r>
-        <w:t xml:space="preserve"> </w:t>
-      </w:r>
-      <w:r>
-        <w:rPr>
-          <w:rStyle w:val="VerbatimChar"/>
-        </w:rPr>
-        <w:t xml:space="preserve">AlphaVantageStockPriceAdapter</w:t>
-      </w:r>
-      <w:r>
-        <w:t xml:space="preserve"> </w:t>
-      </w:r>
-      <w:r>
-        <w:t xml:space="preserve">o un adaptador mock per a proves i demos controlades.</w:t>
-      </w:r>
-    </w:p>
-    <w:p>
-      <w:pPr>
-        <w:pStyle w:val="BodyText"/>
-      </w:pPr>
-      <w:r>
-        <w:t xml:space="preserve">El patró és idèntic al cas AGAUR. En el cas administratiu, el procediment necessita informació patrimonial, no una tecnologia concreta. En HexaStock, el cas d’ús necessita un preu actual, no un proveïdor concret. [mirada al tribunal]</w:t>
-      </w:r>
-    </w:p>
-    <w:p>
-      <w:pPr>
-        <w:pStyle w:val="BodyText"/>
-      </w:pPr>
-      <w:r>
-        <w:t xml:space="preserve">Per tant, el missatge docent és transferible: primer identifiquem la necessitat funcional; després definim el port; finalment implementem adaptadors.</w:t>
+        <w:t xml:space="preserve">, i després crida el domini:</w:t>
+      </w:r>
+      <w:r>
+        <w:t xml:space="preserve"> </w:t>
+      </w:r>
+      <w:r>
+        <w:rPr>
+          <w:rStyle w:val="VerbatimChar"/>
+        </w:rPr>
+        <w:t xml:space="preserve">portfolio.sell(ticker, quantity, price)</w:t>
+      </w:r>
+      <w:r>
+        <w:t xml:space="preserve">. [pausa breu]</w:t>
+      </w:r>
+    </w:p>
+    <w:p>
+      <w:pPr>
+        <w:pStyle w:val="BodyText"/>
+      </w:pPr>
+      <w:r>
+        <w:t xml:space="preserve">La separació de responsabilitats és molt important. El servei coordina. El port obté informació. L’adaptador integra amb la infraestructura. Però la decisió de domini, la venda i el càlcul del resultat, no es resolen ni al controlador ni a l’adaptador de preus. Es resolen al model de domini, dins l’agregat</w:t>
+      </w:r>
+      <w:r>
+        <w:t xml:space="preserve"> </w:t>
+      </w:r>
+      <w:r>
+        <w:rPr>
+          <w:rStyle w:val="VerbatimChar"/>
+        </w:rPr>
+        <w:t xml:space="preserve">Portfolio</w:t>
+      </w:r>
+      <w:r>
+        <w:t xml:space="preserve">.</w:t>
+      </w:r>
+    </w:p>
+    <w:p>
+      <w:pPr>
+        <w:pStyle w:val="BodyText"/>
+      </w:pPr>
+      <w:r>
+        <w:t xml:space="preserve">Dit de manera sintètica: l’adaptador pot saber com obtenir un preu; no hauria de decidir com es ven una acció dins la cartera. [pausa]</w:t>
       </w:r>
     </w:p>
     <w:bookmarkEnd w:id="20"/>
-    <w:bookmarkStart w:id="21" w:name="X52ba5e9e737e38c182d434998da64a8e8df3254"/>
+    <w:bookmarkStart w:id="21" w:name="diapositiva-11.-demo---145"/>
     <w:p>
       <w:pPr>
         <w:pStyle w:val="Heading3"/>
       </w:pPr>
       <w:r>
-        <w:t xml:space="preserve">Diapositiva 11. Flux i codi essencial - 1:40</w:t>
+        <w:t xml:space="preserve">Diapositiva 11. Demo - 1:45</w:t>
       </w:r>
     </w:p>
     <w:p>
@@ -1436,47 +1447,15 @@
         <w:pStyle w:val="FirstParagraph"/>
       </w:pPr>
       <w:r>
-        <w:t xml:space="preserve">Aquesta diapositiva mostra el flux temporal del cas d’ús de venda. [assenyalar el diagrama de seqüència]</w:t>
-      </w:r>
-    </w:p>
-    <w:p>
-      <w:pPr>
-        <w:pStyle w:val="BodyText"/>
-      </w:pPr>
-      <w:r>
-        <w:t xml:space="preserve">Convé aclarir que, en un diagrama de seqüència, les fletxes representen ordre d’execució, no dependències de codi. Això és perfectament compatible amb la inversió de dependències que acabem d’explicar.</w:t>
-      </w:r>
-    </w:p>
-    <w:p>
-      <w:pPr>
-        <w:pStyle w:val="BodyText"/>
-      </w:pPr>
-      <w:r>
-        <w:t xml:space="preserve">El client o controlador invoca el port d’entrada,</w:t>
-      </w:r>
-      <w:r>
-        <w:t xml:space="preserve"> </w:t>
-      </w:r>
-      <w:r>
-        <w:rPr>
-          <w:rStyle w:val="VerbatimChar"/>
-        </w:rPr>
-        <w:t xml:space="preserve">PortfolioStockOperationsUseCase</w:t>
-      </w:r>
-      <w:r>
-        <w:t xml:space="preserve">. La implementació és el servei d’aplicació,</w:t>
-      </w:r>
-      <w:r>
-        <w:t xml:space="preserve"> </w:t>
-      </w:r>
-      <w:r>
-        <w:rPr>
-          <w:rStyle w:val="VerbatimChar"/>
-        </w:rPr>
-        <w:t xml:space="preserve">PortfolioStockOperationsService</w:t>
-      </w:r>
-      <w:r>
-        <w:t xml:space="preserve">. Aquest servei recupera el portfolio mitjançant un port de persistència, consulta el preu mitjançant</w:t>
+        <w:t xml:space="preserve">La demo, en aquesta microlliçó, no pretén impressionar per complexitat tècnica. Té una funció docent molt concreta: mostrar que podem mantenir el mateix cas d’ús, el mateix servei d’aplicació i el mateix domini, canviant només l’adaptador. [assenyalar les tres caixes]</w:t>
+      </w:r>
+    </w:p>
+    <w:p>
+      <w:pPr>
+        <w:pStyle w:val="BodyText"/>
+      </w:pPr>
+      <w:r>
+        <w:t xml:space="preserve">En HexaStock, això es pot veure amb perfils diferents: un adaptador Finnhub, un adaptador Alpha Vantage o un adaptador mock. El port que veu el servei és el mateix:</w:t>
       </w:r>
       <w:r>
         <w:t xml:space="preserve"> </w:t>
@@ -1488,36 +1467,714 @@
         <w:t xml:space="preserve">StockPriceProviderPort</w:t>
       </w:r>
       <w:r>
-        <w:t xml:space="preserve">, i després crida el domini:</w:t>
-      </w:r>
-      <w:r>
-        <w:t xml:space="preserve"> </w:t>
-      </w:r>
-      <w:r>
-        <w:rPr>
-          <w:rStyle w:val="VerbatimChar"/>
-        </w:rPr>
-        <w:t xml:space="preserve">portfolio.sell(ticker, quantity, price)</w:t>
-      </w:r>
-      <w:r>
-        <w:t xml:space="preserve">. [pausa breu]</w:t>
-      </w:r>
-    </w:p>
-    <w:p>
-      <w:pPr>
-        <w:pStyle w:val="BodyText"/>
-      </w:pPr>
-      <w:r>
-        <w:t xml:space="preserve">La separació de responsabilitats és molt important. El servei coordina. El port obté informació. L’adaptador integra amb la infraestructura. Però la decisió de domini, la venda i el càlcul del resultat, no es resolen ni al controlador ni a l’adaptador de preus. Es resolen al model de domini, dins l’agregat</w:t>
-      </w:r>
-      <w:r>
-        <w:t xml:space="preserve"> </w:t>
-      </w:r>
-      <w:r>
-        <w:rPr>
-          <w:rStyle w:val="VerbatimChar"/>
-        </w:rPr>
-        <w:t xml:space="preserve">Portfolio</w:t>
+        <w:t xml:space="preserve">. La implementació concreta canvia segons la configuració.</w:t>
+      </w:r>
+    </w:p>
+    <w:p>
+      <w:pPr>
+        <w:pStyle w:val="BodyText"/>
+      </w:pPr>
+      <w:r>
+        <w:t xml:space="preserve">Aquest punt és especialment rellevant en docència. Permet fer proves sense dependre d’internet, sense claus reals, sense disponibilitat d’un proveïdor extern i sense contaminar el domini amb detalls tècnics. [mirada al tribunal]</w:t>
+      </w:r>
+    </w:p>
+    <w:p>
+      <w:pPr>
+        <w:pStyle w:val="BodyText"/>
+      </w:pPr>
+      <w:r>
+        <w:t xml:space="preserve">El missatge de la demo és el mateix que hem treballat des del principi: canvia la infraestructura; el cas d’ús i el domini romanen estables.</w:t>
+      </w:r>
+    </w:p>
+    <w:p>
+      <w:pPr>
+        <w:pStyle w:val="BodyText"/>
+      </w:pPr>
+      <w:r>
+        <w:t xml:space="preserve">Això no vol dir que l’arquitectura elimini el canvi. El canvi continua existint. El que fa una bona arquitectura és localitzar-lo.</w:t>
+      </w:r>
+    </w:p>
+    <w:bookmarkEnd w:id="21"/>
+    <w:bookmarkStart w:id="22" w:name="diapositiva-12.-agraïment---120"/>
+    <w:p>
+      <w:pPr>
+        <w:pStyle w:val="Heading3"/>
+      </w:pPr>
+      <w:r>
+        <w:t xml:space="preserve">Diapositiva 12. Agraïment - 1:20</w:t>
+      </w:r>
+    </w:p>
+    <w:p>
+      <w:pPr>
+        <w:pStyle w:val="FirstParagraph"/>
+      </w:pPr>
+      <w:r>
+        <w:t xml:space="preserve">Per tancar, voldria recuperar aquesta idea final. [pausa breu]</w:t>
+      </w:r>
+    </w:p>
+    <w:p>
+      <w:pPr>
+        <w:pStyle w:val="BodyText"/>
+      </w:pPr>
+      <w:r>
+        <w:t xml:space="preserve">L’arquitectura no elimina la dependència del món exterior. Les aplicacions reals necessiten bases de dades, APIs, plataformes corporatives, proveïdors externs i mecanismes d’integració. El que fa l’arquitectura hexagonal és convertir aquesta dependència en una frontera explícita, substituïble i comprovable.</w:t>
+      </w:r>
+    </w:p>
+    <w:p>
+      <w:pPr>
+        <w:pStyle w:val="BodyText"/>
+      </w:pPr>
+      <w:r>
+        <w:t xml:space="preserve">Quan canvia un proveïdor, una API o una tecnologia, volem canviar l’adaptador. No volem reescriure el cas d’ús ni deformar el model de domini. [pausa]</w:t>
+      </w:r>
+    </w:p>
+    <w:p>
+      <w:pPr>
+        <w:pStyle w:val="BodyText"/>
+      </w:pPr>
+      <w:r>
+        <w:t xml:space="preserve">Vull expressar el meu agraïment al TecnoCampus per un entorn que m’encoratja a créixer, tant en la docència com en l’àmbit acadèmic, al costat d’un equip del qual aprenc i amb qui comparteixo coneixement, responsabilitat i compromís amb la formació universitària. [pausa breu; mirar el tribunal]</w:t>
+      </w:r>
+    </w:p>
+    <w:p>
+      <w:pPr>
+        <w:pStyle w:val="BodyText"/>
+      </w:pPr>
+      <w:r>
+        <w:t xml:space="preserve">També vull fer un agraïment especial al Dr. Josep Roure, company professor del TecnoCampus, amb qui he tingut l’oportunitat d’aprendre sobre arquitectura de software, metodologies actives d’aprenentatge i treball en equip. [mirada al tribunal]</w:t>
+      </w:r>
+    </w:p>
+    <w:p>
+      <w:pPr>
+        <w:pStyle w:val="BodyText"/>
+      </w:pPr>
+      <w:r>
+        <w:t xml:space="preserve">Moltes gràcies.</w:t>
+      </w:r>
+    </w:p>
+    <w:bookmarkEnd w:id="22"/>
+    <w:bookmarkEnd w:id="23"/>
+    <w:bookmarkStart w:id="36" w:name="notes-del-presentador-per-diapositiva"/>
+    <w:p>
+      <w:pPr>
+        <w:pStyle w:val="Heading2"/>
+      </w:pPr>
+      <w:r>
+        <w:t xml:space="preserve">4. Notes del presentador per diapositiva</w:t>
+      </w:r>
+    </w:p>
+    <w:bookmarkStart w:id="24" w:name="portada---145"/>
+    <w:p>
+      <w:pPr>
+        <w:pStyle w:val="Heading3"/>
+      </w:pPr>
+      <w:r>
+        <w:t xml:space="preserve">1. Portada - 1:45</w:t>
+      </w:r>
+    </w:p>
+    <w:p>
+      <w:pPr>
+        <w:pStyle w:val="Compact"/>
+        <w:numPr>
+          <w:ilvl w:val="0"/>
+          <w:numId w:val="1003"/>
+        </w:numPr>
+      </w:pPr>
+      <w:r>
+        <w:t xml:space="preserve">Microlliçó de DSI, no explicació completa d’arquitectura hexagonal.</w:t>
+      </w:r>
+    </w:p>
+    <w:p>
+      <w:pPr>
+        <w:pStyle w:val="Compact"/>
+        <w:numPr>
+          <w:ilvl w:val="0"/>
+          <w:numId w:val="1003"/>
+        </w:numPr>
+      </w:pPr>
+      <w:r>
+        <w:t xml:space="preserve">Informe AGAUR incorporat al tribunal: activitat real de 60 hores, maig-juliol 2025.</w:t>
+      </w:r>
+    </w:p>
+    <w:p>
+      <w:pPr>
+        <w:pStyle w:val="Compact"/>
+        <w:numPr>
+          <w:ilvl w:val="0"/>
+          <w:numId w:val="1003"/>
+        </w:numPr>
+      </w:pPr>
+      <w:r>
+        <w:t xml:space="preserve">Connexió: docència amb Dr. Josep Roure + consultoria en sistemes d’informació.</w:t>
+      </w:r>
+    </w:p>
+    <w:p>
+      <w:pPr>
+        <w:pStyle w:val="Compact"/>
+        <w:numPr>
+          <w:ilvl w:val="0"/>
+          <w:numId w:val="1003"/>
+        </w:numPr>
+      </w:pPr>
+      <w:r>
+        <w:t xml:space="preserve">No revelar dades internes; cas real com a base docent.</w:t>
+      </w:r>
+    </w:p>
+    <w:p>
+      <w:pPr>
+        <w:pStyle w:val="Compact"/>
+        <w:numPr>
+          <w:ilvl w:val="0"/>
+          <w:numId w:val="1003"/>
+        </w:numPr>
+      </w:pPr>
+      <w:r>
+        <w:t xml:space="preserve">Transició: ens centrarem en una decisió concreta, el port de sortida.</w:t>
+      </w:r>
+    </w:p>
+    <w:bookmarkEnd w:id="24"/>
+    <w:bookmarkStart w:id="25" w:name="on-som-dins-lassignatura---110"/>
+    <w:p>
+      <w:pPr>
+        <w:pStyle w:val="Heading3"/>
+      </w:pPr>
+      <w:r>
+        <w:t xml:space="preserve">2. On som dins l’assignatura - 1:10</w:t>
+      </w:r>
+    </w:p>
+    <w:p>
+      <w:pPr>
+        <w:pStyle w:val="Compact"/>
+        <w:numPr>
+          <w:ilvl w:val="0"/>
+          <w:numId w:val="1004"/>
+        </w:numPr>
+      </w:pPr>
+      <w:r>
+        <w:t xml:space="preserve">Pla docent: 3r curs, 6 ECTS, assignatura obligatòria.</w:t>
+      </w:r>
+    </w:p>
+    <w:p>
+      <w:pPr>
+        <w:pStyle w:val="Compact"/>
+        <w:numPr>
+          <w:ilvl w:val="0"/>
+          <w:numId w:val="1004"/>
+        </w:numPr>
+      </w:pPr>
+      <w:r>
+        <w:t xml:space="preserve">Bloc: clean/hexagonal, ports i adaptadors, mapping, mòduls, DDD.</w:t>
+      </w:r>
+    </w:p>
+    <w:p>
+      <w:pPr>
+        <w:pStyle w:val="Compact"/>
+        <w:numPr>
+          <w:ilvl w:val="0"/>
+          <w:numId w:val="1004"/>
+        </w:numPr>
+      </w:pPr>
+      <w:r>
+        <w:t xml:space="preserve">Justificar que la sessió encaixa en el temari.</w:t>
+      </w:r>
+    </w:p>
+    <w:p>
+      <w:pPr>
+        <w:pStyle w:val="Compact"/>
+        <w:numPr>
+          <w:ilvl w:val="0"/>
+          <w:numId w:val="1004"/>
+        </w:numPr>
+      </w:pPr>
+      <w:r>
+        <w:t xml:space="preserve">No panoràmica completa; focus en ports de sortida.</w:t>
+      </w:r>
+    </w:p>
+    <w:p>
+      <w:pPr>
+        <w:pStyle w:val="Compact"/>
+        <w:numPr>
+          <w:ilvl w:val="0"/>
+          <w:numId w:val="1004"/>
+        </w:numPr>
+      </w:pPr>
+      <w:r>
+        <w:t xml:space="preserve">Transició: objectiu mínim i entrada ràpida al cas real.</w:t>
+      </w:r>
+    </w:p>
+    <w:bookmarkEnd w:id="25"/>
+    <w:bookmarkStart w:id="26" w:name="objectiu-de-la-sessió---055"/>
+    <w:p>
+      <w:pPr>
+        <w:pStyle w:val="Heading3"/>
+      </w:pPr>
+      <w:r>
+        <w:t xml:space="preserve">3. Objectiu de la sessió - 0:55</w:t>
+      </w:r>
+    </w:p>
+    <w:p>
+      <w:pPr>
+        <w:pStyle w:val="Compact"/>
+        <w:numPr>
+          <w:ilvl w:val="0"/>
+          <w:numId w:val="1005"/>
+        </w:numPr>
+      </w:pPr>
+      <w:r>
+        <w:t xml:space="preserve">Passar-hi ràpid: és una diapositiva pont, no una explicació teòrica llarga.</w:t>
+      </w:r>
+    </w:p>
+    <w:p>
+      <w:pPr>
+        <w:pStyle w:val="Compact"/>
+        <w:numPr>
+          <w:ilvl w:val="0"/>
+          <w:numId w:val="1005"/>
+        </w:numPr>
+      </w:pPr>
+      <w:r>
+        <w:t xml:space="preserve">Frase clau: el cas d’ús necessita una capacitat, no una tecnologia.</w:t>
+      </w:r>
+    </w:p>
+    <w:p>
+      <w:pPr>
+        <w:pStyle w:val="Compact"/>
+        <w:numPr>
+          <w:ilvl w:val="0"/>
+          <w:numId w:val="1005"/>
+        </w:numPr>
+      </w:pPr>
+      <w:r>
+        <w:t xml:space="preserve">Tres accions: identificar necessitat, definir port, implementar adaptadors.</w:t>
+      </w:r>
+    </w:p>
+    <w:p>
+      <w:pPr>
+        <w:pStyle w:val="Compact"/>
+        <w:numPr>
+          <w:ilvl w:val="0"/>
+          <w:numId w:val="1005"/>
+        </w:numPr>
+      </w:pPr>
+      <w:r>
+        <w:t xml:space="preserve">Anunciar metodologia: primer cas real, després abstracció arquitectònica.</w:t>
+      </w:r>
+    </w:p>
+    <w:p>
+      <w:pPr>
+        <w:pStyle w:val="Compact"/>
+        <w:numPr>
+          <w:ilvl w:val="0"/>
+          <w:numId w:val="1005"/>
+        </w:numPr>
+      </w:pPr>
+      <w:r>
+        <w:t xml:space="preserve">Transició: començar pel procediment de beca.</w:t>
+      </w:r>
+    </w:p>
+    <w:bookmarkEnd w:id="26"/>
+    <w:bookmarkStart w:id="27" w:name="avaluació-econòmica---150"/>
+    <w:p>
+      <w:pPr>
+        <w:pStyle w:val="Heading3"/>
+      </w:pPr>
+      <w:r>
+        <w:t xml:space="preserve">4. Avaluació econòmica - 1:50</w:t>
+      </w:r>
+    </w:p>
+    <w:p>
+      <w:pPr>
+        <w:pStyle w:val="Compact"/>
+        <w:numPr>
+          <w:ilvl w:val="0"/>
+          <w:numId w:val="1006"/>
+        </w:numPr>
+      </w:pPr>
+      <w:r>
+        <w:t xml:space="preserve">Primer entendre procediment, després tecnologia.</w:t>
+      </w:r>
+    </w:p>
+    <w:p>
+      <w:pPr>
+        <w:pStyle w:val="Compact"/>
+        <w:numPr>
+          <w:ilvl w:val="0"/>
+          <w:numId w:val="1006"/>
+        </w:numPr>
+      </w:pPr>
+      <w:r>
+        <w:t xml:space="preserve">Sol·licitud, expedient, requisits generals, econòmics, revisió, resolució.</w:t>
+      </w:r>
+    </w:p>
+    <w:p>
+      <w:pPr>
+        <w:pStyle w:val="Compact"/>
+        <w:numPr>
+          <w:ilvl w:val="0"/>
+          <w:numId w:val="1006"/>
+        </w:numPr>
+      </w:pPr>
+      <w:r>
+        <w:t xml:space="preserve">Renda i patrimoni com a decisió funcional.</w:t>
+      </w:r>
+    </w:p>
+    <w:p>
+      <w:pPr>
+        <w:pStyle w:val="Compact"/>
+        <w:numPr>
+          <w:ilvl w:val="0"/>
+          <w:numId w:val="1006"/>
+        </w:numPr>
+      </w:pPr>
+      <w:r>
+        <w:t xml:space="preserve">Evitar començar per SOAP/REST/PICA.</w:t>
+      </w:r>
+    </w:p>
+    <w:p>
+      <w:pPr>
+        <w:pStyle w:val="Compact"/>
+        <w:numPr>
+          <w:ilvl w:val="0"/>
+          <w:numId w:val="1006"/>
+        </w:numPr>
+      </w:pPr>
+      <w:r>
+        <w:t xml:space="preserve">Transició: quines dades externes fan falta?</w:t>
+      </w:r>
+    </w:p>
+    <w:bookmarkEnd w:id="27"/>
+    <w:bookmarkStart w:id="28" w:name="informació-externa---200"/>
+    <w:p>
+      <w:pPr>
+        <w:pStyle w:val="Heading3"/>
+      </w:pPr>
+      <w:r>
+        <w:t xml:space="preserve">5. Informació externa - 2:00</w:t>
+      </w:r>
+    </w:p>
+    <w:p>
+      <w:pPr>
+        <w:pStyle w:val="Compact"/>
+        <w:numPr>
+          <w:ilvl w:val="0"/>
+          <w:numId w:val="1007"/>
+        </w:numPr>
+      </w:pPr>
+      <w:r>
+        <w:t xml:space="preserve">Necessitats: renda, patrimoni, béns immobles.</w:t>
+      </w:r>
+    </w:p>
+    <w:p>
+      <w:pPr>
+        <w:pStyle w:val="Compact"/>
+        <w:numPr>
+          <w:ilvl w:val="0"/>
+          <w:numId w:val="1007"/>
+        </w:numPr>
+      </w:pPr>
+      <w:r>
+        <w:t xml:space="preserve">Fonts: AEAT, Cadastre, PICA.</w:t>
+      </w:r>
+    </w:p>
+    <w:p>
+      <w:pPr>
+        <w:pStyle w:val="Compact"/>
+        <w:numPr>
+          <w:ilvl w:val="0"/>
+          <w:numId w:val="1007"/>
+        </w:numPr>
+      </w:pPr>
+      <w:r>
+        <w:t xml:space="preserve">PICA com a interoperabilitat administrativa.</w:t>
+      </w:r>
+    </w:p>
+    <w:p>
+      <w:pPr>
+        <w:pStyle w:val="Compact"/>
+        <w:numPr>
+          <w:ilvl w:val="0"/>
+          <w:numId w:val="1007"/>
+        </w:numPr>
+      </w:pPr>
+      <w:r>
+        <w:t xml:space="preserve">Frase clau: informació administrativa, no API concreta.</w:t>
+      </w:r>
+    </w:p>
+    <w:p>
+      <w:pPr>
+        <w:pStyle w:val="Compact"/>
+        <w:numPr>
+          <w:ilvl w:val="0"/>
+          <w:numId w:val="1007"/>
+        </w:numPr>
+      </w:pPr>
+      <w:r>
+        <w:t xml:space="preserve">Transició: si no separem, apareix dependència directa.</w:t>
+      </w:r>
+    </w:p>
+    <w:bookmarkEnd w:id="28"/>
+    <w:bookmarkStart w:id="29" w:name="dependència-directa---210"/>
+    <w:p>
+      <w:pPr>
+        <w:pStyle w:val="Heading3"/>
+      </w:pPr>
+      <w:r>
+        <w:t xml:space="preserve">6. Dependència directa - 2:10</w:t>
+      </w:r>
+    </w:p>
+    <w:p>
+      <w:pPr>
+        <w:pStyle w:val="Compact"/>
+        <w:numPr>
+          <w:ilvl w:val="0"/>
+          <w:numId w:val="1008"/>
+        </w:numPr>
+      </w:pPr>
+      <w:r>
+        <w:t xml:space="preserve">El problema no és PICA; és l’acoblament directe.</w:t>
+      </w:r>
+    </w:p>
+    <w:p>
+      <w:pPr>
+        <w:pStyle w:val="Compact"/>
+        <w:numPr>
+          <w:ilvl w:val="0"/>
+          <w:numId w:val="1008"/>
+        </w:numPr>
+      </w:pPr>
+      <w:r>
+        <w:t xml:space="preserve">Cas d’ús coneix SOAP/XML, DTOs, clients, errors tècnics.</w:t>
+      </w:r>
+    </w:p>
+    <w:p>
+      <w:pPr>
+        <w:pStyle w:val="Compact"/>
+        <w:numPr>
+          <w:ilvl w:val="0"/>
+          <w:numId w:val="1008"/>
+        </w:numPr>
+      </w:pPr>
+      <w:r>
+        <w:t xml:space="preserve">Evolució tecnològica travessa frontera.</w:t>
+      </w:r>
+    </w:p>
+    <w:p>
+      <w:pPr>
+        <w:pStyle w:val="Compact"/>
+        <w:numPr>
+          <w:ilvl w:val="0"/>
+          <w:numId w:val="1008"/>
+        </w:numPr>
+      </w:pPr>
+      <w:r>
+        <w:t xml:space="preserve">Tres riscos: acoblament, manteniment fràgil, continuïtat operativa.</w:t>
+      </w:r>
+    </w:p>
+    <w:p>
+      <w:pPr>
+        <w:pStyle w:val="Compact"/>
+        <w:numPr>
+          <w:ilvl w:val="0"/>
+          <w:numId w:val="1008"/>
+        </w:numPr>
+      </w:pPr>
+      <w:r>
+        <w:t xml:space="preserve">Transició: resposta arquitectònica, port de sortida.</w:t>
+      </w:r>
+    </w:p>
+    <w:bookmarkEnd w:id="29"/>
+    <w:bookmarkStart w:id="30" w:name="port-i-adaptador---130"/>
+    <w:p>
+      <w:pPr>
+        <w:pStyle w:val="Heading3"/>
+      </w:pPr>
+      <w:r>
+        <w:t xml:space="preserve">7. Port i adaptador - 1:30</w:t>
+      </w:r>
+    </w:p>
+    <w:p>
+      <w:pPr>
+        <w:pStyle w:val="Compact"/>
+        <w:numPr>
+          <w:ilvl w:val="0"/>
+          <w:numId w:val="1009"/>
+        </w:numPr>
+      </w:pPr>
+      <w:r>
+        <w:t xml:space="preserve">Port = què necessita l’aplicació.</w:t>
+      </w:r>
+    </w:p>
+    <w:p>
+      <w:pPr>
+        <w:pStyle w:val="Compact"/>
+        <w:numPr>
+          <w:ilvl w:val="0"/>
+          <w:numId w:val="1009"/>
+        </w:numPr>
+      </w:pPr>
+      <w:r>
+        <w:t xml:space="preserve">Adaptador = com s’integra tècnicament.</w:t>
+      </w:r>
+    </w:p>
+    <w:p>
+      <w:pPr>
+        <w:pStyle w:val="Compact"/>
+        <w:numPr>
+          <w:ilvl w:val="0"/>
+          <w:numId w:val="1009"/>
+        </w:numPr>
+      </w:pPr>
+      <w:r>
+        <w:t xml:space="preserve">Distingir flux d’execució i dependència de codi.</w:t>
+      </w:r>
+    </w:p>
+    <w:p>
+      <w:pPr>
+        <w:pStyle w:val="Compact"/>
+        <w:numPr>
+          <w:ilvl w:val="0"/>
+          <w:numId w:val="1009"/>
+        </w:numPr>
+      </w:pPr>
+      <w:r>
+        <w:t xml:space="preserve">Inversió: adaptador implementa port; nucli no depèn d’adaptador.</w:t>
+      </w:r>
+    </w:p>
+    <w:p>
+      <w:pPr>
+        <w:pStyle w:val="Compact"/>
+        <w:numPr>
+          <w:ilvl w:val="0"/>
+          <w:numId w:val="1009"/>
+        </w:numPr>
+      </w:pPr>
+      <w:r>
+        <w:t xml:space="preserve">Transició: aplicar-ho al cas patrimonial.</w:t>
+      </w:r>
+    </w:p>
+    <w:bookmarkEnd w:id="30"/>
+    <w:bookmarkStart w:id="31" w:name="port-patrimonial---205"/>
+    <w:p>
+      <w:pPr>
+        <w:pStyle w:val="Heading3"/>
+      </w:pPr>
+      <w:r>
+        <w:t xml:space="preserve">8. Port patrimonial - 2:05</w:t>
+      </w:r>
+    </w:p>
+    <w:p>
+      <w:pPr>
+        <w:pStyle w:val="Compact"/>
+        <w:numPr>
+          <w:ilvl w:val="0"/>
+          <w:numId w:val="1010"/>
+        </w:numPr>
+      </w:pPr>
+      <w:r>
+        <w:t xml:space="preserve">Servei d’aplicació depèn de contractes propis.</w:t>
+      </w:r>
+    </w:p>
+    <w:p>
+      <w:pPr>
+        <w:pStyle w:val="Compact"/>
+        <w:numPr>
+          <w:ilvl w:val="0"/>
+          <w:numId w:val="1010"/>
+        </w:numPr>
+      </w:pPr>
+      <w:r>
+        <w:t xml:space="preserve">Adaptadors fora del nucli.</w:t>
+      </w:r>
+    </w:p>
+    <w:p>
+      <w:pPr>
+        <w:pStyle w:val="Compact"/>
+        <w:numPr>
+          <w:ilvl w:val="0"/>
+          <w:numId w:val="1010"/>
+        </w:numPr>
+      </w:pPr>
+      <w:r>
+        <w:t xml:space="preserve">PICA/JDBC/SOAP/REST són detalls substituïbles.</w:t>
+      </w:r>
+    </w:p>
+    <w:p>
+      <w:pPr>
+        <w:pStyle w:val="Compact"/>
+        <w:numPr>
+          <w:ilvl w:val="0"/>
+          <w:numId w:val="1010"/>
+        </w:numPr>
+      </w:pPr>
+      <w:r>
+        <w:t xml:space="preserve">Fletxa correcta d’implementació: adaptador -&gt; port.</w:t>
+      </w:r>
+    </w:p>
+    <w:p>
+      <w:pPr>
+        <w:pStyle w:val="Compact"/>
+        <w:numPr>
+          <w:ilvl w:val="0"/>
+          <w:numId w:val="1010"/>
+        </w:numPr>
+      </w:pPr>
+      <w:r>
+        <w:t xml:space="preserve">Transició: mateix patró en HexaStock.</w:t>
+      </w:r>
+    </w:p>
+    <w:bookmarkEnd w:id="31"/>
+    <w:bookmarkStart w:id="32" w:name="hexastock---145"/>
+    <w:p>
+      <w:pPr>
+        <w:pStyle w:val="Heading3"/>
+      </w:pPr>
+      <w:r>
+        <w:t xml:space="preserve">9. HexaStock - 1:45</w:t>
+      </w:r>
+    </w:p>
+    <w:p>
+      <w:pPr>
+        <w:pStyle w:val="Compact"/>
+        <w:numPr>
+          <w:ilvl w:val="0"/>
+          <w:numId w:val="1011"/>
+        </w:numPr>
+      </w:pPr>
+      <w:r>
+        <w:t xml:space="preserve">Domini financer: vendre accions.</w:t>
+      </w:r>
+    </w:p>
+    <w:p>
+      <w:pPr>
+        <w:pStyle w:val="Compact"/>
+        <w:numPr>
+          <w:ilvl w:val="0"/>
+          <w:numId w:val="1011"/>
+        </w:numPr>
+      </w:pPr>
+      <w:r>
+        <w:t xml:space="preserve">Necessitat: preu actual del ticker.</w:t>
+      </w:r>
+    </w:p>
+    <w:p>
+      <w:pPr>
+        <w:pStyle w:val="Compact"/>
+        <w:numPr>
+          <w:ilvl w:val="0"/>
+          <w:numId w:val="1011"/>
+        </w:numPr>
+      </w:pPr>
+      <w:r>
+        <w:t xml:space="preserve">Port:</w:t>
+      </w:r>
+      <w:r>
+        <w:t xml:space="preserve"> </w:t>
+      </w:r>
+      <w:r>
+        <w:rPr>
+          <w:rStyle w:val="VerbatimChar"/>
+        </w:rPr>
+        <w:t xml:space="preserve">StockPriceProviderPort</w:t>
       </w:r>
       <w:r>
         <w:t xml:space="preserve">.</w:t>
@@ -1525,1103 +2182,253 @@
     </w:p>
     <w:p>
       <w:pPr>
-        <w:pStyle w:val="BodyText"/>
-      </w:pPr>
-      <w:r>
-        <w:t xml:space="preserve">Dit de manera sintètica: l’adaptador pot saber com obtenir un preu; no hauria de decidir com es ven una acció dins la cartera. [pausa]</w:t>
-      </w:r>
-    </w:p>
-    <w:bookmarkEnd w:id="21"/>
-    <w:bookmarkStart w:id="22" w:name="diapositiva-12.-demo---140"/>
+        <w:pStyle w:val="Compact"/>
+        <w:numPr>
+          <w:ilvl w:val="0"/>
+          <w:numId w:val="1011"/>
+        </w:numPr>
+      </w:pPr>
+      <w:r>
+        <w:t xml:space="preserve">Adaptadors: Finnhub, Alpha Vantage, mock.</w:t>
+      </w:r>
+    </w:p>
+    <w:p>
+      <w:pPr>
+        <w:pStyle w:val="Compact"/>
+        <w:numPr>
+          <w:ilvl w:val="0"/>
+          <w:numId w:val="1011"/>
+        </w:numPr>
+      </w:pPr>
+      <w:r>
+        <w:t xml:space="preserve">Transició: veure el flux i el codi essencial.</w:t>
+      </w:r>
+    </w:p>
+    <w:bookmarkEnd w:id="32"/>
+    <w:bookmarkStart w:id="33" w:name="flux-i-codi---145"/>
     <w:p>
       <w:pPr>
         <w:pStyle w:val="Heading3"/>
       </w:pPr>
       <w:r>
-        <w:t xml:space="preserve">Diapositiva 12. Demo - 1:40</w:t>
-      </w:r>
-    </w:p>
-    <w:p>
-      <w:pPr>
-        <w:pStyle w:val="FirstParagraph"/>
-      </w:pPr>
-      <w:r>
-        <w:t xml:space="preserve">La demo, en aquesta microlliçó, no pretén impressionar per complexitat tècnica. Té una funció docent molt concreta: mostrar que podem mantenir el mateix cas d’ús, el mateix servei d’aplicació i el mateix domini, canviant només l’adaptador. [assenyalar les tres caixes]</w:t>
-      </w:r>
-    </w:p>
-    <w:p>
-      <w:pPr>
-        <w:pStyle w:val="BodyText"/>
-      </w:pPr>
-      <w:r>
-        <w:t xml:space="preserve">En HexaStock, això es pot veure amb perfils diferents: un adaptador Finnhub, un adaptador Alpha Vantage o un adaptador mock. El port que veu el servei és el mateix:</w:t>
-      </w:r>
-      <w:r>
-        <w:t xml:space="preserve"> </w:t>
-      </w:r>
-      <w:r>
-        <w:rPr>
-          <w:rStyle w:val="VerbatimChar"/>
-        </w:rPr>
-        <w:t xml:space="preserve">StockPriceProviderPort</w:t>
-      </w:r>
-      <w:r>
-        <w:t xml:space="preserve">. La implementació concreta canvia segons la configuració.</w:t>
-      </w:r>
-    </w:p>
-    <w:p>
-      <w:pPr>
-        <w:pStyle w:val="BodyText"/>
-      </w:pPr>
-      <w:r>
-        <w:t xml:space="preserve">Aquest punt és especialment rellevant en docència. Permet fer proves sense dependre d’internet, sense claus reals, sense disponibilitat d’un proveïdor extern i sense contaminar el domini amb detalls tècnics. [mirada al tribunal]</w:t>
-      </w:r>
-    </w:p>
-    <w:p>
-      <w:pPr>
-        <w:pStyle w:val="BodyText"/>
-      </w:pPr>
-      <w:r>
-        <w:t xml:space="preserve">El missatge de la demo és el mateix que hem treballat des del principi: canvia la infraestructura; el cas d’ús i el domini romanen estables.</w:t>
-      </w:r>
-    </w:p>
-    <w:p>
-      <w:pPr>
-        <w:pStyle w:val="BodyText"/>
-      </w:pPr>
-      <w:r>
-        <w:t xml:space="preserve">Això no vol dir que l’arquitectura elimini el canvi. El canvi continua existint. El que fa una bona arquitectura és localitzar-lo.</w:t>
-      </w:r>
-    </w:p>
-    <w:bookmarkEnd w:id="22"/>
-    <w:bookmarkStart w:id="23" w:name="diapositiva-13.-agraïment---100"/>
+        <w:t xml:space="preserve">10. Flux i codi - 1:45</w:t>
+      </w:r>
+    </w:p>
+    <w:p>
+      <w:pPr>
+        <w:pStyle w:val="Compact"/>
+        <w:numPr>
+          <w:ilvl w:val="0"/>
+          <w:numId w:val="1012"/>
+        </w:numPr>
+      </w:pPr>
+      <w:r>
+        <w:t xml:space="preserve">Diagrama de seqüència = flux temporal, no dependència de codi.</w:t>
+      </w:r>
+    </w:p>
+    <w:p>
+      <w:pPr>
+        <w:pStyle w:val="Compact"/>
+        <w:numPr>
+          <w:ilvl w:val="0"/>
+          <w:numId w:val="1012"/>
+        </w:numPr>
+      </w:pPr>
+      <w:r>
+        <w:t xml:space="preserve">Controller -&gt; port d’entrada -&gt; servei.</w:t>
+      </w:r>
+    </w:p>
+    <w:p>
+      <w:pPr>
+        <w:pStyle w:val="Compact"/>
+        <w:numPr>
+          <w:ilvl w:val="0"/>
+          <w:numId w:val="1012"/>
+        </w:numPr>
+      </w:pPr>
+      <w:r>
+        <w:t xml:space="preserve">Servei consulta ports i delega venda al domini.</w:t>
+      </w:r>
+    </w:p>
+    <w:p>
+      <w:pPr>
+        <w:pStyle w:val="Compact"/>
+        <w:numPr>
+          <w:ilvl w:val="0"/>
+          <w:numId w:val="1012"/>
+        </w:numPr>
+      </w:pPr>
+      <w:r>
+        <w:t xml:space="preserve">Domini decideix; adaptador integra.</w:t>
+      </w:r>
+    </w:p>
+    <w:p>
+      <w:pPr>
+        <w:pStyle w:val="Compact"/>
+        <w:numPr>
+          <w:ilvl w:val="0"/>
+          <w:numId w:val="1012"/>
+        </w:numPr>
+      </w:pPr>
+      <w:r>
+        <w:t xml:space="preserve">Transició: demo controlada amb adaptador substituïble.</w:t>
+      </w:r>
+    </w:p>
+    <w:bookmarkEnd w:id="33"/>
+    <w:bookmarkStart w:id="34" w:name="demo---145"/>
     <w:p>
       <w:pPr>
         <w:pStyle w:val="Heading3"/>
       </w:pPr>
       <w:r>
-        <w:t xml:space="preserve">Diapositiva 13. Agraïment - 1:00</w:t>
-      </w:r>
-    </w:p>
-    <w:p>
-      <w:pPr>
-        <w:pStyle w:val="FirstParagraph"/>
-      </w:pPr>
-      <w:r>
-        <w:t xml:space="preserve">Per tancar, voldria recuperar aquesta idea final. [pausa breu]</w:t>
-      </w:r>
-    </w:p>
-    <w:p>
-      <w:pPr>
-        <w:pStyle w:val="BodyText"/>
-      </w:pPr>
-      <w:r>
-        <w:t xml:space="preserve">L’arquitectura no elimina la dependència del món exterior. Les aplicacions reals necessiten bases de dades, APIs, plataformes corporatives, proveïdors externs i mecanismes d’integració. El que fa l’arquitectura hexagonal és convertir aquesta dependència en una frontera explícita, substituïble i comprovable.</w:t>
-      </w:r>
-    </w:p>
-    <w:p>
-      <w:pPr>
-        <w:pStyle w:val="BodyText"/>
-      </w:pPr>
-      <w:r>
-        <w:t xml:space="preserve">Quan canvia un proveïdor, una API o una tecnologia, volem canviar l’adaptador. No volem reescriure el cas d’ús ni deformar el model de domini. [pausa]</w:t>
-      </w:r>
-    </w:p>
-    <w:p>
-      <w:pPr>
-        <w:pStyle w:val="BodyText"/>
-      </w:pPr>
-      <w:r>
-        <w:t xml:space="preserve">Vull expressar el meu agraïment al TecnoCampus per un entorn que m’encoratja a créixer, tant en la docència com en l’àmbit acadèmic, al costat d’un equip del qual aprenc i amb qui comparteixo coneixement, responsabilitat i compromís amb la formació universitària. [pausa breu; mirar el tribunal]</w:t>
-      </w:r>
-    </w:p>
-    <w:p>
-      <w:pPr>
-        <w:pStyle w:val="BodyText"/>
-      </w:pPr>
-      <w:r>
-        <w:t xml:space="preserve">També vull fer un agraïment especial al Dr. Josep Roure, company professor del TecnoCampus, amb qui he tingut l’oportunitat d’aprendre sobre arquitectura de software, metodologies actives d’aprenentatge i treball en equip. [mirada al tribunal]</w:t>
-      </w:r>
-    </w:p>
-    <w:p>
-      <w:pPr>
-        <w:pStyle w:val="BodyText"/>
-      </w:pPr>
-      <w:r>
-        <w:t xml:space="preserve">Moltes gràcies.</w:t>
-      </w:r>
-    </w:p>
-    <w:bookmarkEnd w:id="23"/>
-    <w:bookmarkEnd w:id="24"/>
-    <w:bookmarkStart w:id="38" w:name="notes-del-presentador-per-diapositiva"/>
-    <w:p>
-      <w:pPr>
-        <w:pStyle w:val="Heading2"/>
-      </w:pPr>
-      <w:r>
-        <w:t xml:space="preserve">4. Notes del presentador per diapositiva</w:t>
-      </w:r>
-    </w:p>
-    <w:bookmarkStart w:id="25" w:name="portada---145"/>
+        <w:t xml:space="preserve">11. Demo - 1:45</w:t>
+      </w:r>
+    </w:p>
+    <w:p>
+      <w:pPr>
+        <w:pStyle w:val="Compact"/>
+        <w:numPr>
+          <w:ilvl w:val="0"/>
+          <w:numId w:val="1013"/>
+        </w:numPr>
+      </w:pPr>
+      <w:r>
+        <w:t xml:space="preserve">Mateix cas d’ús, servei i domini.</w:t>
+      </w:r>
+    </w:p>
+    <w:p>
+      <w:pPr>
+        <w:pStyle w:val="Compact"/>
+        <w:numPr>
+          <w:ilvl w:val="0"/>
+          <w:numId w:val="1013"/>
+        </w:numPr>
+      </w:pPr>
+      <w:r>
+        <w:t xml:space="preserve">Canvia l’adaptador.</w:t>
+      </w:r>
+    </w:p>
+    <w:p>
+      <w:pPr>
+        <w:pStyle w:val="Compact"/>
+        <w:numPr>
+          <w:ilvl w:val="0"/>
+          <w:numId w:val="1013"/>
+        </w:numPr>
+      </w:pPr>
+      <w:r>
+        <w:t xml:space="preserve">Perfils: Finnhub, Alpha Vantage, mock.</w:t>
+      </w:r>
+    </w:p>
+    <w:p>
+      <w:pPr>
+        <w:pStyle w:val="Compact"/>
+        <w:numPr>
+          <w:ilvl w:val="0"/>
+          <w:numId w:val="1013"/>
+        </w:numPr>
+      </w:pPr>
+      <w:r>
+        <w:t xml:space="preserve">Utilitat docent: proves sense internet ni claus.</w:t>
+      </w:r>
+    </w:p>
+    <w:p>
+      <w:pPr>
+        <w:pStyle w:val="Compact"/>
+        <w:numPr>
+          <w:ilvl w:val="0"/>
+          <w:numId w:val="1013"/>
+        </w:numPr>
+      </w:pPr>
+      <w:r>
+        <w:t xml:space="preserve">Transició: conclusió final.</w:t>
+      </w:r>
+    </w:p>
+    <w:bookmarkEnd w:id="34"/>
+    <w:bookmarkStart w:id="35" w:name="agraïment---120"/>
     <w:p>
       <w:pPr>
         <w:pStyle w:val="Heading3"/>
       </w:pPr>
       <w:r>
-        <w:t xml:space="preserve">1. Portada - 1:45</w:t>
-      </w:r>
-    </w:p>
-    <w:p>
-      <w:pPr>
-        <w:pStyle w:val="Compact"/>
-        <w:numPr>
-          <w:ilvl w:val="0"/>
-          <w:numId w:val="1003"/>
-        </w:numPr>
-      </w:pPr>
-      <w:r>
-        <w:t xml:space="preserve">Microlliçó de DSI, no explicació completa d’arquitectura hexagonal.</w:t>
-      </w:r>
-    </w:p>
-    <w:p>
-      <w:pPr>
-        <w:pStyle w:val="Compact"/>
-        <w:numPr>
-          <w:ilvl w:val="0"/>
-          <w:numId w:val="1003"/>
-        </w:numPr>
-      </w:pPr>
-      <w:r>
-        <w:t xml:space="preserve">Informe AGAUR incorporat al tribunal: activitat real de 60 hores, maig-juliol 2025.</w:t>
-      </w:r>
-    </w:p>
-    <w:p>
-      <w:pPr>
-        <w:pStyle w:val="Compact"/>
-        <w:numPr>
-          <w:ilvl w:val="0"/>
-          <w:numId w:val="1003"/>
-        </w:numPr>
-      </w:pPr>
-      <w:r>
-        <w:t xml:space="preserve">Connexió: docència amb Dr. Josep Roure + consultoria en sistemes d’informació.</w:t>
-      </w:r>
-    </w:p>
-    <w:p>
-      <w:pPr>
-        <w:pStyle w:val="Compact"/>
-        <w:numPr>
-          <w:ilvl w:val="0"/>
-          <w:numId w:val="1003"/>
-        </w:numPr>
-      </w:pPr>
-      <w:r>
-        <w:t xml:space="preserve">No revelar dades internes; cas real com a base docent.</w:t>
-      </w:r>
-    </w:p>
-    <w:p>
-      <w:pPr>
-        <w:pStyle w:val="Compact"/>
-        <w:numPr>
-          <w:ilvl w:val="0"/>
-          <w:numId w:val="1003"/>
-        </w:numPr>
-      </w:pPr>
-      <w:r>
-        <w:t xml:space="preserve">Transició: ens centrarem en una decisió concreta, el port de sortida.</w:t>
-      </w:r>
-    </w:p>
-    <w:bookmarkEnd w:id="25"/>
-    <w:bookmarkStart w:id="26" w:name="on-som-dins-lassignatura---115"/>
-    <w:p>
-      <w:pPr>
-        <w:pStyle w:val="Heading3"/>
-      </w:pPr>
-      <w:r>
-        <w:t xml:space="preserve">2. On som dins l’assignatura - 1:15</w:t>
-      </w:r>
-    </w:p>
-    <w:p>
-      <w:pPr>
-        <w:pStyle w:val="Compact"/>
-        <w:numPr>
-          <w:ilvl w:val="0"/>
-          <w:numId w:val="1004"/>
-        </w:numPr>
-      </w:pPr>
-      <w:r>
-        <w:t xml:space="preserve">Pla docent: 3r curs, 6 ECTS, assignatura obligatòria.</w:t>
-      </w:r>
-    </w:p>
-    <w:p>
-      <w:pPr>
-        <w:pStyle w:val="Compact"/>
-        <w:numPr>
-          <w:ilvl w:val="0"/>
-          <w:numId w:val="1004"/>
-        </w:numPr>
-      </w:pPr>
-      <w:r>
-        <w:t xml:space="preserve">Bloc: clean/hexagonal, ports i adaptadors, mapping, mòduls, DDD.</w:t>
-      </w:r>
-    </w:p>
-    <w:p>
-      <w:pPr>
-        <w:pStyle w:val="Compact"/>
-        <w:numPr>
-          <w:ilvl w:val="0"/>
-          <w:numId w:val="1004"/>
-        </w:numPr>
-      </w:pPr>
-      <w:r>
-        <w:t xml:space="preserve">Justificar que la sessió encaixa en el temari.</w:t>
-      </w:r>
-    </w:p>
-    <w:p>
-      <w:pPr>
-        <w:pStyle w:val="Compact"/>
-        <w:numPr>
-          <w:ilvl w:val="0"/>
-          <w:numId w:val="1004"/>
-        </w:numPr>
-      </w:pPr>
-      <w:r>
-        <w:t xml:space="preserve">No panoràmica completa; focus en APIs externes desacoblades.</w:t>
-      </w:r>
-    </w:p>
-    <w:p>
-      <w:pPr>
-        <w:pStyle w:val="Compact"/>
-        <w:numPr>
-          <w:ilvl w:val="0"/>
-          <w:numId w:val="1004"/>
-        </w:numPr>
-      </w:pPr>
-      <w:r>
-        <w:t xml:space="preserve">Transició: formular l’objectiu d’aprenentatge.</w:t>
-      </w:r>
-    </w:p>
-    <w:bookmarkEnd w:id="26"/>
-    <w:bookmarkStart w:id="27" w:name="principi-de-disseny---110"/>
-    <w:p>
-      <w:pPr>
-        <w:pStyle w:val="Heading3"/>
-      </w:pPr>
-      <w:r>
-        <w:t xml:space="preserve">3. Principi de disseny - 1:10</w:t>
-      </w:r>
-    </w:p>
-    <w:p>
-      <w:pPr>
-        <w:pStyle w:val="Compact"/>
-        <w:numPr>
-          <w:ilvl w:val="0"/>
-          <w:numId w:val="1005"/>
-        </w:numPr>
-      </w:pPr>
-      <w:r>
-        <w:t xml:space="preserve">Frase clau: capacitat, no tecnologia.</w:t>
-      </w:r>
-    </w:p>
-    <w:p>
-      <w:pPr>
-        <w:pStyle w:val="Compact"/>
-        <w:numPr>
-          <w:ilvl w:val="0"/>
-          <w:numId w:val="1005"/>
-        </w:numPr>
-      </w:pPr>
-      <w:r>
-        <w:t xml:space="preserve">Canviar la pregunta: no</w:t>
-      </w:r>
-      <w:r>
-        <w:t xml:space="preserve"> </w:t>
-      </w:r>
-      <w:r>
-        <w:rPr>
-          <w:rStyle w:val="VerbatimChar"/>
-        </w:rPr>
-        <w:t xml:space="preserve">quina API?</w:t>
-      </w:r>
-      <w:r>
-        <w:t xml:space="preserve">, sinó</w:t>
-      </w:r>
-      <w:r>
-        <w:t xml:space="preserve"> </w:t>
-      </w:r>
-      <w:r>
-        <w:rPr>
-          <w:rStyle w:val="VerbatimChar"/>
-        </w:rPr>
-        <w:t xml:space="preserve">quina necessitat?</w:t>
+        <w:t xml:space="preserve">12. Agraïment - 1:20</w:t>
+      </w:r>
+    </w:p>
+    <w:p>
+      <w:pPr>
+        <w:pStyle w:val="Compact"/>
+        <w:numPr>
+          <w:ilvl w:val="0"/>
+          <w:numId w:val="1014"/>
+        </w:numPr>
+      </w:pPr>
+      <w:r>
+        <w:t xml:space="preserve">Arquitectura no elimina canvi; el localitza.</w:t>
+      </w:r>
+    </w:p>
+    <w:p>
+      <w:pPr>
+        <w:pStyle w:val="Compact"/>
+        <w:numPr>
+          <w:ilvl w:val="0"/>
+          <w:numId w:val="1014"/>
+        </w:numPr>
+      </w:pPr>
+      <w:r>
+        <w:t xml:space="preserve">Canviar adaptador, no cas d’ús ni domini.</w:t>
+      </w:r>
+    </w:p>
+    <w:p>
+      <w:pPr>
+        <w:pStyle w:val="Compact"/>
+        <w:numPr>
+          <w:ilvl w:val="0"/>
+          <w:numId w:val="1014"/>
+        </w:numPr>
+      </w:pPr>
+      <w:r>
+        <w:t xml:space="preserve">Agraïment TecnoCampus.</w:t>
+      </w:r>
+    </w:p>
+    <w:p>
+      <w:pPr>
+        <w:pStyle w:val="Compact"/>
+        <w:numPr>
+          <w:ilvl w:val="0"/>
+          <w:numId w:val="1014"/>
+        </w:numPr>
+      </w:pPr>
+      <w:r>
+        <w:t xml:space="preserve">Agraïment Dr. Josep Roure.</w:t>
+      </w:r>
+    </w:p>
+    <w:p>
+      <w:pPr>
+        <w:pStyle w:val="Compact"/>
+        <w:numPr>
+          <w:ilvl w:val="0"/>
+          <w:numId w:val="1014"/>
+        </w:numPr>
+      </w:pPr>
+      <w:r>
+        <w:t xml:space="preserve">Tancar mirant el tribunal:</w:t>
+      </w:r>
+      <w:r>
+        <w:t xml:space="preserve"> </w:t>
+      </w:r>
+      <w:r>
+        <w:rPr>
+          <w:rStyle w:val="VerbatimChar"/>
+        </w:rPr>
+        <w:t xml:space="preserve">Moltes gràcies</w:t>
       </w:r>
       <w:r>
         <w:t xml:space="preserve">.</w:t>
       </w:r>
     </w:p>
-    <w:p>
-      <w:pPr>
-        <w:pStyle w:val="Compact"/>
-        <w:numPr>
-          <w:ilvl w:val="0"/>
-          <w:numId w:val="1005"/>
-        </w:numPr>
-      </w:pPr>
-      <w:r>
-        <w:t xml:space="preserve">El nucli parla llenguatge del problema.</w:t>
-      </w:r>
-    </w:p>
-    <w:p>
-      <w:pPr>
-        <w:pStyle w:val="Compact"/>
-        <w:numPr>
-          <w:ilvl w:val="0"/>
-          <w:numId w:val="1005"/>
-        </w:numPr>
-      </w:pPr>
-      <w:r>
-        <w:t xml:space="preserve">Dependències cap al nucli, no cap a la infraestructura.</w:t>
-      </w:r>
-    </w:p>
-    <w:p>
-      <w:pPr>
-        <w:pStyle w:val="Compact"/>
-        <w:numPr>
-          <w:ilvl w:val="0"/>
-          <w:numId w:val="1005"/>
-        </w:numPr>
-      </w:pPr>
-      <w:r>
-        <w:t xml:space="preserve">Transició: convertir el principi en accions observables.</w:t>
-      </w:r>
-    </w:p>
-    <w:bookmarkEnd w:id="27"/>
-    <w:bookmarkStart w:id="28" w:name="objectiu-daprenentatge---050"/>
-    <w:p>
-      <w:pPr>
-        <w:pStyle w:val="Heading3"/>
-      </w:pPr>
-      <w:r>
-        <w:t xml:space="preserve">4. Objectiu d’aprenentatge - 0:50</w:t>
-      </w:r>
-    </w:p>
-    <w:p>
-      <w:pPr>
-        <w:pStyle w:val="Compact"/>
-        <w:numPr>
-          <w:ilvl w:val="0"/>
-          <w:numId w:val="1006"/>
-        </w:numPr>
-      </w:pPr>
-      <w:r>
-        <w:t xml:space="preserve">Identificar necessitat.</w:t>
-      </w:r>
-    </w:p>
-    <w:p>
-      <w:pPr>
-        <w:pStyle w:val="Compact"/>
-        <w:numPr>
-          <w:ilvl w:val="0"/>
-          <w:numId w:val="1006"/>
-        </w:numPr>
-      </w:pPr>
-      <w:r>
-        <w:t xml:space="preserve">Definir port.</w:t>
-      </w:r>
-    </w:p>
-    <w:p>
-      <w:pPr>
-        <w:pStyle w:val="Compact"/>
-        <w:numPr>
-          <w:ilvl w:val="0"/>
-          <w:numId w:val="1006"/>
-        </w:numPr>
-      </w:pPr>
-      <w:r>
-        <w:t xml:space="preserve">Implementar adaptadors.</w:t>
-      </w:r>
-    </w:p>
-    <w:p>
-      <w:pPr>
-        <w:pStyle w:val="Compact"/>
-        <w:numPr>
-          <w:ilvl w:val="0"/>
-          <w:numId w:val="1006"/>
-        </w:numPr>
-      </w:pPr>
-      <w:r>
-        <w:t xml:space="preserve">L’estudiant ha de detectar acoblament i proposar frontera.</w:t>
-      </w:r>
-    </w:p>
-    <w:p>
-      <w:pPr>
-        <w:pStyle w:val="Compact"/>
-        <w:numPr>
-          <w:ilvl w:val="0"/>
-          <w:numId w:val="1006"/>
-        </w:numPr>
-      </w:pPr>
-      <w:r>
-        <w:t xml:space="preserve">Transició: aplicar-ho a un cas funcional.</w:t>
-      </w:r>
-    </w:p>
-    <w:bookmarkEnd w:id="28"/>
-    <w:bookmarkStart w:id="29" w:name="avaluació-econòmica---145"/>
-    <w:p>
-      <w:pPr>
-        <w:pStyle w:val="Heading3"/>
-      </w:pPr>
-      <w:r>
-        <w:t xml:space="preserve">5. Avaluació econòmica - 1:45</w:t>
-      </w:r>
-    </w:p>
-    <w:p>
-      <w:pPr>
-        <w:pStyle w:val="Compact"/>
-        <w:numPr>
-          <w:ilvl w:val="0"/>
-          <w:numId w:val="1007"/>
-        </w:numPr>
-      </w:pPr>
-      <w:r>
-        <w:t xml:space="preserve">Primer entendre procediment, després tecnologia.</w:t>
-      </w:r>
-    </w:p>
-    <w:p>
-      <w:pPr>
-        <w:pStyle w:val="Compact"/>
-        <w:numPr>
-          <w:ilvl w:val="0"/>
-          <w:numId w:val="1007"/>
-        </w:numPr>
-      </w:pPr>
-      <w:r>
-        <w:t xml:space="preserve">Sol·licitud, expedient, requisits generals, econòmics, revisió, resolució.</w:t>
-      </w:r>
-    </w:p>
-    <w:p>
-      <w:pPr>
-        <w:pStyle w:val="Compact"/>
-        <w:numPr>
-          <w:ilvl w:val="0"/>
-          <w:numId w:val="1007"/>
-        </w:numPr>
-      </w:pPr>
-      <w:r>
-        <w:t xml:space="preserve">Renda i patrimoni com a decisió funcional.</w:t>
-      </w:r>
-    </w:p>
-    <w:p>
-      <w:pPr>
-        <w:pStyle w:val="Compact"/>
-        <w:numPr>
-          <w:ilvl w:val="0"/>
-          <w:numId w:val="1007"/>
-        </w:numPr>
-      </w:pPr>
-      <w:r>
-        <w:t xml:space="preserve">Evitar començar per SOAP/REST/PICA.</w:t>
-      </w:r>
-    </w:p>
-    <w:p>
-      <w:pPr>
-        <w:pStyle w:val="Compact"/>
-        <w:numPr>
-          <w:ilvl w:val="0"/>
-          <w:numId w:val="1007"/>
-        </w:numPr>
-      </w:pPr>
-      <w:r>
-        <w:t xml:space="preserve">Transició: quines dades externes fan falta?</w:t>
-      </w:r>
-    </w:p>
-    <w:bookmarkEnd w:id="29"/>
-    <w:bookmarkStart w:id="30" w:name="informació-externa---155"/>
-    <w:p>
-      <w:pPr>
-        <w:pStyle w:val="Heading3"/>
-      </w:pPr>
-      <w:r>
-        <w:t xml:space="preserve">6. Informació externa - 1:55</w:t>
-      </w:r>
-    </w:p>
-    <w:p>
-      <w:pPr>
-        <w:pStyle w:val="Compact"/>
-        <w:numPr>
-          <w:ilvl w:val="0"/>
-          <w:numId w:val="1008"/>
-        </w:numPr>
-      </w:pPr>
-      <w:r>
-        <w:t xml:space="preserve">Necessitats: renda, patrimoni, béns immobles.</w:t>
-      </w:r>
-    </w:p>
-    <w:p>
-      <w:pPr>
-        <w:pStyle w:val="Compact"/>
-        <w:numPr>
-          <w:ilvl w:val="0"/>
-          <w:numId w:val="1008"/>
-        </w:numPr>
-      </w:pPr>
-      <w:r>
-        <w:t xml:space="preserve">Fonts: AEAT, Cadastre, PICA.</w:t>
-      </w:r>
-    </w:p>
-    <w:p>
-      <w:pPr>
-        <w:pStyle w:val="Compact"/>
-        <w:numPr>
-          <w:ilvl w:val="0"/>
-          <w:numId w:val="1008"/>
-        </w:numPr>
-      </w:pPr>
-      <w:r>
-        <w:t xml:space="preserve">PICA com a interoperabilitat administrativa.</w:t>
-      </w:r>
-    </w:p>
-    <w:p>
-      <w:pPr>
-        <w:pStyle w:val="Compact"/>
-        <w:numPr>
-          <w:ilvl w:val="0"/>
-          <w:numId w:val="1008"/>
-        </w:numPr>
-      </w:pPr>
-      <w:r>
-        <w:t xml:space="preserve">Frase clau: informació administrativa, no API concreta.</w:t>
-      </w:r>
-    </w:p>
-    <w:p>
-      <w:pPr>
-        <w:pStyle w:val="Compact"/>
-        <w:numPr>
-          <w:ilvl w:val="0"/>
-          <w:numId w:val="1008"/>
-        </w:numPr>
-      </w:pPr>
-      <w:r>
-        <w:t xml:space="preserve">Transició: si no separem, apareix dependència directa.</w:t>
-      </w:r>
-    </w:p>
-    <w:bookmarkEnd w:id="30"/>
-    <w:bookmarkStart w:id="31" w:name="dependència-directa---200"/>
-    <w:p>
-      <w:pPr>
-        <w:pStyle w:val="Heading3"/>
-      </w:pPr>
-      <w:r>
-        <w:t xml:space="preserve">7. Dependència directa - 2:00</w:t>
-      </w:r>
-    </w:p>
-    <w:p>
-      <w:pPr>
-        <w:pStyle w:val="Compact"/>
-        <w:numPr>
-          <w:ilvl w:val="0"/>
-          <w:numId w:val="1009"/>
-        </w:numPr>
-      </w:pPr>
-      <w:r>
-        <w:t xml:space="preserve">El problema no és PICA; és l’acoblament directe.</w:t>
-      </w:r>
-    </w:p>
-    <w:p>
-      <w:pPr>
-        <w:pStyle w:val="Compact"/>
-        <w:numPr>
-          <w:ilvl w:val="0"/>
-          <w:numId w:val="1009"/>
-        </w:numPr>
-      </w:pPr>
-      <w:r>
-        <w:t xml:space="preserve">Cas d’ús coneix SOAP/XML, DTOs, clients, errors tècnics.</w:t>
-      </w:r>
-    </w:p>
-    <w:p>
-      <w:pPr>
-        <w:pStyle w:val="Compact"/>
-        <w:numPr>
-          <w:ilvl w:val="0"/>
-          <w:numId w:val="1009"/>
-        </w:numPr>
-      </w:pPr>
-      <w:r>
-        <w:t xml:space="preserve">Evolució tecnològica travessa frontera.</w:t>
-      </w:r>
-    </w:p>
-    <w:p>
-      <w:pPr>
-        <w:pStyle w:val="Compact"/>
-        <w:numPr>
-          <w:ilvl w:val="0"/>
-          <w:numId w:val="1009"/>
-        </w:numPr>
-      </w:pPr>
-      <w:r>
-        <w:t xml:space="preserve">Tres riscos: acoblament, manteniment fràgil, continuïtat operativa.</w:t>
-      </w:r>
-    </w:p>
-    <w:p>
-      <w:pPr>
-        <w:pStyle w:val="Compact"/>
-        <w:numPr>
-          <w:ilvl w:val="0"/>
-          <w:numId w:val="1009"/>
-        </w:numPr>
-      </w:pPr>
-      <w:r>
-        <w:t xml:space="preserve">Transició: resposta arquitectònica, port de sortida.</w:t>
-      </w:r>
-    </w:p>
-    <w:bookmarkEnd w:id="31"/>
-    <w:bookmarkStart w:id="32" w:name="port-i-adaptador---125"/>
-    <w:p>
-      <w:pPr>
-        <w:pStyle w:val="Heading3"/>
-      </w:pPr>
-      <w:r>
-        <w:t xml:space="preserve">8. Port i adaptador - 1:25</w:t>
-      </w:r>
-    </w:p>
-    <w:p>
-      <w:pPr>
-        <w:pStyle w:val="Compact"/>
-        <w:numPr>
-          <w:ilvl w:val="0"/>
-          <w:numId w:val="1010"/>
-        </w:numPr>
-      </w:pPr>
-      <w:r>
-        <w:t xml:space="preserve">Port = què necessita l’aplicació.</w:t>
-      </w:r>
-    </w:p>
-    <w:p>
-      <w:pPr>
-        <w:pStyle w:val="Compact"/>
-        <w:numPr>
-          <w:ilvl w:val="0"/>
-          <w:numId w:val="1010"/>
-        </w:numPr>
-      </w:pPr>
-      <w:r>
-        <w:t xml:space="preserve">Adaptador = com s’integra tècnicament.</w:t>
-      </w:r>
-    </w:p>
-    <w:p>
-      <w:pPr>
-        <w:pStyle w:val="Compact"/>
-        <w:numPr>
-          <w:ilvl w:val="0"/>
-          <w:numId w:val="1010"/>
-        </w:numPr>
-      </w:pPr>
-      <w:r>
-        <w:t xml:space="preserve">Distingir flux d’execució i dependència de codi.</w:t>
-      </w:r>
-    </w:p>
-    <w:p>
-      <w:pPr>
-        <w:pStyle w:val="Compact"/>
-        <w:numPr>
-          <w:ilvl w:val="0"/>
-          <w:numId w:val="1010"/>
-        </w:numPr>
-      </w:pPr>
-      <w:r>
-        <w:t xml:space="preserve">Inversió: adaptador implementa port; nucli no depèn d’adaptador.</w:t>
-      </w:r>
-    </w:p>
-    <w:p>
-      <w:pPr>
-        <w:pStyle w:val="Compact"/>
-        <w:numPr>
-          <w:ilvl w:val="0"/>
-          <w:numId w:val="1010"/>
-        </w:numPr>
-      </w:pPr>
-      <w:r>
-        <w:t xml:space="preserve">Transició: aplicar-ho al cas patrimonial.</w:t>
-      </w:r>
-    </w:p>
-    <w:bookmarkEnd w:id="32"/>
-    <w:bookmarkStart w:id="33" w:name="port-patrimonial---155"/>
-    <w:p>
-      <w:pPr>
-        <w:pStyle w:val="Heading3"/>
-      </w:pPr>
-      <w:r>
-        <w:t xml:space="preserve">9. Port patrimonial - 1:55</w:t>
-      </w:r>
-    </w:p>
-    <w:p>
-      <w:pPr>
-        <w:pStyle w:val="Compact"/>
-        <w:numPr>
-          <w:ilvl w:val="0"/>
-          <w:numId w:val="1011"/>
-        </w:numPr>
-      </w:pPr>
-      <w:r>
-        <w:t xml:space="preserve">Servei d’aplicació depèn de contractes propis.</w:t>
-      </w:r>
-    </w:p>
-    <w:p>
-      <w:pPr>
-        <w:pStyle w:val="Compact"/>
-        <w:numPr>
-          <w:ilvl w:val="0"/>
-          <w:numId w:val="1011"/>
-        </w:numPr>
-      </w:pPr>
-      <w:r>
-        <w:t xml:space="preserve">Adaptadors fora del nucli.</w:t>
-      </w:r>
-    </w:p>
-    <w:p>
-      <w:pPr>
-        <w:pStyle w:val="Compact"/>
-        <w:numPr>
-          <w:ilvl w:val="0"/>
-          <w:numId w:val="1011"/>
-        </w:numPr>
-      </w:pPr>
-      <w:r>
-        <w:t xml:space="preserve">PICA/JDBC/SOAP/REST són detalls substituïbles.</w:t>
-      </w:r>
-    </w:p>
-    <w:p>
-      <w:pPr>
-        <w:pStyle w:val="Compact"/>
-        <w:numPr>
-          <w:ilvl w:val="0"/>
-          <w:numId w:val="1011"/>
-        </w:numPr>
-      </w:pPr>
-      <w:r>
-        <w:t xml:space="preserve">Fletxa correcta d’implementació: adaptador -&gt; port.</w:t>
-      </w:r>
-    </w:p>
-    <w:p>
-      <w:pPr>
-        <w:pStyle w:val="Compact"/>
-        <w:numPr>
-          <w:ilvl w:val="0"/>
-          <w:numId w:val="1011"/>
-        </w:numPr>
-      </w:pPr>
-      <w:r>
-        <w:t xml:space="preserve">Transició: mateix patró en HexaStock.</w:t>
-      </w:r>
-    </w:p>
-    <w:bookmarkEnd w:id="33"/>
-    <w:bookmarkStart w:id="34" w:name="hexastock---140"/>
-    <w:p>
-      <w:pPr>
-        <w:pStyle w:val="Heading3"/>
-      </w:pPr>
-      <w:r>
-        <w:t xml:space="preserve">10. HexaStock - 1:40</w:t>
-      </w:r>
-    </w:p>
-    <w:p>
-      <w:pPr>
-        <w:pStyle w:val="Compact"/>
-        <w:numPr>
-          <w:ilvl w:val="0"/>
-          <w:numId w:val="1012"/>
-        </w:numPr>
-      </w:pPr>
-      <w:r>
-        <w:t xml:space="preserve">Domini financer: vendre accions.</w:t>
-      </w:r>
-    </w:p>
-    <w:p>
-      <w:pPr>
-        <w:pStyle w:val="Compact"/>
-        <w:numPr>
-          <w:ilvl w:val="0"/>
-          <w:numId w:val="1012"/>
-        </w:numPr>
-      </w:pPr>
-      <w:r>
-        <w:t xml:space="preserve">Necessitat: preu actual del ticker.</w:t>
-      </w:r>
-    </w:p>
-    <w:p>
-      <w:pPr>
-        <w:pStyle w:val="Compact"/>
-        <w:numPr>
-          <w:ilvl w:val="0"/>
-          <w:numId w:val="1012"/>
-        </w:numPr>
-      </w:pPr>
-      <w:r>
-        <w:t xml:space="preserve">Port:</w:t>
-      </w:r>
-      <w:r>
-        <w:t xml:space="preserve"> </w:t>
-      </w:r>
-      <w:r>
-        <w:rPr>
-          <w:rStyle w:val="VerbatimChar"/>
-        </w:rPr>
-        <w:t xml:space="preserve">StockPriceProviderPort</w:t>
-      </w:r>
-      <w:r>
-        <w:t xml:space="preserve">.</w:t>
-      </w:r>
-    </w:p>
-    <w:p>
-      <w:pPr>
-        <w:pStyle w:val="Compact"/>
-        <w:numPr>
-          <w:ilvl w:val="0"/>
-          <w:numId w:val="1012"/>
-        </w:numPr>
-      </w:pPr>
-      <w:r>
-        <w:t xml:space="preserve">Adaptadors: Finnhub, Alpha Vantage, mock.</w:t>
-      </w:r>
-    </w:p>
-    <w:p>
-      <w:pPr>
-        <w:pStyle w:val="Compact"/>
-        <w:numPr>
-          <w:ilvl w:val="0"/>
-          <w:numId w:val="1012"/>
-        </w:numPr>
-      </w:pPr>
-      <w:r>
-        <w:t xml:space="preserve">Transició: veure el flux i el codi essencial.</w:t>
-      </w:r>
-    </w:p>
-    <w:bookmarkEnd w:id="34"/>
-    <w:bookmarkStart w:id="35" w:name="flux-i-codi---140"/>
-    <w:p>
-      <w:pPr>
-        <w:pStyle w:val="Heading3"/>
-      </w:pPr>
-      <w:r>
-        <w:t xml:space="preserve">11. Flux i codi - 1:40</w:t>
-      </w:r>
-    </w:p>
-    <w:p>
-      <w:pPr>
-        <w:pStyle w:val="Compact"/>
-        <w:numPr>
-          <w:ilvl w:val="0"/>
-          <w:numId w:val="1013"/>
-        </w:numPr>
-      </w:pPr>
-      <w:r>
-        <w:t xml:space="preserve">Diagrama de seqüència = flux temporal, no dependència de codi.</w:t>
-      </w:r>
-    </w:p>
-    <w:p>
-      <w:pPr>
-        <w:pStyle w:val="Compact"/>
-        <w:numPr>
-          <w:ilvl w:val="0"/>
-          <w:numId w:val="1013"/>
-        </w:numPr>
-      </w:pPr>
-      <w:r>
-        <w:t xml:space="preserve">Controller -&gt; port d’entrada -&gt; servei.</w:t>
-      </w:r>
-    </w:p>
-    <w:p>
-      <w:pPr>
-        <w:pStyle w:val="Compact"/>
-        <w:numPr>
-          <w:ilvl w:val="0"/>
-          <w:numId w:val="1013"/>
-        </w:numPr>
-      </w:pPr>
-      <w:r>
-        <w:t xml:space="preserve">Servei consulta ports i delega venda al domini.</w:t>
-      </w:r>
-    </w:p>
-    <w:p>
-      <w:pPr>
-        <w:pStyle w:val="Compact"/>
-        <w:numPr>
-          <w:ilvl w:val="0"/>
-          <w:numId w:val="1013"/>
-        </w:numPr>
-      </w:pPr>
-      <w:r>
-        <w:t xml:space="preserve">Domini decideix; adaptador integra.</w:t>
-      </w:r>
-    </w:p>
-    <w:p>
-      <w:pPr>
-        <w:pStyle w:val="Compact"/>
-        <w:numPr>
-          <w:ilvl w:val="0"/>
-          <w:numId w:val="1013"/>
-        </w:numPr>
-      </w:pPr>
-      <w:r>
-        <w:t xml:space="preserve">Transició: demo controlada amb adaptador substituïble.</w:t>
-      </w:r>
-    </w:p>
     <w:bookmarkEnd w:id="35"/>
-    <w:bookmarkStart w:id="36" w:name="demo---140"/>
-    <w:p>
-      <w:pPr>
-        <w:pStyle w:val="Heading3"/>
-      </w:pPr>
-      <w:r>
-        <w:t xml:space="preserve">12. Demo - 1:40</w:t>
-      </w:r>
-    </w:p>
-    <w:p>
-      <w:pPr>
-        <w:pStyle w:val="Compact"/>
-        <w:numPr>
-          <w:ilvl w:val="0"/>
-          <w:numId w:val="1014"/>
-        </w:numPr>
-      </w:pPr>
-      <w:r>
-        <w:t xml:space="preserve">Mateix cas d’ús, servei i domini.</w:t>
-      </w:r>
-    </w:p>
-    <w:p>
-      <w:pPr>
-        <w:pStyle w:val="Compact"/>
-        <w:numPr>
-          <w:ilvl w:val="0"/>
-          <w:numId w:val="1014"/>
-        </w:numPr>
-      </w:pPr>
-      <w:r>
-        <w:t xml:space="preserve">Canvia l’adaptador.</w:t>
-      </w:r>
-    </w:p>
-    <w:p>
-      <w:pPr>
-        <w:pStyle w:val="Compact"/>
-        <w:numPr>
-          <w:ilvl w:val="0"/>
-          <w:numId w:val="1014"/>
-        </w:numPr>
-      </w:pPr>
-      <w:r>
-        <w:t xml:space="preserve">Perfils: Finnhub, Alpha Vantage, mock.</w:t>
-      </w:r>
-    </w:p>
-    <w:p>
-      <w:pPr>
-        <w:pStyle w:val="Compact"/>
-        <w:numPr>
-          <w:ilvl w:val="0"/>
-          <w:numId w:val="1014"/>
-        </w:numPr>
-      </w:pPr>
-      <w:r>
-        <w:t xml:space="preserve">Utilitat docent: proves sense internet ni claus.</w:t>
-      </w:r>
-    </w:p>
-    <w:p>
-      <w:pPr>
-        <w:pStyle w:val="Compact"/>
-        <w:numPr>
-          <w:ilvl w:val="0"/>
-          <w:numId w:val="1014"/>
-        </w:numPr>
-      </w:pPr>
-      <w:r>
-        <w:t xml:space="preserve">Transició: conclusió final.</w:t>
-      </w:r>
-    </w:p>
     <w:bookmarkEnd w:id="36"/>
-    <w:bookmarkStart w:id="37" w:name="agraïment---100"/>
-    <w:p>
-      <w:pPr>
-        <w:pStyle w:val="Heading3"/>
-      </w:pPr>
-      <w:r>
-        <w:t xml:space="preserve">13. Agraïment - 1:00</w:t>
-      </w:r>
-    </w:p>
-    <w:p>
-      <w:pPr>
-        <w:pStyle w:val="Compact"/>
-        <w:numPr>
-          <w:ilvl w:val="0"/>
-          <w:numId w:val="1015"/>
-        </w:numPr>
-      </w:pPr>
-      <w:r>
-        <w:t xml:space="preserve">Arquitectura no elimina canvi; el localitza.</w:t>
-      </w:r>
-    </w:p>
-    <w:p>
-      <w:pPr>
-        <w:pStyle w:val="Compact"/>
-        <w:numPr>
-          <w:ilvl w:val="0"/>
-          <w:numId w:val="1015"/>
-        </w:numPr>
-      </w:pPr>
-      <w:r>
-        <w:t xml:space="preserve">Canviar adaptador, no cas d’ús ni domini.</w:t>
-      </w:r>
-    </w:p>
-    <w:p>
-      <w:pPr>
-        <w:pStyle w:val="Compact"/>
-        <w:numPr>
-          <w:ilvl w:val="0"/>
-          <w:numId w:val="1015"/>
-        </w:numPr>
-      </w:pPr>
-      <w:r>
-        <w:t xml:space="preserve">Agraïment TecnoCampus.</w:t>
-      </w:r>
-    </w:p>
-    <w:p>
-      <w:pPr>
-        <w:pStyle w:val="Compact"/>
-        <w:numPr>
-          <w:ilvl w:val="0"/>
-          <w:numId w:val="1015"/>
-        </w:numPr>
-      </w:pPr>
-      <w:r>
-        <w:t xml:space="preserve">Agraïment Dr. Josep Roure.</w:t>
-      </w:r>
-    </w:p>
-    <w:p>
-      <w:pPr>
-        <w:pStyle w:val="Compact"/>
-        <w:numPr>
-          <w:ilvl w:val="0"/>
-          <w:numId w:val="1015"/>
-        </w:numPr>
-      </w:pPr>
-      <w:r>
-        <w:t xml:space="preserve">Tancar mirant el tribunal:</w:t>
-      </w:r>
-      <w:r>
-        <w:t xml:space="preserve"> </w:t>
-      </w:r>
-      <w:r>
-        <w:rPr>
-          <w:rStyle w:val="VerbatimChar"/>
-        </w:rPr>
-        <w:t xml:space="preserve">Moltes gràcies</w:t>
-      </w:r>
-      <w:r>
-        <w:t xml:space="preserve">.</w:t>
-      </w:r>
-    </w:p>
-    <w:bookmarkEnd w:id="37"/>
-    <w:bookmarkEnd w:id="38"/>
-    <w:bookmarkStart w:id="39" w:name="esquema-de-memorització"/>
+    <w:bookmarkStart w:id="37" w:name="esquema-de-memorització"/>
     <w:p>
       <w:pPr>
         <w:pStyle w:val="Heading2"/>
@@ -2813,7 +2620,7 @@
               <w:pStyle w:val="Compact"/>
             </w:pPr>
             <w:r>
-              <w:t xml:space="preserve">Objectiu d’aprenentatge</w:t>
+              <w:t xml:space="preserve">Objectiu breu</w:t>
             </w:r>
           </w:p>
         </w:tc>
@@ -2837,6 +2644,17 @@
               <w:pStyle w:val="Compact"/>
             </w:pPr>
             <w:r>
+              <w:t xml:space="preserve">Objectiu: necessitat, port, adaptador</w:t>
+            </w:r>
+          </w:p>
+        </w:tc>
+        <w:tc>
+          <w:tcPr/>
+          <w:p>
+            <w:pPr>
+              <w:pStyle w:val="Compact"/>
+            </w:pPr>
+            <w:r>
               <w:t xml:space="preserve">Capacitat, no tecnologia</w:t>
             </w:r>
           </w:p>
@@ -2848,17 +2666,6 @@
               <w:pStyle w:val="Compact"/>
             </w:pPr>
             <w:r>
-              <w:t xml:space="preserve">Dependències cap al nucli</w:t>
-            </w:r>
-          </w:p>
-        </w:tc>
-        <w:tc>
-          <w:tcPr/>
-          <w:p>
-            <w:pPr>
-              <w:pStyle w:val="Compact"/>
-            </w:pPr>
-            <w:r>
               <w:t xml:space="preserve">Assignatura</w:t>
             </w:r>
           </w:p>
@@ -2870,7 +2677,7 @@
               <w:pStyle w:val="Compact"/>
             </w:pPr>
             <w:r>
-              <w:t xml:space="preserve">Accions observables</w:t>
+              <w:t xml:space="preserve">Cas funcional</w:t>
             </w:r>
           </w:p>
         </w:tc>
@@ -2894,40 +2701,40 @@
               <w:pStyle w:val="Compact"/>
             </w:pPr>
             <w:r>
-              <w:t xml:space="preserve">Identificar, definir, implementar</w:t>
-            </w:r>
-          </w:p>
-        </w:tc>
-        <w:tc>
-          <w:tcPr/>
-          <w:p>
-            <w:pPr>
-              <w:pStyle w:val="Compact"/>
-            </w:pPr>
-            <w:r>
-              <w:t xml:space="preserve">Port com a contracte</w:t>
-            </w:r>
-          </w:p>
-        </w:tc>
-        <w:tc>
-          <w:tcPr/>
-          <w:p>
-            <w:pPr>
-              <w:pStyle w:val="Compact"/>
-            </w:pPr>
-            <w:r>
-              <w:t xml:space="preserve">Principi</w:t>
-            </w:r>
-          </w:p>
-        </w:tc>
-        <w:tc>
-          <w:tcPr/>
-          <w:p>
-            <w:pPr>
-              <w:pStyle w:val="Compact"/>
-            </w:pPr>
-            <w:r>
-              <w:t xml:space="preserve">Cas funcional</w:t>
+              <w:t xml:space="preserve">Primer procediment, després tecnologia</w:t>
+            </w:r>
+          </w:p>
+        </w:tc>
+        <w:tc>
+          <w:tcPr/>
+          <w:p>
+            <w:pPr>
+              <w:pStyle w:val="Compact"/>
+            </w:pPr>
+            <w:r>
+              <w:t xml:space="preserve">Necessitat funcional</w:t>
+            </w:r>
+          </w:p>
+        </w:tc>
+        <w:tc>
+          <w:tcPr/>
+          <w:p>
+            <w:pPr>
+              <w:pStyle w:val="Compact"/>
+            </w:pPr>
+            <w:r>
+              <w:t xml:space="preserve">Objectiu</w:t>
+            </w:r>
+          </w:p>
+        </w:tc>
+        <w:tc>
+          <w:tcPr/>
+          <w:p>
+            <w:pPr>
+              <w:pStyle w:val="Compact"/>
+            </w:pPr>
+            <w:r>
+              <w:t xml:space="preserve">Fonts externes</w:t>
             </w:r>
           </w:p>
         </w:tc>
@@ -2951,40 +2758,40 @@
               <w:pStyle w:val="Compact"/>
             </w:pPr>
             <w:r>
-              <w:t xml:space="preserve">Primer procediment, després tecnologia</w:t>
-            </w:r>
-          </w:p>
-        </w:tc>
-        <w:tc>
-          <w:tcPr/>
-          <w:p>
-            <w:pPr>
-              <w:pStyle w:val="Compact"/>
-            </w:pPr>
-            <w:r>
-              <w:t xml:space="preserve">Necessitat funcional</w:t>
-            </w:r>
-          </w:p>
-        </w:tc>
-        <w:tc>
-          <w:tcPr/>
-          <w:p>
-            <w:pPr>
-              <w:pStyle w:val="Compact"/>
-            </w:pPr>
-            <w:r>
-              <w:t xml:space="preserve">Objectiu</w:t>
-            </w:r>
-          </w:p>
-        </w:tc>
-        <w:tc>
-          <w:tcPr/>
-          <w:p>
-            <w:pPr>
-              <w:pStyle w:val="Compact"/>
-            </w:pPr>
-            <w:r>
-              <w:t xml:space="preserve">Fonts externes</w:t>
+              <w:t xml:space="preserve">El procediment necessita dades, no API</w:t>
+            </w:r>
+          </w:p>
+        </w:tc>
+        <w:tc>
+          <w:tcPr/>
+          <w:p>
+            <w:pPr>
+              <w:pStyle w:val="Compact"/>
+            </w:pPr>
+            <w:r>
+              <w:t xml:space="preserve">Interoperabilitat administrativa</w:t>
+            </w:r>
+          </w:p>
+        </w:tc>
+        <w:tc>
+          <w:tcPr/>
+          <w:p>
+            <w:pPr>
+              <w:pStyle w:val="Compact"/>
+            </w:pPr>
+            <w:r>
+              <w:t xml:space="preserve">Procediment</w:t>
+            </w:r>
+          </w:p>
+        </w:tc>
+        <w:tc>
+          <w:tcPr/>
+          <w:p>
+            <w:pPr>
+              <w:pStyle w:val="Compact"/>
+            </w:pPr>
+            <w:r>
+              <w:t xml:space="preserve">Risc d’acoblament</w:t>
             </w:r>
           </w:p>
         </w:tc>
@@ -3008,40 +2815,40 @@
               <w:pStyle w:val="Compact"/>
             </w:pPr>
             <w:r>
-              <w:t xml:space="preserve">El procediment necessita dades, no API</w:t>
-            </w:r>
-          </w:p>
-        </w:tc>
-        <w:tc>
-          <w:tcPr/>
-          <w:p>
-            <w:pPr>
-              <w:pStyle w:val="Compact"/>
-            </w:pPr>
-            <w:r>
-              <w:t xml:space="preserve">Interoperabilitat administrativa</w:t>
-            </w:r>
-          </w:p>
-        </w:tc>
-        <w:tc>
-          <w:tcPr/>
-          <w:p>
-            <w:pPr>
-              <w:pStyle w:val="Compact"/>
-            </w:pPr>
-            <w:r>
-              <w:t xml:space="preserve">Procediment</w:t>
-            </w:r>
-          </w:p>
-        </w:tc>
-        <w:tc>
-          <w:tcPr/>
-          <w:p>
-            <w:pPr>
-              <w:pStyle w:val="Compact"/>
-            </w:pPr>
-            <w:r>
-              <w:t xml:space="preserve">Risc d’acoblament</w:t>
+              <w:t xml:space="preserve">La dependència directa fa fràgil el cas d’ús</w:t>
+            </w:r>
+          </w:p>
+        </w:tc>
+        <w:tc>
+          <w:tcPr/>
+          <w:p>
+            <w:pPr>
+              <w:pStyle w:val="Compact"/>
+            </w:pPr>
+            <w:r>
+              <w:t xml:space="preserve">Acoblament tecnològic</w:t>
+            </w:r>
+          </w:p>
+        </w:tc>
+        <w:tc>
+          <w:tcPr/>
+          <w:p>
+            <w:pPr>
+              <w:pStyle w:val="Compact"/>
+            </w:pPr>
+            <w:r>
+              <w:t xml:space="preserve">Dades externes</w:t>
+            </w:r>
+          </w:p>
+        </w:tc>
+        <w:tc>
+          <w:tcPr/>
+          <w:p>
+            <w:pPr>
+              <w:pStyle w:val="Compact"/>
+            </w:pPr>
+            <w:r>
+              <w:t xml:space="preserve">Port de sortida</w:t>
             </w:r>
           </w:p>
         </w:tc>
@@ -3065,40 +2872,40 @@
               <w:pStyle w:val="Compact"/>
             </w:pPr>
             <w:r>
-              <w:t xml:space="preserve">La dependència directa fa fràgil el cas d’ús</w:t>
-            </w:r>
-          </w:p>
-        </w:tc>
-        <w:tc>
-          <w:tcPr/>
-          <w:p>
-            <w:pPr>
-              <w:pStyle w:val="Compact"/>
-            </w:pPr>
-            <w:r>
-              <w:t xml:space="preserve">Acoblament tecnològic</w:t>
-            </w:r>
-          </w:p>
-        </w:tc>
-        <w:tc>
-          <w:tcPr/>
-          <w:p>
-            <w:pPr>
-              <w:pStyle w:val="Compact"/>
-            </w:pPr>
-            <w:r>
-              <w:t xml:space="preserve">Dades externes</w:t>
-            </w:r>
-          </w:p>
-        </w:tc>
-        <w:tc>
-          <w:tcPr/>
-          <w:p>
-            <w:pPr>
-              <w:pStyle w:val="Compact"/>
-            </w:pPr>
-            <w:r>
-              <w:t xml:space="preserve">Port de sortida</w:t>
+              <w:t xml:space="preserve">Port diu què; adaptador diu com</w:t>
+            </w:r>
+          </w:p>
+        </w:tc>
+        <w:tc>
+          <w:tcPr/>
+          <w:p>
+            <w:pPr>
+              <w:pStyle w:val="Compact"/>
+            </w:pPr>
+            <w:r>
+              <w:t xml:space="preserve">Inversió de dependències</w:t>
+            </w:r>
+          </w:p>
+        </w:tc>
+        <w:tc>
+          <w:tcPr/>
+          <w:p>
+            <w:pPr>
+              <w:pStyle w:val="Compact"/>
+            </w:pPr>
+            <w:r>
+              <w:t xml:space="preserve">Problema</w:t>
+            </w:r>
+          </w:p>
+        </w:tc>
+        <w:tc>
+          <w:tcPr/>
+          <w:p>
+            <w:pPr>
+              <w:pStyle w:val="Compact"/>
+            </w:pPr>
+            <w:r>
+              <w:t xml:space="preserve">Aplicació al cas patrimonial</w:t>
             </w:r>
           </w:p>
         </w:tc>
@@ -3122,40 +2929,40 @@
               <w:pStyle w:val="Compact"/>
             </w:pPr>
             <w:r>
-              <w:t xml:space="preserve">Port diu què; adaptador diu com</w:t>
-            </w:r>
-          </w:p>
-        </w:tc>
-        <w:tc>
-          <w:tcPr/>
-          <w:p>
-            <w:pPr>
-              <w:pStyle w:val="Compact"/>
-            </w:pPr>
-            <w:r>
-              <w:t xml:space="preserve">Inversió de dependències</w:t>
-            </w:r>
-          </w:p>
-        </w:tc>
-        <w:tc>
-          <w:tcPr/>
-          <w:p>
-            <w:pPr>
-              <w:pStyle w:val="Compact"/>
-            </w:pPr>
-            <w:r>
-              <w:t xml:space="preserve">Problema</w:t>
-            </w:r>
-          </w:p>
-        </w:tc>
-        <w:tc>
-          <w:tcPr/>
-          <w:p>
-            <w:pPr>
-              <w:pStyle w:val="Compact"/>
-            </w:pPr>
-            <w:r>
-              <w:t xml:space="preserve">Aplicació al cas patrimonial</w:t>
+              <w:t xml:space="preserve">AGAUR: contracte d’aplicació, no detall tècnic</w:t>
+            </w:r>
+          </w:p>
+        </w:tc>
+        <w:tc>
+          <w:tcPr/>
+          <w:p>
+            <w:pPr>
+              <w:pStyle w:val="Compact"/>
+            </w:pPr>
+            <w:r>
+              <w:t xml:space="preserve">Adaptador implementa port</w:t>
+            </w:r>
+          </w:p>
+        </w:tc>
+        <w:tc>
+          <w:tcPr/>
+          <w:p>
+            <w:pPr>
+              <w:pStyle w:val="Compact"/>
+            </w:pPr>
+            <w:r>
+              <w:t xml:space="preserve">Port genèric</w:t>
+            </w:r>
+          </w:p>
+        </w:tc>
+        <w:tc>
+          <w:tcPr/>
+          <w:p>
+            <w:pPr>
+              <w:pStyle w:val="Compact"/>
+            </w:pPr>
+            <w:r>
+              <w:t xml:space="preserve">Transferència a HexaStock</w:t>
             </w:r>
           </w:p>
         </w:tc>
@@ -3169,63 +2976,6 @@
             </w:pPr>
             <w:r>
               <w:t xml:space="preserve">9</w:t>
-            </w:r>
-          </w:p>
-        </w:tc>
-        <w:tc>
-          <w:tcPr/>
-          <w:p>
-            <w:pPr>
-              <w:pStyle w:val="Compact"/>
-            </w:pPr>
-            <w:r>
-              <w:t xml:space="preserve">AGAUR: contracte d’aplicació, no detall tècnic</w:t>
-            </w:r>
-          </w:p>
-        </w:tc>
-        <w:tc>
-          <w:tcPr/>
-          <w:p>
-            <w:pPr>
-              <w:pStyle w:val="Compact"/>
-            </w:pPr>
-            <w:r>
-              <w:t xml:space="preserve">Adaptador implementa port</w:t>
-            </w:r>
-          </w:p>
-        </w:tc>
-        <w:tc>
-          <w:tcPr/>
-          <w:p>
-            <w:pPr>
-              <w:pStyle w:val="Compact"/>
-            </w:pPr>
-            <w:r>
-              <w:t xml:space="preserve">Port genèric</w:t>
-            </w:r>
-          </w:p>
-        </w:tc>
-        <w:tc>
-          <w:tcPr/>
-          <w:p>
-            <w:pPr>
-              <w:pStyle w:val="Compact"/>
-            </w:pPr>
-            <w:r>
-              <w:t xml:space="preserve">Transferència a HexaStock</w:t>
-            </w:r>
-          </w:p>
-        </w:tc>
-      </w:tr>
-      <w:tr>
-        <w:tc>
-          <w:tcPr/>
-          <w:p>
-            <w:pPr>
-              <w:pStyle w:val="Compact"/>
-            </w:pPr>
-            <w:r>
-              <w:t xml:space="preserve">10</w:t>
             </w:r>
           </w:p>
         </w:tc>
@@ -3285,7 +3035,7 @@
               <w:pStyle w:val="Compact"/>
             </w:pPr>
             <w:r>
-              <w:t xml:space="preserve">11</w:t>
+              <w:t xml:space="preserve">10</w:t>
             </w:r>
           </w:p>
         </w:tc>
@@ -3342,7 +3092,7 @@
               <w:pStyle w:val="Compact"/>
             </w:pPr>
             <w:r>
-              <w:t xml:space="preserve">12</w:t>
+              <w:t xml:space="preserve">11</w:t>
             </w:r>
           </w:p>
         </w:tc>
@@ -3399,7 +3149,7 @@
               <w:pStyle w:val="Compact"/>
             </w:pPr>
             <w:r>
-              <w:t xml:space="preserve">13</w:t>
+              <w:t xml:space="preserve">12</w:t>
             </w:r>
           </w:p>
         </w:tc>
@@ -3463,14 +3213,14 @@
         <w:rPr>
           <w:rStyle w:val="VerbatimChar"/>
         </w:rPr>
-        <w:t xml:space="preserve">cas real -&gt; assignatura -&gt; objectiu -&gt; procediment -&gt; dada externa -&gt; acoblament -&gt; port -&gt; adaptador -&gt; HexaStock -&gt; flux -&gt; demo -&gt; conclusió</w:t>
+        <w:t xml:space="preserve">context -&gt; assignatura -&gt; objectiu breu -&gt; procediment -&gt; dada externa -&gt; acoblament -&gt; port -&gt; AGAUR -&gt; HexaStock -&gt; flux -&gt; demo -&gt; conclusió</w:t>
       </w:r>
       <w:r>
         <w:t xml:space="preserve">.</w:t>
       </w:r>
     </w:p>
-    <w:bookmarkEnd w:id="39"/>
-    <w:bookmarkStart w:id="40" w:name="pla-dentrenament-comunicatiu"/>
+    <w:bookmarkEnd w:id="37"/>
+    <w:bookmarkStart w:id="38" w:name="pla-dentrenament-comunicatiu"/>
     <w:p>
       <w:pPr>
         <w:pStyle w:val="Heading2"/>
@@ -3532,35 +3282,35 @@
         <w:pStyle w:val="Compact"/>
         <w:numPr>
           <w:ilvl w:val="0"/>
-          <w:numId w:val="1016"/>
-        </w:numPr>
-      </w:pPr>
-      <w:r>
-        <w:t xml:space="preserve">Bloc 1: diapositives 1-4, context i objectiu.</w:t>
-      </w:r>
-    </w:p>
-    <w:p>
-      <w:pPr>
-        <w:pStyle w:val="Compact"/>
-        <w:numPr>
-          <w:ilvl w:val="0"/>
-          <w:numId w:val="1016"/>
-        </w:numPr>
-      </w:pPr>
-      <w:r>
-        <w:t xml:space="preserve">Bloc 2: diapositives 5-9, cas AGAUR i port de sortida.</w:t>
-      </w:r>
-    </w:p>
-    <w:p>
-      <w:pPr>
-        <w:pStyle w:val="Compact"/>
-        <w:numPr>
-          <w:ilvl w:val="0"/>
-          <w:numId w:val="1016"/>
-        </w:numPr>
-      </w:pPr>
-      <w:r>
-        <w:t xml:space="preserve">Bloc 3: diapositives 10-13, HexaStock, demo i tancament.</w:t>
+          <w:numId w:val="1015"/>
+        </w:numPr>
+      </w:pPr>
+      <w:r>
+        <w:t xml:space="preserve">Bloc 1: diapositives 1-3, context, assignatura i objectiu breu.</w:t>
+      </w:r>
+    </w:p>
+    <w:p>
+      <w:pPr>
+        <w:pStyle w:val="Compact"/>
+        <w:numPr>
+          <w:ilvl w:val="0"/>
+          <w:numId w:val="1015"/>
+        </w:numPr>
+      </w:pPr>
+      <w:r>
+        <w:t xml:space="preserve">Bloc 2: diapositives 4-8, cas AGAUR, problema i port de sortida.</w:t>
+      </w:r>
+    </w:p>
+    <w:p>
+      <w:pPr>
+        <w:pStyle w:val="Compact"/>
+        <w:numPr>
+          <w:ilvl w:val="0"/>
+          <w:numId w:val="1015"/>
+        </w:numPr>
+      </w:pPr>
+      <w:r>
+        <w:t xml:space="preserve">Bloc 3: diapositives 9-12, HexaStock, flux, demo i tancament.</w:t>
       </w:r>
     </w:p>
     <w:p>
@@ -3620,7 +3370,7 @@
         <w:pStyle w:val="Compact"/>
         <w:numPr>
           <w:ilvl w:val="0"/>
-          <w:numId w:val="1017"/>
+          <w:numId w:val="1016"/>
         </w:numPr>
       </w:pPr>
       <w:r>
@@ -3632,7 +3382,7 @@
         <w:pStyle w:val="Compact"/>
         <w:numPr>
           <w:ilvl w:val="0"/>
-          <w:numId w:val="1017"/>
+          <w:numId w:val="1016"/>
         </w:numPr>
       </w:pPr>
       <w:r>
@@ -3644,7 +3394,7 @@
         <w:pStyle w:val="Compact"/>
         <w:numPr>
           <w:ilvl w:val="0"/>
-          <w:numId w:val="1017"/>
+          <w:numId w:val="1016"/>
         </w:numPr>
       </w:pPr>
       <w:r>
@@ -3656,7 +3406,7 @@
         <w:pStyle w:val="FirstParagraph"/>
       </w:pPr>
       <w:r>
-        <w:t xml:space="preserve">Grava una passada en vídeo. Revisa només quatre indicadors: si mires massa la pantalla, si acceleres a les diapositives 7-11, si les pauses existeixen de veritat, i si la frase</w:t>
+        <w:t xml:space="preserve">Grava una passada en vídeo. Revisa només quatre indicadors: si mires massa la pantalla, si acceleres a les diapositives 6-10, si les pauses existeixen de veritat, i si la frase</w:t>
       </w:r>
       <w:r>
         <w:t xml:space="preserve"> </w:t>
@@ -3691,7 +3441,7 @@
         <w:pStyle w:val="BodyText"/>
       </w:pPr>
       <w:r>
-        <w:t xml:space="preserve">Mantingues un to més lent a les diapositives 3, 7, 8 i 9, perquè són les conceptualment més importants. Fes pauses llargues després de:</w:t>
+        <w:t xml:space="preserve">Mantingues un to més lent a les diapositives 3, 6, 7 i 8, perquè són les conceptualment més importants. Fes pauses llargues després de:</w:t>
       </w:r>
       <w:r>
         <w:t xml:space="preserve"> </w:t>
@@ -3750,90 +3500,90 @@
         <w:t xml:space="preserve">La postura ha de ser estable, amb els peus oberts a amplada d’espatlles. Usa les mans per marcar fronteres: dins/fora, port/adaptador, flux/dependència. Si et perds, torna al mantra: necessitat, port, adaptador. Aquesta triada recupera tota la presentació.</w:t>
       </w:r>
     </w:p>
+    <w:bookmarkEnd w:id="38"/>
+    <w:bookmarkStart w:id="39" w:name="advertiments-finals"/>
+    <w:p>
+      <w:pPr>
+        <w:pStyle w:val="Heading2"/>
+      </w:pPr>
+      <w:r>
+        <w:t xml:space="preserve">7. Advertiments finals</w:t>
+      </w:r>
+    </w:p>
+    <w:p>
+      <w:pPr>
+        <w:pStyle w:val="FirstParagraph"/>
+      </w:pPr>
+      <w:r>
+        <w:t xml:space="preserve">Risc de temps: les diapositives 4-10 poden allargar-se fàcilment. Si vas tard, no retallis la conclusió; retalla detall del cas AGAUR i de la demo.</w:t>
+      </w:r>
+    </w:p>
+    <w:p>
+      <w:pPr>
+        <w:pStyle w:val="BodyText"/>
+      </w:pPr>
+      <w:r>
+        <w:t xml:space="preserve">Risc conceptual: no diguis que PICA és el problema. Formula-ho sempre així: el problema és que el cas d’ús depengui directament dels detalls tècnics de la integració.</w:t>
+      </w:r>
+    </w:p>
+    <w:p>
+      <w:pPr>
+        <w:pStyle w:val="BodyText"/>
+      </w:pPr>
+      <w:r>
+        <w:t xml:space="preserve">Risc de fletxes: quan el tribunal vegi fletxes cap a fora, aclareix si representen flux d’execució. Quan parlis d’implementació o dependència de codi, la direcció correcta és adaptador cap al port.</w:t>
+      </w:r>
+    </w:p>
+    <w:p>
+      <w:pPr>
+        <w:pStyle w:val="BodyText"/>
+      </w:pPr>
+      <w:r>
+        <w:t xml:space="preserve">Risc documental: el pla docent oficial diu que la llengua de docència és l’anglès. Si surt la pregunta, la resposta prudent és que la defensa és en català i que la microlliçó és una adaptació per al context del tribunal; el contingut docent és el mateix.</w:t>
+      </w:r>
+    </w:p>
+    <w:p>
+      <w:pPr>
+        <w:pStyle w:val="BodyText"/>
+      </w:pPr>
+      <w:r>
+        <w:t xml:space="preserve">Risc de nom: el pla docent identifica</w:t>
+      </w:r>
+      <w:r>
+        <w:t xml:space="preserve"> </w:t>
+      </w:r>
+      <w:r>
+        <w:rPr>
+          <w:rStyle w:val="VerbatimChar"/>
+        </w:rPr>
+        <w:t xml:space="preserve">Josep Roure Alcobé</w:t>
+      </w:r>
+      <w:r>
+        <w:t xml:space="preserve">. Si a altres documents apareix</w:t>
+      </w:r>
+      <w:r>
+        <w:t xml:space="preserve"> </w:t>
+      </w:r>
+      <w:r>
+        <w:rPr>
+          <w:rStyle w:val="VerbatimChar"/>
+        </w:rPr>
+        <w:t xml:space="preserve">Roura</w:t>
+      </w:r>
+      <w:r>
+        <w:t xml:space="preserve">, cal unificar abans de tancar la PPTX.</w:t>
+      </w:r>
+    </w:p>
+    <w:p>
+      <w:pPr>
+        <w:pStyle w:val="BodyText"/>
+      </w:pPr>
+      <w:r>
+        <w:t xml:space="preserve">Risc de confidencialitat: no mencionar endpoints, credencials, captures internes ni detalls operatius d’AGAUR. L’informe acredita l’activitat; la classe només usa el cas com a abstracció docent.</w:t>
+      </w:r>
+    </w:p>
+    <w:bookmarkEnd w:id="39"/>
     <w:bookmarkEnd w:id="40"/>
-    <w:bookmarkStart w:id="41" w:name="advertiments-finals"/>
-    <w:p>
-      <w:pPr>
-        <w:pStyle w:val="Heading2"/>
-      </w:pPr>
-      <w:r>
-        <w:t xml:space="preserve">7. Advertiments finals</w:t>
-      </w:r>
-    </w:p>
-    <w:p>
-      <w:pPr>
-        <w:pStyle w:val="FirstParagraph"/>
-      </w:pPr>
-      <w:r>
-        <w:t xml:space="preserve">Risc de temps: les diapositives 5-11 poden allargar-se fàcilment. Si vas tard, no retallis la conclusió; retalla detall del cas AGAUR i de la demo.</w:t>
-      </w:r>
-    </w:p>
-    <w:p>
-      <w:pPr>
-        <w:pStyle w:val="BodyText"/>
-      </w:pPr>
-      <w:r>
-        <w:t xml:space="preserve">Risc conceptual: no diguis que PICA és el problema. Formula-ho sempre així: el problema és que el cas d’ús depengui directament dels detalls tècnics de la integració.</w:t>
-      </w:r>
-    </w:p>
-    <w:p>
-      <w:pPr>
-        <w:pStyle w:val="BodyText"/>
-      </w:pPr>
-      <w:r>
-        <w:t xml:space="preserve">Risc de fletxes: quan el tribunal vegi fletxes cap a fora, aclareix si representen flux d’execució. Quan parlis d’implementació o dependència de codi, la direcció correcta és adaptador cap al port.</w:t>
-      </w:r>
-    </w:p>
-    <w:p>
-      <w:pPr>
-        <w:pStyle w:val="BodyText"/>
-      </w:pPr>
-      <w:r>
-        <w:t xml:space="preserve">Risc documental: el pla docent oficial diu que la llengua de docència és l’anglès. Si surt la pregunta, la resposta prudent és que la defensa és en català i que la microlliçó és una adaptació per al context del tribunal; el contingut docent és el mateix.</w:t>
-      </w:r>
-    </w:p>
-    <w:p>
-      <w:pPr>
-        <w:pStyle w:val="BodyText"/>
-      </w:pPr>
-      <w:r>
-        <w:t xml:space="preserve">Risc de nom: el pla docent identifica</w:t>
-      </w:r>
-      <w:r>
-        <w:t xml:space="preserve"> </w:t>
-      </w:r>
-      <w:r>
-        <w:rPr>
-          <w:rStyle w:val="VerbatimChar"/>
-        </w:rPr>
-        <w:t xml:space="preserve">Josep Roure Alcobé</w:t>
-      </w:r>
-      <w:r>
-        <w:t xml:space="preserve">. Si a altres documents apareix</w:t>
-      </w:r>
-      <w:r>
-        <w:t xml:space="preserve"> </w:t>
-      </w:r>
-      <w:r>
-        <w:rPr>
-          <w:rStyle w:val="VerbatimChar"/>
-        </w:rPr>
-        <w:t xml:space="preserve">Roura</w:t>
-      </w:r>
-      <w:r>
-        <w:t xml:space="preserve">, cal unificar abans de tancar la PPTX.</w:t>
-      </w:r>
-    </w:p>
-    <w:p>
-      <w:pPr>
-        <w:pStyle w:val="BodyText"/>
-      </w:pPr>
-      <w:r>
-        <w:t xml:space="preserve">Risc de confidencialitat: no mencionar endpoints, credencials, captures internes ni detalls operatius d’AGAUR. L’informe acredita l’activitat; la classe només usa el cas com a abstracció docent.</w:t>
-      </w:r>
-    </w:p>
-    <w:bookmarkEnd w:id="41"/>
-    <w:bookmarkEnd w:id="42"/>
     <w:sectPr>
       <w:footnotePr>
         <w:numRestart w:val="eachSect"/>
@@ -4096,9 +3846,6 @@
     <w:abstractNumId w:val="991"/>
   </w:num>
   <w:num w:numId="1016">
-    <w:abstractNumId w:val="991"/>
-  </w:num>
-  <w:num w:numId="1017">
     <w:abstractNumId w:val="991"/>
   </w:num>
 </w:numbering>

</xml_diff>

<commit_message>
docs: sync remarkable oral materials
</commit_message>
<xml_diff>
--- a/doc/presentations/defensa-placa-permanent-dsi-ports-sortida-hexagonal/output/materials-orals-canonics-20-minuts.docx
+++ b/doc/presentations/defensa-placa-permanent-dsi-ports-sortida-hexagonal/output/materials-orals-canonics-20-minuts.docx
@@ -177,7 +177,7 @@
         <w:pStyle w:val="BodyText"/>
       </w:pPr>
       <w:r>
-        <w:t xml:space="preserve">El risc principal és que algunes diapositives poden confondre tres plans diferents: flux d’execució, dependència de codi i dependència arquitectònica. La recomanació del Dr. Josep Roure és conceptualment correcta: en ports de sortida, l’adaptador implementa el port definit per l’aplicació. Per tant, si la fletxa representa dependència de codi o realització d’interfície, ha d’anar de l’adaptador cap al port, no del port cap a l’adaptador. Si la fletxa representa flux d’execució, aleshores pot anar del servei cap al port, del port cap a l’adaptador i de l’adaptador cap al sistema extern. Les dues lectures són compatibles, però s’han de distingir visualment.</w:t>
+        <w:t xml:space="preserve">El punt conceptual que cal preservar és la distinció entre tres plans diferents: flux d’execució, dependència de codi i dependència arquitectònica. Aquesta millora ja queda incorporada als diagrames principals: quan la fletxa representa implementació, apunta de l’adaptador cap al port; quan representa ús o flux d’execució, pot sortir del servei cap al port i cap al sistema extern. Les dues lectures són compatibles, però s’han de distingir oralment amb precisió.</w:t>
       </w:r>
     </w:p>
     <w:p>
@@ -189,13 +189,13 @@
       </w:r>
     </w:p>
     <w:bookmarkEnd w:id="9"/>
-    <w:bookmarkStart w:id="10" w:name="millores-proposades-per-diapositiva"/>
+    <w:bookmarkStart w:id="10" w:name="estat-de-les-millores-per-diapositiva"/>
     <w:p>
       <w:pPr>
         <w:pStyle w:val="Heading2"/>
       </w:pPr>
       <w:r>
-        <w:t xml:space="preserve">2. Millores proposades per diapositiva</w:t>
+        <w:t xml:space="preserve">2. Estat de les millores per diapositiva</w:t>
       </w:r>
     </w:p>
     <w:p>
@@ -398,87 +398,7 @@
         <w:pStyle w:val="BodyText"/>
       </w:pPr>
       <w:r>
-        <w:t xml:space="preserve">Aquí cal aplicar la millora de fletxes. La seqüència vertical actual explica bé el flux d’execució, però no la dependència de codi. Proposta visual:</w:t>
-      </w:r>
-    </w:p>
-    <w:p>
-      <w:pPr>
-        <w:pStyle w:val="Compact"/>
-        <w:numPr>
-          <w:ilvl w:val="0"/>
-          <w:numId w:val="1002"/>
-        </w:numPr>
-      </w:pPr>
-      <w:r>
-        <w:t xml:space="preserve">Fletxa continua i fina cap avall:</w:t>
-      </w:r>
-      <w:r>
-        <w:t xml:space="preserve"> </w:t>
-      </w:r>
-      <w:r>
-        <w:rPr>
-          <w:rStyle w:val="VerbatimChar"/>
-        </w:rPr>
-        <w:t xml:space="preserve">flux d'execució</w:t>
-      </w:r>
-      <w:r>
-        <w:t xml:space="preserve">.</w:t>
-      </w:r>
-    </w:p>
-    <w:p>
-      <w:pPr>
-        <w:pStyle w:val="Compact"/>
-        <w:numPr>
-          <w:ilvl w:val="0"/>
-          <w:numId w:val="1002"/>
-        </w:numPr>
-      </w:pPr>
-      <w:r>
-        <w:t xml:space="preserve">Fletxa discontinua o d’un altre color de l’adaptador cap al port:</w:t>
-      </w:r>
-      <w:r>
-        <w:t xml:space="preserve"> </w:t>
-      </w:r>
-      <w:r>
-        <w:rPr>
-          <w:rStyle w:val="VerbatimChar"/>
-        </w:rPr>
-        <w:t xml:space="preserve">dependència de codi / implementa</w:t>
-      </w:r>
-      <w:r>
-        <w:t xml:space="preserve">.</w:t>
-      </w:r>
-    </w:p>
-    <w:p>
-      <w:pPr>
-        <w:pStyle w:val="Compact"/>
-        <w:numPr>
-          <w:ilvl w:val="0"/>
-          <w:numId w:val="1002"/>
-        </w:numPr>
-      </w:pPr>
-      <w:r>
-        <w:t xml:space="preserve">Text lateral:</w:t>
-      </w:r>
-      <w:r>
-        <w:t xml:space="preserve"> </w:t>
-      </w:r>
-      <w:r>
-        <w:rPr>
-          <w:rStyle w:val="VerbatimChar"/>
-        </w:rPr>
-        <w:t xml:space="preserve">El servei usa el port; l'adaptador implementa el port</w:t>
-      </w:r>
-      <w:r>
-        <w:t xml:space="preserve">.</w:t>
-      </w:r>
-    </w:p>
-    <w:p>
-      <w:pPr>
-        <w:pStyle w:val="FirstParagraph"/>
-      </w:pPr>
-      <w:r>
-        <w:t xml:space="preserve">Això permet dir: el cas d’ús crida una capacitat definida pel port, però la implementació concreta depèn del contracte de l’aplicació.</w:t>
+        <w:t xml:space="preserve">La diapositiva funciona com a esquema de flux d’execució: cas d’ús, port, adaptador i sistema extern. No cal carregar-la amb una segona notació gràfica. Oralment convé aclarir que aquesta seqüència mostra el camí de la crida, mentre que la dependència de codi queda expressada en els diagrames següents: el servei usa el port i l’adaptador implementa el port.</w:t>
       </w:r>
     </w:p>
     <w:p>
@@ -498,7 +418,7 @@
         <w:pStyle w:val="BodyText"/>
       </w:pPr>
       <w:r>
-        <w:t xml:space="preserve">La frase superior és molt bona. El diagrama, però, manté</w:t>
+        <w:t xml:space="preserve">Correcció aplicada. El diagrama ja diferencia el flux d’ús del servei cap als ports i la implementació dels ports per part dels adaptadors. Les fletxes</w:t>
       </w:r>
       <w:r>
         <w:t xml:space="preserve"> </w:t>
@@ -513,34 +433,7 @@
         <w:t xml:space="preserve"> </w:t>
       </w:r>
       <w:r>
-        <w:t xml:space="preserve">amb fletxes que visualment semblen sortir del port cap a l’adaptador. Proposta: invertir aquestes fletxes o canviar-ne l’etiqueta a</w:t>
-      </w:r>
-      <w:r>
-        <w:t xml:space="preserve"> </w:t>
-      </w:r>
-      <w:r>
-        <w:rPr>
-          <w:rStyle w:val="VerbatimChar"/>
-        </w:rPr>
-        <w:t xml:space="preserve">implementa</w:t>
-      </w:r>
-      <w:r>
-        <w:t xml:space="preserve">, amb la direcció adaptador -&gt; port. Mantenir les fletxes de</w:t>
-      </w:r>
-      <w:r>
-        <w:t xml:space="preserve"> </w:t>
-      </w:r>
-      <w:r>
-        <w:rPr>
-          <w:rStyle w:val="VerbatimChar"/>
-        </w:rPr>
-        <w:t xml:space="preserve">uses</w:t>
-      </w:r>
-      <w:r>
-        <w:t xml:space="preserve"> </w:t>
-      </w:r>
-      <w:r>
-        <w:t xml:space="preserve">des del servei cap als ports si es vol representar el flux d’execució.</w:t>
+        <w:t xml:space="preserve">apunten des dels adaptadors cap als ports, de manera coherent amb la inversió de dependències. En l’explicació oral cal mantenir aquesta lectura: el servei usa el port; l’adaptador implementa el port.</w:t>
       </w:r>
     </w:p>
     <w:p>
@@ -560,7 +453,7 @@
         <w:pStyle w:val="BodyText"/>
       </w:pPr>
       <w:r>
-        <w:t xml:space="preserve">La transferència és clara. El diagrama HexaStock, com el d’AGAUR, hauria de distingir flux d’execució i dependència de codi. Especialment en</w:t>
+        <w:t xml:space="preserve">Correcció aplicada. El diagrama HexaStock ja manté la mateixa lectura que el cas AGAUR: les fletxes d’ús representen el flux del servei cap als ports, i les fletxes</w:t>
       </w:r>
       <w:r>
         <w:t xml:space="preserve"> </w:t>
@@ -569,52 +462,25 @@
         <w:rPr>
           <w:rStyle w:val="VerbatimChar"/>
         </w:rPr>
+        <w:t xml:space="preserve">implemented by</w:t>
+      </w:r>
+      <w:r>
+        <w:t xml:space="preserve"> </w:t>
+      </w:r>
+      <w:r>
+        <w:t xml:space="preserve">apunten dels adaptadors cap als ports. En</w:t>
+      </w:r>
+      <w:r>
+        <w:t xml:space="preserve"> </w:t>
+      </w:r>
+      <w:r>
+        <w:rPr>
+          <w:rStyle w:val="VerbatimChar"/>
+        </w:rPr>
         <w:t xml:space="preserve">StockPriceProviderPort</w:t>
       </w:r>
       <w:r>
-        <w:t xml:space="preserve">, convé que</w:t>
-      </w:r>
-      <w:r>
-        <w:t xml:space="preserve"> </w:t>
-      </w:r>
-      <w:r>
-        <w:rPr>
-          <w:rStyle w:val="VerbatimChar"/>
-        </w:rPr>
-        <w:t xml:space="preserve">FinhubStockPriceAdapter</w:t>
-      </w:r>
-      <w:r>
-        <w:t xml:space="preserve">,</w:t>
-      </w:r>
-      <w:r>
-        <w:t xml:space="preserve"> </w:t>
-      </w:r>
-      <w:r>
-        <w:rPr>
-          <w:rStyle w:val="VerbatimChar"/>
-        </w:rPr>
-        <w:t xml:space="preserve">AlphaVantageStockPriceAdapter</w:t>
-      </w:r>
-      <w:r>
-        <w:t xml:space="preserve"> </w:t>
-      </w:r>
-      <w:r>
-        <w:t xml:space="preserve">i</w:t>
-      </w:r>
-      <w:r>
-        <w:t xml:space="preserve"> </w:t>
-      </w:r>
-      <w:r>
-        <w:rPr>
-          <w:rStyle w:val="VerbatimChar"/>
-        </w:rPr>
-        <w:t xml:space="preserve">MockFinhubStockPriceAdapter</w:t>
-      </w:r>
-      <w:r>
-        <w:t xml:space="preserve"> </w:t>
-      </w:r>
-      <w:r>
-        <w:t xml:space="preserve">apareguin com a implementacions que apunten cap al port. El missatge central és correcte i s’ha de mantenir: el cas d’ús necessita el preu actual, no un proveïdor concret.</w:t>
+        <w:t xml:space="preserve">, els adaptadors de mercat apareixen com a implementacions del port. El missatge central és correcte i s’ha de mantenir: el cas d’ús necessita el preu actual, no un proveïdor concret.</w:t>
       </w:r>
     </w:p>
     <w:p>
@@ -1210,7 +1076,7 @@
         <w:pStyle w:val="BodyText"/>
       </w:pPr>
       <w:r>
-        <w:t xml:space="preserve">Per això la proposta de revisar les fletxes és encertada. Si la fletxa indica</w:t>
+        <w:t xml:space="preserve">Aquesta distinció queda reflectida en la direcció de les fletxes. Quan indiquen</w:t>
       </w:r>
       <w:r>
         <w:t xml:space="preserve"> </w:t>
@@ -1219,10 +1085,10 @@
         <w:rPr>
           <w:rStyle w:val="VerbatimChar"/>
         </w:rPr>
-        <w:t xml:space="preserve">implementa</w:t>
-      </w:r>
-      <w:r>
-        <w:t xml:space="preserve">, hauria d’anar de l’adaptador cap al port. El servei usa el port. L’adaptador implementa el port. I el domini no coneix ni l’adaptador, ni PICA, ni SOAP, ni REST.</w:t>
+        <w:t xml:space="preserve">implemented by</w:t>
+      </w:r>
+      <w:r>
+        <w:t xml:space="preserve">, les fletxes van de l’adaptador cap al port. El servei usa el port. L’adaptador implementa el port. I el domini no coneix ni l’adaptador, ni PICA, ni SOAP, ni REST.</w:t>
       </w:r>
     </w:p>
     <w:p>
@@ -1577,7 +1443,7 @@
         <w:pStyle w:val="Compact"/>
         <w:numPr>
           <w:ilvl w:val="0"/>
-          <w:numId w:val="1003"/>
+          <w:numId w:val="1002"/>
         </w:numPr>
       </w:pPr>
       <w:r>
@@ -1589,7 +1455,7 @@
         <w:pStyle w:val="Compact"/>
         <w:numPr>
           <w:ilvl w:val="0"/>
-          <w:numId w:val="1003"/>
+          <w:numId w:val="1002"/>
         </w:numPr>
       </w:pPr>
       <w:r>
@@ -1601,7 +1467,7 @@
         <w:pStyle w:val="Compact"/>
         <w:numPr>
           <w:ilvl w:val="0"/>
-          <w:numId w:val="1003"/>
+          <w:numId w:val="1002"/>
         </w:numPr>
       </w:pPr>
       <w:r>
@@ -1613,7 +1479,7 @@
         <w:pStyle w:val="Compact"/>
         <w:numPr>
           <w:ilvl w:val="0"/>
-          <w:numId w:val="1003"/>
+          <w:numId w:val="1002"/>
         </w:numPr>
       </w:pPr>
       <w:r>
@@ -1625,7 +1491,7 @@
         <w:pStyle w:val="Compact"/>
         <w:numPr>
           <w:ilvl w:val="0"/>
-          <w:numId w:val="1003"/>
+          <w:numId w:val="1002"/>
         </w:numPr>
       </w:pPr>
       <w:r>
@@ -1647,7 +1513,7 @@
         <w:pStyle w:val="Compact"/>
         <w:numPr>
           <w:ilvl w:val="0"/>
-          <w:numId w:val="1004"/>
+          <w:numId w:val="1003"/>
         </w:numPr>
       </w:pPr>
       <w:r>
@@ -1659,7 +1525,7 @@
         <w:pStyle w:val="Compact"/>
         <w:numPr>
           <w:ilvl w:val="0"/>
-          <w:numId w:val="1004"/>
+          <w:numId w:val="1003"/>
         </w:numPr>
       </w:pPr>
       <w:r>
@@ -1671,7 +1537,7 @@
         <w:pStyle w:val="Compact"/>
         <w:numPr>
           <w:ilvl w:val="0"/>
-          <w:numId w:val="1004"/>
+          <w:numId w:val="1003"/>
         </w:numPr>
       </w:pPr>
       <w:r>
@@ -1683,7 +1549,7 @@
         <w:pStyle w:val="Compact"/>
         <w:numPr>
           <w:ilvl w:val="0"/>
-          <w:numId w:val="1004"/>
+          <w:numId w:val="1003"/>
         </w:numPr>
       </w:pPr>
       <w:r>
@@ -1695,7 +1561,7 @@
         <w:pStyle w:val="Compact"/>
         <w:numPr>
           <w:ilvl w:val="0"/>
-          <w:numId w:val="1004"/>
+          <w:numId w:val="1003"/>
         </w:numPr>
       </w:pPr>
       <w:r>
@@ -1717,7 +1583,7 @@
         <w:pStyle w:val="Compact"/>
         <w:numPr>
           <w:ilvl w:val="0"/>
-          <w:numId w:val="1005"/>
+          <w:numId w:val="1004"/>
         </w:numPr>
       </w:pPr>
       <w:r>
@@ -1729,7 +1595,7 @@
         <w:pStyle w:val="Compact"/>
         <w:numPr>
           <w:ilvl w:val="0"/>
-          <w:numId w:val="1005"/>
+          <w:numId w:val="1004"/>
         </w:numPr>
       </w:pPr>
       <w:r>
@@ -1741,7 +1607,7 @@
         <w:pStyle w:val="Compact"/>
         <w:numPr>
           <w:ilvl w:val="0"/>
-          <w:numId w:val="1005"/>
+          <w:numId w:val="1004"/>
         </w:numPr>
       </w:pPr>
       <w:r>
@@ -1753,7 +1619,7 @@
         <w:pStyle w:val="Compact"/>
         <w:numPr>
           <w:ilvl w:val="0"/>
-          <w:numId w:val="1005"/>
+          <w:numId w:val="1004"/>
         </w:numPr>
       </w:pPr>
       <w:r>
@@ -1765,7 +1631,7 @@
         <w:pStyle w:val="Compact"/>
         <w:numPr>
           <w:ilvl w:val="0"/>
-          <w:numId w:val="1005"/>
+          <w:numId w:val="1004"/>
         </w:numPr>
       </w:pPr>
       <w:r>
@@ -1787,7 +1653,7 @@
         <w:pStyle w:val="Compact"/>
         <w:numPr>
           <w:ilvl w:val="0"/>
-          <w:numId w:val="1006"/>
+          <w:numId w:val="1005"/>
         </w:numPr>
       </w:pPr>
       <w:r>
@@ -1799,7 +1665,7 @@
         <w:pStyle w:val="Compact"/>
         <w:numPr>
           <w:ilvl w:val="0"/>
-          <w:numId w:val="1006"/>
+          <w:numId w:val="1005"/>
         </w:numPr>
       </w:pPr>
       <w:r>
@@ -1811,7 +1677,7 @@
         <w:pStyle w:val="Compact"/>
         <w:numPr>
           <w:ilvl w:val="0"/>
-          <w:numId w:val="1006"/>
+          <w:numId w:val="1005"/>
         </w:numPr>
       </w:pPr>
       <w:r>
@@ -1823,7 +1689,7 @@
         <w:pStyle w:val="Compact"/>
         <w:numPr>
           <w:ilvl w:val="0"/>
-          <w:numId w:val="1006"/>
+          <w:numId w:val="1005"/>
         </w:numPr>
       </w:pPr>
       <w:r>
@@ -1835,7 +1701,7 @@
         <w:pStyle w:val="Compact"/>
         <w:numPr>
           <w:ilvl w:val="0"/>
-          <w:numId w:val="1006"/>
+          <w:numId w:val="1005"/>
         </w:numPr>
       </w:pPr>
       <w:r>
@@ -1857,7 +1723,7 @@
         <w:pStyle w:val="Compact"/>
         <w:numPr>
           <w:ilvl w:val="0"/>
-          <w:numId w:val="1007"/>
+          <w:numId w:val="1006"/>
         </w:numPr>
       </w:pPr>
       <w:r>
@@ -1869,7 +1735,7 @@
         <w:pStyle w:val="Compact"/>
         <w:numPr>
           <w:ilvl w:val="0"/>
-          <w:numId w:val="1007"/>
+          <w:numId w:val="1006"/>
         </w:numPr>
       </w:pPr>
       <w:r>
@@ -1881,7 +1747,7 @@
         <w:pStyle w:val="Compact"/>
         <w:numPr>
           <w:ilvl w:val="0"/>
-          <w:numId w:val="1007"/>
+          <w:numId w:val="1006"/>
         </w:numPr>
       </w:pPr>
       <w:r>
@@ -1893,7 +1759,7 @@
         <w:pStyle w:val="Compact"/>
         <w:numPr>
           <w:ilvl w:val="0"/>
-          <w:numId w:val="1007"/>
+          <w:numId w:val="1006"/>
         </w:numPr>
       </w:pPr>
       <w:r>
@@ -1905,7 +1771,7 @@
         <w:pStyle w:val="Compact"/>
         <w:numPr>
           <w:ilvl w:val="0"/>
-          <w:numId w:val="1007"/>
+          <w:numId w:val="1006"/>
         </w:numPr>
       </w:pPr>
       <w:r>
@@ -1927,7 +1793,7 @@
         <w:pStyle w:val="Compact"/>
         <w:numPr>
           <w:ilvl w:val="0"/>
-          <w:numId w:val="1008"/>
+          <w:numId w:val="1007"/>
         </w:numPr>
       </w:pPr>
       <w:r>
@@ -1939,7 +1805,7 @@
         <w:pStyle w:val="Compact"/>
         <w:numPr>
           <w:ilvl w:val="0"/>
-          <w:numId w:val="1008"/>
+          <w:numId w:val="1007"/>
         </w:numPr>
       </w:pPr>
       <w:r>
@@ -1951,7 +1817,7 @@
         <w:pStyle w:val="Compact"/>
         <w:numPr>
           <w:ilvl w:val="0"/>
-          <w:numId w:val="1008"/>
+          <w:numId w:val="1007"/>
         </w:numPr>
       </w:pPr>
       <w:r>
@@ -1963,7 +1829,7 @@
         <w:pStyle w:val="Compact"/>
         <w:numPr>
           <w:ilvl w:val="0"/>
-          <w:numId w:val="1008"/>
+          <w:numId w:val="1007"/>
         </w:numPr>
       </w:pPr>
       <w:r>
@@ -1975,7 +1841,7 @@
         <w:pStyle w:val="Compact"/>
         <w:numPr>
           <w:ilvl w:val="0"/>
-          <w:numId w:val="1008"/>
+          <w:numId w:val="1007"/>
         </w:numPr>
       </w:pPr>
       <w:r>
@@ -1997,7 +1863,7 @@
         <w:pStyle w:val="Compact"/>
         <w:numPr>
           <w:ilvl w:val="0"/>
-          <w:numId w:val="1009"/>
+          <w:numId w:val="1008"/>
         </w:numPr>
       </w:pPr>
       <w:r>
@@ -2009,7 +1875,7 @@
         <w:pStyle w:val="Compact"/>
         <w:numPr>
           <w:ilvl w:val="0"/>
-          <w:numId w:val="1009"/>
+          <w:numId w:val="1008"/>
         </w:numPr>
       </w:pPr>
       <w:r>
@@ -2021,7 +1887,7 @@
         <w:pStyle w:val="Compact"/>
         <w:numPr>
           <w:ilvl w:val="0"/>
-          <w:numId w:val="1009"/>
+          <w:numId w:val="1008"/>
         </w:numPr>
       </w:pPr>
       <w:r>
@@ -2033,7 +1899,7 @@
         <w:pStyle w:val="Compact"/>
         <w:numPr>
           <w:ilvl w:val="0"/>
-          <w:numId w:val="1009"/>
+          <w:numId w:val="1008"/>
         </w:numPr>
       </w:pPr>
       <w:r>
@@ -2045,7 +1911,7 @@
         <w:pStyle w:val="Compact"/>
         <w:numPr>
           <w:ilvl w:val="0"/>
-          <w:numId w:val="1009"/>
+          <w:numId w:val="1008"/>
         </w:numPr>
       </w:pPr>
       <w:r>
@@ -2067,7 +1933,7 @@
         <w:pStyle w:val="Compact"/>
         <w:numPr>
           <w:ilvl w:val="0"/>
-          <w:numId w:val="1010"/>
+          <w:numId w:val="1009"/>
         </w:numPr>
       </w:pPr>
       <w:r>
@@ -2079,7 +1945,7 @@
         <w:pStyle w:val="Compact"/>
         <w:numPr>
           <w:ilvl w:val="0"/>
-          <w:numId w:val="1010"/>
+          <w:numId w:val="1009"/>
         </w:numPr>
       </w:pPr>
       <w:r>
@@ -2091,7 +1957,7 @@
         <w:pStyle w:val="Compact"/>
         <w:numPr>
           <w:ilvl w:val="0"/>
-          <w:numId w:val="1010"/>
+          <w:numId w:val="1009"/>
         </w:numPr>
       </w:pPr>
       <w:r>
@@ -2103,7 +1969,7 @@
         <w:pStyle w:val="Compact"/>
         <w:numPr>
           <w:ilvl w:val="0"/>
-          <w:numId w:val="1010"/>
+          <w:numId w:val="1009"/>
         </w:numPr>
       </w:pPr>
       <w:r>
@@ -2115,7 +1981,7 @@
         <w:pStyle w:val="Compact"/>
         <w:numPr>
           <w:ilvl w:val="0"/>
-          <w:numId w:val="1010"/>
+          <w:numId w:val="1009"/>
         </w:numPr>
       </w:pPr>
       <w:r>
@@ -2137,7 +2003,7 @@
         <w:pStyle w:val="Compact"/>
         <w:numPr>
           <w:ilvl w:val="0"/>
-          <w:numId w:val="1011"/>
+          <w:numId w:val="1010"/>
         </w:numPr>
       </w:pPr>
       <w:r>
@@ -2149,7 +2015,7 @@
         <w:pStyle w:val="Compact"/>
         <w:numPr>
           <w:ilvl w:val="0"/>
-          <w:numId w:val="1011"/>
+          <w:numId w:val="1010"/>
         </w:numPr>
       </w:pPr>
       <w:r>
@@ -2161,7 +2027,7 @@
         <w:pStyle w:val="Compact"/>
         <w:numPr>
           <w:ilvl w:val="0"/>
-          <w:numId w:val="1011"/>
+          <w:numId w:val="1010"/>
         </w:numPr>
       </w:pPr>
       <w:r>
@@ -2185,7 +2051,7 @@
         <w:pStyle w:val="Compact"/>
         <w:numPr>
           <w:ilvl w:val="0"/>
-          <w:numId w:val="1011"/>
+          <w:numId w:val="1010"/>
         </w:numPr>
       </w:pPr>
       <w:r>
@@ -2197,7 +2063,7 @@
         <w:pStyle w:val="Compact"/>
         <w:numPr>
           <w:ilvl w:val="0"/>
-          <w:numId w:val="1011"/>
+          <w:numId w:val="1010"/>
         </w:numPr>
       </w:pPr>
       <w:r>
@@ -2219,7 +2085,7 @@
         <w:pStyle w:val="Compact"/>
         <w:numPr>
           <w:ilvl w:val="0"/>
-          <w:numId w:val="1012"/>
+          <w:numId w:val="1011"/>
         </w:numPr>
       </w:pPr>
       <w:r>
@@ -2231,7 +2097,7 @@
         <w:pStyle w:val="Compact"/>
         <w:numPr>
           <w:ilvl w:val="0"/>
-          <w:numId w:val="1012"/>
+          <w:numId w:val="1011"/>
         </w:numPr>
       </w:pPr>
       <w:r>
@@ -2243,7 +2109,7 @@
         <w:pStyle w:val="Compact"/>
         <w:numPr>
           <w:ilvl w:val="0"/>
-          <w:numId w:val="1012"/>
+          <w:numId w:val="1011"/>
         </w:numPr>
       </w:pPr>
       <w:r>
@@ -2255,7 +2121,7 @@
         <w:pStyle w:val="Compact"/>
         <w:numPr>
           <w:ilvl w:val="0"/>
-          <w:numId w:val="1012"/>
+          <w:numId w:val="1011"/>
         </w:numPr>
       </w:pPr>
       <w:r>
@@ -2267,7 +2133,7 @@
         <w:pStyle w:val="Compact"/>
         <w:numPr>
           <w:ilvl w:val="0"/>
-          <w:numId w:val="1012"/>
+          <w:numId w:val="1011"/>
         </w:numPr>
       </w:pPr>
       <w:r>
@@ -2289,7 +2155,7 @@
         <w:pStyle w:val="Compact"/>
         <w:numPr>
           <w:ilvl w:val="0"/>
-          <w:numId w:val="1013"/>
+          <w:numId w:val="1012"/>
         </w:numPr>
       </w:pPr>
       <w:r>
@@ -2301,7 +2167,7 @@
         <w:pStyle w:val="Compact"/>
         <w:numPr>
           <w:ilvl w:val="0"/>
-          <w:numId w:val="1013"/>
+          <w:numId w:val="1012"/>
         </w:numPr>
       </w:pPr>
       <w:r>
@@ -2313,7 +2179,7 @@
         <w:pStyle w:val="Compact"/>
         <w:numPr>
           <w:ilvl w:val="0"/>
-          <w:numId w:val="1013"/>
+          <w:numId w:val="1012"/>
         </w:numPr>
       </w:pPr>
       <w:r>
@@ -2325,7 +2191,7 @@
         <w:pStyle w:val="Compact"/>
         <w:numPr>
           <w:ilvl w:val="0"/>
-          <w:numId w:val="1013"/>
+          <w:numId w:val="1012"/>
         </w:numPr>
       </w:pPr>
       <w:r>
@@ -2337,7 +2203,7 @@
         <w:pStyle w:val="Compact"/>
         <w:numPr>
           <w:ilvl w:val="0"/>
-          <w:numId w:val="1013"/>
+          <w:numId w:val="1012"/>
         </w:numPr>
       </w:pPr>
       <w:r>
@@ -2359,7 +2225,7 @@
         <w:pStyle w:val="Compact"/>
         <w:numPr>
           <w:ilvl w:val="0"/>
-          <w:numId w:val="1014"/>
+          <w:numId w:val="1013"/>
         </w:numPr>
       </w:pPr>
       <w:r>
@@ -2371,7 +2237,7 @@
         <w:pStyle w:val="Compact"/>
         <w:numPr>
           <w:ilvl w:val="0"/>
-          <w:numId w:val="1014"/>
+          <w:numId w:val="1013"/>
         </w:numPr>
       </w:pPr>
       <w:r>
@@ -2383,7 +2249,7 @@
         <w:pStyle w:val="Compact"/>
         <w:numPr>
           <w:ilvl w:val="0"/>
-          <w:numId w:val="1014"/>
+          <w:numId w:val="1013"/>
         </w:numPr>
       </w:pPr>
       <w:r>
@@ -2395,7 +2261,7 @@
         <w:pStyle w:val="Compact"/>
         <w:numPr>
           <w:ilvl w:val="0"/>
-          <w:numId w:val="1014"/>
+          <w:numId w:val="1013"/>
         </w:numPr>
       </w:pPr>
       <w:r>
@@ -2407,7 +2273,7 @@
         <w:pStyle w:val="Compact"/>
         <w:numPr>
           <w:ilvl w:val="0"/>
-          <w:numId w:val="1014"/>
+          <w:numId w:val="1013"/>
         </w:numPr>
       </w:pPr>
       <w:r>
@@ -3282,7 +3148,7 @@
         <w:pStyle w:val="Compact"/>
         <w:numPr>
           <w:ilvl w:val="0"/>
-          <w:numId w:val="1015"/>
+          <w:numId w:val="1014"/>
         </w:numPr>
       </w:pPr>
       <w:r>
@@ -3294,7 +3160,7 @@
         <w:pStyle w:val="Compact"/>
         <w:numPr>
           <w:ilvl w:val="0"/>
-          <w:numId w:val="1015"/>
+          <w:numId w:val="1014"/>
         </w:numPr>
       </w:pPr>
       <w:r>
@@ -3306,7 +3172,7 @@
         <w:pStyle w:val="Compact"/>
         <w:numPr>
           <w:ilvl w:val="0"/>
-          <w:numId w:val="1015"/>
+          <w:numId w:val="1014"/>
         </w:numPr>
       </w:pPr>
       <w:r>
@@ -3370,7 +3236,7 @@
         <w:pStyle w:val="Compact"/>
         <w:numPr>
           <w:ilvl w:val="0"/>
-          <w:numId w:val="1016"/>
+          <w:numId w:val="1015"/>
         </w:numPr>
       </w:pPr>
       <w:r>
@@ -3382,7 +3248,7 @@
         <w:pStyle w:val="Compact"/>
         <w:numPr>
           <w:ilvl w:val="0"/>
-          <w:numId w:val="1016"/>
+          <w:numId w:val="1015"/>
         </w:numPr>
       </w:pPr>
       <w:r>
@@ -3394,7 +3260,7 @@
         <w:pStyle w:val="Compact"/>
         <w:numPr>
           <w:ilvl w:val="0"/>
-          <w:numId w:val="1016"/>
+          <w:numId w:val="1015"/>
         </w:numPr>
       </w:pPr>
       <w:r>
@@ -3531,7 +3397,7 @@
         <w:pStyle w:val="BodyText"/>
       </w:pPr>
       <w:r>
-        <w:t xml:space="preserve">Risc de fletxes: quan el tribunal vegi fletxes cap a fora, aclareix si representen flux d’execució. Quan parlis d’implementació o dependència de codi, la direcció correcta és adaptador cap al port.</w:t>
+        <w:t xml:space="preserve">Risc de lectura de fletxes: no presentar totes les fletxes com si signifiquessin el mateix. Quan representen ús o flux d’execució, poden sortir del servei cap als ports. Quan representen implementació o dependència de codi, la lectura correcta és de l’adaptador cap al port.</w:t>
       </w:r>
     </w:p>
     <w:p>
@@ -3843,9 +3709,6 @@
     <w:abstractNumId w:val="991"/>
   </w:num>
   <w:num w:numId="1015">
-    <w:abstractNumId w:val="991"/>
-  </w:num>
-  <w:num w:numId="1016">
     <w:abstractNumId w:val="991"/>
   </w:num>
 </w:numbering>

</xml_diff>

<commit_message>
docs: regenerate final defense practice artifacts
</commit_message>
<xml_diff>
--- a/doc/presentations/defensa-placa-permanent-dsi-ports-sortida-hexagonal/output/materials-orals-canonics-20-minuts.docx
+++ b/doc/presentations/defensa-placa-permanent-dsi-ports-sortida-hexagonal/output/materials-orals-canonics-20-minuts.docx
@@ -1,8 +1,16 @@
 
 <file path=word/document.xml><?xml version="1.0" encoding="utf-8"?>
-<w:document xmlns:w="http://schemas.openxmlformats.org/wordprocessingml/2006/main" xmlns:m="http://schemas.openxmlformats.org/officeDocument/2006/math" xmlns:r="http://schemas.openxmlformats.org/officeDocument/2006/relationships" xmlns:o="urn:schemas-microsoft-com:office:office" xmlns:v="urn:schemas-microsoft-com:vml" xmlns:w10="urn:schemas-microsoft-com:office:word" xmlns:a="http://schemas.openxmlformats.org/drawingml/2006/main" xmlns:pic="http://schemas.openxmlformats.org/drawingml/2006/picture" xmlns:wp="http://schemas.openxmlformats.org/drawingml/2006/wordprocessingDrawing">
+<w:document xmlns:w="http://schemas.openxmlformats.org/wordprocessingml/2006/main">
   <w:body>
-    <w:bookmarkStart w:id="40" w:name="X79cee1dd7752e91aad864bc270c2d5ac95f00d7"/>
+    <w:p>
+      <w:pPr>
+        <w:pStyle w:val="Title"/>
+      </w:pPr>
+      <w:r>
+        <w:t xml:space="preserve">Materials orals canònics</w:t>
+      </w:r>
+    </w:p>
+    <w:bookmarkStart w:id="38" w:name="X79cee1dd7752e91aad864bc270c2d5ac95f00d7"/>
     <w:p>
       <w:pPr>
         <w:pStyle w:val="Heading1"/>
@@ -147,13 +155,13 @@
         <w:t xml:space="preserve">i altres esborranys previs.</w:t>
       </w:r>
     </w:p>
-    <w:bookmarkStart w:id="9" w:name="diagnòstic-general"/>
+    <w:bookmarkStart w:id="21" w:name="guió-oral-complet-imprimible"/>
     <w:p>
       <w:pPr>
         <w:pStyle w:val="Heading2"/>
       </w:pPr>
       <w:r>
-        <w:t xml:space="preserve">1. Diagnòstic general</w:t>
+        <w:t xml:space="preserve">1. Guió oral complet imprimible</w:t>
       </w:r>
     </w:p>
     <w:p>
@@ -161,41 +169,16 @@
         <w:pStyle w:val="FirstParagraph"/>
       </w:pPr>
       <w:r>
-        <w:t xml:space="preserve">La presentació té un fil narratiu acadèmicament defensable: situa la classe dins Disseny de Sistemes d’Informació, formula un objectiu d’aprenentatge concret, parteix d’un cas real d’administració pública, diagnostica l’acoblament tecnològic, presenta el port de sortida i transfereix el patró a HexaStock. Aquesta estructura és adequada per a un tribunal perquè no presenta només tecnologia, sinó una decisió de disseny vinculada a docència, experiència professional i rigor arquitectònic.</w:t>
-      </w:r>
-    </w:p>
-    <w:p>
-      <w:pPr>
-        <w:pStyle w:val="BodyText"/>
-      </w:pPr>
-      <w:r>
-        <w:t xml:space="preserve">El punt més fort és la connexió entre el pla docent i l’informe AGAUR. El pla docent situa l’assignatura a tercer curs, 6 ECTS, amb continguts de clean o hexagonal architecture, ports i adaptadors, mapping entre capes, organització en mòduls, microserveis i DDD. L’informe AGAUR acredita una activitat professional especialitzada vinculada a arquitectura hexagonal i sistemes d’informació.</w:t>
-      </w:r>
-    </w:p>
-    <w:p>
-      <w:pPr>
-        <w:pStyle w:val="BodyText"/>
-      </w:pPr>
-      <w:r>
-        <w:t xml:space="preserve">El punt conceptual que cal preservar és la distinció entre tres plans diferents: flux d’execució, dependència de codi i dependència arquitectònica. Aquesta millora ja queda incorporada als diagrames principals: quan la fletxa representa implementació, apunta de l’adaptador cap al port; quan representa ús o flux d’execució, pot sortir del servei cap al port i cap al sistema extern. Les dues lectures són compatibles, però s’han de distingir oralment amb precisió.</w:t>
-      </w:r>
-    </w:p>
-    <w:p>
-      <w:pPr>
-        <w:pStyle w:val="BodyText"/>
-      </w:pPr>
-      <w:r>
-        <w:t xml:space="preserve">S’han revisat també els detalls formals del text visible de la presentació: ortografia, accents, apòstrofs, cometes, noms propis i numeració visible de les diapositives. La terminologia de desacoblament ja queda formulada de manera correcta i coherent.</w:t>
-      </w:r>
-    </w:p>
-    <w:bookmarkEnd w:id="9"/>
-    <w:bookmarkStart w:id="10" w:name="estat-de-les-millores-per-diapositiva"/>
-    <w:p>
-      <w:pPr>
-        <w:pStyle w:val="Heading2"/>
-      </w:pPr>
-      <w:r>
-        <w:t xml:space="preserve">2. Estat de les millores per diapositiva</w:t>
+        <w:t xml:space="preserve">Temps total previst: 20:00.</w:t>
+      </w:r>
+    </w:p>
+    <w:bookmarkStart w:id="9" w:name="diapositiva-1.-portada---145"/>
+    <w:p>
+      <w:pPr>
+        <w:pStyle w:val="Heading3"/>
+      </w:pPr>
+      <w:r>
+        <w:t xml:space="preserve">Diapositiva 1. Portada - 1:45</w:t>
       </w:r>
     </w:p>
     <w:p>
@@ -203,39 +186,15 @@
         <w:pStyle w:val="FirstParagraph"/>
       </w:pPr>
       <w:r>
-        <w:rPr>
-          <w:b/>
-          <w:bCs/>
-        </w:rPr>
-        <w:t xml:space="preserve">Diapositiva 1. Portada</w:t>
-      </w:r>
-    </w:p>
-    <w:p>
-      <w:pPr>
-        <w:pStyle w:val="BodyText"/>
-      </w:pPr>
-      <w:r>
-        <w:t xml:space="preserve">Mantindria el títol. És clar, tècnic i ajustat. Afegiria oralment, no necessàriament a la diapositiva, que l’informe AGAUR està incorporat a la documentació del tribunal com a evidència de la connexió entre docència i pràctica professional. No carregaria la portada amb més text.</w:t>
-      </w:r>
-    </w:p>
-    <w:p>
-      <w:pPr>
-        <w:pStyle w:val="BodyText"/>
-      </w:pPr>
-      <w:r>
-        <w:rPr>
-          <w:b/>
-          <w:bCs/>
-        </w:rPr>
-        <w:t xml:space="preserve">Diapositiva 2. On som dins l’assignatura</w:t>
-      </w:r>
-    </w:p>
-    <w:p>
-      <w:pPr>
-        <w:pStyle w:val="BodyText"/>
-      </w:pPr>
-      <w:r>
-        <w:t xml:space="preserve">La diapositiva funciona. S’ha reforçat el vincle amb el pla docent amb una referència discreta:</w:t>
+        <w:t xml:space="preserve">Bon dia, membres del tribunal. [pausa breu, mirada al tribunal]</w:t>
+      </w:r>
+    </w:p>
+    <w:p>
+      <w:pPr>
+        <w:pStyle w:val="BodyText"/>
+      </w:pPr>
+      <w:r>
+        <w:t xml:space="preserve">La classe que presento porta per títol</w:t>
       </w:r>
       <w:r>
         <w:t xml:space="preserve"> </w:t>
@@ -244,50 +203,242 @@
         <w:rPr>
           <w:rStyle w:val="VerbatimChar"/>
         </w:rPr>
-        <w:t xml:space="preserve">Pla docent 103322: clean/hexagonal architecture, ports i adaptadors, mapping, mòduls i DDD</w:t>
-      </w:r>
-      <w:r>
-        <w:t xml:space="preserve">. No cal citar tot el pla docent; amb aquesta referència n’hi ha prou.</w:t>
-      </w:r>
-    </w:p>
-    <w:p>
-      <w:pPr>
-        <w:pStyle w:val="BodyText"/>
-      </w:pPr>
-      <w:r>
-        <w:rPr>
-          <w:b/>
-          <w:bCs/>
-        </w:rPr>
-        <w:t xml:space="preserve">Diapositiva 3. Objectiu de la sessió</w:t>
-      </w:r>
-    </w:p>
-    <w:p>
-      <w:pPr>
-        <w:pStyle w:val="BodyText"/>
-      </w:pPr>
-      <w:r>
-        <w:t xml:space="preserve">Correcció aplicada. Les antigues diapositives 3 i 4 s’han fusionat en una sola diapositiva pont, més lleugera i sense diagrama. La diapositiva presenta només el principi de treball —el cas d’ús necessita una capacitat, no una tecnologia— i les tres accions observables: identificar una necessitat, definir un port de sortida i implementar adaptadors. La funció d’aquesta diapositiva és situar l’objectiu sense frenar l’entrada al cas real.</w:t>
-      </w:r>
-    </w:p>
-    <w:p>
-      <w:pPr>
-        <w:pStyle w:val="BodyText"/>
-      </w:pPr>
-      <w:r>
-        <w:rPr>
-          <w:b/>
-          <w:bCs/>
-        </w:rPr>
-        <w:t xml:space="preserve">Diapositiva 4. Avaluació econòmica d’una beca</w:t>
-      </w:r>
-    </w:p>
-    <w:p>
-      <w:pPr>
-        <w:pStyle w:val="BodyText"/>
-      </w:pPr>
-      <w:r>
-        <w:t xml:space="preserve">La diapositiva situa bé el cas funcional abans de la tecnologia. S’hi ha incorporat una formulació més institucional i prudent:</w:t>
+        <w:t xml:space="preserve">Disseny de ports de sortida en arquitectura hexagonal</w:t>
+      </w:r>
+      <w:r>
+        <w:t xml:space="preserve">, i se centra en el desacoblament entre casos d’ús, domini i APIs externes. [assenyalar el títol]</w:t>
+      </w:r>
+    </w:p>
+    <w:p>
+      <w:pPr>
+        <w:pStyle w:val="BodyText"/>
+      </w:pPr>
+      <w:r>
+        <w:t xml:space="preserve">Abans d’entrar en el contingut tècnic, voldria fer una precisió de context. A la documentació de la convocatòria he incorporat un informe acreditatiu de la meva activitat de consultoria especialitzada per a la Generalitat de Catalunya, concretament l’Agència de Gestió d’Ajuts Universitaris i de Recerca. [pausa breu]</w:t>
+      </w:r>
+    </w:p>
+    <w:p>
+      <w:pPr>
+        <w:pStyle w:val="BodyText"/>
+      </w:pPr>
+      <w:r>
+        <w:t xml:space="preserve">Ho explico perquè em semblava molt enriquidor plantejar aquesta sessió com una trobada entre dues dimensions.</w:t>
+      </w:r>
+    </w:p>
+    <w:p>
+      <w:pPr>
+        <w:pStyle w:val="BodyText"/>
+      </w:pPr>
+      <w:r>
+        <w:t xml:space="preserve">D’una banda, la dimensió acadèmica: l’assignatura de Disseny de Sistemes d’Informació, on treballem conceptes com arquitectura hexagonal, ports, adaptadors i inversió de dependències.</w:t>
+      </w:r>
+    </w:p>
+    <w:p>
+      <w:pPr>
+        <w:pStyle w:val="BodyText"/>
+      </w:pPr>
+      <w:r>
+        <w:t xml:space="preserve">I de l’altra, la dimensió professional: un cas real que ens permet veure com aquests conceptes s’aterren en reptes concrets d’arquitectura de software. [mirada al tribunal]</w:t>
+      </w:r>
+    </w:p>
+    <w:p>
+      <w:pPr>
+        <w:pStyle w:val="BodyText"/>
+      </w:pPr>
+      <w:r>
+        <w:t xml:space="preserve">En vint minuts no seria rigorós intentar explicar tota l’arquitectura hexagonal. Per això em centraré en una decisió concreta: com dissenyar un port de sortida quan un cas d’ús necessita informació que es troba fora de l’aplicació.</w:t>
+      </w:r>
+    </w:p>
+    <w:bookmarkEnd w:id="9"/>
+    <w:bookmarkStart w:id="10" w:name="Xbd8d813bdf1f660b3e63d6e4e001ea5920e5fb0"/>
+    <w:p>
+      <w:pPr>
+        <w:pStyle w:val="Heading3"/>
+      </w:pPr>
+      <w:r>
+        <w:t xml:space="preserve">Diapositiva 2. On som dins l’assignatura - 1:10</w:t>
+      </w:r>
+    </w:p>
+    <w:p>
+      <w:pPr>
+        <w:pStyle w:val="FirstParagraph"/>
+      </w:pPr>
+      <w:r>
+        <w:t xml:space="preserve">La sessió se situa dins Disseny de Sistemes d’Informació, una assignatura obligatòria de tercer curs, de 6 ECTS. [assenyalar la part esquerra]</w:t>
+      </w:r>
+    </w:p>
+    <w:p>
+      <w:pPr>
+        <w:pStyle w:val="BodyText"/>
+      </w:pPr>
+      <w:r>
+        <w:t xml:space="preserve">El pla docent de l’assignatura explica que s’hi treballa una visió global d’arquitectures de sistemes d’informació: arquitectures per capes, arquitectures clean o hexagonals, i arquitectures basades en microserveis. Dins el bloc d’arquitectures clean o hexagonals hi apareixen explícitament ports i adaptadors, mapping entre capes i organització en mòduls. [to calmat, explicatiu]</w:t>
+      </w:r>
+    </w:p>
+    <w:p>
+      <w:pPr>
+        <w:pStyle w:val="BodyText"/>
+      </w:pPr>
+      <w:r>
+        <w:t xml:space="preserve">Per tant, aquesta no és una sessió afegida artificialment al temari. És una classe versemblant dins l’assignatura. [pausa breu]</w:t>
+      </w:r>
+    </w:p>
+    <w:p>
+      <w:pPr>
+        <w:pStyle w:val="BodyText"/>
+      </w:pPr>
+      <w:r>
+        <w:t xml:space="preserve">El que farem avui és acotar molt el focus. No analitzarem tota l’arquitectura hexagonal. Ens centrarem en els ports de sortida: aquells ports que permeten que l’aplicació obtingui o persisteixi informació mitjançant sistemes externs, sense que el cas d’ús quedi lligat a una tecnologia concreta.</w:t>
+      </w:r>
+    </w:p>
+    <w:bookmarkEnd w:id="10"/>
+    <w:bookmarkStart w:id="11" w:name="X3696606fd6d9b6d83d02a9073392ba28f4d25a2"/>
+    <w:p>
+      <w:pPr>
+        <w:pStyle w:val="Heading3"/>
+      </w:pPr>
+      <w:r>
+        <w:t xml:space="preserve">Diapositiva 3. Objectiu de la sessió - 0:55</w:t>
+      </w:r>
+    </w:p>
+    <w:p>
+      <w:pPr>
+        <w:pStyle w:val="FirstParagraph"/>
+      </w:pPr>
+      <w:r>
+        <w:t xml:space="preserve">Abans d’entrar en el cas, deixo formulat l’objectiu de la sessió. [pausa breu]</w:t>
+      </w:r>
+    </w:p>
+    <w:p>
+      <w:pPr>
+        <w:pStyle w:val="BodyText"/>
+      </w:pPr>
+      <w:r>
+        <w:t xml:space="preserve">El principi de treball és aquest: el cas d’ús necessita una capacitat, no una tecnologia. [mirar el tribunal]</w:t>
+      </w:r>
+    </w:p>
+    <w:p>
+      <w:pPr>
+        <w:pStyle w:val="BodyText"/>
+      </w:pPr>
+      <w:r>
+        <w:t xml:space="preserve">Per tant, el que aprendrem és a fer tres operacions: identificar una necessitat externa del cas d’ús, expressar-la com a port de sortida i implementar-la mitjançant adaptadors substituïbles. [assenyalar les tres caixes]</w:t>
+      </w:r>
+    </w:p>
+    <w:p>
+      <w:pPr>
+        <w:pStyle w:val="BodyText"/>
+      </w:pPr>
+      <w:r>
+        <w:t xml:space="preserve">No desenvoluparé encara tota l’abstracció. Primer veurem el problema en un cas real d’administració pública, i a partir d’aquí formularem la decisió arquitectònica. [pausa breu]</w:t>
+      </w:r>
+    </w:p>
+    <w:bookmarkEnd w:id="11"/>
+    <w:bookmarkStart w:id="12" w:name="Xe44e148b7ebe898f3299718f45351b6467fee24"/>
+    <w:p>
+      <w:pPr>
+        <w:pStyle w:val="Heading3"/>
+      </w:pPr>
+      <w:r>
+        <w:t xml:space="preserve">Diapositiva 4. Avaluació econòmica d’una beca - 1:50</w:t>
+      </w:r>
+    </w:p>
+    <w:p>
+      <w:pPr>
+        <w:pStyle w:val="FirstParagraph"/>
+      </w:pPr>
+      <w:r>
+        <w:t xml:space="preserve">Abans de parlar d’arquitectura de software, cal entendre mínimament el procediment administratiu. [to més lent]</w:t>
+      </w:r>
+    </w:p>
+    <w:p>
+      <w:pPr>
+        <w:pStyle w:val="BodyText"/>
+      </w:pPr>
+      <w:r>
+        <w:t xml:space="preserve">En un procediment de beca, una sol·licitud dona lloc a un expedient. Aquest expedient passa per diferents fases: requisits generals, requisits econòmics, revisió acadèmica i resolució. [assenyalar la seqüència de la dreta]</w:t>
+      </w:r>
+    </w:p>
+    <w:p>
+      <w:pPr>
+        <w:pStyle w:val="BodyText"/>
+      </w:pPr>
+      <w:r>
+        <w:t xml:space="preserve">La part que ens interessa és l’avaluació econòmica. En aquest punt es comproven aspectes com la renda familiar i el patrimoni. Quan no s’acredita el compliment dels requisits econòmics, l’expedient no obté una valoració favorable en aquesta fase. [pausa breu]</w:t>
+      </w:r>
+    </w:p>
+    <w:p>
+      <w:pPr>
+        <w:pStyle w:val="BodyText"/>
+      </w:pPr>
+      <w:r>
+        <w:t xml:space="preserve">La idea docent important és que aquí encara no hem parlat de SOAP, ni de REST, ni de PICA, ni de cap base de dades. Estem parlant de la necessitat funcional del procediment: per poder aplicar uns criteris econòmics, el sistema necessita dades fiables sobre renda i patrimoni.</w:t>
+      </w:r>
+    </w:p>
+    <w:p>
+      <w:pPr>
+        <w:pStyle w:val="BodyText"/>
+      </w:pPr>
+      <w:r>
+        <w:t xml:space="preserve">Aquest pas és essencial. Si comencem directament per la tecnologia, correm el risc de construir el cas d’ús al voltant de la integració. En canvi, si comencem pel procediment, podem distingir entre la decisió administrativa que volem modelar i el mecanisme tècnic que ens proporciona la informació.</w:t>
+      </w:r>
+    </w:p>
+    <w:bookmarkEnd w:id="12"/>
+    <w:bookmarkStart w:id="13" w:name="X49d8499aef8096cf0d8707c0a2b10b4e00df2f8"/>
+    <w:p>
+      <w:pPr>
+        <w:pStyle w:val="Heading3"/>
+      </w:pPr>
+      <w:r>
+        <w:t xml:space="preserve">Diapositiva 5. Quina informació externa necessita el procediment? - 2:00</w:t>
+      </w:r>
+    </w:p>
+    <w:p>
+      <w:pPr>
+        <w:pStyle w:val="FirstParagraph"/>
+      </w:pPr>
+      <w:r>
+        <w:t xml:space="preserve">Per avaluar renda i patrimoni, el procediment pot necessitar informació que no neix dins l’aplicació. [assenyalar la columna de necessitats]</w:t>
+      </w:r>
+    </w:p>
+    <w:p>
+      <w:pPr>
+        <w:pStyle w:val="BodyText"/>
+      </w:pPr>
+      <w:r>
+        <w:t xml:space="preserve">En termes funcionals, podem parlar de renda familiar, patrimoni i béns immobles. En termes de fonts administratives, apareixen organismes i plataformes com l’AEAT, el Cadastre i PICA. [assenyalar la columna de fonts]</w:t>
+      </w:r>
+    </w:p>
+    <w:p>
+      <w:pPr>
+        <w:pStyle w:val="BodyText"/>
+      </w:pPr>
+      <w:r>
+        <w:t xml:space="preserve">PICA és la Plataforma d’Integració i Col·laboració Administrativa de la Generalitat de Catalunya. Per a aquesta classe, no cal entrar en tots els detalls tècnics de PICA. El que ens interessa és que actua com a mecanisme corporatiu d’interoperabilitat administrativa.</w:t>
+      </w:r>
+    </w:p>
+    <w:p>
+      <w:pPr>
+        <w:pStyle w:val="BodyText"/>
+      </w:pPr>
+      <w:r>
+        <w:t xml:space="preserve">La distinció clau és aquesta: el procediment necessita informació administrativa; no necessita, en el seu llenguatge propi, una API concreta. [pausa llarga; mirar el tribunal]</w:t>
+      </w:r>
+    </w:p>
+    <w:p>
+      <w:pPr>
+        <w:pStyle w:val="BodyText"/>
+      </w:pPr>
+      <w:r>
+        <w:t xml:space="preserve">Això no vol dir que el mecanisme tècnic concret no sigui important. Ho és, i molt. Però encara no som en aquest nivell de decisió. En aquest moment, el que volem destacar és que el cas d’ús ha d’expressar una necessitat del procediment, no una dependència tecnològica concreta.</w:t>
+      </w:r>
+    </w:p>
+    <w:p>
+      <w:pPr>
+        <w:pStyle w:val="BodyText"/>
+      </w:pPr>
+      <w:r>
+        <w:t xml:space="preserve">El cas d’ús hauria de poder formular-se així:</w:t>
       </w:r>
       <w:r>
         <w:t xml:space="preserve"> </w:t>
@@ -296,129 +447,176 @@
         <w:rPr>
           <w:rStyle w:val="VerbatimChar"/>
         </w:rPr>
-        <w:t xml:space="preserve">Quan no s'acredita el compliment dels requisits econòmics, l'expedient no obté una valoració favorable en aquesta fase.</w:t>
-      </w:r>
-      <w:r>
-        <w:t xml:space="preserve"> </w:t>
-      </w:r>
-      <w:r>
-        <w:t xml:space="preserve">El diagrama petit pot ser difícil de llegir; si no es retoca, cal assenyalar només el bloc d’avaluació econòmica.</w:t>
-      </w:r>
-    </w:p>
-    <w:p>
-      <w:pPr>
-        <w:pStyle w:val="BodyText"/>
-      </w:pPr>
-      <w:r>
-        <w:rPr>
-          <w:b/>
-          <w:bCs/>
-        </w:rPr>
-        <w:t xml:space="preserve">Diapositiva 5. Informació externa</w:t>
-      </w:r>
-    </w:p>
-    <w:p>
-      <w:pPr>
-        <w:pStyle w:val="BodyText"/>
-      </w:pPr>
-      <w:r>
-        <w:t xml:space="preserve">La idea és molt bona: necessitat funcional abans que API concreta. La definició de PICA s’ha simplificat per evitar una nota massa llarga. La resta s’explica oralment.</w:t>
-      </w:r>
-    </w:p>
-    <w:p>
-      <w:pPr>
-        <w:pStyle w:val="BodyText"/>
-      </w:pPr>
-      <w:r>
-        <w:rPr>
-          <w:b/>
-          <w:bCs/>
-        </w:rPr>
-        <w:t xml:space="preserve">Diapositiva 6. Dependència directa</w:t>
-      </w:r>
-    </w:p>
-    <w:p>
-      <w:pPr>
-        <w:pStyle w:val="BodyText"/>
-      </w:pPr>
-      <w:r>
-        <w:t xml:space="preserve">Funciona com a diapositiva de problema. Recomanació: si no es vol aportar una font pública específica sobre</w:t>
-      </w:r>
-      <w:r>
-        <w:t xml:space="preserve"> </w:t>
-      </w:r>
-      <w:r>
-        <w:rPr>
-          <w:rStyle w:val="VerbatimChar"/>
-        </w:rPr>
-        <w:t xml:space="preserve">principis del CTTI</w:t>
-      </w:r>
-      <w:r>
-        <w:t xml:space="preserve">, suavitzar la frase inicial:</w:t>
-      </w:r>
-      <w:r>
-        <w:t xml:space="preserve"> </w:t>
-      </w:r>
-      <w:r>
-        <w:rPr>
-          <w:rStyle w:val="VerbatimChar"/>
-        </w:rPr>
-        <w:t xml:space="preserve">En arquitectures corporatives, l'orientació habitual és reduir l'acoblament i encapsular la integració amb sistemes externs</w:t>
-      </w:r>
-      <w:r>
-        <w:t xml:space="preserve">. Mantindria la frase final:</w:t>
-      </w:r>
-      <w:r>
-        <w:t xml:space="preserve"> </w:t>
-      </w:r>
-      <w:r>
-        <w:rPr>
-          <w:rStyle w:val="VerbatimChar"/>
-        </w:rPr>
-        <w:t xml:space="preserve">El problema no és consumir PICA; és que el procediment en depengui directament</w:t>
-      </w:r>
-      <w:r>
-        <w:t xml:space="preserve">.</w:t>
-      </w:r>
-    </w:p>
-    <w:p>
-      <w:pPr>
-        <w:pStyle w:val="BodyText"/>
-      </w:pPr>
-      <w:r>
-        <w:rPr>
-          <w:b/>
-          <w:bCs/>
-        </w:rPr>
-        <w:t xml:space="preserve">Diapositiva 7. Port de sortida i adaptador</w:t>
-      </w:r>
-    </w:p>
-    <w:p>
-      <w:pPr>
-        <w:pStyle w:val="BodyText"/>
-      </w:pPr>
-      <w:r>
-        <w:t xml:space="preserve">La diapositiva funciona com a esquema de flux d’execució: cas d’ús, port, adaptador i sistema extern. No cal carregar-la amb una segona notació gràfica. Oralment convé aclarir que aquesta seqüència mostra el camí de la crida, mentre que la dependència de codi queda expressada en els diagrames següents: el servei usa el port i l’adaptador implementa el port.</w:t>
-      </w:r>
-    </w:p>
-    <w:p>
-      <w:pPr>
-        <w:pStyle w:val="BodyText"/>
-      </w:pPr>
-      <w:r>
-        <w:rPr>
-          <w:b/>
-          <w:bCs/>
-        </w:rPr>
-        <w:t xml:space="preserve">Diapositiva 8. Port de sortida per a informació patrimonial</w:t>
-      </w:r>
-    </w:p>
-    <w:p>
-      <w:pPr>
-        <w:pStyle w:val="BodyText"/>
-      </w:pPr>
-      <w:r>
-        <w:t xml:space="preserve">Correcció aplicada. El diagrama ja diferencia el flux d’ús del servei cap als ports i la implementació dels ports per part dels adaptadors. Les fletxes</w:t>
+        <w:t xml:space="preserve">necessito informació patrimonial avaluable</w:t>
+      </w:r>
+      <w:r>
+        <w:t xml:space="preserve">. Encara no estem decidint si aquesta informació arribarà a través de PICA, d’un servei SOAP, d’una API REST, d’un certificat, d’una base de dades corporativa o d’un altre mecanisme futur.</w:t>
+      </w:r>
+    </w:p>
+    <w:p>
+      <w:pPr>
+        <w:pStyle w:val="BodyText"/>
+      </w:pPr>
+      <w:r>
+        <w:t xml:space="preserve">Quan aquesta separació no es respecta, apareix el problema arquitectònic que veurem ara.</w:t>
+      </w:r>
+    </w:p>
+    <w:bookmarkEnd w:id="13"/>
+    <w:bookmarkStart w:id="14" w:name="X84147f10029592ec3bd146ffb3a5109a19eca0d"/>
+    <w:p>
+      <w:pPr>
+        <w:pStyle w:val="Heading3"/>
+      </w:pPr>
+      <w:r>
+        <w:t xml:space="preserve">Diapositiva 6. Dependència directa entre procediment i integració - 2:10</w:t>
+      </w:r>
+    </w:p>
+    <w:p>
+      <w:pPr>
+        <w:pStyle w:val="FirstParagraph"/>
+      </w:pPr>
+      <w:r>
+        <w:t xml:space="preserve">Imaginem una situació en què el cas d’ús queda vinculat directament a la cadena tècnica: SOAP/XML, PICA, AEAT o Cadastre. [assenyalar la cadena central]</w:t>
+      </w:r>
+    </w:p>
+    <w:p>
+      <w:pPr>
+        <w:pStyle w:val="BodyText"/>
+      </w:pPr>
+      <w:r>
+        <w:t xml:space="preserve">El problema no és consumir PICA. Ho remarco perquè és important. PICA, en aquest context, és una plataforma corporativa d’interoperabilitat. El problema arquitectònic apareix quan la lògica del procediment administratiu depèn directament dels detalls de la integració: DTOs externs, estructures XML, clients SOAP, codis d’error tècnics o convencions d’una API concreta. [pausa breu]</w:t>
+      </w:r>
+    </w:p>
+    <w:p>
+      <w:pPr>
+        <w:pStyle w:val="BodyText"/>
+      </w:pPr>
+      <w:r>
+        <w:t xml:space="preserve">Quan això passa, l’evolució tecnològica travessa la frontera del cas d’ús. Si un servei evoluciona, si canvia el contracte tècnic, si cal passar de SOAP a REST, o si apareix un altre mecanisme corporatiu, el canvi pot impactar codi que hauria d’estar expressant criteris del procediment.</w:t>
+      </w:r>
+    </w:p>
+    <w:p>
+      <w:pPr>
+        <w:pStyle w:val="BodyText"/>
+      </w:pPr>
+      <w:r>
+        <w:t xml:space="preserve">Des del punt de vista de l’enginyeria de software, això incrementa tres riscos. Primer, acoblament tecnològic: el cas d’ús coneix massa detalls externs. Segon, fragilitat del manteniment: canvis d’infraestructura obliguen a revisar lògica d’aplicació. I tercer, risc de continuïtat operativa: una evolució tècnica pot afectar un procediment que hauria de romandre estable. [assenyalar les tres caixes]</w:t>
+      </w:r>
+    </w:p>
+    <w:p>
+      <w:pPr>
+        <w:pStyle w:val="BodyText"/>
+      </w:pPr>
+      <w:r>
+        <w:t xml:space="preserve">La pregunta docent, per tant, és: com podem permetre que el cas d’ús necessiti dades externes, però sense dependre directament de la tecnologia que les proporciona?</w:t>
+      </w:r>
+    </w:p>
+    <w:p>
+      <w:pPr>
+        <w:pStyle w:val="BodyText"/>
+      </w:pPr>
+      <w:r>
+        <w:t xml:space="preserve">La resposta és introduir un port de sortida.</w:t>
+      </w:r>
+    </w:p>
+    <w:bookmarkEnd w:id="14"/>
+    <w:bookmarkStart w:id="15" w:name="X1b46c11a0007e42ff86c8d65e9cc641b28b5559"/>
+    <w:p>
+      <w:pPr>
+        <w:pStyle w:val="Heading3"/>
+      </w:pPr>
+      <w:r>
+        <w:t xml:space="preserve">Diapositiva 7. Port de sortida i adaptador - 0:55</w:t>
+      </w:r>
+    </w:p>
+    <w:p>
+      <w:pPr>
+        <w:pStyle w:val="FirstParagraph"/>
+      </w:pPr>
+      <w:r>
+        <w:t xml:space="preserve">Abans d’aplicar-ho al cas patrimonial, fixem una distinció important.</w:t>
+      </w:r>
+    </w:p>
+    <w:p>
+      <w:pPr>
+        <w:pStyle w:val="BodyText"/>
+      </w:pPr>
+      <w:r>
+        <w:t xml:space="preserve">Una cosa és el flux d’execució: el cas d’ús demana una informació i aquesta informació pot acabar venint d’un sistema extern. [assenyalar la primera línia]</w:t>
+      </w:r>
+    </w:p>
+    <w:p>
+      <w:pPr>
+        <w:pStyle w:val="BodyText"/>
+      </w:pPr>
+      <w:r>
+        <w:t xml:space="preserve">Una altra cosa és la dependència de codi: el cas d’ús depèn del port, i l’adaptador implementa aquest port. [assenyalar la segona línia]</w:t>
+      </w:r>
+    </w:p>
+    <w:p>
+      <w:pPr>
+        <w:pStyle w:val="BodyText"/>
+      </w:pPr>
+      <w:r>
+        <w:t xml:space="preserve">Aquesta és la inversió de dependències: la infraestructura depèn del port definit per l’aplicació, no a l’inrevés. [mirada al tribunal]</w:t>
+      </w:r>
+    </w:p>
+    <w:p>
+      <w:pPr>
+        <w:pStyle w:val="BodyText"/>
+      </w:pPr>
+      <w:r>
+        <w:t xml:space="preserve">Amb aquesta idea clara, ara podem portar el patró al cas administratiu.</w:t>
+      </w:r>
+    </w:p>
+    <w:bookmarkEnd w:id="15"/>
+    <w:bookmarkStart w:id="16" w:name="X25282647dc1f1bc8d2bf508fc797cb7f01a992d"/>
+    <w:p>
+      <w:pPr>
+        <w:pStyle w:val="Heading3"/>
+      </w:pPr>
+      <w:r>
+        <w:t xml:space="preserve">Diapositiva 8. Port de sortida per a informació patrimonial - 2:05</w:t>
+      </w:r>
+    </w:p>
+    <w:p>
+      <w:pPr>
+        <w:pStyle w:val="FirstParagraph"/>
+      </w:pPr>
+      <w:r>
+        <w:t xml:space="preserve">Portem aquesta idea al cas administratiu. [assenyalar el diagrama]</w:t>
+      </w:r>
+    </w:p>
+    <w:p>
+      <w:pPr>
+        <w:pStyle w:val="BodyText"/>
+      </w:pPr>
+      <w:r>
+        <w:t xml:space="preserve">El servei d’aplicació que avalua econòmicament una beca no hauria de conèixer directament els detalls de PICA, SOAP/XML, REST o JDBC. Hauria de dependre d’un contracte expressat en el llenguatge de l’aplicació. Per exemple: obtenir informació patrimonial, recuperar dades de renda o carregar l’expedient administratiu.</w:t>
+      </w:r>
+    </w:p>
+    <w:p>
+      <w:pPr>
+        <w:pStyle w:val="BodyText"/>
+      </w:pPr>
+      <w:r>
+        <w:t xml:space="preserve">En el diagrama, el nucli de l’aplicació conté el servei d’aplicació i el model de domini. Al voltant hi ha ports: un port d’entrada per invocar el cas d’ús i ports de sortida per obtenir o persistir informació. Fora del nucli hi ha els adaptadors: el controlador REST, l’adaptador JDBC, l’adaptador d’interoperabilitat amb PICA o qualsevol altre mecanisme concret.</w:t>
+      </w:r>
+    </w:p>
+    <w:p>
+      <w:pPr>
+        <w:pStyle w:val="BodyText"/>
+      </w:pPr>
+      <w:r>
+        <w:t xml:space="preserve">El punt tècnic més important és que l’adaptador de PICA o l’adaptador JDBC no són el centre de l’arquitectura. Són substituïbles. El que és estable és el contracte que el cas d’ús necessita. [pausa breu]</w:t>
+      </w:r>
+    </w:p>
+    <w:p>
+      <w:pPr>
+        <w:pStyle w:val="BodyText"/>
+      </w:pPr>
+      <w:r>
+        <w:t xml:space="preserve">Aquesta distinció queda reflectida en la direcció de les fletxes. Quan indiquen</w:t>
       </w:r>
       <w:r>
         <w:t xml:space="preserve"> </w:t>
@@ -430,30 +628,57 @@
         <w:t xml:space="preserve">implemented by</w:t>
       </w:r>
       <w:r>
-        <w:t xml:space="preserve"> </w:t>
-      </w:r>
-      <w:r>
-        <w:t xml:space="preserve">apunten des dels adaptadors cap als ports, de manera coherent amb la inversió de dependències. En l’explicació oral cal mantenir aquesta lectura: el servei usa el port; l’adaptador implementa el port.</w:t>
-      </w:r>
-    </w:p>
-    <w:p>
-      <w:pPr>
-        <w:pStyle w:val="BodyText"/>
-      </w:pPr>
-      <w:r>
-        <w:rPr>
-          <w:b/>
-          <w:bCs/>
-        </w:rPr>
-        <w:t xml:space="preserve">Diapositiva 9. Transferència a domini financer</w:t>
-      </w:r>
-    </w:p>
-    <w:p>
-      <w:pPr>
-        <w:pStyle w:val="BodyText"/>
-      </w:pPr>
-      <w:r>
-        <w:t xml:space="preserve">Correcció aplicada. El diagrama HexaStock ja manté la mateixa lectura que el cas AGAUR: les fletxes d’ús representen el flux del servei cap als ports, i les fletxes</w:t>
+        <w:t xml:space="preserve">, les fletxes van de l’adaptador cap al port. El servei usa el port. L’adaptador implementa el port. I el domini no coneix ni l’adaptador, ni PICA, ni SOAP, ni REST.</w:t>
+      </w:r>
+    </w:p>
+    <w:p>
+      <w:pPr>
+        <w:pStyle w:val="BodyText"/>
+      </w:pPr>
+      <w:r>
+        <w:t xml:space="preserve">Aquesta mateixa estructura la podem transferir ara a un domini diferent: una aplicació de gestió d’una cartera d’inversió personal.</w:t>
+      </w:r>
+    </w:p>
+    <w:bookmarkEnd w:id="16"/>
+    <w:bookmarkStart w:id="17" w:name="X619a10340c1a251e91abc9532d1ef3ec34eca8e"/>
+    <w:p>
+      <w:pPr>
+        <w:pStyle w:val="Heading3"/>
+      </w:pPr>
+      <w:r>
+        <w:t xml:space="preserve">Diapositiva 9. Transferència a domini financer - 1:45</w:t>
+      </w:r>
+    </w:p>
+    <w:p>
+      <w:pPr>
+        <w:pStyle w:val="FirstParagraph"/>
+      </w:pPr>
+      <w:r>
+        <w:t xml:space="preserve">Ara fem un canvi de domini. Ja no parlem d’una sol·licitud de beca, sinó d’una aplicació de gestió d’una cartera d’inversió personal. [assenyalar el títol]</w:t>
+      </w:r>
+    </w:p>
+    <w:p>
+      <w:pPr>
+        <w:pStyle w:val="BodyText"/>
+      </w:pPr>
+      <w:r>
+        <w:t xml:space="preserve">El diagrama que veiem ja correspon al projecte que utilitzaré després a la demo. Ara, però, no em centraré en els noms concrets; el que m’interessa és reconèixer el mateix patró: cas d’ús, port de sortida i adaptadors substituïbles.</w:t>
+      </w:r>
+    </w:p>
+    <w:p>
+      <w:pPr>
+        <w:pStyle w:val="BodyText"/>
+      </w:pPr>
+      <w:r>
+        <w:t xml:space="preserve">Imaginem un cas d’ús molt concret: vendre accions d’una cartera. Per executar aquesta operació correctament, l’aplicació pot necessitar consultar el preu actual de l’acció que l’usuari vol vendre.</w:t>
+      </w:r>
+    </w:p>
+    <w:p>
+      <w:pPr>
+        <w:pStyle w:val="BodyText"/>
+      </w:pPr>
+      <w:r>
+        <w:t xml:space="preserve">Ara bé, el cas d’ús no hauria de dependre directament d’un proveïdor concret de dades financeres, ni d’una API específica, ni del format tècnic de la resposta. El cas d’ús només hauria d’expressar la seva necessitat:</w:t>
       </w:r>
       <w:r>
         <w:t xml:space="preserve"> </w:t>
@@ -462,13 +687,154 @@
         <w:rPr>
           <w:rStyle w:val="VerbatimChar"/>
         </w:rPr>
-        <w:t xml:space="preserve">implemented by</w:t>
+        <w:t xml:space="preserve">necessito obtenir el preu actual d'una acció concreta</w:t>
+      </w:r>
+      <w:r>
+        <w:t xml:space="preserve">.</w:t>
+      </w:r>
+    </w:p>
+    <w:p>
+      <w:pPr>
+        <w:pStyle w:val="BodyText"/>
+      </w:pPr>
+      <w:r>
+        <w:t xml:space="preserve">Aquesta necessitat es pot representar amb un port de sortida. Aquest port no diu quin proveïdor s’ha de consultar, ni quin endpoint s’ha d’utilitzar, ni si la resposta vindrà en JSON, XML o qualsevol altre format. Només defineix una capacitat que l’aplicació necessita.</w:t>
+      </w:r>
+    </w:p>
+    <w:p>
+      <w:pPr>
+        <w:pStyle w:val="BodyText"/>
+      </w:pPr>
+      <w:r>
+        <w:t xml:space="preserve">L’adaptador serà la peça que implementarà aquest port i coneixerà el detall tècnic concret: quin servei extern es consulta, com es fa la petició, quin format retorna la resposta i com es transforma aquesta informació perquè el cas d’ús la pugui utilitzar.</w:t>
+      </w:r>
+    </w:p>
+    <w:p>
+      <w:pPr>
+        <w:pStyle w:val="BodyText"/>
+      </w:pPr>
+      <w:r>
+        <w:t xml:space="preserve">El patró és idèntic al cas AGAUR. En el cas administratiu, el procediment necessita informació patrimonial, no una tecnologia concreta. En el domini financer, el cas d’ús necessita un preu actual, no un proveïdor concret. [mirada al tribunal]</w:t>
+      </w:r>
+    </w:p>
+    <w:p>
+      <w:pPr>
+        <w:pStyle w:val="BodyText"/>
+      </w:pPr>
+      <w:r>
+        <w:t xml:space="preserve">Per tant, el missatge docent és transferible: primer identifiquem la necessitat funcional; després definim el port; finalment implementem adaptadors.</w:t>
+      </w:r>
+    </w:p>
+    <w:bookmarkEnd w:id="17"/>
+    <w:bookmarkStart w:id="18" w:name="Xf23ce5279610c607185e420fa6986d11a2001c6"/>
+    <w:p>
+      <w:pPr>
+        <w:pStyle w:val="Heading3"/>
+      </w:pPr>
+      <w:r>
+        <w:t xml:space="preserve">Diapositiva 10. Flux i codi essencial - 1:45</w:t>
+      </w:r>
+    </w:p>
+    <w:p>
+      <w:pPr>
+        <w:pStyle w:val="FirstParagraph"/>
+      </w:pPr>
+      <w:r>
+        <w:t xml:space="preserve">A partir d’aquí ja podem baixar al projecte concret de la demo: HexaStock. Aquesta diapositiva mostra el flux temporal del cas d’ús de venda. [assenyalar el diagrama de seqüència]</w:t>
+      </w:r>
+    </w:p>
+    <w:p>
+      <w:pPr>
+        <w:pStyle w:val="BodyText"/>
+      </w:pPr>
+      <w:r>
+        <w:t xml:space="preserve">Convé aclarir que, en un diagrama de seqüència, les fletxes representen ordre d’execució, no dependències de codi. Això és perfectament compatible amb la inversió de dependències que acabem d’explicar.</w:t>
+      </w:r>
+    </w:p>
+    <w:p>
+      <w:pPr>
+        <w:pStyle w:val="BodyText"/>
+      </w:pPr>
+      <w:r>
+        <w:t xml:space="preserve">El client o controlador invoca el port d’entrada,</w:t>
       </w:r>
       <w:r>
         <w:t xml:space="preserve"> </w:t>
       </w:r>
       <w:r>
-        <w:t xml:space="preserve">apunten dels adaptadors cap als ports. En</w:t>
+        <w:rPr>
+          <w:rStyle w:val="VerbatimChar"/>
+        </w:rPr>
+        <w:t xml:space="preserve">PortfolioStockOperationsUseCase</w:t>
+      </w:r>
+      <w:r>
+        <w:t xml:space="preserve">. La implementació és el servei d’aplicació,</w:t>
+      </w:r>
+      <w:r>
+        <w:t xml:space="preserve"> </w:t>
+      </w:r>
+      <w:r>
+        <w:rPr>
+          <w:rStyle w:val="VerbatimChar"/>
+        </w:rPr>
+        <w:t xml:space="preserve">PortfolioStockOperationsService</w:t>
+      </w:r>
+      <w:r>
+        <w:t xml:space="preserve">. Aquest servei recupera el portfolio mitjançant un port de persistència, consulta el preu mitjançant el port de preus, i després crida el domini amb l’acció, la quantitat i el preu. [pausa breu]</w:t>
+      </w:r>
+    </w:p>
+    <w:p>
+      <w:pPr>
+        <w:pStyle w:val="BodyText"/>
+      </w:pPr>
+      <w:r>
+        <w:t xml:space="preserve">La separació de responsabilitats és molt important. El servei coordina. El port obté informació. L’adaptador integra amb la infraestructura. Però la decisió de domini, la venda i el càlcul del resultat, no es resolen ni al controlador ni a l’adaptador de preus. Es resolen al model de domini, dins l’agregat</w:t>
+      </w:r>
+      <w:r>
+        <w:t xml:space="preserve"> </w:t>
+      </w:r>
+      <w:r>
+        <w:rPr>
+          <w:rStyle w:val="VerbatimChar"/>
+        </w:rPr>
+        <w:t xml:space="preserve">Portfolio</w:t>
+      </w:r>
+      <w:r>
+        <w:t xml:space="preserve">.</w:t>
+      </w:r>
+    </w:p>
+    <w:p>
+      <w:pPr>
+        <w:pStyle w:val="BodyText"/>
+      </w:pPr>
+      <w:r>
+        <w:t xml:space="preserve">Dit de manera sintètica: l’adaptador pot saber com obtenir un preu; no hauria de decidir com es ven una acció dins la cartera. [pausa]</w:t>
+      </w:r>
+    </w:p>
+    <w:bookmarkEnd w:id="18"/>
+    <w:bookmarkStart w:id="19" w:name="diapositiva-11.-demo---145"/>
+    <w:p>
+      <w:pPr>
+        <w:pStyle w:val="Heading3"/>
+      </w:pPr>
+      <w:r>
+        <w:t xml:space="preserve">Diapositiva 11. Demo - 1:45</w:t>
+      </w:r>
+    </w:p>
+    <w:p>
+      <w:pPr>
+        <w:pStyle w:val="FirstParagraph"/>
+      </w:pPr>
+      <w:r>
+        <w:t xml:space="preserve">La demo, en aquesta classe, no pretén impressionar per complexitat tècnica. Té una funció docent molt concreta: mostrar que podem mantenir el mateix cas d’ús, el mateix servei d’aplicació i el mateix domini, canviant només l’adaptador. [assenyalar les tres caixes]</w:t>
+      </w:r>
+    </w:p>
+    <w:p>
+      <w:pPr>
+        <w:pStyle w:val="BodyText"/>
+      </w:pPr>
+      <w:r>
+        <w:t xml:space="preserve">En HexaStock, això es pot veure amb perfils diferents: un adaptador Finnhub, un adaptador Alpha Vantage o un adaptador mock. El port que veu el servei és el mateix:</w:t>
       </w:r>
       <w:r>
         <w:t xml:space="preserve"> </w:t>
@@ -480,1738 +846,905 @@
         <w:t xml:space="preserve">StockPriceProviderPort</w:t>
       </w:r>
       <w:r>
-        <w:t xml:space="preserve">, els adaptadors de mercat apareixen com a implementacions del port. El missatge central és correcte i s’ha de mantenir: el cas d’ús necessita el preu actual, no un proveïdor concret.</w:t>
-      </w:r>
-    </w:p>
-    <w:p>
-      <w:pPr>
-        <w:pStyle w:val="BodyText"/>
-      </w:pPr>
-      <w:r>
-        <w:rPr>
-          <w:b/>
-          <w:bCs/>
-        </w:rPr>
-        <w:t xml:space="preserve">Diapositiva 10. Flux i codi essencial</w:t>
-      </w:r>
-    </w:p>
-    <w:p>
-      <w:pPr>
-        <w:pStyle w:val="BodyText"/>
-      </w:pPr>
-      <w:r>
-        <w:t xml:space="preserve">La diapositiva és forta perquè mostra el flux temporal. Afegiria oralment una frase preventiva:</w:t>
-      </w:r>
-      <w:r>
-        <w:t xml:space="preserve"> </w:t>
-      </w:r>
-      <w:r>
-        <w:rPr>
-          <w:rStyle w:val="VerbatimChar"/>
-        </w:rPr>
-        <w:t xml:space="preserve">Aquest diagrama de seqüència representa ordre d'execució, no direcció de dependències de codi</w:t>
-      </w:r>
-      <w:r>
-        <w:t xml:space="preserve">. Això evita contradiccions amb les diapositives 7-9.</w:t>
-      </w:r>
-    </w:p>
-    <w:p>
-      <w:pPr>
-        <w:pStyle w:val="BodyText"/>
-      </w:pPr>
-      <w:r>
-        <w:rPr>
-          <w:b/>
-          <w:bCs/>
-        </w:rPr>
-        <w:t xml:space="preserve">Diapositiva 11. Demo</w:t>
-      </w:r>
-    </w:p>
-    <w:p>
-      <w:pPr>
-        <w:pStyle w:val="BodyText"/>
-      </w:pPr>
-      <w:r>
-        <w:t xml:space="preserve">Funciona com a demostració controlada. Substituiria</w:t>
-      </w:r>
-      <w:r>
-        <w:t xml:space="preserve"> </w:t>
-      </w:r>
-      <w:r>
-        <w:rPr>
-          <w:rStyle w:val="VerbatimChar"/>
-        </w:rPr>
-        <w:t xml:space="preserve">consultoria empresarial</w:t>
-      </w:r>
-      <w:r>
-        <w:t xml:space="preserve"> </w:t>
-      </w:r>
-      <w:r>
-        <w:t xml:space="preserve">per</w:t>
-      </w:r>
-      <w:r>
-        <w:t xml:space="preserve"> </w:t>
-      </w:r>
-      <w:r>
-        <w:rPr>
-          <w:rStyle w:val="VerbatimChar"/>
-        </w:rPr>
-        <w:t xml:space="preserve">formació o consultoria professional</w:t>
-      </w:r>
-      <w:r>
-        <w:t xml:space="preserve">, perquè en aquest context la referència principal és administració pública i universitat. Si es fa demo real, cal tenir preparada una versió sense internet ni claus.</w:t>
-      </w:r>
-    </w:p>
-    <w:p>
-      <w:pPr>
-        <w:pStyle w:val="BodyText"/>
-      </w:pPr>
-      <w:r>
-        <w:rPr>
-          <w:b/>
-          <w:bCs/>
-        </w:rPr>
-        <w:t xml:space="preserve">Diapositiva 12. Agraïment</w:t>
-      </w:r>
-    </w:p>
-    <w:p>
-      <w:pPr>
-        <w:pStyle w:val="BodyText"/>
-      </w:pPr>
-      <w:r>
-        <w:t xml:space="preserve">Correcta i institucional. El tancament s’ha reformulat per evitar un to de comiat o de petició explícita: agraeix l’entorn que encoratja el creixement docent i acadèmic, en present, i manté el vincle amb l’equip docent. El pla docent identifica el professor com a Josep Roure Alcobé; per coherència documental, es pot fer servir</w:t>
-      </w:r>
-      <w:r>
-        <w:t xml:space="preserve"> </w:t>
-      </w:r>
-      <w:r>
-        <w:rPr>
-          <w:rStyle w:val="VerbatimChar"/>
-        </w:rPr>
-        <w:t xml:space="preserve">Dr. Josep Roure Alcobé</w:t>
-      </w:r>
-      <w:r>
-        <w:t xml:space="preserve">. Millor tancar mirant el tribunal, no llegint la diapositiva.</w:t>
-      </w:r>
-    </w:p>
-    <w:bookmarkEnd w:id="10"/>
-    <w:bookmarkStart w:id="23" w:name="guió-oral-complet-imprimible"/>
+        <w:t xml:space="preserve">. La implementació concreta canvia segons la configuració.</w:t>
+      </w:r>
+    </w:p>
+    <w:p>
+      <w:pPr>
+        <w:pStyle w:val="BodyText"/>
+      </w:pPr>
+      <w:r>
+        <w:t xml:space="preserve">Aquests noms són implementacions concretes. El que vull que observeu és que el contracte que veu el cas d’ús no canvia.</w:t>
+      </w:r>
+    </w:p>
+    <w:p>
+      <w:pPr>
+        <w:pStyle w:val="BodyText"/>
+      </w:pPr>
+      <w:r>
+        <w:t xml:space="preserve">Aquest punt és especialment rellevant en docència. Permet fer proves amb un adaptador mock, sense claus reals, sense disponibilitat d’un proveïdor extern i sense contaminar el domini amb detalls tècnics. [mirada al tribunal]</w:t>
+      </w:r>
+    </w:p>
+    <w:p>
+      <w:pPr>
+        <w:pStyle w:val="BodyText"/>
+      </w:pPr>
+      <w:r>
+        <w:t xml:space="preserve">El missatge de la demo és el mateix que hem treballat des del principi: canvia la infraestructura; el cas d’ús i el domini romanen estables.</w:t>
+      </w:r>
+    </w:p>
+    <w:p>
+      <w:pPr>
+        <w:pStyle w:val="BodyText"/>
+      </w:pPr>
+      <w:r>
+        <w:t xml:space="preserve">Això no vol dir que l’arquitectura elimini el canvi. El canvi continua existint. El que fa una bona arquitectura és localitzar-lo.</w:t>
+      </w:r>
+    </w:p>
+    <w:bookmarkEnd w:id="19"/>
+    <w:bookmarkStart w:id="20" w:name="diapositiva-12.-agraïment---120"/>
+    <w:p>
+      <w:pPr>
+        <w:pStyle w:val="Heading3"/>
+      </w:pPr>
+      <w:r>
+        <w:t xml:space="preserve">Diapositiva 12. Agraïment - 1:20</w:t>
+      </w:r>
+    </w:p>
+    <w:p>
+      <w:pPr>
+        <w:pStyle w:val="FirstParagraph"/>
+      </w:pPr>
+      <w:r>
+        <w:t xml:space="preserve">Per tancar, voldria recuperar aquesta idea final. [pausa breu]</w:t>
+      </w:r>
+    </w:p>
+    <w:p>
+      <w:pPr>
+        <w:pStyle w:val="BodyText"/>
+      </w:pPr>
+      <w:r>
+        <w:t xml:space="preserve">L’arquitectura no elimina la dependència del món exterior. Les aplicacions reals necessiten bases de dades, APIs, plataformes corporatives, proveïdors externs i mecanismes d’integració. El que fa l’arquitectura hexagonal és convertir aquesta dependència en una frontera explícita, substituïble i comprovable.</w:t>
+      </w:r>
+    </w:p>
+    <w:p>
+      <w:pPr>
+        <w:pStyle w:val="BodyText"/>
+      </w:pPr>
+      <w:r>
+        <w:t xml:space="preserve">Quan canvia un proveïdor, una API o una tecnologia, volem canviar l’adaptador. No volem reescriure el cas d’ús ni deformar el model de domini. [pausa]</w:t>
+      </w:r>
+    </w:p>
+    <w:p>
+      <w:pPr>
+        <w:pStyle w:val="BodyText"/>
+      </w:pPr>
+      <w:r>
+        <w:t xml:space="preserve">Vull expressar el meu agraïment al TecnoCampus per un entorn que m’encoratja a créixer, tant en la docència com en l’àmbit acadèmic, al costat d’un equip del qual aprenc i amb qui comparteixo coneixement, responsabilitat i compromís amb la formació universitària. [pausa breu; mirar el tribunal]</w:t>
+      </w:r>
+    </w:p>
+    <w:p>
+      <w:pPr>
+        <w:pStyle w:val="BodyText"/>
+      </w:pPr>
+      <w:r>
+        <w:t xml:space="preserve">També vull fer un agraïment especial al Dr. Josep Roure, company professor del TecnoCampus, amb qui he tingut l’oportunitat d’aprendre sobre arquitectura de software, metodologies actives d’aprenentatge i treball en equip. [mirada al tribunal]</w:t>
+      </w:r>
+    </w:p>
+    <w:p>
+      <w:pPr>
+        <w:pStyle w:val="BodyText"/>
+      </w:pPr>
+      <w:r>
+        <w:t xml:space="preserve">Moltes gràcies.</w:t>
+      </w:r>
+    </w:p>
+    <w:bookmarkEnd w:id="20"/>
+    <w:bookmarkEnd w:id="21"/>
+    <w:bookmarkStart w:id="34" w:name="notes-del-presentador-per-diapositiva"/>
     <w:p>
       <w:pPr>
         <w:pStyle w:val="Heading2"/>
       </w:pPr>
       <w:r>
-        <w:t xml:space="preserve">3. Guió oral complet imprimible</w:t>
-      </w:r>
-    </w:p>
-    <w:p>
-      <w:pPr>
-        <w:pStyle w:val="FirstParagraph"/>
-      </w:pPr>
-      <w:r>
-        <w:t xml:space="preserve">Temps total previst: 20:00.</w:t>
-      </w:r>
-    </w:p>
-    <w:bookmarkStart w:id="11" w:name="diapositiva-1.-portada---145"/>
+        <w:t xml:space="preserve">2. Notes del presentador per diapositiva</w:t>
+      </w:r>
+    </w:p>
+    <w:bookmarkStart w:id="22" w:name="portada---145"/>
     <w:p>
       <w:pPr>
         <w:pStyle w:val="Heading3"/>
       </w:pPr>
       <w:r>
-        <w:t xml:space="preserve">Diapositiva 1. Portada - 1:45</w:t>
-      </w:r>
-    </w:p>
-    <w:p>
-      <w:pPr>
-        <w:pStyle w:val="FirstParagraph"/>
-      </w:pPr>
-      <w:r>
-        <w:t xml:space="preserve">Bon dia, membres del tribunal. [pausa breu, mirada al tribunal]</w:t>
-      </w:r>
-    </w:p>
-    <w:p>
-      <w:pPr>
-        <w:pStyle w:val="BodyText"/>
-      </w:pPr>
-      <w:r>
-        <w:t xml:space="preserve">La classe que presento porta per títol</w:t>
-      </w:r>
-      <w:r>
-        <w:t xml:space="preserve"> </w:t>
-      </w:r>
-      <w:r>
-        <w:rPr>
-          <w:rStyle w:val="VerbatimChar"/>
-        </w:rPr>
-        <w:t xml:space="preserve">Disseny de ports de sortida en arquitectura hexagonal</w:t>
-      </w:r>
-      <w:r>
-        <w:t xml:space="preserve">, i se centra en el desacoblament entre casos d’ús, domini i APIs externes. [assenyalar el títol]</w:t>
-      </w:r>
-    </w:p>
-    <w:p>
-      <w:pPr>
-        <w:pStyle w:val="BodyText"/>
-      </w:pPr>
-      <w:r>
-        <w:t xml:space="preserve">Abans d’entrar en el contingut tècnic, voldria fer una precisió de context. A la documentació del tribunal he incorporat un informe acreditatiu de la meva activitat de formació i consultoria especialitzada per a l’AGAUR, l’Agència de Gestió d’Ajuts Universitaris i de Recerca. [pausa breu]</w:t>
-      </w:r>
-    </w:p>
-    <w:p>
-      <w:pPr>
-        <w:pStyle w:val="BodyText"/>
-      </w:pPr>
-      <w:r>
-        <w:t xml:space="preserve">Ho explico al principi perquè aquesta sessió està plantejada deliberadament a partir d’una doble vinculació. D’una banda, és una classe situada dins l’assignatura Disseny de Sistemes d’Informació, que imparteixo juntament amb el Dr. Josep Roure. De l’altra, parteix d’un cas professional real en l’àmbit de l’administració pública catalana. [mirada al tribunal]</w:t>
-      </w:r>
-    </w:p>
-    <w:p>
-      <w:pPr>
-        <w:pStyle w:val="BodyText"/>
-      </w:pPr>
-      <w:r>
-        <w:t xml:space="preserve">La intenció no és revelar cap detall intern, ni cap endpoint, ni cap dada sensible. La intenció és docent: mostrar com conceptes que treballem a l’aula, com ports, adaptadors, inversió de dependències i separació entre domini, aplicació i infraestructura, apareixen també en problemes reals d’evolució de sistemes d’informació. [pausa]</w:t>
-      </w:r>
-    </w:p>
-    <w:p>
-      <w:pPr>
-        <w:pStyle w:val="BodyText"/>
-      </w:pPr>
-      <w:r>
-        <w:t xml:space="preserve">En vint minuts no seria rigorós intentar explicar tota l’arquitectura hexagonal. Per això em centraré en una decisió concreta: com dissenyar un port de sortida quan un cas d’ús necessita informació que es troba fora de l’aplicació.</w:t>
-      </w:r>
-    </w:p>
-    <w:bookmarkEnd w:id="11"/>
-    <w:bookmarkStart w:id="12" w:name="Xbd8d813bdf1f660b3e63d6e4e001ea5920e5fb0"/>
+        <w:t xml:space="preserve">1. Portada - 1:45</w:t>
+      </w:r>
+    </w:p>
+    <w:p>
+      <w:pPr>
+        <w:pStyle w:val="Compact"/>
+        <w:numPr>
+          <w:ilvl w:val="0"/>
+          <w:numId w:val="1002"/>
+        </w:numPr>
+      </w:pPr>
+      <w:r>
+        <w:t xml:space="preserve">Classe de DSI, no explicació completa d’arquitectura hexagonal.</w:t>
+      </w:r>
+    </w:p>
+    <w:p>
+      <w:pPr>
+        <w:pStyle w:val="Compact"/>
+        <w:numPr>
+          <w:ilvl w:val="0"/>
+          <w:numId w:val="1002"/>
+        </w:numPr>
+      </w:pPr>
+      <w:r>
+        <w:t xml:space="preserve">Informe incorporat a la documentació de la convocatòria: consultoria especialitzada per a la Generalitat/AGAUR.</w:t>
+      </w:r>
+    </w:p>
+    <w:p>
+      <w:pPr>
+        <w:pStyle w:val="Compact"/>
+        <w:numPr>
+          <w:ilvl w:val="0"/>
+          <w:numId w:val="1002"/>
+        </w:numPr>
+      </w:pPr>
+      <w:r>
+        <w:t xml:space="preserve">Trobada entre dimensió acadèmica i dimensió professional.</w:t>
+      </w:r>
+    </w:p>
+    <w:p>
+      <w:pPr>
+        <w:pStyle w:val="Compact"/>
+        <w:numPr>
+          <w:ilvl w:val="0"/>
+          <w:numId w:val="1002"/>
+        </w:numPr>
+      </w:pPr>
+      <w:r>
+        <w:t xml:space="preserve">Cas real com a base docent, sense entrar en detalls interns.</w:t>
+      </w:r>
+    </w:p>
+    <w:p>
+      <w:pPr>
+        <w:pStyle w:val="Compact"/>
+        <w:numPr>
+          <w:ilvl w:val="0"/>
+          <w:numId w:val="1002"/>
+        </w:numPr>
+      </w:pPr>
+      <w:r>
+        <w:t xml:space="preserve">Transició: ens centrarem en una decisió concreta, el port de sortida.</w:t>
+      </w:r>
+    </w:p>
+    <w:bookmarkEnd w:id="22"/>
+    <w:bookmarkStart w:id="23" w:name="on-som-dins-lassignatura---110"/>
     <w:p>
       <w:pPr>
         <w:pStyle w:val="Heading3"/>
       </w:pPr>
       <w:r>
-        <w:t xml:space="preserve">Diapositiva 2. On som dins l’assignatura - 1:10</w:t>
-      </w:r>
-    </w:p>
-    <w:p>
-      <w:pPr>
-        <w:pStyle w:val="FirstParagraph"/>
-      </w:pPr>
-      <w:r>
-        <w:t xml:space="preserve">La sessió se situa dins Disseny de Sistemes d’Informació, una assignatura obligatòria de tercer curs, de 6 ECTS. [assenyalar la part esquerra]</w:t>
-      </w:r>
-    </w:p>
-    <w:p>
-      <w:pPr>
-        <w:pStyle w:val="BodyText"/>
-      </w:pPr>
-      <w:r>
-        <w:t xml:space="preserve">El pla docent de l’assignatura explica que s’hi treballa una visió global d’arquitectures de sistemes d’informació: arquitectures per capes, arquitectures clean o hexagonals, i arquitectures basades en microserveis. Dins el bloc d’arquitectures clean o hexagonals hi apareixen explícitament ports i adaptadors, mapping entre capes i organització en mòduls. [to calmat, explicatiu]</w:t>
-      </w:r>
-    </w:p>
-    <w:p>
-      <w:pPr>
-        <w:pStyle w:val="BodyText"/>
-      </w:pPr>
-      <w:r>
-        <w:t xml:space="preserve">Per tant, aquesta no és una sessió afegida artificialment al temari. És una classe versemblant dins l’assignatura. [pausa breu]</w:t>
-      </w:r>
-    </w:p>
-    <w:p>
-      <w:pPr>
-        <w:pStyle w:val="BodyText"/>
-      </w:pPr>
-      <w:r>
-        <w:t xml:space="preserve">El que farem avui és acotar molt el focus. No analitzarem tota l’arquitectura hexagonal. Ens centrarem en els ports de sortida: aquells ports que permeten que l’aplicació obtingui o persisteixi informació mitjançant sistemes externs, sense que el cas d’ús quedi lligat a una tecnologia concreta.</w:t>
-      </w:r>
-    </w:p>
-    <w:bookmarkEnd w:id="12"/>
-    <w:bookmarkStart w:id="13" w:name="X3696606fd6d9b6d83d02a9073392ba28f4d25a2"/>
+        <w:t xml:space="preserve">2. On som dins l’assignatura - 1:10</w:t>
+      </w:r>
+    </w:p>
+    <w:p>
+      <w:pPr>
+        <w:pStyle w:val="Compact"/>
+        <w:numPr>
+          <w:ilvl w:val="0"/>
+          <w:numId w:val="1003"/>
+        </w:numPr>
+      </w:pPr>
+      <w:r>
+        <w:t xml:space="preserve">Pla docent: 3r curs, 6 ECTS, assignatura obligatòria.</w:t>
+      </w:r>
+    </w:p>
+    <w:p>
+      <w:pPr>
+        <w:pStyle w:val="Compact"/>
+        <w:numPr>
+          <w:ilvl w:val="0"/>
+          <w:numId w:val="1003"/>
+        </w:numPr>
+      </w:pPr>
+      <w:r>
+        <w:t xml:space="preserve">Bloc: clean/hexagonal, ports i adaptadors, mapping, mòduls, DDD.</w:t>
+      </w:r>
+    </w:p>
+    <w:p>
+      <w:pPr>
+        <w:pStyle w:val="Compact"/>
+        <w:numPr>
+          <w:ilvl w:val="0"/>
+          <w:numId w:val="1003"/>
+        </w:numPr>
+      </w:pPr>
+      <w:r>
+        <w:t xml:space="preserve">Justificar que la sessió encaixa en el temari.</w:t>
+      </w:r>
+    </w:p>
+    <w:p>
+      <w:pPr>
+        <w:pStyle w:val="Compact"/>
+        <w:numPr>
+          <w:ilvl w:val="0"/>
+          <w:numId w:val="1003"/>
+        </w:numPr>
+      </w:pPr>
+      <w:r>
+        <w:t xml:space="preserve">No panoràmica completa; focus en ports de sortida.</w:t>
+      </w:r>
+    </w:p>
+    <w:p>
+      <w:pPr>
+        <w:pStyle w:val="Compact"/>
+        <w:numPr>
+          <w:ilvl w:val="0"/>
+          <w:numId w:val="1003"/>
+        </w:numPr>
+      </w:pPr>
+      <w:r>
+        <w:t xml:space="preserve">Transició: objectiu mínim i entrada ràpida al cas real.</w:t>
+      </w:r>
+    </w:p>
+    <w:bookmarkEnd w:id="23"/>
+    <w:bookmarkStart w:id="24" w:name="objectiu-de-la-sessió---055"/>
     <w:p>
       <w:pPr>
         <w:pStyle w:val="Heading3"/>
       </w:pPr>
       <w:r>
-        <w:t xml:space="preserve">Diapositiva 3. Objectiu de la sessió - 0:55</w:t>
-      </w:r>
-    </w:p>
-    <w:p>
-      <w:pPr>
-        <w:pStyle w:val="FirstParagraph"/>
-      </w:pPr>
-      <w:r>
-        <w:t xml:space="preserve">Abans d’entrar en el cas, deixo formulat l’objectiu de la sessió. [pausa breu]</w:t>
-      </w:r>
-    </w:p>
-    <w:p>
-      <w:pPr>
-        <w:pStyle w:val="BodyText"/>
-      </w:pPr>
-      <w:r>
-        <w:t xml:space="preserve">El principi de treball és aquest: el cas d’ús necessita una capacitat, no una tecnologia. [mirar el tribunal]</w:t>
-      </w:r>
-    </w:p>
-    <w:p>
-      <w:pPr>
-        <w:pStyle w:val="BodyText"/>
-      </w:pPr>
-      <w:r>
-        <w:t xml:space="preserve">Per tant, el que aprendrem és a fer tres operacions: identificar una necessitat externa del cas d’ús, expressar-la com a port de sortida i implementar-la mitjançant adaptadors substituïbles. [assenyalar les tres caixes]</w:t>
-      </w:r>
-    </w:p>
-    <w:p>
-      <w:pPr>
-        <w:pStyle w:val="BodyText"/>
-      </w:pPr>
-      <w:r>
-        <w:t xml:space="preserve">No desenvoluparé encara tota l’abstracció. Primer veurem el problema en un cas real d’administració pública, i a partir d’aquí formularem la decisió arquitectònica. [pausa breu]</w:t>
-      </w:r>
-    </w:p>
-    <w:bookmarkEnd w:id="13"/>
-    <w:bookmarkStart w:id="14" w:name="Xe44e148b7ebe898f3299718f45351b6467fee24"/>
+        <w:t xml:space="preserve">3. Objectiu de la sessió - 0:55</w:t>
+      </w:r>
+    </w:p>
+    <w:p>
+      <w:pPr>
+        <w:pStyle w:val="Compact"/>
+        <w:numPr>
+          <w:ilvl w:val="0"/>
+          <w:numId w:val="1004"/>
+        </w:numPr>
+      </w:pPr>
+      <w:r>
+        <w:t xml:space="preserve">Passar-hi ràpid: és una diapositiva pont, no una explicació teòrica llarga.</w:t>
+      </w:r>
+    </w:p>
+    <w:p>
+      <w:pPr>
+        <w:pStyle w:val="Compact"/>
+        <w:numPr>
+          <w:ilvl w:val="0"/>
+          <w:numId w:val="1004"/>
+        </w:numPr>
+      </w:pPr>
+      <w:r>
+        <w:t xml:space="preserve">Frase clau: el cas d’ús necessita una capacitat, no una tecnologia.</w:t>
+      </w:r>
+    </w:p>
+    <w:p>
+      <w:pPr>
+        <w:pStyle w:val="Compact"/>
+        <w:numPr>
+          <w:ilvl w:val="0"/>
+          <w:numId w:val="1004"/>
+        </w:numPr>
+      </w:pPr>
+      <w:r>
+        <w:t xml:space="preserve">Tres accions: identificar necessitat, definir port, implementar adaptadors.</w:t>
+      </w:r>
+    </w:p>
+    <w:p>
+      <w:pPr>
+        <w:pStyle w:val="Compact"/>
+        <w:numPr>
+          <w:ilvl w:val="0"/>
+          <w:numId w:val="1004"/>
+        </w:numPr>
+      </w:pPr>
+      <w:r>
+        <w:t xml:space="preserve">Anunciar metodologia: primer cas real, després abstracció arquitectònica.</w:t>
+      </w:r>
+    </w:p>
+    <w:p>
+      <w:pPr>
+        <w:pStyle w:val="Compact"/>
+        <w:numPr>
+          <w:ilvl w:val="0"/>
+          <w:numId w:val="1004"/>
+        </w:numPr>
+      </w:pPr>
+      <w:r>
+        <w:t xml:space="preserve">Transició: començar pel procediment de beca.</w:t>
+      </w:r>
+    </w:p>
+    <w:bookmarkEnd w:id="24"/>
+    <w:bookmarkStart w:id="25" w:name="avaluació-econòmica---150"/>
     <w:p>
       <w:pPr>
         <w:pStyle w:val="Heading3"/>
       </w:pPr>
       <w:r>
-        <w:t xml:space="preserve">Diapositiva 4. Avaluació econòmica d’una beca - 1:50</w:t>
-      </w:r>
-    </w:p>
-    <w:p>
-      <w:pPr>
-        <w:pStyle w:val="FirstParagraph"/>
-      </w:pPr>
-      <w:r>
-        <w:t xml:space="preserve">Abans de parlar d’arquitectura de software, cal entendre mínimament el procediment administratiu. [to més lent]</w:t>
-      </w:r>
-    </w:p>
-    <w:p>
-      <w:pPr>
-        <w:pStyle w:val="BodyText"/>
-      </w:pPr>
-      <w:r>
-        <w:t xml:space="preserve">En un procediment de beca, una sol·licitud dona lloc a un expedient. Aquest expedient passa per diferents fases: requisits generals, requisits econòmics, revisió acadèmica i resolució. [assenyalar la seqüència de la dreta]</w:t>
-      </w:r>
-    </w:p>
-    <w:p>
-      <w:pPr>
-        <w:pStyle w:val="BodyText"/>
-      </w:pPr>
-      <w:r>
-        <w:t xml:space="preserve">La part que ens interessa és l’avaluació econòmica. En aquest punt es comproven aspectes com la renda familiar i el patrimoni. Quan no s’acredita el compliment dels requisits econòmics, l’expedient no obté una valoració favorable en aquesta fase. [pausa breu]</w:t>
-      </w:r>
-    </w:p>
-    <w:p>
-      <w:pPr>
-        <w:pStyle w:val="BodyText"/>
-      </w:pPr>
-      <w:r>
-        <w:t xml:space="preserve">La idea docent important és que aquí encara no hem parlat de SOAP, ni de REST, ni de PICA, ni de cap base de dades. Estem parlant de la necessitat funcional del procediment: per poder aplicar uns criteris econòmics, el sistema necessita dades fiables sobre renda i patrimoni.</w:t>
-      </w:r>
-    </w:p>
-    <w:p>
-      <w:pPr>
-        <w:pStyle w:val="BodyText"/>
-      </w:pPr>
-      <w:r>
-        <w:t xml:space="preserve">Aquest pas és essencial. Si comencem directament per la tecnologia, correm el risc de construir el cas d’ús al voltant de la integració. En canvi, si comencem pel procediment, podem distingir entre la decisió administrativa que volem modelar i el mecanisme tècnic que ens proporciona la informació.</w:t>
-      </w:r>
-    </w:p>
-    <w:bookmarkEnd w:id="14"/>
-    <w:bookmarkStart w:id="15" w:name="X49d8499aef8096cf0d8707c0a2b10b4e00df2f8"/>
+        <w:t xml:space="preserve">4. Avaluació econòmica - 1:50</w:t>
+      </w:r>
+    </w:p>
+    <w:p>
+      <w:pPr>
+        <w:pStyle w:val="Compact"/>
+        <w:numPr>
+          <w:ilvl w:val="0"/>
+          <w:numId w:val="1005"/>
+        </w:numPr>
+      </w:pPr>
+      <w:r>
+        <w:t xml:space="preserve">Primer entendre procediment, després tecnologia.</w:t>
+      </w:r>
+    </w:p>
+    <w:p>
+      <w:pPr>
+        <w:pStyle w:val="Compact"/>
+        <w:numPr>
+          <w:ilvl w:val="0"/>
+          <w:numId w:val="1005"/>
+        </w:numPr>
+      </w:pPr>
+      <w:r>
+        <w:t xml:space="preserve">Sol·licitud, expedient, requisits generals, econòmics, revisió, resolució.</w:t>
+      </w:r>
+    </w:p>
+    <w:p>
+      <w:pPr>
+        <w:pStyle w:val="Compact"/>
+        <w:numPr>
+          <w:ilvl w:val="0"/>
+          <w:numId w:val="1005"/>
+        </w:numPr>
+      </w:pPr>
+      <w:r>
+        <w:t xml:space="preserve">Renda i patrimoni com a decisió funcional.</w:t>
+      </w:r>
+    </w:p>
+    <w:p>
+      <w:pPr>
+        <w:pStyle w:val="Compact"/>
+        <w:numPr>
+          <w:ilvl w:val="0"/>
+          <w:numId w:val="1005"/>
+        </w:numPr>
+      </w:pPr>
+      <w:r>
+        <w:t xml:space="preserve">Evitar començar per SOAP/REST/PICA.</w:t>
+      </w:r>
+    </w:p>
+    <w:p>
+      <w:pPr>
+        <w:pStyle w:val="Compact"/>
+        <w:numPr>
+          <w:ilvl w:val="0"/>
+          <w:numId w:val="1005"/>
+        </w:numPr>
+      </w:pPr>
+      <w:r>
+        <w:t xml:space="preserve">Transició: quines dades externes fan falta?</w:t>
+      </w:r>
+    </w:p>
+    <w:bookmarkEnd w:id="25"/>
+    <w:bookmarkStart w:id="26" w:name="informació-externa---200"/>
     <w:p>
       <w:pPr>
         <w:pStyle w:val="Heading3"/>
       </w:pPr>
       <w:r>
-        <w:t xml:space="preserve">Diapositiva 5. Quina informació externa necessita el procediment? - 2:00</w:t>
-      </w:r>
-    </w:p>
-    <w:p>
-      <w:pPr>
-        <w:pStyle w:val="FirstParagraph"/>
-      </w:pPr>
-      <w:r>
-        <w:t xml:space="preserve">Per avaluar renda i patrimoni, el procediment pot necessitar informació que no neix dins l’aplicació. [assenyalar la columna de necessitats]</w:t>
-      </w:r>
-    </w:p>
-    <w:p>
-      <w:pPr>
-        <w:pStyle w:val="BodyText"/>
-      </w:pPr>
-      <w:r>
-        <w:t xml:space="preserve">En termes funcionals, podem parlar de renda familiar, patrimoni i béns immobles. En termes de fonts administratives, apareixen organismes i plataformes com l’AEAT, el Cadastre i PICA. [assenyalar la columna de fonts]</w:t>
-      </w:r>
-    </w:p>
-    <w:p>
-      <w:pPr>
-        <w:pStyle w:val="BodyText"/>
-      </w:pPr>
-      <w:r>
-        <w:t xml:space="preserve">PICA és la Plataforma d’Integració i Col·laboració Administrativa de la Generalitat de Catalunya. Per a aquesta classe, no cal entrar en tots els detalls tècnics de PICA. El que ens interessa és que actua com a mecanisme corporatiu d’interoperabilitat administrativa.</w:t>
-      </w:r>
-    </w:p>
-    <w:p>
-      <w:pPr>
-        <w:pStyle w:val="BodyText"/>
-      </w:pPr>
-      <w:r>
-        <w:t xml:space="preserve">La distinció clau és aquesta: el procediment necessita informació administrativa; no necessita, en el seu llenguatge propi, una API concreta. [pausa llarga; mirar el tribunal]</w:t>
-      </w:r>
-    </w:p>
-    <w:p>
-      <w:pPr>
-        <w:pStyle w:val="BodyText"/>
-      </w:pPr>
-      <w:r>
-        <w:t xml:space="preserve">Això no vol dir que l’API concreta no sigui important. Ho és, i molt. Però pertany a un altre nivell de decisió. El cas d’ús ha de poder dir:</w:t>
-      </w:r>
-      <w:r>
-        <w:t xml:space="preserve"> </w:t>
-      </w:r>
-      <w:r>
-        <w:rPr>
-          <w:rStyle w:val="VerbatimChar"/>
-        </w:rPr>
-        <w:t xml:space="preserve">necessito informació patrimonial avaluable</w:t>
-      </w:r>
-      <w:r>
-        <w:t xml:space="preserve">. L’adaptador ja resoldrà si aquesta informació arriba per SOAP, REST, PICA, un certificat, una base de dades corporativa o un mecanisme futur.</w:t>
-      </w:r>
-    </w:p>
-    <w:p>
-      <w:pPr>
-        <w:pStyle w:val="BodyText"/>
-      </w:pPr>
-      <w:r>
-        <w:t xml:space="preserve">Quan aquesta separació no es respecta, apareix el problema arquitectònic que veurem ara.</w:t>
-      </w:r>
-    </w:p>
-    <w:bookmarkEnd w:id="15"/>
-    <w:bookmarkStart w:id="16" w:name="X84147f10029592ec3bd146ffb3a5109a19eca0d"/>
+        <w:t xml:space="preserve">5. Informació externa - 2:00</w:t>
+      </w:r>
+    </w:p>
+    <w:p>
+      <w:pPr>
+        <w:pStyle w:val="Compact"/>
+        <w:numPr>
+          <w:ilvl w:val="0"/>
+          <w:numId w:val="1006"/>
+        </w:numPr>
+      </w:pPr>
+      <w:r>
+        <w:t xml:space="preserve">Necessitats: renda, patrimoni, béns immobles.</w:t>
+      </w:r>
+    </w:p>
+    <w:p>
+      <w:pPr>
+        <w:pStyle w:val="Compact"/>
+        <w:numPr>
+          <w:ilvl w:val="0"/>
+          <w:numId w:val="1006"/>
+        </w:numPr>
+      </w:pPr>
+      <w:r>
+        <w:t xml:space="preserve">Fonts: AEAT, Cadastre, PICA.</w:t>
+      </w:r>
+    </w:p>
+    <w:p>
+      <w:pPr>
+        <w:pStyle w:val="Compact"/>
+        <w:numPr>
+          <w:ilvl w:val="0"/>
+          <w:numId w:val="1006"/>
+        </w:numPr>
+      </w:pPr>
+      <w:r>
+        <w:t xml:space="preserve">PICA com a interoperabilitat administrativa.</w:t>
+      </w:r>
+    </w:p>
+    <w:p>
+      <w:pPr>
+        <w:pStyle w:val="Compact"/>
+        <w:numPr>
+          <w:ilvl w:val="0"/>
+          <w:numId w:val="1006"/>
+        </w:numPr>
+      </w:pPr>
+      <w:r>
+        <w:t xml:space="preserve">Frase clau: informació administrativa, no API concreta.</w:t>
+      </w:r>
+    </w:p>
+    <w:p>
+      <w:pPr>
+        <w:pStyle w:val="Compact"/>
+        <w:numPr>
+          <w:ilvl w:val="0"/>
+          <w:numId w:val="1006"/>
+        </w:numPr>
+      </w:pPr>
+      <w:r>
+        <w:t xml:space="preserve">Transició: si no separem, apareix dependència directa.</w:t>
+      </w:r>
+    </w:p>
+    <w:bookmarkEnd w:id="26"/>
+    <w:bookmarkStart w:id="27" w:name="dependència-directa---210"/>
     <w:p>
       <w:pPr>
         <w:pStyle w:val="Heading3"/>
       </w:pPr>
       <w:r>
-        <w:t xml:space="preserve">Diapositiva 6. Dependència directa entre procediment i integració - 2:10</w:t>
-      </w:r>
-    </w:p>
-    <w:p>
-      <w:pPr>
-        <w:pStyle w:val="FirstParagraph"/>
-      </w:pPr>
-      <w:r>
-        <w:t xml:space="preserve">Imaginem una situació en què el cas d’ús queda vinculat directament a la cadena tècnica: SOAP/XML, PICA, AEAT o Cadastre. [assenyalar la cadena central]</w:t>
-      </w:r>
-    </w:p>
-    <w:p>
-      <w:pPr>
-        <w:pStyle w:val="BodyText"/>
-      </w:pPr>
-      <w:r>
-        <w:t xml:space="preserve">El problema no és consumir PICA. Ho remarco perquè és important. PICA, en aquest context, és una plataforma corporativa d’interoperabilitat. El problema arquitectònic apareix quan la lògica del procediment administratiu depèn directament dels detalls de la integració: DTOs externs, estructures XML, clients SOAP, codis d’error tècnics o convencions d’una API concreta. [pausa breu]</w:t>
-      </w:r>
-    </w:p>
-    <w:p>
-      <w:pPr>
-        <w:pStyle w:val="BodyText"/>
-      </w:pPr>
-      <w:r>
-        <w:t xml:space="preserve">Quan això passa, l’evolució tecnològica travessa la frontera del cas d’ús. Si un servei evoluciona, si canvia el contracte tècnic, si cal passar de SOAP a REST, o si apareix un altre mecanisme corporatiu, el canvi pot impactar codi que hauria d’estar expressant criteris del procediment.</w:t>
-      </w:r>
-    </w:p>
-    <w:p>
-      <w:pPr>
-        <w:pStyle w:val="BodyText"/>
-      </w:pPr>
-      <w:r>
-        <w:t xml:space="preserve">Des del punt de vista de l’enginyeria de software, això incrementa tres riscos. Primer, acoblament tecnològic: el cas d’ús coneix massa detalls externs. Segon, fragilitat del manteniment: canvis d’infraestructura obliguen a revisar lògica d’aplicació. I tercer, risc de continuïtat operativa: una evolució tècnica pot afectar un procediment que hauria de romandre estable. [assenyalar les tres caixes]</w:t>
-      </w:r>
-    </w:p>
-    <w:p>
-      <w:pPr>
-        <w:pStyle w:val="BodyText"/>
-      </w:pPr>
-      <w:r>
-        <w:t xml:space="preserve">La pregunta docent, per tant, és: com podem permetre que el cas d’ús necessiti dades externes, però sense dependre directament de la tecnologia que les proporciona?</w:t>
-      </w:r>
-    </w:p>
-    <w:p>
-      <w:pPr>
-        <w:pStyle w:val="BodyText"/>
-      </w:pPr>
-      <w:r>
-        <w:t xml:space="preserve">La resposta és introduir un port de sortida.</w:t>
-      </w:r>
-    </w:p>
-    <w:bookmarkEnd w:id="16"/>
-    <w:bookmarkStart w:id="17" w:name="X43a98a6def8e1803c902d37f4cf49908c0aca50"/>
+        <w:t xml:space="preserve">6. Dependència directa - 2:10</w:t>
+      </w:r>
+    </w:p>
+    <w:p>
+      <w:pPr>
+        <w:pStyle w:val="Compact"/>
+        <w:numPr>
+          <w:ilvl w:val="0"/>
+          <w:numId w:val="1007"/>
+        </w:numPr>
+      </w:pPr>
+      <w:r>
+        <w:t xml:space="preserve">El problema no és PICA; és l’acoblament directe.</w:t>
+      </w:r>
+    </w:p>
+    <w:p>
+      <w:pPr>
+        <w:pStyle w:val="Compact"/>
+        <w:numPr>
+          <w:ilvl w:val="0"/>
+          <w:numId w:val="1007"/>
+        </w:numPr>
+      </w:pPr>
+      <w:r>
+        <w:t xml:space="preserve">Cas d’ús coneix SOAP/XML, DTOs, clients, errors tècnics.</w:t>
+      </w:r>
+    </w:p>
+    <w:p>
+      <w:pPr>
+        <w:pStyle w:val="Compact"/>
+        <w:numPr>
+          <w:ilvl w:val="0"/>
+          <w:numId w:val="1007"/>
+        </w:numPr>
+      </w:pPr>
+      <w:r>
+        <w:t xml:space="preserve">Evolució tecnològica travessa frontera.</w:t>
+      </w:r>
+    </w:p>
+    <w:p>
+      <w:pPr>
+        <w:pStyle w:val="Compact"/>
+        <w:numPr>
+          <w:ilvl w:val="0"/>
+          <w:numId w:val="1007"/>
+        </w:numPr>
+      </w:pPr>
+      <w:r>
+        <w:t xml:space="preserve">Tres riscos: acoblament, manteniment fràgil, continuïtat operativa.</w:t>
+      </w:r>
+    </w:p>
+    <w:p>
+      <w:pPr>
+        <w:pStyle w:val="Compact"/>
+        <w:numPr>
+          <w:ilvl w:val="0"/>
+          <w:numId w:val="1007"/>
+        </w:numPr>
+      </w:pPr>
+      <w:r>
+        <w:t xml:space="preserve">Transició: resposta arquitectònica, port de sortida.</w:t>
+      </w:r>
+    </w:p>
+    <w:bookmarkEnd w:id="27"/>
+    <w:bookmarkStart w:id="28" w:name="port-i-adaptador---055"/>
     <w:p>
       <w:pPr>
         <w:pStyle w:val="Heading3"/>
       </w:pPr>
       <w:r>
-        <w:t xml:space="preserve">Diapositiva 7. Port de sortida i adaptador - 1:30</w:t>
-      </w:r>
-    </w:p>
-    <w:p>
-      <w:pPr>
-        <w:pStyle w:val="FirstParagraph"/>
-      </w:pPr>
-      <w:r>
-        <w:t xml:space="preserve">Un port de sortida és un contracte definit des de l’aplicació. [pausa breu]</w:t>
-      </w:r>
-    </w:p>
-    <w:p>
-      <w:pPr>
-        <w:pStyle w:val="BodyText"/>
-      </w:pPr>
-      <w:r>
-        <w:t xml:space="preserve">El cas d’ús o el servei d’aplicació diu:</w:t>
-      </w:r>
-      <w:r>
-        <w:t xml:space="preserve"> </w:t>
-      </w:r>
-      <w:r>
-        <w:rPr>
-          <w:rStyle w:val="VerbatimChar"/>
-        </w:rPr>
-        <w:t xml:space="preserve">necessito aquesta capacitat</w:t>
-      </w:r>
-      <w:r>
-        <w:t xml:space="preserve">. Per exemple: obtenir informació patrimonial, recuperar un expedient, desar una transacció o consultar el preu actual d’una acció. El port expressa aquest</w:t>
-      </w:r>
-      <w:r>
-        <w:t xml:space="preserve"> </w:t>
-      </w:r>
-      <w:r>
-        <w:rPr>
-          <w:rStyle w:val="VerbatimChar"/>
-        </w:rPr>
-        <w:t xml:space="preserve">què</w:t>
-      </w:r>
-      <w:r>
-        <w:t xml:space="preserve">. [assenyalar el port]</w:t>
-      </w:r>
-    </w:p>
-    <w:p>
-      <w:pPr>
-        <w:pStyle w:val="BodyText"/>
-      </w:pPr>
-      <w:r>
-        <w:t xml:space="preserve">L’adaptador, en canvi, resol el</w:t>
-      </w:r>
-      <w:r>
-        <w:t xml:space="preserve"> </w:t>
-      </w:r>
-      <w:r>
-        <w:rPr>
-          <w:rStyle w:val="VerbatimChar"/>
-        </w:rPr>
-        <w:t xml:space="preserve">com</w:t>
-      </w:r>
-      <w:r>
-        <w:t xml:space="preserve">. És la peça que coneix la tecnologia concreta: SOAP, REST, JDBC, JPA, un client HTTP, una estructura XML, JSON o el mecanisme que sigui necessari. [assenyalar adaptador i sistema extern]</w:t>
-      </w:r>
-    </w:p>
-    <w:p>
-      <w:pPr>
-        <w:pStyle w:val="BodyText"/>
-      </w:pPr>
-      <w:r>
-        <w:t xml:space="preserve">Aquí convé distingir dues fletxes. Si parlem de flux d’execució, el servei pot cridar el port i arribar finalment a l’adaptador. Però si parlem de dependència de codi, l’adaptador depèn del port, perquè l’adaptador implementa la interfície definida per l’aplicació. [mirada al tribunal]</w:t>
-      </w:r>
-    </w:p>
-    <w:p>
-      <w:pPr>
-        <w:pStyle w:val="BodyText"/>
-      </w:pPr>
-      <w:r>
-        <w:t xml:space="preserve">Aquesta és la inversió de dependències: el nucli no depèn de la implementació concreta; la implementació concreta depèn del contracte que defineix el nucli.</w:t>
-      </w:r>
-    </w:p>
-    <w:bookmarkEnd w:id="17"/>
-    <w:bookmarkStart w:id="18" w:name="X25282647dc1f1bc8d2bf508fc797cb7f01a992d"/>
+        <w:t xml:space="preserve">7. Port i adaptador - 0:55</w:t>
+      </w:r>
+    </w:p>
+    <w:p>
+      <w:pPr>
+        <w:pStyle w:val="Compact"/>
+        <w:numPr>
+          <w:ilvl w:val="0"/>
+          <w:numId w:val="1008"/>
+        </w:numPr>
+      </w:pPr>
+      <w:r>
+        <w:t xml:space="preserve">Fer-la servir com a frontissa conceptual, no com a explicació llarga.</w:t>
+      </w:r>
+    </w:p>
+    <w:p>
+      <w:pPr>
+        <w:pStyle w:val="Compact"/>
+        <w:numPr>
+          <w:ilvl w:val="0"/>
+          <w:numId w:val="1008"/>
+        </w:numPr>
+      </w:pPr>
+      <w:r>
+        <w:t xml:space="preserve">Flux d’execució: el cas d’ús demana informació cap enfora.</w:t>
+      </w:r>
+    </w:p>
+    <w:p>
+      <w:pPr>
+        <w:pStyle w:val="Compact"/>
+        <w:numPr>
+          <w:ilvl w:val="0"/>
+          <w:numId w:val="1008"/>
+        </w:numPr>
+      </w:pPr>
+      <w:r>
+        <w:t xml:space="preserve">Dependència de codi: el cas d’ús depèn del port; l’adaptador implementa el port.</w:t>
+      </w:r>
+    </w:p>
+    <w:p>
+      <w:pPr>
+        <w:pStyle w:val="Compact"/>
+        <w:numPr>
+          <w:ilvl w:val="0"/>
+          <w:numId w:val="1008"/>
+        </w:numPr>
+      </w:pPr>
+      <w:r>
+        <w:t xml:space="preserve">Inversió: la infraestructura depèn del port definit per l’aplicació.</w:t>
+      </w:r>
+    </w:p>
+    <w:p>
+      <w:pPr>
+        <w:pStyle w:val="Compact"/>
+        <w:numPr>
+          <w:ilvl w:val="0"/>
+          <w:numId w:val="1008"/>
+        </w:numPr>
+      </w:pPr>
+      <w:r>
+        <w:t xml:space="preserve">Transició: aplicar-ho al cas patrimonial.</w:t>
+      </w:r>
+    </w:p>
+    <w:bookmarkEnd w:id="28"/>
+    <w:bookmarkStart w:id="29" w:name="port-patrimonial---205"/>
     <w:p>
       <w:pPr>
         <w:pStyle w:val="Heading3"/>
       </w:pPr>
       <w:r>
-        <w:t xml:space="preserve">Diapositiva 8. Port de sortida per a informació patrimonial - 2:05</w:t>
-      </w:r>
-    </w:p>
-    <w:p>
-      <w:pPr>
-        <w:pStyle w:val="FirstParagraph"/>
-      </w:pPr>
-      <w:r>
-        <w:t xml:space="preserve">Portem aquesta idea al cas administratiu. [assenyalar el diagrama]</w:t>
-      </w:r>
-    </w:p>
-    <w:p>
-      <w:pPr>
-        <w:pStyle w:val="BodyText"/>
-      </w:pPr>
-      <w:r>
-        <w:t xml:space="preserve">El servei d’aplicació que avalua econòmicament una beca no hauria de conèixer directament els detalls de PICA, SOAP/XML, REST o JDBC. Hauria de dependre d’un contracte expressat en el llenguatge de l’aplicació. Per exemple: obtenir informació patrimonial, recuperar dades de renda o carregar l’expedient administratiu.</w:t>
-      </w:r>
-    </w:p>
-    <w:p>
-      <w:pPr>
-        <w:pStyle w:val="BodyText"/>
-      </w:pPr>
-      <w:r>
-        <w:t xml:space="preserve">En el diagrama, el nucli de l’aplicació conté el servei d’aplicació i el model de domini. Al voltant hi ha ports: un port d’entrada per invocar el cas d’ús i ports de sortida per obtenir o persistir informació. Fora del nucli hi ha els adaptadors: el controlador REST, l’adaptador JDBC, l’adaptador d’interoperabilitat amb PICA o qualsevol altre mecanisme concret.</w:t>
-      </w:r>
-    </w:p>
-    <w:p>
-      <w:pPr>
-        <w:pStyle w:val="BodyText"/>
-      </w:pPr>
-      <w:r>
-        <w:t xml:space="preserve">El punt tècnic més important és que l’adaptador de PICA o l’adaptador JDBC no són el centre de l’arquitectura. Són substituïbles. El que és estable és el contracte que el cas d’ús necessita. [pausa breu]</w:t>
-      </w:r>
-    </w:p>
-    <w:p>
-      <w:pPr>
-        <w:pStyle w:val="BodyText"/>
-      </w:pPr>
-      <w:r>
-        <w:t xml:space="preserve">Aquesta distinció queda reflectida en la direcció de les fletxes. Quan indiquen</w:t>
-      </w:r>
-      <w:r>
-        <w:t xml:space="preserve"> </w:t>
-      </w:r>
-      <w:r>
-        <w:rPr>
-          <w:rStyle w:val="VerbatimChar"/>
-        </w:rPr>
-        <w:t xml:space="preserve">implemented by</w:t>
-      </w:r>
-      <w:r>
-        <w:t xml:space="preserve">, les fletxes van de l’adaptador cap al port. El servei usa el port. L’adaptador implementa el port. I el domini no coneix ni l’adaptador, ni PICA, ni SOAP, ni REST.</w:t>
-      </w:r>
-    </w:p>
-    <w:p>
-      <w:pPr>
-        <w:pStyle w:val="BodyText"/>
-      </w:pPr>
-      <w:r>
-        <w:t xml:space="preserve">Aquesta mateixa estructura la podem transferir ara a un domini financer docent: HexaStock.</w:t>
-      </w:r>
-    </w:p>
-    <w:bookmarkEnd w:id="18"/>
-    <w:bookmarkStart w:id="19" w:name="X619a10340c1a251e91abc9532d1ef3ec34eca8e"/>
+        <w:t xml:space="preserve">8. Port patrimonial - 2:05</w:t>
+      </w:r>
+    </w:p>
+    <w:p>
+      <w:pPr>
+        <w:pStyle w:val="Compact"/>
+        <w:numPr>
+          <w:ilvl w:val="0"/>
+          <w:numId w:val="1009"/>
+        </w:numPr>
+      </w:pPr>
+      <w:r>
+        <w:t xml:space="preserve">Servei d’aplicació depèn de contractes propis.</w:t>
+      </w:r>
+    </w:p>
+    <w:p>
+      <w:pPr>
+        <w:pStyle w:val="Compact"/>
+        <w:numPr>
+          <w:ilvl w:val="0"/>
+          <w:numId w:val="1009"/>
+        </w:numPr>
+      </w:pPr>
+      <w:r>
+        <w:t xml:space="preserve">Adaptadors fora del nucli.</w:t>
+      </w:r>
+    </w:p>
+    <w:p>
+      <w:pPr>
+        <w:pStyle w:val="Compact"/>
+        <w:numPr>
+          <w:ilvl w:val="0"/>
+          <w:numId w:val="1009"/>
+        </w:numPr>
+      </w:pPr>
+      <w:r>
+        <w:t xml:space="preserve">PICA/JDBC/SOAP/REST són detalls substituïbles.</w:t>
+      </w:r>
+    </w:p>
+    <w:p>
+      <w:pPr>
+        <w:pStyle w:val="Compact"/>
+        <w:numPr>
+          <w:ilvl w:val="0"/>
+          <w:numId w:val="1009"/>
+        </w:numPr>
+      </w:pPr>
+      <w:r>
+        <w:t xml:space="preserve">Fletxa correcta d’implementació: adaptador -&gt; port.</w:t>
+      </w:r>
+    </w:p>
+    <w:p>
+      <w:pPr>
+        <w:pStyle w:val="Compact"/>
+        <w:numPr>
+          <w:ilvl w:val="0"/>
+          <w:numId w:val="1009"/>
+        </w:numPr>
+      </w:pPr>
+      <w:r>
+        <w:t xml:space="preserve">Transició: mateix patró en un domini financer.</w:t>
+      </w:r>
+    </w:p>
+    <w:bookmarkEnd w:id="29"/>
+    <w:bookmarkStart w:id="30" w:name="domini-financer---145"/>
     <w:p>
       <w:pPr>
         <w:pStyle w:val="Heading3"/>
       </w:pPr>
       <w:r>
-        <w:t xml:space="preserve">Diapositiva 9. Transferència a domini financer - 1:45</w:t>
-      </w:r>
-    </w:p>
-    <w:p>
-      <w:pPr>
-        <w:pStyle w:val="FirstParagraph"/>
-      </w:pPr>
-      <w:r>
-        <w:t xml:space="preserve">HexaStock ens permet treballar el mateix patró en un domini diferent: la venda d’accions. [assenyalar el títol]</w:t>
-      </w:r>
-    </w:p>
-    <w:p>
-      <w:pPr>
-        <w:pStyle w:val="BodyText"/>
-      </w:pPr>
-      <w:r>
-        <w:t xml:space="preserve">Aquí el cas d’ús és vendre accions d’una cartera. Per fer-ho correctament, el servei d’aplicació necessita el preu actual del ticker. Però el cas d’ús no hauria de dependre de Finnhub, Alpha Vantage, tokens, endpoints, JSON, clients HTTP o disponibilitat d’internet. [pausa breu]</w:t>
-      </w:r>
-    </w:p>
-    <w:p>
-      <w:pPr>
-        <w:pStyle w:val="BodyText"/>
-      </w:pPr>
-      <w:r>
-        <w:t xml:space="preserve">El port de sortida és</w:t>
-      </w:r>
-      <w:r>
-        <w:t xml:space="preserve"> </w:t>
-      </w:r>
-      <w:r>
-        <w:rPr>
-          <w:rStyle w:val="VerbatimChar"/>
-        </w:rPr>
-        <w:t xml:space="preserve">StockPriceProviderPort</w:t>
-      </w:r>
-      <w:r>
-        <w:t xml:space="preserve">. Aquest port expressa la capacitat que l’aplicació necessita: obtenir el preu d’una acció. Després podem tenir diferents adaptadors que implementen aquest port:</w:t>
-      </w:r>
-      <w:r>
-        <w:t xml:space="preserve"> </w:t>
-      </w:r>
-      <w:r>
-        <w:rPr>
-          <w:rStyle w:val="VerbatimChar"/>
-        </w:rPr>
-        <w:t xml:space="preserve">FinhubStockPriceAdapter</w:t>
-      </w:r>
-      <w:r>
-        <w:t xml:space="preserve">,</w:t>
-      </w:r>
-      <w:r>
-        <w:t xml:space="preserve"> </w:t>
-      </w:r>
-      <w:r>
-        <w:rPr>
-          <w:rStyle w:val="VerbatimChar"/>
-        </w:rPr>
-        <w:t xml:space="preserve">AlphaVantageStockPriceAdapter</w:t>
-      </w:r>
-      <w:r>
-        <w:t xml:space="preserve"> </w:t>
-      </w:r>
-      <w:r>
-        <w:t xml:space="preserve">o un adaptador mock per a proves i demos controlades.</w:t>
-      </w:r>
-    </w:p>
-    <w:p>
-      <w:pPr>
-        <w:pStyle w:val="BodyText"/>
-      </w:pPr>
-      <w:r>
-        <w:t xml:space="preserve">El patró és idèntic al cas AGAUR. En el cas administratiu, el procediment necessita informació patrimonial, no una tecnologia concreta. En HexaStock, el cas d’ús necessita un preu actual, no un proveïdor concret. [mirada al tribunal]</w:t>
-      </w:r>
-    </w:p>
-    <w:p>
-      <w:pPr>
-        <w:pStyle w:val="BodyText"/>
-      </w:pPr>
-      <w:r>
-        <w:t xml:space="preserve">Per tant, el missatge docent és transferible: primer identifiquem la necessitat funcional; després definim el port; finalment implementem adaptadors.</w:t>
-      </w:r>
-    </w:p>
-    <w:bookmarkEnd w:id="19"/>
-    <w:bookmarkStart w:id="20" w:name="Xf23ce5279610c607185e420fa6986d11a2001c6"/>
+        <w:t xml:space="preserve">9. Domini financer - 1:45</w:t>
+      </w:r>
+    </w:p>
+    <w:p>
+      <w:pPr>
+        <w:pStyle w:val="Compact"/>
+        <w:numPr>
+          <w:ilvl w:val="0"/>
+          <w:numId w:val="1010"/>
+        </w:numPr>
+      </w:pPr>
+      <w:r>
+        <w:t xml:space="preserve">Canvi explícit de domini: beca -&gt; cartera d’inversió personal.</w:t>
+      </w:r>
+    </w:p>
+    <w:p>
+      <w:pPr>
+        <w:pStyle w:val="Compact"/>
+        <w:numPr>
+          <w:ilvl w:val="0"/>
+          <w:numId w:val="1010"/>
+        </w:numPr>
+      </w:pPr>
+      <w:r>
+        <w:t xml:space="preserve">El diagrama ja correspon a HexaStock, però s’ha de llegir com a patró.</w:t>
+      </w:r>
+    </w:p>
+    <w:p>
+      <w:pPr>
+        <w:pStyle w:val="Compact"/>
+        <w:numPr>
+          <w:ilvl w:val="0"/>
+          <w:numId w:val="1010"/>
+        </w:numPr>
+      </w:pPr>
+      <w:r>
+        <w:t xml:space="preserve">Cas d’ús: vendre accions.</w:t>
+      </w:r>
+    </w:p>
+    <w:p>
+      <w:pPr>
+        <w:pStyle w:val="Compact"/>
+        <w:numPr>
+          <w:ilvl w:val="0"/>
+          <w:numId w:val="1010"/>
+        </w:numPr>
+      </w:pPr>
+      <w:r>
+        <w:t xml:space="preserve">Necessitat: preu actual de l’acció que l’usuari vol vendre.</w:t>
+      </w:r>
+    </w:p>
+    <w:p>
+      <w:pPr>
+        <w:pStyle w:val="Compact"/>
+        <w:numPr>
+          <w:ilvl w:val="0"/>
+          <w:numId w:val="1010"/>
+        </w:numPr>
+      </w:pPr>
+      <w:r>
+        <w:t xml:space="preserve">Port de sortida: defineix aquesta capacitat.</w:t>
+      </w:r>
+    </w:p>
+    <w:p>
+      <w:pPr>
+        <w:pStyle w:val="Compact"/>
+        <w:numPr>
+          <w:ilvl w:val="0"/>
+          <w:numId w:val="1010"/>
+        </w:numPr>
+      </w:pPr>
+      <w:r>
+        <w:t xml:space="preserve">Transició: ara sí, concretar-ho en HexaStock.</w:t>
+      </w:r>
+    </w:p>
+    <w:bookmarkEnd w:id="30"/>
+    <w:bookmarkStart w:id="31" w:name="flux-i-codi---145"/>
     <w:p>
       <w:pPr>
         <w:pStyle w:val="Heading3"/>
       </w:pPr>
       <w:r>
-        <w:t xml:space="preserve">Diapositiva 10. Flux i codi essencial - 1:45</w:t>
-      </w:r>
-    </w:p>
-    <w:p>
-      <w:pPr>
-        <w:pStyle w:val="FirstParagraph"/>
-      </w:pPr>
-      <w:r>
-        <w:t xml:space="preserve">Aquesta diapositiva mostra el flux temporal del cas d’ús de venda. [assenyalar el diagrama de seqüència]</w:t>
-      </w:r>
-    </w:p>
-    <w:p>
-      <w:pPr>
-        <w:pStyle w:val="BodyText"/>
-      </w:pPr>
-      <w:r>
-        <w:t xml:space="preserve">Convé aclarir que, en un diagrama de seqüència, les fletxes representen ordre d’execució, no dependències de codi. Això és perfectament compatible amb la inversió de dependències que acabem d’explicar.</w:t>
-      </w:r>
-    </w:p>
-    <w:p>
-      <w:pPr>
-        <w:pStyle w:val="BodyText"/>
-      </w:pPr>
-      <w:r>
-        <w:t xml:space="preserve">El client o controlador invoca el port d’entrada,</w:t>
-      </w:r>
-      <w:r>
-        <w:t xml:space="preserve"> </w:t>
-      </w:r>
-      <w:r>
-        <w:rPr>
-          <w:rStyle w:val="VerbatimChar"/>
-        </w:rPr>
-        <w:t xml:space="preserve">PortfolioStockOperationsUseCase</w:t>
-      </w:r>
-      <w:r>
-        <w:t xml:space="preserve">. La implementació és el servei d’aplicació,</w:t>
-      </w:r>
-      <w:r>
-        <w:t xml:space="preserve"> </w:t>
-      </w:r>
-      <w:r>
-        <w:rPr>
-          <w:rStyle w:val="VerbatimChar"/>
-        </w:rPr>
-        <w:t xml:space="preserve">PortfolioStockOperationsService</w:t>
-      </w:r>
-      <w:r>
-        <w:t xml:space="preserve">. Aquest servei recupera el portfolio mitjançant un port de persistència, consulta el preu mitjançant</w:t>
-      </w:r>
-      <w:r>
-        <w:t xml:space="preserve"> </w:t>
-      </w:r>
-      <w:r>
-        <w:rPr>
-          <w:rStyle w:val="VerbatimChar"/>
-        </w:rPr>
-        <w:t xml:space="preserve">StockPriceProviderPort</w:t>
-      </w:r>
-      <w:r>
-        <w:t xml:space="preserve">, i després crida el domini:</w:t>
-      </w:r>
-      <w:r>
-        <w:t xml:space="preserve"> </w:t>
-      </w:r>
-      <w:r>
-        <w:rPr>
-          <w:rStyle w:val="VerbatimChar"/>
-        </w:rPr>
-        <w:t xml:space="preserve">portfolio.sell(ticker, quantity, price)</w:t>
-      </w:r>
-      <w:r>
-        <w:t xml:space="preserve">. [pausa breu]</w:t>
-      </w:r>
-    </w:p>
-    <w:p>
-      <w:pPr>
-        <w:pStyle w:val="BodyText"/>
-      </w:pPr>
-      <w:r>
-        <w:t xml:space="preserve">La separació de responsabilitats és molt important. El servei coordina. El port obté informació. L’adaptador integra amb la infraestructura. Però la decisió de domini, la venda i el càlcul del resultat, no es resolen ni al controlador ni a l’adaptador de preus. Es resolen al model de domini, dins l’agregat</w:t>
-      </w:r>
-      <w:r>
-        <w:t xml:space="preserve"> </w:t>
-      </w:r>
-      <w:r>
-        <w:rPr>
-          <w:rStyle w:val="VerbatimChar"/>
-        </w:rPr>
-        <w:t xml:space="preserve">Portfolio</w:t>
-      </w:r>
-      <w:r>
-        <w:t xml:space="preserve">.</w:t>
-      </w:r>
-    </w:p>
-    <w:p>
-      <w:pPr>
-        <w:pStyle w:val="BodyText"/>
-      </w:pPr>
-      <w:r>
-        <w:t xml:space="preserve">Dit de manera sintètica: l’adaptador pot saber com obtenir un preu; no hauria de decidir com es ven una acció dins la cartera. [pausa]</w:t>
-      </w:r>
-    </w:p>
-    <w:bookmarkEnd w:id="20"/>
-    <w:bookmarkStart w:id="21" w:name="diapositiva-11.-demo---145"/>
+        <w:t xml:space="preserve">10. Flux i codi - 1:45</w:t>
+      </w:r>
+    </w:p>
+    <w:p>
+      <w:pPr>
+        <w:pStyle w:val="Compact"/>
+        <w:numPr>
+          <w:ilvl w:val="0"/>
+          <w:numId w:val="1011"/>
+        </w:numPr>
+      </w:pPr>
+      <w:r>
+        <w:t xml:space="preserve">Diagrama de seqüència = flux temporal, no dependència de codi.</w:t>
+      </w:r>
+    </w:p>
+    <w:p>
+      <w:pPr>
+        <w:pStyle w:val="Compact"/>
+        <w:numPr>
+          <w:ilvl w:val="0"/>
+          <w:numId w:val="1011"/>
+        </w:numPr>
+      </w:pPr>
+      <w:r>
+        <w:t xml:space="preserve">Controller -&gt; port d’entrada -&gt; servei.</w:t>
+      </w:r>
+    </w:p>
+    <w:p>
+      <w:pPr>
+        <w:pStyle w:val="Compact"/>
+        <w:numPr>
+          <w:ilvl w:val="0"/>
+          <w:numId w:val="1011"/>
+        </w:numPr>
+      </w:pPr>
+      <w:r>
+        <w:t xml:space="preserve">Servei consulta ports i delega venda al domini.</w:t>
+      </w:r>
+    </w:p>
+    <w:p>
+      <w:pPr>
+        <w:pStyle w:val="Compact"/>
+        <w:numPr>
+          <w:ilvl w:val="0"/>
+          <w:numId w:val="1011"/>
+        </w:numPr>
+      </w:pPr>
+      <w:r>
+        <w:t xml:space="preserve">Domini decideix; adaptador integra.</w:t>
+      </w:r>
+    </w:p>
+    <w:p>
+      <w:pPr>
+        <w:pStyle w:val="Compact"/>
+        <w:numPr>
+          <w:ilvl w:val="0"/>
+          <w:numId w:val="1011"/>
+        </w:numPr>
+      </w:pPr>
+      <w:r>
+        <w:t xml:space="preserve">Transició: demo controlada amb adaptador substituïble.</w:t>
+      </w:r>
+    </w:p>
+    <w:bookmarkEnd w:id="31"/>
+    <w:bookmarkStart w:id="32" w:name="demo---145"/>
     <w:p>
       <w:pPr>
         <w:pStyle w:val="Heading3"/>
       </w:pPr>
       <w:r>
-        <w:t xml:space="preserve">Diapositiva 11. Demo - 1:45</w:t>
-      </w:r>
-    </w:p>
-    <w:p>
-      <w:pPr>
-        <w:pStyle w:val="FirstParagraph"/>
-      </w:pPr>
-      <w:r>
-        <w:t xml:space="preserve">La demo, en aquesta classe, no pretén impressionar per complexitat tècnica. Té una funció docent molt concreta: mostrar que podem mantenir el mateix cas d’ús, el mateix servei d’aplicació i el mateix domini, canviant només l’adaptador. [assenyalar les tres caixes]</w:t>
-      </w:r>
-    </w:p>
-    <w:p>
-      <w:pPr>
-        <w:pStyle w:val="BodyText"/>
-      </w:pPr>
-      <w:r>
-        <w:t xml:space="preserve">En HexaStock, això es pot veure amb perfils diferents: un adaptador Finnhub, un adaptador Alpha Vantage o un adaptador mock. El port que veu el servei és el mateix:</w:t>
-      </w:r>
-      <w:r>
-        <w:t xml:space="preserve"> </w:t>
-      </w:r>
-      <w:r>
-        <w:rPr>
-          <w:rStyle w:val="VerbatimChar"/>
-        </w:rPr>
-        <w:t xml:space="preserve">StockPriceProviderPort</w:t>
-      </w:r>
-      <w:r>
-        <w:t xml:space="preserve">. La implementació concreta canvia segons la configuració.</w:t>
-      </w:r>
-    </w:p>
-    <w:p>
-      <w:pPr>
-        <w:pStyle w:val="BodyText"/>
-      </w:pPr>
-      <w:r>
-        <w:t xml:space="preserve">Aquest punt és especialment rellevant en docència. Permet fer proves sense dependre d’internet, sense claus reals, sense disponibilitat d’un proveïdor extern i sense contaminar el domini amb detalls tècnics. [mirada al tribunal]</w:t>
-      </w:r>
-    </w:p>
-    <w:p>
-      <w:pPr>
-        <w:pStyle w:val="BodyText"/>
-      </w:pPr>
-      <w:r>
-        <w:t xml:space="preserve">El missatge de la demo és el mateix que hem treballat des del principi: canvia la infraestructura; el cas d’ús i el domini romanen estables.</w:t>
-      </w:r>
-    </w:p>
-    <w:p>
-      <w:pPr>
-        <w:pStyle w:val="BodyText"/>
-      </w:pPr>
-      <w:r>
-        <w:t xml:space="preserve">Això no vol dir que l’arquitectura elimini el canvi. El canvi continua existint. El que fa una bona arquitectura és localitzar-lo.</w:t>
-      </w:r>
-    </w:p>
-    <w:bookmarkEnd w:id="21"/>
-    <w:bookmarkStart w:id="22" w:name="diapositiva-12.-agraïment---120"/>
-    <w:p>
-      <w:pPr>
-        <w:pStyle w:val="Heading3"/>
-      </w:pPr>
-      <w:r>
-        <w:t xml:space="preserve">Diapositiva 12. Agraïment - 1:20</w:t>
-      </w:r>
-    </w:p>
-    <w:p>
-      <w:pPr>
-        <w:pStyle w:val="FirstParagraph"/>
-      </w:pPr>
-      <w:r>
-        <w:t xml:space="preserve">Per tancar, voldria recuperar aquesta idea final. [pausa breu]</w:t>
-      </w:r>
-    </w:p>
-    <w:p>
-      <w:pPr>
-        <w:pStyle w:val="BodyText"/>
-      </w:pPr>
-      <w:r>
-        <w:t xml:space="preserve">L’arquitectura no elimina la dependència del món exterior. Les aplicacions reals necessiten bases de dades, APIs, plataformes corporatives, proveïdors externs i mecanismes d’integració. El que fa l’arquitectura hexagonal és convertir aquesta dependència en una frontera explícita, substituïble i comprovable.</w:t>
-      </w:r>
-    </w:p>
-    <w:p>
-      <w:pPr>
-        <w:pStyle w:val="BodyText"/>
-      </w:pPr>
-      <w:r>
-        <w:t xml:space="preserve">Quan canvia un proveïdor, una API o una tecnologia, volem canviar l’adaptador. No volem reescriure el cas d’ús ni deformar el model de domini. [pausa]</w:t>
-      </w:r>
-    </w:p>
-    <w:p>
-      <w:pPr>
-        <w:pStyle w:val="BodyText"/>
-      </w:pPr>
-      <w:r>
-        <w:t xml:space="preserve">Vull expressar el meu agraïment al TecnoCampus per un entorn que m’encoratja a créixer, tant en la docència com en l’àmbit acadèmic, al costat d’un equip del qual aprenc i amb qui comparteixo coneixement, responsabilitat i compromís amb la formació universitària. [pausa breu; mirar el tribunal]</w:t>
-      </w:r>
-    </w:p>
-    <w:p>
-      <w:pPr>
-        <w:pStyle w:val="BodyText"/>
-      </w:pPr>
-      <w:r>
-        <w:t xml:space="preserve">També vull fer un agraïment especial al Dr. Josep Roure, company professor del TecnoCampus, amb qui he tingut l’oportunitat d’aprendre sobre arquitectura de software, metodologies actives d’aprenentatge i treball en equip. [mirada al tribunal]</w:t>
-      </w:r>
-    </w:p>
-    <w:p>
-      <w:pPr>
-        <w:pStyle w:val="BodyText"/>
-      </w:pPr>
-      <w:r>
-        <w:t xml:space="preserve">Moltes gràcies.</w:t>
-      </w:r>
-    </w:p>
-    <w:bookmarkEnd w:id="22"/>
-    <w:bookmarkEnd w:id="23"/>
-    <w:bookmarkStart w:id="36" w:name="notes-del-presentador-per-diapositiva"/>
-    <w:p>
-      <w:pPr>
-        <w:pStyle w:val="Heading2"/>
-      </w:pPr>
-      <w:r>
-        <w:t xml:space="preserve">4. Notes del presentador per diapositiva</w:t>
-      </w:r>
-    </w:p>
-    <w:bookmarkStart w:id="24" w:name="portada---145"/>
-    <w:p>
-      <w:pPr>
-        <w:pStyle w:val="Heading3"/>
-      </w:pPr>
-      <w:r>
-        <w:t xml:space="preserve">1. Portada - 1:45</w:t>
-      </w:r>
-    </w:p>
-    <w:p>
-      <w:pPr>
-        <w:pStyle w:val="Compact"/>
-        <w:numPr>
-          <w:ilvl w:val="0"/>
-          <w:numId w:val="1002"/>
-        </w:numPr>
-      </w:pPr>
-      <w:r>
-        <w:t xml:space="preserve">Classe de DSI, no explicació completa d’arquitectura hexagonal.</w:t>
-      </w:r>
-    </w:p>
-    <w:p>
-      <w:pPr>
-        <w:pStyle w:val="Compact"/>
-        <w:numPr>
-          <w:ilvl w:val="0"/>
-          <w:numId w:val="1002"/>
-        </w:numPr>
-      </w:pPr>
-      <w:r>
-        <w:t xml:space="preserve">Informe AGAUR incorporat al tribunal: activitat de formació i consultoria especialitzada.</w:t>
-      </w:r>
-    </w:p>
-    <w:p>
-      <w:pPr>
-        <w:pStyle w:val="Compact"/>
-        <w:numPr>
-          <w:ilvl w:val="0"/>
-          <w:numId w:val="1002"/>
-        </w:numPr>
-      </w:pPr>
-      <w:r>
-        <w:t xml:space="preserve">Connexió: docència amb Dr. Josep Roure + consultoria en sistemes d’informació.</w:t>
-      </w:r>
-    </w:p>
-    <w:p>
-      <w:pPr>
-        <w:pStyle w:val="Compact"/>
-        <w:numPr>
-          <w:ilvl w:val="0"/>
-          <w:numId w:val="1002"/>
-        </w:numPr>
-      </w:pPr>
-      <w:r>
-        <w:t xml:space="preserve">No revelar dades internes; cas real com a base docent.</w:t>
-      </w:r>
-    </w:p>
-    <w:p>
-      <w:pPr>
-        <w:pStyle w:val="Compact"/>
-        <w:numPr>
-          <w:ilvl w:val="0"/>
-          <w:numId w:val="1002"/>
-        </w:numPr>
-      </w:pPr>
-      <w:r>
-        <w:t xml:space="preserve">Transició: ens centrarem en una decisió concreta, el port de sortida.</w:t>
-      </w:r>
-    </w:p>
-    <w:bookmarkEnd w:id="24"/>
-    <w:bookmarkStart w:id="25" w:name="on-som-dins-lassignatura---110"/>
-    <w:p>
-      <w:pPr>
-        <w:pStyle w:val="Heading3"/>
-      </w:pPr>
-      <w:r>
-        <w:t xml:space="preserve">2. On som dins l’assignatura - 1:10</w:t>
-      </w:r>
-    </w:p>
-    <w:p>
-      <w:pPr>
-        <w:pStyle w:val="Compact"/>
-        <w:numPr>
-          <w:ilvl w:val="0"/>
-          <w:numId w:val="1003"/>
-        </w:numPr>
-      </w:pPr>
-      <w:r>
-        <w:t xml:space="preserve">Pla docent: 3r curs, 6 ECTS, assignatura obligatòria.</w:t>
-      </w:r>
-    </w:p>
-    <w:p>
-      <w:pPr>
-        <w:pStyle w:val="Compact"/>
-        <w:numPr>
-          <w:ilvl w:val="0"/>
-          <w:numId w:val="1003"/>
-        </w:numPr>
-      </w:pPr>
-      <w:r>
-        <w:t xml:space="preserve">Bloc: clean/hexagonal, ports i adaptadors, mapping, mòduls, DDD.</w:t>
-      </w:r>
-    </w:p>
-    <w:p>
-      <w:pPr>
-        <w:pStyle w:val="Compact"/>
-        <w:numPr>
-          <w:ilvl w:val="0"/>
-          <w:numId w:val="1003"/>
-        </w:numPr>
-      </w:pPr>
-      <w:r>
-        <w:t xml:space="preserve">Justificar que la sessió encaixa en el temari.</w:t>
-      </w:r>
-    </w:p>
-    <w:p>
-      <w:pPr>
-        <w:pStyle w:val="Compact"/>
-        <w:numPr>
-          <w:ilvl w:val="0"/>
-          <w:numId w:val="1003"/>
-        </w:numPr>
-      </w:pPr>
-      <w:r>
-        <w:t xml:space="preserve">No panoràmica completa; focus en ports de sortida.</w:t>
-      </w:r>
-    </w:p>
-    <w:p>
-      <w:pPr>
-        <w:pStyle w:val="Compact"/>
-        <w:numPr>
-          <w:ilvl w:val="0"/>
-          <w:numId w:val="1003"/>
-        </w:numPr>
-      </w:pPr>
-      <w:r>
-        <w:t xml:space="preserve">Transició: objectiu mínim i entrada ràpida al cas real.</w:t>
-      </w:r>
-    </w:p>
-    <w:bookmarkEnd w:id="25"/>
-    <w:bookmarkStart w:id="26" w:name="objectiu-de-la-sessió---055"/>
-    <w:p>
-      <w:pPr>
-        <w:pStyle w:val="Heading3"/>
-      </w:pPr>
-      <w:r>
-        <w:t xml:space="preserve">3. Objectiu de la sessió - 0:55</w:t>
-      </w:r>
-    </w:p>
-    <w:p>
-      <w:pPr>
-        <w:pStyle w:val="Compact"/>
-        <w:numPr>
-          <w:ilvl w:val="0"/>
-          <w:numId w:val="1004"/>
-        </w:numPr>
-      </w:pPr>
-      <w:r>
-        <w:t xml:space="preserve">Passar-hi ràpid: és una diapositiva pont, no una explicació teòrica llarga.</w:t>
-      </w:r>
-    </w:p>
-    <w:p>
-      <w:pPr>
-        <w:pStyle w:val="Compact"/>
-        <w:numPr>
-          <w:ilvl w:val="0"/>
-          <w:numId w:val="1004"/>
-        </w:numPr>
-      </w:pPr>
-      <w:r>
-        <w:t xml:space="preserve">Frase clau: el cas d’ús necessita una capacitat, no una tecnologia.</w:t>
-      </w:r>
-    </w:p>
-    <w:p>
-      <w:pPr>
-        <w:pStyle w:val="Compact"/>
-        <w:numPr>
-          <w:ilvl w:val="0"/>
-          <w:numId w:val="1004"/>
-        </w:numPr>
-      </w:pPr>
-      <w:r>
-        <w:t xml:space="preserve">Tres accions: identificar necessitat, definir port, implementar adaptadors.</w:t>
-      </w:r>
-    </w:p>
-    <w:p>
-      <w:pPr>
-        <w:pStyle w:val="Compact"/>
-        <w:numPr>
-          <w:ilvl w:val="0"/>
-          <w:numId w:val="1004"/>
-        </w:numPr>
-      </w:pPr>
-      <w:r>
-        <w:t xml:space="preserve">Anunciar metodologia: primer cas real, després abstracció arquitectònica.</w:t>
-      </w:r>
-    </w:p>
-    <w:p>
-      <w:pPr>
-        <w:pStyle w:val="Compact"/>
-        <w:numPr>
-          <w:ilvl w:val="0"/>
-          <w:numId w:val="1004"/>
-        </w:numPr>
-      </w:pPr>
-      <w:r>
-        <w:t xml:space="preserve">Transició: començar pel procediment de beca.</w:t>
-      </w:r>
-    </w:p>
-    <w:bookmarkEnd w:id="26"/>
-    <w:bookmarkStart w:id="27" w:name="avaluació-econòmica---150"/>
-    <w:p>
-      <w:pPr>
-        <w:pStyle w:val="Heading3"/>
-      </w:pPr>
-      <w:r>
-        <w:t xml:space="preserve">4. Avaluació econòmica - 1:50</w:t>
-      </w:r>
-    </w:p>
-    <w:p>
-      <w:pPr>
-        <w:pStyle w:val="Compact"/>
-        <w:numPr>
-          <w:ilvl w:val="0"/>
-          <w:numId w:val="1005"/>
-        </w:numPr>
-      </w:pPr>
-      <w:r>
-        <w:t xml:space="preserve">Primer entendre procediment, després tecnologia.</w:t>
-      </w:r>
-    </w:p>
-    <w:p>
-      <w:pPr>
-        <w:pStyle w:val="Compact"/>
-        <w:numPr>
-          <w:ilvl w:val="0"/>
-          <w:numId w:val="1005"/>
-        </w:numPr>
-      </w:pPr>
-      <w:r>
-        <w:t xml:space="preserve">Sol·licitud, expedient, requisits generals, econòmics, revisió, resolució.</w:t>
-      </w:r>
-    </w:p>
-    <w:p>
-      <w:pPr>
-        <w:pStyle w:val="Compact"/>
-        <w:numPr>
-          <w:ilvl w:val="0"/>
-          <w:numId w:val="1005"/>
-        </w:numPr>
-      </w:pPr>
-      <w:r>
-        <w:t xml:space="preserve">Renda i patrimoni com a decisió funcional.</w:t>
-      </w:r>
-    </w:p>
-    <w:p>
-      <w:pPr>
-        <w:pStyle w:val="Compact"/>
-        <w:numPr>
-          <w:ilvl w:val="0"/>
-          <w:numId w:val="1005"/>
-        </w:numPr>
-      </w:pPr>
-      <w:r>
-        <w:t xml:space="preserve">Evitar començar per SOAP/REST/PICA.</w:t>
-      </w:r>
-    </w:p>
-    <w:p>
-      <w:pPr>
-        <w:pStyle w:val="Compact"/>
-        <w:numPr>
-          <w:ilvl w:val="0"/>
-          <w:numId w:val="1005"/>
-        </w:numPr>
-      </w:pPr>
-      <w:r>
-        <w:t xml:space="preserve">Transició: quines dades externes fan falta?</w:t>
-      </w:r>
-    </w:p>
-    <w:bookmarkEnd w:id="27"/>
-    <w:bookmarkStart w:id="28" w:name="informació-externa---200"/>
-    <w:p>
-      <w:pPr>
-        <w:pStyle w:val="Heading3"/>
-      </w:pPr>
-      <w:r>
-        <w:t xml:space="preserve">5. Informació externa - 2:00</w:t>
-      </w:r>
-    </w:p>
-    <w:p>
-      <w:pPr>
-        <w:pStyle w:val="Compact"/>
-        <w:numPr>
-          <w:ilvl w:val="0"/>
-          <w:numId w:val="1006"/>
-        </w:numPr>
-      </w:pPr>
-      <w:r>
-        <w:t xml:space="preserve">Necessitats: renda, patrimoni, béns immobles.</w:t>
-      </w:r>
-    </w:p>
-    <w:p>
-      <w:pPr>
-        <w:pStyle w:val="Compact"/>
-        <w:numPr>
-          <w:ilvl w:val="0"/>
-          <w:numId w:val="1006"/>
-        </w:numPr>
-      </w:pPr>
-      <w:r>
-        <w:t xml:space="preserve">Fonts: AEAT, Cadastre, PICA.</w:t>
-      </w:r>
-    </w:p>
-    <w:p>
-      <w:pPr>
-        <w:pStyle w:val="Compact"/>
-        <w:numPr>
-          <w:ilvl w:val="0"/>
-          <w:numId w:val="1006"/>
-        </w:numPr>
-      </w:pPr>
-      <w:r>
-        <w:t xml:space="preserve">PICA com a interoperabilitat administrativa.</w:t>
-      </w:r>
-    </w:p>
-    <w:p>
-      <w:pPr>
-        <w:pStyle w:val="Compact"/>
-        <w:numPr>
-          <w:ilvl w:val="0"/>
-          <w:numId w:val="1006"/>
-        </w:numPr>
-      </w:pPr>
-      <w:r>
-        <w:t xml:space="preserve">Frase clau: informació administrativa, no API concreta.</w:t>
-      </w:r>
-    </w:p>
-    <w:p>
-      <w:pPr>
-        <w:pStyle w:val="Compact"/>
-        <w:numPr>
-          <w:ilvl w:val="0"/>
-          <w:numId w:val="1006"/>
-        </w:numPr>
-      </w:pPr>
-      <w:r>
-        <w:t xml:space="preserve">Transició: si no separem, apareix dependència directa.</w:t>
-      </w:r>
-    </w:p>
-    <w:bookmarkEnd w:id="28"/>
-    <w:bookmarkStart w:id="29" w:name="dependència-directa---210"/>
-    <w:p>
-      <w:pPr>
-        <w:pStyle w:val="Heading3"/>
-      </w:pPr>
-      <w:r>
-        <w:t xml:space="preserve">6. Dependència directa - 2:10</w:t>
-      </w:r>
-    </w:p>
-    <w:p>
-      <w:pPr>
-        <w:pStyle w:val="Compact"/>
-        <w:numPr>
-          <w:ilvl w:val="0"/>
-          <w:numId w:val="1007"/>
-        </w:numPr>
-      </w:pPr>
-      <w:r>
-        <w:t xml:space="preserve">El problema no és PICA; és l’acoblament directe.</w:t>
-      </w:r>
-    </w:p>
-    <w:p>
-      <w:pPr>
-        <w:pStyle w:val="Compact"/>
-        <w:numPr>
-          <w:ilvl w:val="0"/>
-          <w:numId w:val="1007"/>
-        </w:numPr>
-      </w:pPr>
-      <w:r>
-        <w:t xml:space="preserve">Cas d’ús coneix SOAP/XML, DTOs, clients, errors tècnics.</w:t>
-      </w:r>
-    </w:p>
-    <w:p>
-      <w:pPr>
-        <w:pStyle w:val="Compact"/>
-        <w:numPr>
-          <w:ilvl w:val="0"/>
-          <w:numId w:val="1007"/>
-        </w:numPr>
-      </w:pPr>
-      <w:r>
-        <w:t xml:space="preserve">Evolució tecnològica travessa frontera.</w:t>
-      </w:r>
-    </w:p>
-    <w:p>
-      <w:pPr>
-        <w:pStyle w:val="Compact"/>
-        <w:numPr>
-          <w:ilvl w:val="0"/>
-          <w:numId w:val="1007"/>
-        </w:numPr>
-      </w:pPr>
-      <w:r>
-        <w:t xml:space="preserve">Tres riscos: acoblament, manteniment fràgil, continuïtat operativa.</w:t>
-      </w:r>
-    </w:p>
-    <w:p>
-      <w:pPr>
-        <w:pStyle w:val="Compact"/>
-        <w:numPr>
-          <w:ilvl w:val="0"/>
-          <w:numId w:val="1007"/>
-        </w:numPr>
-      </w:pPr>
-      <w:r>
-        <w:t xml:space="preserve">Transició: resposta arquitectònica, port de sortida.</w:t>
-      </w:r>
-    </w:p>
-    <w:bookmarkEnd w:id="29"/>
-    <w:bookmarkStart w:id="30" w:name="port-i-adaptador---130"/>
-    <w:p>
-      <w:pPr>
-        <w:pStyle w:val="Heading3"/>
-      </w:pPr>
-      <w:r>
-        <w:t xml:space="preserve">7. Port i adaptador - 1:30</w:t>
-      </w:r>
-    </w:p>
-    <w:p>
-      <w:pPr>
-        <w:pStyle w:val="Compact"/>
-        <w:numPr>
-          <w:ilvl w:val="0"/>
-          <w:numId w:val="1008"/>
-        </w:numPr>
-      </w:pPr>
-      <w:r>
-        <w:t xml:space="preserve">Port = què necessita l’aplicació.</w:t>
-      </w:r>
-    </w:p>
-    <w:p>
-      <w:pPr>
-        <w:pStyle w:val="Compact"/>
-        <w:numPr>
-          <w:ilvl w:val="0"/>
-          <w:numId w:val="1008"/>
-        </w:numPr>
-      </w:pPr>
-      <w:r>
-        <w:t xml:space="preserve">Adaptador = com s’integra tècnicament.</w:t>
-      </w:r>
-    </w:p>
-    <w:p>
-      <w:pPr>
-        <w:pStyle w:val="Compact"/>
-        <w:numPr>
-          <w:ilvl w:val="0"/>
-          <w:numId w:val="1008"/>
-        </w:numPr>
-      </w:pPr>
-      <w:r>
-        <w:t xml:space="preserve">Distingir flux d’execució i dependència de codi.</w:t>
-      </w:r>
-    </w:p>
-    <w:p>
-      <w:pPr>
-        <w:pStyle w:val="Compact"/>
-        <w:numPr>
-          <w:ilvl w:val="0"/>
-          <w:numId w:val="1008"/>
-        </w:numPr>
-      </w:pPr>
-      <w:r>
-        <w:t xml:space="preserve">Inversió: adaptador implementa port; nucli no depèn d’adaptador.</w:t>
-      </w:r>
-    </w:p>
-    <w:p>
-      <w:pPr>
-        <w:pStyle w:val="Compact"/>
-        <w:numPr>
-          <w:ilvl w:val="0"/>
-          <w:numId w:val="1008"/>
-        </w:numPr>
-      </w:pPr>
-      <w:r>
-        <w:t xml:space="preserve">Transició: aplicar-ho al cas patrimonial.</w:t>
-      </w:r>
-    </w:p>
-    <w:bookmarkEnd w:id="30"/>
-    <w:bookmarkStart w:id="31" w:name="port-patrimonial---205"/>
-    <w:p>
-      <w:pPr>
-        <w:pStyle w:val="Heading3"/>
-      </w:pPr>
-      <w:r>
-        <w:t xml:space="preserve">8. Port patrimonial - 2:05</w:t>
-      </w:r>
-    </w:p>
-    <w:p>
-      <w:pPr>
-        <w:pStyle w:val="Compact"/>
-        <w:numPr>
-          <w:ilvl w:val="0"/>
-          <w:numId w:val="1009"/>
-        </w:numPr>
-      </w:pPr>
-      <w:r>
-        <w:t xml:space="preserve">Servei d’aplicació depèn de contractes propis.</w:t>
-      </w:r>
-    </w:p>
-    <w:p>
-      <w:pPr>
-        <w:pStyle w:val="Compact"/>
-        <w:numPr>
-          <w:ilvl w:val="0"/>
-          <w:numId w:val="1009"/>
-        </w:numPr>
-      </w:pPr>
-      <w:r>
-        <w:t xml:space="preserve">Adaptadors fora del nucli.</w:t>
-      </w:r>
-    </w:p>
-    <w:p>
-      <w:pPr>
-        <w:pStyle w:val="Compact"/>
-        <w:numPr>
-          <w:ilvl w:val="0"/>
-          <w:numId w:val="1009"/>
-        </w:numPr>
-      </w:pPr>
-      <w:r>
-        <w:t xml:space="preserve">PICA/JDBC/SOAP/REST són detalls substituïbles.</w:t>
-      </w:r>
-    </w:p>
-    <w:p>
-      <w:pPr>
-        <w:pStyle w:val="Compact"/>
-        <w:numPr>
-          <w:ilvl w:val="0"/>
-          <w:numId w:val="1009"/>
-        </w:numPr>
-      </w:pPr>
-      <w:r>
-        <w:t xml:space="preserve">Fletxa correcta d’implementació: adaptador -&gt; port.</w:t>
-      </w:r>
-    </w:p>
-    <w:p>
-      <w:pPr>
-        <w:pStyle w:val="Compact"/>
-        <w:numPr>
-          <w:ilvl w:val="0"/>
-          <w:numId w:val="1009"/>
-        </w:numPr>
-      </w:pPr>
-      <w:r>
-        <w:t xml:space="preserve">Transició: mateix patró en HexaStock.</w:t>
-      </w:r>
-    </w:p>
-    <w:bookmarkEnd w:id="31"/>
-    <w:bookmarkStart w:id="32" w:name="hexastock---145"/>
-    <w:p>
-      <w:pPr>
-        <w:pStyle w:val="Heading3"/>
-      </w:pPr>
-      <w:r>
-        <w:t xml:space="preserve">9. HexaStock - 1:45</w:t>
-      </w:r>
-    </w:p>
-    <w:p>
-      <w:pPr>
-        <w:pStyle w:val="Compact"/>
-        <w:numPr>
-          <w:ilvl w:val="0"/>
-          <w:numId w:val="1010"/>
-        </w:numPr>
-      </w:pPr>
-      <w:r>
-        <w:t xml:space="preserve">Domini financer: vendre accions.</w:t>
-      </w:r>
-    </w:p>
-    <w:p>
-      <w:pPr>
-        <w:pStyle w:val="Compact"/>
-        <w:numPr>
-          <w:ilvl w:val="0"/>
-          <w:numId w:val="1010"/>
-        </w:numPr>
-      </w:pPr>
-      <w:r>
-        <w:t xml:space="preserve">Necessitat: preu actual del ticker.</w:t>
-      </w:r>
-    </w:p>
-    <w:p>
-      <w:pPr>
-        <w:pStyle w:val="Compact"/>
-        <w:numPr>
-          <w:ilvl w:val="0"/>
-          <w:numId w:val="1010"/>
-        </w:numPr>
-      </w:pPr>
-      <w:r>
-        <w:t xml:space="preserve">Port:</w:t>
-      </w:r>
-      <w:r>
-        <w:t xml:space="preserve"> </w:t>
-      </w:r>
-      <w:r>
-        <w:rPr>
-          <w:rStyle w:val="VerbatimChar"/>
-        </w:rPr>
-        <w:t xml:space="preserve">StockPriceProviderPort</w:t>
-      </w:r>
-      <w:r>
-        <w:t xml:space="preserve">.</w:t>
-      </w:r>
-    </w:p>
-    <w:p>
-      <w:pPr>
-        <w:pStyle w:val="Compact"/>
-        <w:numPr>
-          <w:ilvl w:val="0"/>
-          <w:numId w:val="1010"/>
-        </w:numPr>
-      </w:pPr>
-      <w:r>
-        <w:t xml:space="preserve">Adaptadors: Finnhub, Alpha Vantage, mock.</w:t>
-      </w:r>
-    </w:p>
-    <w:p>
-      <w:pPr>
-        <w:pStyle w:val="Compact"/>
-        <w:numPr>
-          <w:ilvl w:val="0"/>
-          <w:numId w:val="1010"/>
-        </w:numPr>
-      </w:pPr>
-      <w:r>
-        <w:t xml:space="preserve">Transició: veure el flux i el codi essencial.</w:t>
+        <w:t xml:space="preserve">11. Demo - 1:45</w:t>
+      </w:r>
+    </w:p>
+    <w:p>
+      <w:pPr>
+        <w:pStyle w:val="Compact"/>
+        <w:numPr>
+          <w:ilvl w:val="0"/>
+          <w:numId w:val="1012"/>
+        </w:numPr>
+      </w:pPr>
+      <w:r>
+        <w:t xml:space="preserve">Mateix cas d’ús, servei i domini.</w:t>
+      </w:r>
+    </w:p>
+    <w:p>
+      <w:pPr>
+        <w:pStyle w:val="Compact"/>
+        <w:numPr>
+          <w:ilvl w:val="0"/>
+          <w:numId w:val="1012"/>
+        </w:numPr>
+      </w:pPr>
+      <w:r>
+        <w:t xml:space="preserve">Canvia l’adaptador.</w:t>
+      </w:r>
+    </w:p>
+    <w:p>
+      <w:pPr>
+        <w:pStyle w:val="Compact"/>
+        <w:numPr>
+          <w:ilvl w:val="0"/>
+          <w:numId w:val="1012"/>
+        </w:numPr>
+      </w:pPr>
+      <w:r>
+        <w:t xml:space="preserve">Perfils: Finnhub, Alpha Vantage, mock.</w:t>
+      </w:r>
+    </w:p>
+    <w:p>
+      <w:pPr>
+        <w:pStyle w:val="Compact"/>
+        <w:numPr>
+          <w:ilvl w:val="0"/>
+          <w:numId w:val="1012"/>
+        </w:numPr>
+      </w:pPr>
+      <w:r>
+        <w:t xml:space="preserve">Finnhub i Alpha Vantage són implementacions concretes; el contracte no canvia.</w:t>
+      </w:r>
+    </w:p>
+    <w:p>
+      <w:pPr>
+        <w:pStyle w:val="Compact"/>
+        <w:numPr>
+          <w:ilvl w:val="0"/>
+          <w:numId w:val="1012"/>
+        </w:numPr>
+      </w:pPr>
+      <w:r>
+        <w:t xml:space="preserve">Utilitat docent: proves amb adaptador mock i sense claus reals.</w:t>
+      </w:r>
+    </w:p>
+    <w:p>
+      <w:pPr>
+        <w:pStyle w:val="Compact"/>
+        <w:numPr>
+          <w:ilvl w:val="0"/>
+          <w:numId w:val="1012"/>
+        </w:numPr>
+      </w:pPr>
+      <w:r>
+        <w:t xml:space="preserve">Transició: conclusió final.</w:t>
       </w:r>
     </w:p>
     <w:bookmarkEnd w:id="32"/>
-    <w:bookmarkStart w:id="33" w:name="flux-i-codi---145"/>
-    <w:p>
-      <w:pPr>
-        <w:pStyle w:val="Heading3"/>
-      </w:pPr>
-      <w:r>
-        <w:t xml:space="preserve">10. Flux i codi - 1:45</w:t>
-      </w:r>
-    </w:p>
-    <w:p>
-      <w:pPr>
-        <w:pStyle w:val="Compact"/>
-        <w:numPr>
-          <w:ilvl w:val="0"/>
-          <w:numId w:val="1011"/>
-        </w:numPr>
-      </w:pPr>
-      <w:r>
-        <w:t xml:space="preserve">Diagrama de seqüència = flux temporal, no dependència de codi.</w:t>
-      </w:r>
-    </w:p>
-    <w:p>
-      <w:pPr>
-        <w:pStyle w:val="Compact"/>
-        <w:numPr>
-          <w:ilvl w:val="0"/>
-          <w:numId w:val="1011"/>
-        </w:numPr>
-      </w:pPr>
-      <w:r>
-        <w:t xml:space="preserve">Controller -&gt; port d’entrada -&gt; servei.</w:t>
-      </w:r>
-    </w:p>
-    <w:p>
-      <w:pPr>
-        <w:pStyle w:val="Compact"/>
-        <w:numPr>
-          <w:ilvl w:val="0"/>
-          <w:numId w:val="1011"/>
-        </w:numPr>
-      </w:pPr>
-      <w:r>
-        <w:t xml:space="preserve">Servei consulta ports i delega venda al domini.</w:t>
-      </w:r>
-    </w:p>
-    <w:p>
-      <w:pPr>
-        <w:pStyle w:val="Compact"/>
-        <w:numPr>
-          <w:ilvl w:val="0"/>
-          <w:numId w:val="1011"/>
-        </w:numPr>
-      </w:pPr>
-      <w:r>
-        <w:t xml:space="preserve">Domini decideix; adaptador integra.</w:t>
-      </w:r>
-    </w:p>
-    <w:p>
-      <w:pPr>
-        <w:pStyle w:val="Compact"/>
-        <w:numPr>
-          <w:ilvl w:val="0"/>
-          <w:numId w:val="1011"/>
-        </w:numPr>
-      </w:pPr>
-      <w:r>
-        <w:t xml:space="preserve">Transició: demo controlada amb adaptador substituïble.</w:t>
-      </w:r>
-    </w:p>
-    <w:bookmarkEnd w:id="33"/>
-    <w:bookmarkStart w:id="34" w:name="demo---145"/>
-    <w:p>
-      <w:pPr>
-        <w:pStyle w:val="Heading3"/>
-      </w:pPr>
-      <w:r>
-        <w:t xml:space="preserve">11. Demo - 1:45</w:t>
-      </w:r>
-    </w:p>
-    <w:p>
-      <w:pPr>
-        <w:pStyle w:val="Compact"/>
-        <w:numPr>
-          <w:ilvl w:val="0"/>
-          <w:numId w:val="1012"/>
-        </w:numPr>
-      </w:pPr>
-      <w:r>
-        <w:t xml:space="preserve">Mateix cas d’ús, servei i domini.</w:t>
-      </w:r>
-    </w:p>
-    <w:p>
-      <w:pPr>
-        <w:pStyle w:val="Compact"/>
-        <w:numPr>
-          <w:ilvl w:val="0"/>
-          <w:numId w:val="1012"/>
-        </w:numPr>
-      </w:pPr>
-      <w:r>
-        <w:t xml:space="preserve">Canvia l’adaptador.</w:t>
-      </w:r>
-    </w:p>
-    <w:p>
-      <w:pPr>
-        <w:pStyle w:val="Compact"/>
-        <w:numPr>
-          <w:ilvl w:val="0"/>
-          <w:numId w:val="1012"/>
-        </w:numPr>
-      </w:pPr>
-      <w:r>
-        <w:t xml:space="preserve">Perfils: Finnhub, Alpha Vantage, mock.</w:t>
-      </w:r>
-    </w:p>
-    <w:p>
-      <w:pPr>
-        <w:pStyle w:val="Compact"/>
-        <w:numPr>
-          <w:ilvl w:val="0"/>
-          <w:numId w:val="1012"/>
-        </w:numPr>
-      </w:pPr>
-      <w:r>
-        <w:t xml:space="preserve">Utilitat docent: proves sense internet ni claus.</w:t>
-      </w:r>
-    </w:p>
-    <w:p>
-      <w:pPr>
-        <w:pStyle w:val="Compact"/>
-        <w:numPr>
-          <w:ilvl w:val="0"/>
-          <w:numId w:val="1012"/>
-        </w:numPr>
-      </w:pPr>
-      <w:r>
-        <w:t xml:space="preserve">Transició: conclusió final.</w:t>
-      </w:r>
-    </w:p>
-    <w:bookmarkEnd w:id="34"/>
-    <w:bookmarkStart w:id="35" w:name="agraïment---120"/>
+    <w:bookmarkStart w:id="33" w:name="agraïment---120"/>
     <w:p>
       <w:pPr>
         <w:pStyle w:val="Heading3"/>
@@ -2292,15 +1825,15 @@
         <w:t xml:space="preserve">.</w:t>
       </w:r>
     </w:p>
-    <w:bookmarkEnd w:id="35"/>
-    <w:bookmarkEnd w:id="36"/>
-    <w:bookmarkStart w:id="37" w:name="esquema-de-memorització"/>
+    <w:bookmarkEnd w:id="33"/>
+    <w:bookmarkEnd w:id="34"/>
+    <w:bookmarkStart w:id="35" w:name="esquema-de-memorització"/>
     <w:p>
       <w:pPr>
         <w:pStyle w:val="Heading2"/>
       </w:pPr>
       <w:r>
-        <w:t xml:space="preserve">5. Esquema de memorització</w:t>
+        <w:t xml:space="preserve">3. Esquema de memorització</w:t>
       </w:r>
     </w:p>
     <w:tbl>
@@ -2311,11 +1844,11 @@
         <w:tblLook w:firstRow="1" w:lastRow="0" w:firstColumn="0" w:lastColumn="0" w:noHBand="0" w:noVBand="0" w:val="0020"/>
       </w:tblPr>
       <w:tblGrid>
-        <w:gridCol w:w="1584"/>
-        <w:gridCol w:w="1584"/>
-        <w:gridCol w:w="1584"/>
-        <w:gridCol w:w="1584"/>
-        <w:gridCol w:w="1584"/>
+        <w:gridCol w:w="580"/>
+        <w:gridCol w:w="2534"/>
+        <w:gridCol w:w="1795"/>
+        <w:gridCol w:w="1267"/>
+        <w:gridCol w:w="1742"/>
       </w:tblGrid>
       <w:tr>
         <w:trPr>
@@ -2828,7 +2361,7 @@
               <w:pStyle w:val="Compact"/>
             </w:pPr>
             <w:r>
-              <w:t xml:space="preserve">Transferència a HexaStock</w:t>
+              <w:t xml:space="preserve">Transferència al domini financer</w:t>
             </w:r>
           </w:p>
         </w:tc>
@@ -2863,10 +2396,7 @@
               <w:pStyle w:val="Compact"/>
             </w:pPr>
             <w:r>
-              <w:rPr>
-                <w:rStyle w:val="VerbatimChar"/>
-              </w:rPr>
-              <w:t xml:space="preserve">StockPriceProviderPort</w:t>
+              <w:t xml:space="preserve">Necessitat, port i adaptador</w:t>
             </w:r>
           </w:p>
         </w:tc>
@@ -2888,7 +2418,7 @@
               <w:pStyle w:val="Compact"/>
             </w:pPr>
             <w:r>
-              <w:t xml:space="preserve">Flux temporal</w:t>
+              <w:t xml:space="preserve">Projecte concret</w:t>
             </w:r>
           </w:p>
         </w:tc>
@@ -2934,7 +2464,7 @@
               <w:pStyle w:val="Compact"/>
             </w:pPr>
             <w:r>
-              <w:t xml:space="preserve">Diagrama HexaStock</w:t>
+              <w:t xml:space="preserve">Transferència genèrica</w:t>
             </w:r>
           </w:p>
         </w:tc>
@@ -3079,20 +2609,20 @@
         <w:rPr>
           <w:rStyle w:val="VerbatimChar"/>
         </w:rPr>
-        <w:t xml:space="preserve">context -&gt; assignatura -&gt; objectiu breu -&gt; procediment -&gt; dada externa -&gt; acoblament -&gt; port -&gt; AGAUR -&gt; HexaStock -&gt; flux -&gt; demo -&gt; conclusió</w:t>
+        <w:t xml:space="preserve">context -&gt; assignatura -&gt; objectiu breu -&gt; procediment -&gt; dada externa -&gt; acoblament -&gt; port -&gt; AGAUR -&gt; domini financer -&gt; HexaStock -&gt; demo -&gt; conclusió</w:t>
       </w:r>
       <w:r>
         <w:t xml:space="preserve">.</w:t>
       </w:r>
     </w:p>
-    <w:bookmarkEnd w:id="37"/>
-    <w:bookmarkStart w:id="38" w:name="pla-dentrenament-comunicatiu"/>
+    <w:bookmarkEnd w:id="35"/>
+    <w:bookmarkStart w:id="36" w:name="pla-dentrenament-comunicatiu"/>
     <w:p>
       <w:pPr>
         <w:pStyle w:val="Heading2"/>
       </w:pPr>
       <w:r>
-        <w:t xml:space="preserve">6. Pla d’entrenament comunicatiu</w:t>
+        <w:t xml:space="preserve">4. Pla d’entrenament comunicatiu</w:t>
       </w:r>
     </w:p>
     <w:p>
@@ -3176,7 +2706,7 @@
         </w:numPr>
       </w:pPr>
       <w:r>
-        <w:t xml:space="preserve">Bloc 3: diapositives 9-12, HexaStock, flux, demo i tancament.</w:t>
+        <w:t xml:space="preserve">Bloc 3: diapositives 9-12, domini financer, HexaStock, demo i tancament.</w:t>
       </w:r>
     </w:p>
     <w:p>
@@ -3366,14 +2896,14 @@
         <w:t xml:space="preserve">La postura ha de ser estable, amb els peus oberts a amplada d’espatlles. Usa les mans per marcar fronteres: dins/fora, port/adaptador, flux/dependència. Si et perds, torna al mantra: necessitat, port, adaptador. Aquesta triada recupera tota la presentació.</w:t>
       </w:r>
     </w:p>
-    <w:bookmarkEnd w:id="38"/>
-    <w:bookmarkStart w:id="39" w:name="advertiments-finals"/>
+    <w:bookmarkEnd w:id="36"/>
+    <w:bookmarkStart w:id="37" w:name="advertiments-finals"/>
     <w:p>
       <w:pPr>
         <w:pStyle w:val="Heading2"/>
       </w:pPr>
       <w:r>
-        <w:t xml:space="preserve">7. Advertiments finals</w:t>
+        <w:t xml:space="preserve">5. Advertiments finals</w:t>
       </w:r>
     </w:p>
     <w:p>
@@ -3448,9 +2978,11 @@
         <w:t xml:space="preserve">Risc de confidencialitat: no mencionar endpoints, credencials, captures internes ni detalls operatius d’AGAUR. L’informe acredita l’activitat; la classe només usa el cas com a abstracció docent.</w:t>
       </w:r>
     </w:p>
-    <w:bookmarkEnd w:id="39"/>
-    <w:bookmarkEnd w:id="40"/>
+    <w:bookmarkEnd w:id="37"/>
+    <w:bookmarkEnd w:id="38"/>
     <w:sectPr>
+      <w:pgSz w:w="11906" w:h="16838"/>
+      <w:pgMar w:top="1440" w:right="1440" w:bottom="1440" w:left="1440" w:header="720" w:footer="720" w:gutter="0"/>
       <w:footnotePr>
         <w:numRestart w:val="eachSect"/>
       </w:footnotePr>
@@ -4370,7 +3902,7 @@
       <w:color w:themeColor="accent1" w:themeShade="BF" w:val="365F91"/>
     </w:rPr>
   </w:style>
-  <w:style w:type="paragraph" w:customStyle="1" w:styleId="SourceCode">
+  <w:style w:customStyle="1" w:styleId="SourceCode" w:type="paragraph">
     <w:name w:val="Source Code"/>
     <w:basedOn w:val="Normal"/>
     <w:link w:val="VerbatimChar"/>
@@ -4378,7 +3910,7 @@
       <w:wordWrap w:val="off"/>
     </w:pPr>
   </w:style>
-  <w:style w:type="character" w:customStyle="1" w:styleId="KeywordTok">
+  <w:style w:customStyle="1" w:styleId="KeywordTok" w:type="character">
     <w:name w:val="KeywordTok"/>
     <w:basedOn w:val="VerbatimChar"/>
     <w:rPr>
@@ -4386,77 +3918,77 @@
       <w:color w:val="007020"/>
     </w:rPr>
   </w:style>
-  <w:style w:type="character" w:customStyle="1" w:styleId="DataTypeTok">
+  <w:style w:customStyle="1" w:styleId="DataTypeTok" w:type="character">
     <w:name w:val="DataTypeTok"/>
     <w:basedOn w:val="VerbatimChar"/>
     <w:rPr>
       <w:color w:val="902000"/>
     </w:rPr>
   </w:style>
-  <w:style w:type="character" w:customStyle="1" w:styleId="DecValTok">
+  <w:style w:customStyle="1" w:styleId="DecValTok" w:type="character">
     <w:name w:val="DecValTok"/>
     <w:basedOn w:val="VerbatimChar"/>
     <w:rPr>
       <w:color w:val="40a070"/>
     </w:rPr>
   </w:style>
-  <w:style w:type="character" w:customStyle="1" w:styleId="BaseNTok">
+  <w:style w:customStyle="1" w:styleId="BaseNTok" w:type="character">
     <w:name w:val="BaseNTok"/>
     <w:basedOn w:val="VerbatimChar"/>
     <w:rPr>
       <w:color w:val="40a070"/>
     </w:rPr>
   </w:style>
-  <w:style w:type="character" w:customStyle="1" w:styleId="FloatTok">
+  <w:style w:customStyle="1" w:styleId="FloatTok" w:type="character">
     <w:name w:val="FloatTok"/>
     <w:basedOn w:val="VerbatimChar"/>
     <w:rPr>
       <w:color w:val="40a070"/>
     </w:rPr>
   </w:style>
-  <w:style w:type="character" w:customStyle="1" w:styleId="ConstantTok">
+  <w:style w:customStyle="1" w:styleId="ConstantTok" w:type="character">
     <w:name w:val="ConstantTok"/>
     <w:basedOn w:val="VerbatimChar"/>
     <w:rPr>
       <w:color w:val="880000"/>
     </w:rPr>
   </w:style>
-  <w:style w:type="character" w:customStyle="1" w:styleId="CharTok">
+  <w:style w:customStyle="1" w:styleId="CharTok" w:type="character">
     <w:name w:val="CharTok"/>
     <w:basedOn w:val="VerbatimChar"/>
     <w:rPr>
       <w:color w:val="4070a0"/>
     </w:rPr>
   </w:style>
-  <w:style w:type="character" w:customStyle="1" w:styleId="SpecialCharTok">
+  <w:style w:customStyle="1" w:styleId="SpecialCharTok" w:type="character">
     <w:name w:val="SpecialCharTok"/>
     <w:basedOn w:val="VerbatimChar"/>
     <w:rPr>
       <w:color w:val="4070a0"/>
     </w:rPr>
   </w:style>
-  <w:style w:type="character" w:customStyle="1" w:styleId="StringTok">
+  <w:style w:customStyle="1" w:styleId="StringTok" w:type="character">
     <w:name w:val="StringTok"/>
     <w:basedOn w:val="VerbatimChar"/>
     <w:rPr>
       <w:color w:val="4070a0"/>
     </w:rPr>
   </w:style>
-  <w:style w:type="character" w:customStyle="1" w:styleId="VerbatimStringTok">
+  <w:style w:customStyle="1" w:styleId="VerbatimStringTok" w:type="character">
     <w:name w:val="VerbatimStringTok"/>
     <w:basedOn w:val="VerbatimChar"/>
     <w:rPr>
       <w:color w:val="4070a0"/>
     </w:rPr>
   </w:style>
-  <w:style w:type="character" w:customStyle="1" w:styleId="SpecialStringTok">
+  <w:style w:customStyle="1" w:styleId="SpecialStringTok" w:type="character">
     <w:name w:val="SpecialStringTok"/>
     <w:basedOn w:val="VerbatimChar"/>
     <w:rPr>
       <w:color w:val="bb6688"/>
     </w:rPr>
   </w:style>
-  <w:style w:type="character" w:customStyle="1" w:styleId="ImportTok">
+  <w:style w:customStyle="1" w:styleId="ImportTok" w:type="character">
     <w:name w:val="ImportTok"/>
     <w:basedOn w:val="VerbatimChar"/>
     <w:rPr>
@@ -4464,7 +3996,7 @@
       <w:color w:val="008000"/>
     </w:rPr>
   </w:style>
-  <w:style w:type="character" w:customStyle="1" w:styleId="CommentTok">
+  <w:style w:customStyle="1" w:styleId="CommentTok" w:type="character">
     <w:name w:val="CommentTok"/>
     <w:basedOn w:val="VerbatimChar"/>
     <w:rPr>
@@ -4472,7 +4004,7 @@
       <w:color w:val="60a0b0"/>
     </w:rPr>
   </w:style>
-  <w:style w:type="character" w:customStyle="1" w:styleId="DocumentationTok">
+  <w:style w:customStyle="1" w:styleId="DocumentationTok" w:type="character">
     <w:name w:val="DocumentationTok"/>
     <w:basedOn w:val="VerbatimChar"/>
     <w:rPr>
@@ -4480,7 +4012,7 @@
       <w:color w:val="ba2121"/>
     </w:rPr>
   </w:style>
-  <w:style w:type="character" w:customStyle="1" w:styleId="AnnotationTok">
+  <w:style w:customStyle="1" w:styleId="AnnotationTok" w:type="character">
     <w:name w:val="AnnotationTok"/>
     <w:basedOn w:val="VerbatimChar"/>
     <w:rPr>
@@ -4489,7 +4021,7 @@
       <w:color w:val="60a0b0"/>
     </w:rPr>
   </w:style>
-  <w:style w:type="character" w:customStyle="1" w:styleId="CommentVarTok">
+  <w:style w:customStyle="1" w:styleId="CommentVarTok" w:type="character">
     <w:name w:val="CommentVarTok"/>
     <w:basedOn w:val="VerbatimChar"/>
     <w:rPr>
@@ -4498,28 +4030,28 @@
       <w:color w:val="60a0b0"/>
     </w:rPr>
   </w:style>
-  <w:style w:type="character" w:customStyle="1" w:styleId="OtherTok">
+  <w:style w:customStyle="1" w:styleId="OtherTok" w:type="character">
     <w:name w:val="OtherTok"/>
     <w:basedOn w:val="VerbatimChar"/>
     <w:rPr>
       <w:color w:val="007020"/>
     </w:rPr>
   </w:style>
-  <w:style w:type="character" w:customStyle="1" w:styleId="FunctionTok">
+  <w:style w:customStyle="1" w:styleId="FunctionTok" w:type="character">
     <w:name w:val="FunctionTok"/>
     <w:basedOn w:val="VerbatimChar"/>
     <w:rPr>
       <w:color w:val="06287e"/>
     </w:rPr>
   </w:style>
-  <w:style w:type="character" w:customStyle="1" w:styleId="VariableTok">
+  <w:style w:customStyle="1" w:styleId="VariableTok" w:type="character">
     <w:name w:val="VariableTok"/>
     <w:basedOn w:val="VerbatimChar"/>
     <w:rPr>
       <w:color w:val="19177c"/>
     </w:rPr>
   </w:style>
-  <w:style w:type="character" w:customStyle="1" w:styleId="ControlFlowTok">
+  <w:style w:customStyle="1" w:styleId="ControlFlowTok" w:type="character">
     <w:name w:val="ControlFlowTok"/>
     <w:basedOn w:val="VerbatimChar"/>
     <w:rPr>
@@ -4527,45 +4059,45 @@
       <w:color w:val="007020"/>
     </w:rPr>
   </w:style>
-  <w:style w:type="character" w:customStyle="1" w:styleId="OperatorTok">
+  <w:style w:customStyle="1" w:styleId="OperatorTok" w:type="character">
     <w:name w:val="OperatorTok"/>
     <w:basedOn w:val="VerbatimChar"/>
     <w:rPr>
       <w:color w:val="666666"/>
     </w:rPr>
   </w:style>
-  <w:style w:type="character" w:customStyle="1" w:styleId="BuiltInTok">
+  <w:style w:customStyle="1" w:styleId="BuiltInTok" w:type="character">
     <w:name w:val="BuiltInTok"/>
     <w:basedOn w:val="VerbatimChar"/>
     <w:rPr>
       <w:color w:val="008000"/>
     </w:rPr>
   </w:style>
-  <w:style w:type="character" w:customStyle="1" w:styleId="ExtensionTok">
+  <w:style w:customStyle="1" w:styleId="ExtensionTok" w:type="character">
     <w:name w:val="ExtensionTok"/>
     <w:basedOn w:val="VerbatimChar"/>
     <w:rPr/>
   </w:style>
-  <w:style w:type="character" w:customStyle="1" w:styleId="PreprocessorTok">
+  <w:style w:customStyle="1" w:styleId="PreprocessorTok" w:type="character">
     <w:name w:val="PreprocessorTok"/>
     <w:basedOn w:val="VerbatimChar"/>
     <w:rPr>
       <w:color w:val="bc7a00"/>
     </w:rPr>
   </w:style>
-  <w:style w:type="character" w:customStyle="1" w:styleId="AttributeTok">
+  <w:style w:customStyle="1" w:styleId="AttributeTok" w:type="character">
     <w:name w:val="AttributeTok"/>
     <w:basedOn w:val="VerbatimChar"/>
     <w:rPr>
       <w:color w:val="7d9029"/>
     </w:rPr>
   </w:style>
-  <w:style w:type="character" w:customStyle="1" w:styleId="RegionMarkerTok">
+  <w:style w:customStyle="1" w:styleId="RegionMarkerTok" w:type="character">
     <w:name w:val="RegionMarkerTok"/>
     <w:basedOn w:val="VerbatimChar"/>
     <w:rPr/>
   </w:style>
-  <w:style w:type="character" w:customStyle="1" w:styleId="InformationTok">
+  <w:style w:customStyle="1" w:styleId="InformationTok" w:type="character">
     <w:name w:val="InformationTok"/>
     <w:basedOn w:val="VerbatimChar"/>
     <w:rPr>
@@ -4574,7 +4106,7 @@
       <w:color w:val="60a0b0"/>
     </w:rPr>
   </w:style>
-  <w:style w:type="character" w:customStyle="1" w:styleId="WarningTok">
+  <w:style w:customStyle="1" w:styleId="WarningTok" w:type="character">
     <w:name w:val="WarningTok"/>
     <w:basedOn w:val="VerbatimChar"/>
     <w:rPr>
@@ -4583,7 +4115,7 @@
       <w:color w:val="60a0b0"/>
     </w:rPr>
   </w:style>
-  <w:style w:type="character" w:customStyle="1" w:styleId="AlertTok">
+  <w:style w:customStyle="1" w:styleId="AlertTok" w:type="character">
     <w:name w:val="AlertTok"/>
     <w:basedOn w:val="VerbatimChar"/>
     <w:rPr>
@@ -4591,7 +4123,7 @@
       <w:color w:val="ff0000"/>
     </w:rPr>
   </w:style>
-  <w:style w:type="character" w:customStyle="1" w:styleId="ErrorTok">
+  <w:style w:customStyle="1" w:styleId="ErrorTok" w:type="character">
     <w:name w:val="ErrorTok"/>
     <w:basedOn w:val="VerbatimChar"/>
     <w:rPr>
@@ -4599,7 +4131,7 @@
       <w:color w:val="ff0000"/>
     </w:rPr>
   </w:style>
-  <w:style w:type="character" w:customStyle="1" w:styleId="NormalTok">
+  <w:style w:customStyle="1" w:styleId="NormalTok" w:type="character">
     <w:name w:val="NormalTok"/>
     <w:basedOn w:val="VerbatimChar"/>
     <w:rPr/>

</xml_diff>